<commit_message>
Replace image-based DOCX with editable text Word conversion
Co-authored-by: Ron Gurfinkel <RonBabaj@users.noreply.github.com>
</commit_message>
<xml_diff>
--- a/exports/medical_certificate.docx
+++ b/exports/medical_certificate.docx
@@ -2,49 +2,583 @@
 <file path=word/document.xml><?xml version="1.0" encoding="utf-8"?>
 <w:document xmlns:wpc="http://schemas.microsoft.com/office/word/2010/wordprocessingCanvas" xmlns:mo="http://schemas.microsoft.com/office/mac/office/2008/main" xmlns:mc="http://schemas.openxmlformats.org/markup-compatibility/2006" xmlns:mv="urn:schemas-microsoft-com:mac:vml" xmlns:o="urn:schemas-microsoft-com:office:office" xmlns:r="http://schemas.openxmlformats.org/officeDocument/2006/relationships" xmlns:m="http://schemas.openxmlformats.org/officeDocument/2006/math" xmlns:v="urn:schemas-microsoft-com:vml" xmlns:wp14="http://schemas.microsoft.com/office/word/2010/wordprocessingDrawing" xmlns:wp="http://schemas.openxmlformats.org/drawingml/2006/wordprocessingDrawing" xmlns:w10="urn:schemas-microsoft-com:office:word" xmlns:w="http://schemas.openxmlformats.org/wordprocessingml/2006/main" xmlns:w14="http://schemas.microsoft.com/office/word/2010/wordml" xmlns:wpg="http://schemas.microsoft.com/office/word/2010/wordprocessingGroup" xmlns:wpi="http://schemas.microsoft.com/office/word/2010/wordprocessingInk" xmlns:wne="http://schemas.microsoft.com/office/word/2006/wordml" xmlns:wps="http://schemas.microsoft.com/office/word/2010/wordprocessingShape" mc:Ignorable="w14 wp14">
   <w:body>
+    <w:tbl>
+      <w:tblPr>
+        <w:tblW w:type="auto" w:w="0"/>
+        <w:jc w:val="center"/>
+        <w:tblLook w:firstColumn="1" w:firstRow="1" w:lastColumn="0" w:lastRow="0" w:noHBand="0" w:noVBand="1" w:val="04A0"/>
+        <w:tblBorders>
+          <w:top w:val="none" w:sz="0" w:space="0" w:color="auto"/>
+          <w:left w:val="none" w:sz="0" w:space="0" w:color="auto"/>
+          <w:bottom w:val="none" w:sz="0" w:space="0" w:color="auto"/>
+          <w:right w:val="none" w:sz="0" w:space="0" w:color="auto"/>
+          <w:insideH w:val="none" w:sz="0" w:space="0" w:color="auto"/>
+          <w:insideV w:val="none" w:sz="0" w:space="0" w:color="auto"/>
+        </w:tblBorders>
+      </w:tblPr>
+      <w:tblGrid>
+        <w:gridCol w:w="3489"/>
+        <w:gridCol w:w="3489"/>
+        <w:gridCol w:w="3489"/>
+      </w:tblGrid>
+      <w:tr>
+        <w:tc>
+          <w:tcPr>
+            <w:tcW w:type="dxa" w:w="3489"/>
+          </w:tcPr>
+          <w:p>
+            <w:pPr>
+              <w:bidi w:val="1"/>
+              <w:jc w:val="left"/>
+            </w:pPr>
+            <w:r>
+              <w:rPr>
+                <w:rFonts w:ascii="Arial" w:hAnsi="Arial" w:cs="Arial"/>
+                <w:b w:val="0"/>
+                <w:sz w:val="19"/>
+              </w:rPr>
+              <w:t>דר' קגנוביץ גלינה</w:t>
+            </w:r>
+          </w:p>
+          <w:p>
+            <w:pPr>
+              <w:bidi w:val="1"/>
+              <w:jc w:val="left"/>
+            </w:pPr>
+            <w:r>
+              <w:rPr>
+                <w:rFonts w:ascii="Arial" w:hAnsi="Arial" w:cs="Arial"/>
+                <w:b w:val="0"/>
+                <w:sz w:val="19"/>
+              </w:rPr>
+              <w:t>מ.ר 024125</w:t>
+            </w:r>
+          </w:p>
+          <w:p>
+            <w:pPr>
+              <w:bidi w:val="1"/>
+              <w:jc w:val="left"/>
+            </w:pPr>
+            <w:r>
+              <w:rPr>
+                <w:rFonts w:ascii="Arial" w:hAnsi="Arial" w:cs="Arial"/>
+                <w:b w:val="0"/>
+                <w:sz w:val="19"/>
+              </w:rPr>
+              <w:t>גורם מפנה</w:t>
+            </w:r>
+          </w:p>
+          <w:p>
+            <w:pPr>
+              <w:bidi w:val="1"/>
+              <w:jc w:val="left"/>
+            </w:pPr>
+            <w:r>
+              <w:rPr>
+                <w:rFonts w:ascii="Arial" w:hAnsi="Arial" w:cs="Arial"/>
+                <w:b w:val="0"/>
+                <w:sz w:val="19"/>
+              </w:rPr>
+              <w:t>משפחה, פנימית וכללית</w:t>
+            </w:r>
+          </w:p>
+        </w:tc>
+        <w:tc>
+          <w:tcPr>
+            <w:tcW w:type="dxa" w:w="3489"/>
+          </w:tcPr>
+          <w:p>
+            <w:pPr>
+              <w:jc w:val="center"/>
+            </w:pPr>
+            <w:r>
+              <w:drawing>
+                <wp:inline xmlns:a="http://schemas.openxmlformats.org/drawingml/2006/main" xmlns:pic="http://schemas.openxmlformats.org/drawingml/2006/picture">
+                  <wp:extent cx="792000" cy="571443"/>
+                  <wp:docPr id="1" name="Picture 1"/>
+                  <wp:cNvGraphicFramePr>
+                    <a:graphicFrameLocks noChangeAspect="1"/>
+                  </wp:cNvGraphicFramePr>
+                  <a:graphic>
+                    <a:graphicData uri="http://schemas.openxmlformats.org/drawingml/2006/picture">
+                      <pic:pic>
+                        <pic:nvPicPr>
+                          <pic:cNvPr id="0" name="maccabi_logo.png"/>
+                          <pic:cNvPicPr/>
+                        </pic:nvPicPr>
+                        <pic:blipFill>
+                          <a:blip r:embed="rId9"/>
+                          <a:stretch>
+                            <a:fillRect/>
+                          </a:stretch>
+                        </pic:blipFill>
+                        <pic:spPr>
+                          <a:xfrm>
+                            <a:off x="0" y="0"/>
+                            <a:ext cx="792000" cy="571443"/>
+                          </a:xfrm>
+                          <a:prstGeom prst="rect"/>
+                        </pic:spPr>
+                      </pic:pic>
+                    </a:graphicData>
+                  </a:graphic>
+                </wp:inline>
+              </w:drawing>
+            </w:r>
+          </w:p>
+        </w:tc>
+        <w:tc>
+          <w:tcPr>
+            <w:tcW w:type="dxa" w:w="3489"/>
+          </w:tcPr>
+          <w:p>
+            <w:pPr>
+              <w:bidi w:val="1"/>
+              <w:jc w:val="right"/>
+            </w:pPr>
+            <w:r>
+              <w:rPr>
+                <w:rFonts w:ascii="Arial" w:hAnsi="Arial" w:cs="Arial"/>
+                <w:b/>
+                <w:sz w:val="24"/>
+              </w:rPr>
+              <w:t>מכבי</w:t>
+            </w:r>
+            <w:r>
+              <w:rPr>
+                <w:rFonts w:ascii="Arial" w:hAnsi="Arial" w:cs="Arial"/>
+                <w:b/>
+                <w:sz w:val="24"/>
+              </w:rPr>
+              <w:t xml:space="preserve"> שירותי בריאות</w:t>
+            </w:r>
+          </w:p>
+          <w:p>
+            <w:pPr>
+              <w:bidi w:val="1"/>
+              <w:jc w:val="right"/>
+            </w:pPr>
+            <w:r>
+              <w:rPr>
+                <w:rFonts w:ascii="Arial" w:hAnsi="Arial" w:cs="Arial"/>
+                <w:b w:val="0"/>
+                <w:sz w:val="19"/>
+              </w:rPr>
+              <w:t>תאריך: 31/08/2026</w:t>
+            </w:r>
+          </w:p>
+        </w:tc>
+      </w:tr>
+    </w:tbl>
+    <w:tbl>
+      <w:tblPr>
+        <w:tblW w:type="auto" w:w="0"/>
+        <w:tblLook w:firstColumn="1" w:firstRow="1" w:lastColumn="0" w:lastRow="0" w:noHBand="0" w:noVBand="1" w:val="04A0"/>
+        <w:tblBorders>
+          <w:top w:val="none" w:sz="0" w:space="0" w:color="auto"/>
+          <w:left w:val="none" w:sz="0" w:space="0" w:color="auto"/>
+          <w:bottom w:val="none" w:sz="0" w:space="0" w:color="auto"/>
+          <w:right w:val="none" w:sz="0" w:space="0" w:color="auto"/>
+          <w:insideH w:val="none" w:sz="0" w:space="0" w:color="auto"/>
+          <w:insideV w:val="none" w:sz="0" w:space="0" w:color="auto"/>
+        </w:tblBorders>
+      </w:tblPr>
+      <w:tblGrid>
+        <w:gridCol w:w="10466"/>
+      </w:tblGrid>
+      <w:tr>
+        <w:tc>
+          <w:tcPr>
+            <w:tcW w:type="dxa" w:w="10466"/>
+          </w:tcPr>
+          <w:p>
+            <w:pPr>
+              <w:bidi w:val="1"/>
+              <w:jc w:val="left"/>
+            </w:pPr>
+            <w:r>
+              <w:rPr>
+                <w:rFonts w:ascii="Arial" w:hAnsi="Arial" w:cs="Arial"/>
+                <w:b w:val="0"/>
+                <w:sz w:val="19"/>
+              </w:rPr>
+              <w:t>טלפון: 08-9257689</w:t>
+            </w:r>
+          </w:p>
+        </w:tc>
+      </w:tr>
+      <w:tr>
+        <w:tc>
+          <w:tcPr>
+            <w:tcW w:type="dxa" w:w="10466"/>
+          </w:tcPr>
+          <w:p>
+            <w:pPr>
+              <w:bidi w:val="1"/>
+              <w:jc w:val="left"/>
+            </w:pPr>
+            <w:r>
+              <w:rPr>
+                <w:rFonts w:ascii="Arial" w:hAnsi="Arial" w:cs="Arial"/>
+                <w:b w:val="0"/>
+                <w:sz w:val="19"/>
+              </w:rPr>
+              <w:t>פקס: 08-9257689</w:t>
+            </w:r>
+          </w:p>
+        </w:tc>
+      </w:tr>
+      <w:tr>
+        <w:tc>
+          <w:tcPr>
+            <w:tcW w:type="dxa" w:w="10466"/>
+          </w:tcPr>
+          <w:p>
+            <w:pPr>
+              <w:bidi w:val="1"/>
+              <w:jc w:val="left"/>
+            </w:pPr>
+            <w:r>
+              <w:rPr>
+                <w:rFonts w:ascii="Arial" w:hAnsi="Arial" w:cs="Arial"/>
+                <w:b w:val="0"/>
+                <w:sz w:val="19"/>
+              </w:rPr>
+              <w:t>כתובת: שטרן יאיר 14, רמלה</w:t>
+            </w:r>
+          </w:p>
+        </w:tc>
+      </w:tr>
+    </w:tbl>
+    <w:p/>
     <w:p>
       <w:pPr>
-        <w:spacing w:before="0" w:after="0"/>
+        <w:bidi w:val="1"/>
+        <w:jc w:val="right"/>
+      </w:pPr>
+      <w:r>
+        <w:rPr>
+          <w:rFonts w:ascii="Arial" w:hAnsi="Arial" w:cs="Arial"/>
+          <w:b/>
+          <w:sz w:val="16"/>
+        </w:rPr>
+        <w:t>פרטי הנבדק:</w:t>
+      </w:r>
+    </w:p>
+    <w:tbl>
+      <w:tblPr>
+        <w:tblW w:type="auto" w:w="0"/>
+        <w:tblLook w:firstColumn="1" w:firstRow="1" w:lastColumn="0" w:lastRow="0" w:noHBand="0" w:noVBand="1" w:val="04A0"/>
+        <w:tblBorders>
+          <w:top w:val="none" w:sz="0" w:space="0" w:color="auto"/>
+          <w:left w:val="none" w:sz="0" w:space="0" w:color="auto"/>
+          <w:bottom w:val="none" w:sz="0" w:space="0" w:color="auto"/>
+          <w:right w:val="none" w:sz="0" w:space="0" w:color="auto"/>
+          <w:insideH w:val="none" w:sz="0" w:space="0" w:color="auto"/>
+          <w:insideV w:val="none" w:sz="0" w:space="0" w:color="auto"/>
+        </w:tblBorders>
+      </w:tblPr>
+      <w:tblGrid>
+        <w:gridCol w:w="5233"/>
+        <w:gridCol w:w="5233"/>
+      </w:tblGrid>
+      <w:tr>
+        <w:tc>
+          <w:tcPr>
+            <w:tcW w:type="dxa" w:w="5233"/>
+          </w:tcPr>
+          <w:p>
+            <w:pPr>
+              <w:bidi w:val="1"/>
+              <w:jc w:val="left"/>
+            </w:pPr>
+            <w:r>
+              <w:rPr>
+                <w:rFonts w:ascii="Arial" w:hAnsi="Arial" w:cs="Arial"/>
+                <w:b w:val="0"/>
+                <w:sz w:val="19"/>
+              </w:rPr>
+              <w:t>שם פרטי: רון</w:t>
+            </w:r>
+          </w:p>
+        </w:tc>
+        <w:tc>
+          <w:tcPr>
+            <w:tcW w:type="dxa" w:w="5233"/>
+          </w:tcPr>
+          <w:p>
+            <w:pPr>
+              <w:bidi w:val="1"/>
+              <w:jc w:val="right"/>
+            </w:pPr>
+            <w:r>
+              <w:rPr>
+                <w:rFonts w:ascii="Arial" w:hAnsi="Arial" w:cs="Arial"/>
+                <w:b w:val="0"/>
+                <w:sz w:val="19"/>
+              </w:rPr>
+              <w:t>שם משפחה: גורפינקל</w:t>
+            </w:r>
+          </w:p>
+        </w:tc>
+      </w:tr>
+      <w:tr>
+        <w:tc>
+          <w:tcPr>
+            <w:tcW w:type="dxa" w:w="5233"/>
+          </w:tcPr>
+          <w:p>
+            <w:pPr>
+              <w:bidi w:val="1"/>
+              <w:jc w:val="left"/>
+            </w:pPr>
+            <w:r>
+              <w:rPr>
+                <w:rFonts w:ascii="Arial" w:hAnsi="Arial" w:cs="Arial"/>
+                <w:b w:val="0"/>
+                <w:sz w:val="19"/>
+              </w:rPr>
+              <w:t>0215359910</w:t>
+            </w:r>
+          </w:p>
+        </w:tc>
+        <w:tc>
+          <w:tcPr>
+            <w:tcW w:type="dxa" w:w="5233"/>
+          </w:tcPr>
+          <w:p>
+            <w:pPr>
+              <w:bidi w:val="1"/>
+              <w:jc w:val="right"/>
+            </w:pPr>
+            <w:r>
+              <w:rPr>
+                <w:rFonts w:ascii="Arial" w:hAnsi="Arial" w:cs="Arial"/>
+                <w:b w:val="0"/>
+                <w:sz w:val="19"/>
+              </w:rPr>
+              <w:t>ת.ז.: 215359910</w:t>
+            </w:r>
+          </w:p>
+        </w:tc>
+      </w:tr>
+      <w:tr>
+        <w:tc>
+          <w:tcPr>
+            <w:tcW w:type="dxa" w:w="5233"/>
+          </w:tcPr>
+          <w:p>
+            <w:pPr>
+              <w:bidi w:val="1"/>
+              <w:jc w:val="left"/>
+            </w:pPr>
+            <w:r>
+              <w:rPr>
+                <w:rFonts w:ascii="Arial" w:hAnsi="Arial" w:cs="Arial"/>
+                <w:b w:val="0"/>
+                <w:sz w:val="19"/>
+              </w:rPr>
+              <w:t>טלפון: 08-9244787    טל. עבודה/נייד: 0522460193</w:t>
+            </w:r>
+          </w:p>
+        </w:tc>
+        <w:tc>
+          <w:tcPr>
+            <w:tcW w:type="dxa" w:w="5233"/>
+          </w:tcPr>
+          <w:p>
+            <w:pPr>
+              <w:bidi w:val="1"/>
+              <w:jc w:val="right"/>
+            </w:pPr>
+            <w:r>
+              <w:rPr>
+                <w:rFonts w:ascii="Arial" w:hAnsi="Arial" w:cs="Arial"/>
+                <w:b w:val="0"/>
+                <w:sz w:val="19"/>
+              </w:rPr>
+              <w:t>ת.לידה: 30/05/2005    מין: ז</w:t>
+            </w:r>
+          </w:p>
+        </w:tc>
+      </w:tr>
+      <w:tr>
+        <w:tc>
+          <w:tcPr>
+            <w:tcW w:type="dxa" w:w="5233"/>
+          </w:tcPr>
+          <w:p>
+            <w:pPr>
+              <w:bidi w:val="1"/>
+              <w:jc w:val="left"/>
+            </w:pPr>
+            <w:r>
+              <w:rPr>
+                <w:rFonts w:ascii="Arial" w:hAnsi="Arial" w:cs="Arial"/>
+                <w:b w:val="0"/>
+                <w:sz w:val="19"/>
+              </w:rPr>
+              <w:t>מיקוד 7228212</w:t>
+            </w:r>
+          </w:p>
+        </w:tc>
+        <w:tc>
+          <w:tcPr>
+            <w:tcW w:type="dxa" w:w="5233"/>
+          </w:tcPr>
+          <w:p>
+            <w:pPr>
+              <w:bidi w:val="1"/>
+              <w:jc w:val="right"/>
+            </w:pPr>
+            <w:r>
+              <w:rPr>
+                <w:rFonts w:ascii="Arial" w:hAnsi="Arial" w:cs="Arial"/>
+                <w:b w:val="0"/>
+                <w:sz w:val="19"/>
+              </w:rPr>
+              <w:t>כתובת: הרב אפריאט 6, רמלה</w:t>
+            </w:r>
+          </w:p>
+        </w:tc>
+      </w:tr>
+    </w:tbl>
+    <w:p/>
+    <w:p>
+      <w:pPr>
+        <w:bidi w:val="1"/>
         <w:jc w:val="center"/>
       </w:pPr>
       <w:r>
-        <w:drawing>
-          <wp:inline xmlns:a="http://schemas.openxmlformats.org/drawingml/2006/main" xmlns:pic="http://schemas.openxmlformats.org/drawingml/2006/picture">
-            <wp:extent cx="7560000" cy="10689432"/>
-            <wp:docPr id="1" name="Picture 1"/>
-            <wp:cNvGraphicFramePr>
-              <a:graphicFrameLocks noChangeAspect="1"/>
-            </wp:cNvGraphicFramePr>
-            <a:graphic>
-              <a:graphicData uri="http://schemas.openxmlformats.org/drawingml/2006/picture">
-                <pic:pic>
-                  <pic:nvPicPr>
-                    <pic:cNvPr id="0" name="page_render.png"/>
-                    <pic:cNvPicPr/>
-                  </pic:nvPicPr>
-                  <pic:blipFill>
-                    <a:blip r:embed="rId9"/>
-                    <a:stretch>
-                      <a:fillRect/>
-                    </a:stretch>
-                  </pic:blipFill>
-                  <pic:spPr>
-                    <a:xfrm>
-                      <a:off x="0" y="0"/>
-                      <a:ext cx="7560000" cy="10689432"/>
-                    </a:xfrm>
-                    <a:prstGeom prst="rect"/>
-                  </pic:spPr>
-                </pic:pic>
-              </a:graphicData>
-            </a:graphic>
-          </wp:inline>
-        </w:drawing>
+        <w:rPr>
+          <w:rFonts w:ascii="Arial" w:hAnsi="Arial" w:cs="Arial"/>
+          <w:b/>
+          <w:sz w:val="24"/>
+        </w:rPr>
+        <w:t>אישור מחלה</w:t>
       </w:r>
     </w:p>
+    <w:p/>
+    <w:p>
+      <w:pPr>
+        <w:jc w:val="left"/>
+      </w:pPr>
+      <w:r>
+        <w:rPr>
+          <w:rFonts w:ascii="Arial" w:hAnsi="Arial" w:cs="Arial"/>
+          <w:b w:val="0"/>
+          <w:sz w:val="16"/>
+        </w:rPr>
+        <w:t>ET4D-CV5-ZKC-6R82-449XH</w:t>
+      </w:r>
+    </w:p>
+    <w:p/>
+    <w:p>
+      <w:pPr>
+        <w:bidi w:val="1"/>
+        <w:jc w:val="right"/>
+      </w:pPr>
+      <w:r>
+        <w:rPr>
+          <w:rFonts w:ascii="Arial" w:hAnsi="Arial" w:cs="Arial"/>
+          <w:b w:val="0"/>
+          <w:sz w:val="19"/>
+        </w:rPr>
+        <w:t>הנני לאשר כי הנ"ל חלה/תה, האבחנה מפורטת ברשומה הרפואית.</w:t>
+      </w:r>
+    </w:p>
+    <w:p/>
+    <w:p>
+      <w:pPr>
+        <w:bidi w:val="1"/>
+        <w:jc w:val="right"/>
+      </w:pPr>
+      <w:r>
+        <w:rPr>
+          <w:rFonts w:ascii="Arial" w:hAnsi="Arial" w:cs="Arial"/>
+          <w:b w:val="0"/>
+          <w:sz w:val="19"/>
+        </w:rPr>
+        <w:t>אינו/ה מסוגל/ת לעבוד מיום: 24/08/2026 עד יום: 27/08/2026 סה"כ: 4 ימים.</w:t>
+      </w:r>
+    </w:p>
+    <w:p/>
+    <w:p/>
+    <w:tbl>
+      <w:tblPr>
+        <w:tblW w:type="auto" w:w="0"/>
+        <w:tblLook w:firstColumn="1" w:firstRow="1" w:lastColumn="0" w:lastRow="0" w:noHBand="0" w:noVBand="1" w:val="04A0"/>
+        <w:tblBorders>
+          <w:top w:val="none" w:sz="0" w:space="0" w:color="auto"/>
+          <w:left w:val="none" w:sz="0" w:space="0" w:color="auto"/>
+          <w:bottom w:val="none" w:sz="0" w:space="0" w:color="auto"/>
+          <w:right w:val="none" w:sz="0" w:space="0" w:color="auto"/>
+          <w:insideH w:val="none" w:sz="0" w:space="0" w:color="auto"/>
+          <w:insideV w:val="none" w:sz="0" w:space="0" w:color="auto"/>
+        </w:tblBorders>
+      </w:tblPr>
+      <w:tblGrid>
+        <w:gridCol w:w="5233"/>
+        <w:gridCol w:w="5233"/>
+      </w:tblGrid>
+      <w:tr>
+        <w:tc>
+          <w:tcPr>
+            <w:tcW w:type="dxa" w:w="5233"/>
+          </w:tcPr>
+          <w:p/>
+        </w:tc>
+        <w:tc>
+          <w:tcPr>
+            <w:tcW w:type="dxa" w:w="5233"/>
+          </w:tcPr>
+          <w:p>
+            <w:pPr>
+              <w:bidi w:val="1"/>
+              <w:jc w:val="right"/>
+            </w:pPr>
+            <w:r>
+              <w:rPr>
+                <w:rFonts w:ascii="Arial" w:hAnsi="Arial" w:cs="Arial"/>
+                <w:b w:val="0"/>
+                <w:sz w:val="19"/>
+              </w:rPr>
+              <w:t>31/08/2026</w:t>
+            </w:r>
+          </w:p>
+        </w:tc>
+      </w:tr>
+      <w:tr>
+        <w:tc>
+          <w:tcPr>
+            <w:tcW w:type="dxa" w:w="5233"/>
+          </w:tcPr>
+          <w:p>
+            <w:pPr>
+              <w:bidi w:val="1"/>
+              <w:jc w:val="right"/>
+            </w:pPr>
+            <w:r>
+              <w:rPr>
+                <w:rFonts w:ascii="Arial" w:hAnsi="Arial" w:cs="Arial"/>
+                <w:b w:val="0"/>
+                <w:sz w:val="19"/>
+              </w:rPr>
+              <w:t>תאריך חתימה וחותמת הרופא</w:t>
+            </w:r>
+          </w:p>
+        </w:tc>
+        <w:tc>
+          <w:tcPr>
+            <w:tcW w:type="dxa" w:w="5233"/>
+          </w:tcPr>
+          <w:p/>
+        </w:tc>
+      </w:tr>
+    </w:tbl>
     <w:sectPr>
       <w:pgSz w:w="11906" w:h="16838"/>
-      <w:pgMar w:top="0" w:right="0" w:bottom="0" w:left="0" w:header="720" w:footer="720" w:gutter="0"/>
+      <w:pgMar w:top="720" w:right="720" w:bottom="720" w:left="720" w:header="720" w:footer="720" w:gutter="0"/>
       <w:cols w:space="720"/>
       <w:docGrid w:linePitch="360"/>
     </w:sectPr>

</xml_diff>

<commit_message>
Convert PDF to text-only Word document with no embedded images
Co-authored-by: Ron Gurfinkel <RonBabaj@users.noreply.github.com>
</commit_message>
<xml_diff>
--- a/exports/medical_certificate.docx
+++ b/exports/medical_certificate.docx
@@ -2,169 +2,433 @@
 <file path=word/document.xml><?xml version="1.0" encoding="utf-8"?>
 <w:document xmlns:wpc="http://schemas.microsoft.com/office/word/2010/wordprocessingCanvas" xmlns:mo="http://schemas.microsoft.com/office/mac/office/2008/main" xmlns:mc="http://schemas.openxmlformats.org/markup-compatibility/2006" xmlns:mv="urn:schemas-microsoft-com:mac:vml" xmlns:o="urn:schemas-microsoft-com:office:office" xmlns:r="http://schemas.openxmlformats.org/officeDocument/2006/relationships" xmlns:m="http://schemas.openxmlformats.org/officeDocument/2006/math" xmlns:v="urn:schemas-microsoft-com:vml" xmlns:wp14="http://schemas.microsoft.com/office/word/2010/wordprocessingDrawing" xmlns:wp="http://schemas.openxmlformats.org/drawingml/2006/wordprocessingDrawing" xmlns:w10="urn:schemas-microsoft-com:office:word" xmlns:w="http://schemas.openxmlformats.org/wordprocessingml/2006/main" xmlns:w14="http://schemas.microsoft.com/office/word/2010/wordml" xmlns:wpg="http://schemas.microsoft.com/office/word/2010/wordprocessingGroup" xmlns:wpi="http://schemas.microsoft.com/office/word/2010/wordprocessingInk" xmlns:wne="http://schemas.microsoft.com/office/word/2006/wordml" xmlns:wps="http://schemas.microsoft.com/office/word/2010/wordprocessingShape" mc:Ignorable="w14 wp14">
   <w:body>
+    <w:p>
+      <w:pPr>
+        <w:bidi w:val="1"/>
+        <w:jc w:val="left"/>
+      </w:pPr>
+      <w:r>
+        <w:t>024125</w:t>
+      </w:r>
+    </w:p>
+    <w:p>
+      <w:pPr>
+        <w:bidi w:val="1"/>
+        <w:jc w:val="left"/>
+      </w:pPr>
+      <w:r>
+        <w:t xml:space="preserve">ET4D-CV5-ZKC-6R82-449XH </w:t>
+      </w:r>
+    </w:p>
     <w:tbl>
       <w:tblPr>
         <w:tblW w:type="auto" w:w="0"/>
-        <w:jc w:val="center"/>
         <w:tblLook w:firstColumn="1" w:firstRow="1" w:lastColumn="0" w:lastRow="0" w:noHBand="0" w:noVBand="1" w:val="04A0"/>
-        <w:tblBorders>
-          <w:top w:val="none" w:sz="0" w:space="0" w:color="auto"/>
-          <w:left w:val="none" w:sz="0" w:space="0" w:color="auto"/>
-          <w:bottom w:val="none" w:sz="0" w:space="0" w:color="auto"/>
-          <w:right w:val="none" w:sz="0" w:space="0" w:color="auto"/>
-          <w:insideH w:val="none" w:sz="0" w:space="0" w:color="auto"/>
-          <w:insideV w:val="none" w:sz="0" w:space="0" w:color="auto"/>
-        </w:tblBorders>
       </w:tblPr>
       <w:tblGrid>
-        <w:gridCol w:w="3489"/>
-        <w:gridCol w:w="3489"/>
-        <w:gridCol w:w="3489"/>
+        <w:gridCol w:w="1083"/>
+        <w:gridCol w:w="1083"/>
+        <w:gridCol w:w="1083"/>
+        <w:gridCol w:w="1083"/>
+        <w:gridCol w:w="1083"/>
+        <w:gridCol w:w="1083"/>
+        <w:gridCol w:w="1083"/>
+        <w:gridCol w:w="1083"/>
+        <w:gridCol w:w="1083"/>
+        <w:gridCol w:w="1083"/>
       </w:tblGrid>
       <w:tr>
         <w:tc>
           <w:tcPr>
-            <w:tcW w:type="dxa" w:w="3489"/>
+            <w:tcW w:type="dxa" w:w="1083"/>
           </w:tcPr>
           <w:p>
             <w:pPr>
               <w:bidi w:val="1"/>
-              <w:jc w:val="left"/>
             </w:pPr>
             <w:r>
-              <w:rPr>
-                <w:rFonts w:ascii="Arial" w:hAnsi="Arial" w:cs="Arial"/>
-                <w:b w:val="0"/>
-                <w:sz w:val="19"/>
-              </w:rPr>
-              <w:t>דר' קגנוביץ גלינה</w:t>
-            </w:r>
-          </w:p>
-          <w:p>
-            <w:pPr>
-              <w:bidi w:val="1"/>
-              <w:jc w:val="left"/>
-            </w:pPr>
-            <w:r>
-              <w:rPr>
-                <w:rFonts w:ascii="Arial" w:hAnsi="Arial" w:cs="Arial"/>
-                <w:b w:val="0"/>
-                <w:sz w:val="19"/>
-              </w:rPr>
-              <w:t>מ.ר 024125</w:t>
-            </w:r>
-          </w:p>
-          <w:p>
-            <w:pPr>
-              <w:bidi w:val="1"/>
-              <w:jc w:val="left"/>
-            </w:pPr>
-            <w:r>
-              <w:rPr>
-                <w:rFonts w:ascii="Arial" w:hAnsi="Arial" w:cs="Arial"/>
-                <w:b w:val="0"/>
-                <w:sz w:val="19"/>
-              </w:rPr>
-              <w:t>גורם מפנה</w:t>
-            </w:r>
-          </w:p>
-          <w:p>
-            <w:pPr>
-              <w:bidi w:val="1"/>
-              <w:jc w:val="left"/>
-            </w:pPr>
-            <w:r>
-              <w:rPr>
-                <w:rFonts w:ascii="Arial" w:hAnsi="Arial" w:cs="Arial"/>
-                <w:b w:val="0"/>
-                <w:sz w:val="19"/>
-              </w:rPr>
-              <w:t>משפחה, פנימית וכללית</w:t>
+              <w:t>31/08/2026</w:t>
             </w:r>
           </w:p>
         </w:tc>
         <w:tc>
           <w:tcPr>
-            <w:tcW w:type="dxa" w:w="3489"/>
+            <w:tcW w:type="dxa" w:w="1083"/>
           </w:tcPr>
           <w:p>
             <w:pPr>
-              <w:jc w:val="center"/>
+              <w:bidi w:val="1"/>
             </w:pPr>
             <w:r>
-              <w:drawing>
-                <wp:inline xmlns:a="http://schemas.openxmlformats.org/drawingml/2006/main" xmlns:pic="http://schemas.openxmlformats.org/drawingml/2006/picture">
-                  <wp:extent cx="792000" cy="571443"/>
-                  <wp:docPr id="1" name="Picture 1"/>
-                  <wp:cNvGraphicFramePr>
-                    <a:graphicFrameLocks noChangeAspect="1"/>
-                  </wp:cNvGraphicFramePr>
-                  <a:graphic>
-                    <a:graphicData uri="http://schemas.openxmlformats.org/drawingml/2006/picture">
-                      <pic:pic>
-                        <pic:nvPicPr>
-                          <pic:cNvPr id="0" name="maccabi_logo.png"/>
-                          <pic:cNvPicPr/>
-                        </pic:nvPicPr>
-                        <pic:blipFill>
-                          <a:blip r:embed="rId9"/>
-                          <a:stretch>
-                            <a:fillRect/>
-                          </a:stretch>
-                        </pic:blipFill>
-                        <pic:spPr>
-                          <a:xfrm>
-                            <a:off x="0" y="0"/>
-                            <a:ext cx="792000" cy="571443"/>
-                          </a:xfrm>
-                          <a:prstGeom prst="rect"/>
-                        </pic:spPr>
-                      </pic:pic>
-                    </a:graphicData>
-                  </a:graphic>
-                </wp:inline>
-              </w:drawing>
+              <w:t>תאריך:</w:t>
             </w:r>
           </w:p>
         </w:tc>
         <w:tc>
           <w:tcPr>
-            <w:tcW w:type="dxa" w:w="3489"/>
+            <w:tcW w:type="dxa" w:w="1083"/>
           </w:tcPr>
           <w:p>
             <w:pPr>
               <w:bidi w:val="1"/>
-              <w:jc w:val="right"/>
             </w:pPr>
             <w:r>
-              <w:rPr>
-                <w:rFonts w:ascii="Arial" w:hAnsi="Arial" w:cs="Arial"/>
-                <w:b/>
-                <w:sz w:val="24"/>
-              </w:rPr>
-              <w:t>מכבי</w:t>
-            </w:r>
-            <w:r>
-              <w:rPr>
-                <w:rFonts w:ascii="Arial" w:hAnsi="Arial" w:cs="Arial"/>
-                <w:b/>
-                <w:sz w:val="24"/>
-              </w:rPr>
-              <w:t xml:space="preserve"> שירותי בריאות</w:t>
+              <w:t>גורם</w:t>
             </w:r>
           </w:p>
+        </w:tc>
+        <w:tc>
+          <w:tcPr>
+            <w:tcW w:type="dxa" w:w="1083"/>
+          </w:tcPr>
           <w:p>
             <w:pPr>
               <w:bidi w:val="1"/>
-              <w:jc w:val="right"/>
             </w:pPr>
             <w:r>
-              <w:rPr>
-                <w:rFonts w:ascii="Arial" w:hAnsi="Arial" w:cs="Arial"/>
-                <w:b w:val="0"/>
-                <w:sz w:val="19"/>
-              </w:rPr>
-              <w:t>תאריך: 31/08/2026</w:t>
+              <w:t>מ.ר</w:t>
+            </w:r>
+          </w:p>
+        </w:tc>
+        <w:tc>
+          <w:tcPr>
+            <w:tcW w:type="dxa" w:w="1083"/>
+          </w:tcPr>
+          <w:p>
+            <w:pPr>
+              <w:bidi w:val="1"/>
+            </w:pPr>
+            <w:r>
+              <w:t>בריאות</w:t>
+            </w:r>
+          </w:p>
+        </w:tc>
+        <w:tc>
+          <w:tcPr>
+            <w:tcW w:type="dxa" w:w="1083"/>
+          </w:tcPr>
+          <w:p>
+            <w:pPr>
+              <w:bidi w:val="1"/>
+            </w:pPr>
+            <w:r>
+              <w:t>שירותי</w:t>
+            </w:r>
+          </w:p>
+        </w:tc>
+        <w:tc>
+          <w:tcPr>
+            <w:tcW w:type="dxa" w:w="1083"/>
+          </w:tcPr>
+          <w:p>
+            <w:pPr>
+              <w:bidi w:val="1"/>
+            </w:pPr>
+            <w:r>
+              <w:t>מכבי</w:t>
+            </w:r>
+          </w:p>
+        </w:tc>
+        <w:tc>
+          <w:tcPr>
+            <w:tcW w:type="dxa" w:w="1083"/>
+          </w:tcPr>
+          <w:p>
+            <w:pPr>
+              <w:bidi w:val="1"/>
+            </w:pPr>
+            <w:r>
+              <w:t>גלינה</w:t>
+            </w:r>
+          </w:p>
+        </w:tc>
+        <w:tc>
+          <w:tcPr>
+            <w:tcW w:type="dxa" w:w="1083"/>
+          </w:tcPr>
+          <w:p>
+            <w:pPr>
+              <w:bidi w:val="1"/>
+            </w:pPr>
+            <w:r>
+              <w:t>גלינה</w:t>
+            </w:r>
+          </w:p>
+        </w:tc>
+        <w:tc>
+          <w:tcPr>
+            <w:tcW w:type="dxa" w:w="1083"/>
+          </w:tcPr>
+          <w:p>
+            <w:pPr>
+              <w:bidi w:val="1"/>
+            </w:pPr>
+            <w:r>
+              <w:t>דר' קגנוביץ</w:t>
+            </w:r>
+          </w:p>
+        </w:tc>
+      </w:tr>
+      <w:tr>
+        <w:tc>
+          <w:tcPr>
+            <w:tcW w:type="dxa" w:w="1083"/>
+          </w:tcPr>
+          <w:p>
+            <w:pPr>
+              <w:bidi w:val="1"/>
+            </w:pPr>
+            <w:r>
+              <w:t>31/08/2026</w:t>
+            </w:r>
+          </w:p>
+        </w:tc>
+        <w:tc>
+          <w:tcPr>
+            <w:tcW w:type="dxa" w:w="1083"/>
+          </w:tcPr>
+          <w:p>
+            <w:pPr>
+              <w:bidi w:val="1"/>
+            </w:pPr>
+            <w:r>
+              <w:t>מפנה</w:t>
+            </w:r>
+          </w:p>
+        </w:tc>
+        <w:tc>
+          <w:tcPr>
+            <w:tcW w:type="dxa" w:w="1083"/>
+          </w:tcPr>
+          <w:p>
+            <w:pPr>
+              <w:bidi w:val="1"/>
+            </w:pPr>
+            <w:r>
+              <w:t>גורם</w:t>
+            </w:r>
+          </w:p>
+        </w:tc>
+        <w:tc>
+          <w:tcPr>
+            <w:tcW w:type="dxa" w:w="1083"/>
+          </w:tcPr>
+          <w:p>
+            <w:pPr>
+              <w:bidi w:val="1"/>
+            </w:pPr>
+            <w:r>
+              <w:t>מ.ר</w:t>
+            </w:r>
+          </w:p>
+        </w:tc>
+        <w:tc>
+          <w:tcPr>
+            <w:tcW w:type="dxa" w:w="1083"/>
+          </w:tcPr>
+          <w:p>
+            <w:pPr>
+              <w:bidi w:val="1"/>
+            </w:pPr>
+            <w:r>
+              <w:t>בריאות</w:t>
+            </w:r>
+          </w:p>
+        </w:tc>
+        <w:tc>
+          <w:tcPr>
+            <w:tcW w:type="dxa" w:w="1083"/>
+          </w:tcPr>
+          <w:p>
+            <w:pPr>
+              <w:bidi w:val="1"/>
+            </w:pPr>
+            <w:r>
+              <w:t>שירותי</w:t>
+            </w:r>
+          </w:p>
+        </w:tc>
+        <w:tc>
+          <w:tcPr>
+            <w:tcW w:type="dxa" w:w="1083"/>
+          </w:tcPr>
+          <w:p>
+            <w:pPr>
+              <w:bidi w:val="1"/>
+            </w:pPr>
+            <w:r>
+              <w:t>מכבי</w:t>
+            </w:r>
+          </w:p>
+        </w:tc>
+        <w:tc>
+          <w:tcPr>
+            <w:tcW w:type="dxa" w:w="1083"/>
+          </w:tcPr>
+          <w:p>
+            <w:pPr>
+              <w:bidi w:val="1"/>
+            </w:pPr>
+            <w:r>
+              <w:t>גלינה</w:t>
+            </w:r>
+          </w:p>
+        </w:tc>
+        <w:tc>
+          <w:tcPr>
+            <w:tcW w:type="dxa" w:w="1083"/>
+          </w:tcPr>
+          <w:p>
+            <w:pPr>
+              <w:bidi w:val="1"/>
+            </w:pPr>
+            <w:r>
+              <w:t>גלינה</w:t>
+            </w:r>
+          </w:p>
+        </w:tc>
+        <w:tc>
+          <w:tcPr>
+            <w:tcW w:type="dxa" w:w="1083"/>
+          </w:tcPr>
+          <w:p>
+            <w:pPr>
+              <w:bidi w:val="1"/>
+            </w:pPr>
+            <w:r>
+              <w:t>דר' קגנוביץ</w:t>
+            </w:r>
+          </w:p>
+        </w:tc>
+      </w:tr>
+      <w:tr>
+        <w:tc>
+          <w:tcPr>
+            <w:tcW w:type="dxa" w:w="1083"/>
+          </w:tcPr>
+          <w:p>
+            <w:pPr>
+              <w:bidi w:val="1"/>
+            </w:pPr>
+            <w:r>
+              <w:t>31/08/2026</w:t>
+            </w:r>
+          </w:p>
+        </w:tc>
+        <w:tc>
+          <w:tcPr>
+            <w:tcW w:type="dxa" w:w="1083"/>
+          </w:tcPr>
+          <w:p>
+            <w:pPr>
+              <w:bidi w:val="1"/>
+            </w:pPr>
+            <w:r>
+              <w:t>מפנה</w:t>
+            </w:r>
+          </w:p>
+        </w:tc>
+        <w:tc>
+          <w:tcPr>
+            <w:tcW w:type="dxa" w:w="1083"/>
+          </w:tcPr>
+          <w:p>
+            <w:pPr>
+              <w:bidi w:val="1"/>
+            </w:pPr>
+            <w:r>
+              <w:t>גורם</w:t>
+            </w:r>
+          </w:p>
+        </w:tc>
+        <w:tc>
+          <w:tcPr>
+            <w:tcW w:type="dxa" w:w="1083"/>
+          </w:tcPr>
+          <w:p>
+            <w:pPr>
+              <w:bidi w:val="1"/>
+            </w:pPr>
+            <w:r>
+              <w:t>מ.ר</w:t>
+            </w:r>
+          </w:p>
+        </w:tc>
+        <w:tc>
+          <w:tcPr>
+            <w:tcW w:type="dxa" w:w="1083"/>
+          </w:tcPr>
+          <w:p>
+            <w:pPr>
+              <w:bidi w:val="1"/>
+            </w:pPr>
+            <w:r>
+              <w:t>בריאות</w:t>
+            </w:r>
+          </w:p>
+        </w:tc>
+        <w:tc>
+          <w:tcPr>
+            <w:tcW w:type="dxa" w:w="1083"/>
+          </w:tcPr>
+          <w:p>
+            <w:pPr>
+              <w:bidi w:val="1"/>
+            </w:pPr>
+            <w:r>
+              <w:t>שירותי</w:t>
+            </w:r>
+          </w:p>
+        </w:tc>
+        <w:tc>
+          <w:tcPr>
+            <w:tcW w:type="dxa" w:w="1083"/>
+          </w:tcPr>
+          <w:p>
+            <w:pPr>
+              <w:bidi w:val="1"/>
+            </w:pPr>
+            <w:r>
+              <w:t>מכבי</w:t>
+            </w:r>
+          </w:p>
+        </w:tc>
+        <w:tc>
+          <w:tcPr>
+            <w:tcW w:type="dxa" w:w="1083"/>
+          </w:tcPr>
+          <w:p>
+            <w:pPr>
+              <w:bidi w:val="1"/>
+            </w:pPr>
+            <w:r>
+              <w:t>וכללית</w:t>
+            </w:r>
+          </w:p>
+        </w:tc>
+        <w:tc>
+          <w:tcPr>
+            <w:tcW w:type="dxa" w:w="1083"/>
+          </w:tcPr>
+          <w:p>
+            <w:pPr>
+              <w:bidi w:val="1"/>
+            </w:pPr>
+            <w:r>
+              <w:t>משפחה ,פנימית</w:t>
+            </w:r>
+          </w:p>
+        </w:tc>
+        <w:tc>
+          <w:tcPr>
+            <w:tcW w:type="dxa" w:w="1083"/>
+          </w:tcPr>
+          <w:p>
+            <w:pPr>
+              <w:bidi w:val="1"/>
+            </w:pPr>
+            <w:r>
+              <w:t>משפחה ,פנימית</w:t>
             </w:r>
           </w:p>
         </w:tc>
@@ -174,35 +438,49 @@
       <w:tblPr>
         <w:tblW w:type="auto" w:w="0"/>
         <w:tblLook w:firstColumn="1" w:firstRow="1" w:lastColumn="0" w:lastRow="0" w:noHBand="0" w:noVBand="1" w:val="04A0"/>
-        <w:tblBorders>
-          <w:top w:val="none" w:sz="0" w:space="0" w:color="auto"/>
-          <w:left w:val="none" w:sz="0" w:space="0" w:color="auto"/>
-          <w:bottom w:val="none" w:sz="0" w:space="0" w:color="auto"/>
-          <w:right w:val="none" w:sz="0" w:space="0" w:color="auto"/>
-          <w:insideH w:val="none" w:sz="0" w:space="0" w:color="auto"/>
-          <w:insideV w:val="none" w:sz="0" w:space="0" w:color="auto"/>
-        </w:tblBorders>
       </w:tblPr>
       <w:tblGrid>
-        <w:gridCol w:w="10466"/>
+        <w:gridCol w:w="3612"/>
+        <w:gridCol w:w="3612"/>
+        <w:gridCol w:w="3612"/>
       </w:tblGrid>
       <w:tr>
         <w:tc>
           <w:tcPr>
-            <w:tcW w:type="dxa" w:w="10466"/>
+            <w:tcW w:type="dxa" w:w="3612"/>
           </w:tcPr>
           <w:p>
             <w:pPr>
               <w:bidi w:val="1"/>
-              <w:jc w:val="left"/>
             </w:pPr>
             <w:r>
-              <w:rPr>
-                <w:rFonts w:ascii="Arial" w:hAnsi="Arial" w:cs="Arial"/>
-                <w:b w:val="0"/>
-                <w:sz w:val="19"/>
-              </w:rPr>
-              <w:t>טלפון: 08-9257689</w:t>
+              <w:t>08-9257689</w:t>
+            </w:r>
+          </w:p>
+        </w:tc>
+        <w:tc>
+          <w:tcPr>
+            <w:tcW w:type="dxa" w:w="3612"/>
+          </w:tcPr>
+          <w:p>
+            <w:pPr>
+              <w:bidi w:val="1"/>
+            </w:pPr>
+            <w:r>
+              <w:t>08-9257689</w:t>
+            </w:r>
+          </w:p>
+        </w:tc>
+        <w:tc>
+          <w:tcPr>
+            <w:tcW w:type="dxa" w:w="3612"/>
+          </w:tcPr>
+          <w:p>
+            <w:pPr>
+              <w:bidi w:val="1"/>
+            </w:pPr>
+            <w:r>
+              <w:t>טלפון:</w:t>
             </w:r>
           </w:p>
         </w:tc>
@@ -210,20 +488,40 @@
       <w:tr>
         <w:tc>
           <w:tcPr>
-            <w:tcW w:type="dxa" w:w="10466"/>
+            <w:tcW w:type="dxa" w:w="3612"/>
           </w:tcPr>
           <w:p>
             <w:pPr>
               <w:bidi w:val="1"/>
-              <w:jc w:val="left"/>
             </w:pPr>
             <w:r>
-              <w:rPr>
-                <w:rFonts w:ascii="Arial" w:hAnsi="Arial" w:cs="Arial"/>
-                <w:b w:val="0"/>
-                <w:sz w:val="19"/>
-              </w:rPr>
-              <w:t>פקס: 08-9257689</w:t>
+              <w:t>08-9257689</w:t>
+            </w:r>
+          </w:p>
+        </w:tc>
+        <w:tc>
+          <w:tcPr>
+            <w:tcW w:type="dxa" w:w="3612"/>
+          </w:tcPr>
+          <w:p>
+            <w:pPr>
+              <w:bidi w:val="1"/>
+            </w:pPr>
+            <w:r>
+              <w:t>08-9257689</w:t>
+            </w:r>
+          </w:p>
+        </w:tc>
+        <w:tc>
+          <w:tcPr>
+            <w:tcW w:type="dxa" w:w="3612"/>
+          </w:tcPr>
+          <w:p>
+            <w:pPr>
+              <w:bidi w:val="1"/>
+            </w:pPr>
+            <w:r>
+              <w:t>פקס:</w:t>
             </w:r>
           </w:p>
         </w:tc>
@@ -231,20 +529,40 @@
       <w:tr>
         <w:tc>
           <w:tcPr>
-            <w:tcW w:type="dxa" w:w="10466"/>
+            <w:tcW w:type="dxa" w:w="3612"/>
           </w:tcPr>
           <w:p>
             <w:pPr>
               <w:bidi w:val="1"/>
-              <w:jc w:val="left"/>
             </w:pPr>
             <w:r>
-              <w:rPr>
-                <w:rFonts w:ascii="Arial" w:hAnsi="Arial" w:cs="Arial"/>
-                <w:b w:val="0"/>
-                <w:sz w:val="19"/>
-              </w:rPr>
-              <w:t>כתובת: שטרן יאיר 14, רמלה</w:t>
+              <w:t xml:space="preserve"> ,רמלהיאיר14</w:t>
+            </w:r>
+          </w:p>
+        </w:tc>
+        <w:tc>
+          <w:tcPr>
+            <w:tcW w:type="dxa" w:w="3612"/>
+          </w:tcPr>
+          <w:p>
+            <w:pPr>
+              <w:bidi w:val="1"/>
+            </w:pPr>
+            <w:r>
+              <w:t>כתובת:שטרן</w:t>
+            </w:r>
+          </w:p>
+        </w:tc>
+        <w:tc>
+          <w:tcPr>
+            <w:tcW w:type="dxa" w:w="3612"/>
+          </w:tcPr>
+          <w:p>
+            <w:pPr>
+              <w:bidi w:val="1"/>
+            </w:pPr>
+            <w:r>
+              <w:t>כתובת:שטרן</w:t>
             </w:r>
           </w:p>
         </w:tc>
@@ -257,11 +575,6 @@
         <w:jc w:val="right"/>
       </w:pPr>
       <w:r>
-        <w:rPr>
-          <w:rFonts w:ascii="Arial" w:hAnsi="Arial" w:cs="Arial"/>
-          <w:b/>
-          <w:sz w:val="16"/>
-        </w:rPr>
         <w:t>פרטי הנבדק:</w:t>
       </w:r>
     </w:p>
@@ -269,54 +582,34 @@
       <w:tblPr>
         <w:tblW w:type="auto" w:w="0"/>
         <w:tblLook w:firstColumn="1" w:firstRow="1" w:lastColumn="0" w:lastRow="0" w:noHBand="0" w:noVBand="1" w:val="04A0"/>
-        <w:tblBorders>
-          <w:top w:val="none" w:sz="0" w:space="0" w:color="auto"/>
-          <w:left w:val="none" w:sz="0" w:space="0" w:color="auto"/>
-          <w:bottom w:val="none" w:sz="0" w:space="0" w:color="auto"/>
-          <w:right w:val="none" w:sz="0" w:space="0" w:color="auto"/>
-          <w:insideH w:val="none" w:sz="0" w:space="0" w:color="auto"/>
-          <w:insideV w:val="none" w:sz="0" w:space="0" w:color="auto"/>
-        </w:tblBorders>
       </w:tblPr>
       <w:tblGrid>
-        <w:gridCol w:w="5233"/>
-        <w:gridCol w:w="5233"/>
+        <w:gridCol w:w="5417"/>
+        <w:gridCol w:w="5417"/>
       </w:tblGrid>
       <w:tr>
         <w:tc>
           <w:tcPr>
-            <w:tcW w:type="dxa" w:w="5233"/>
+            <w:tcW w:type="dxa" w:w="5417"/>
           </w:tcPr>
           <w:p>
             <w:pPr>
               <w:bidi w:val="1"/>
-              <w:jc w:val="left"/>
             </w:pPr>
             <w:r>
-              <w:rPr>
-                <w:rFonts w:ascii="Arial" w:hAnsi="Arial" w:cs="Arial"/>
-                <w:b w:val="0"/>
-                <w:sz w:val="19"/>
-              </w:rPr>
               <w:t>שם פרטי: רון</w:t>
             </w:r>
           </w:p>
         </w:tc>
         <w:tc>
           <w:tcPr>
-            <w:tcW w:type="dxa" w:w="5233"/>
+            <w:tcW w:type="dxa" w:w="5417"/>
           </w:tcPr>
           <w:p>
             <w:pPr>
               <w:bidi w:val="1"/>
-              <w:jc w:val="right"/>
             </w:pPr>
             <w:r>
-              <w:rPr>
-                <w:rFonts w:ascii="Arial" w:hAnsi="Arial" w:cs="Arial"/>
-                <w:b w:val="0"/>
-                <w:sz w:val="19"/>
-              </w:rPr>
               <w:t>שם משפחה: גורפינקל</w:t>
             </w:r>
           </w:p>
@@ -325,38 +618,26 @@
       <w:tr>
         <w:tc>
           <w:tcPr>
-            <w:tcW w:type="dxa" w:w="5233"/>
+            <w:tcW w:type="dxa" w:w="5417"/>
           </w:tcPr>
           <w:p>
             <w:pPr>
               <w:bidi w:val="1"/>
-              <w:jc w:val="left"/>
             </w:pPr>
             <w:r>
-              <w:rPr>
-                <w:rFonts w:ascii="Arial" w:hAnsi="Arial" w:cs="Arial"/>
-                <w:b w:val="0"/>
-                <w:sz w:val="19"/>
-              </w:rPr>
               <w:t>0215359910</w:t>
             </w:r>
           </w:p>
         </w:tc>
         <w:tc>
           <w:tcPr>
-            <w:tcW w:type="dxa" w:w="5233"/>
+            <w:tcW w:type="dxa" w:w="5417"/>
           </w:tcPr>
           <w:p>
             <w:pPr>
               <w:bidi w:val="1"/>
-              <w:jc w:val="right"/>
             </w:pPr>
             <w:r>
-              <w:rPr>
-                <w:rFonts w:ascii="Arial" w:hAnsi="Arial" w:cs="Arial"/>
-                <w:b w:val="0"/>
-                <w:sz w:val="19"/>
-              </w:rPr>
               <w:t>ת.ז.: 215359910</w:t>
             </w:r>
           </w:p>
@@ -365,39 +646,27 @@
       <w:tr>
         <w:tc>
           <w:tcPr>
-            <w:tcW w:type="dxa" w:w="5233"/>
+            <w:tcW w:type="dxa" w:w="5417"/>
           </w:tcPr>
           <w:p>
             <w:pPr>
               <w:bidi w:val="1"/>
-              <w:jc w:val="left"/>
             </w:pPr>
             <w:r>
-              <w:rPr>
-                <w:rFonts w:ascii="Arial" w:hAnsi="Arial" w:cs="Arial"/>
-                <w:b w:val="0"/>
-                <w:sz w:val="19"/>
-              </w:rPr>
-              <w:t>טלפון: 08-9244787    טל. עבודה/נייד: 0522460193</w:t>
+              <w:t>טלפון: 08-9244787  טל. עבודה/נייד: 0522460193</w:t>
             </w:r>
           </w:p>
         </w:tc>
         <w:tc>
           <w:tcPr>
-            <w:tcW w:type="dxa" w:w="5233"/>
+            <w:tcW w:type="dxa" w:w="5417"/>
           </w:tcPr>
           <w:p>
             <w:pPr>
               <w:bidi w:val="1"/>
-              <w:jc w:val="right"/>
             </w:pPr>
             <w:r>
-              <w:rPr>
-                <w:rFonts w:ascii="Arial" w:hAnsi="Arial" w:cs="Arial"/>
-                <w:b w:val="0"/>
-                <w:sz w:val="19"/>
-              </w:rPr>
-              <w:t>ת.לידה: 30/05/2005    מין: ז</w:t>
+              <w:t>ת.לידה: 30/05/2005  מין: ז</w:t>
             </w:r>
           </w:p>
         </w:tc>
@@ -405,38 +674,26 @@
       <w:tr>
         <w:tc>
           <w:tcPr>
-            <w:tcW w:type="dxa" w:w="5233"/>
+            <w:tcW w:type="dxa" w:w="5417"/>
           </w:tcPr>
           <w:p>
             <w:pPr>
               <w:bidi w:val="1"/>
-              <w:jc w:val="left"/>
             </w:pPr>
             <w:r>
-              <w:rPr>
-                <w:rFonts w:ascii="Arial" w:hAnsi="Arial" w:cs="Arial"/>
-                <w:b w:val="0"/>
-                <w:sz w:val="19"/>
-              </w:rPr>
               <w:t>מיקוד 7228212</w:t>
             </w:r>
           </w:p>
         </w:tc>
         <w:tc>
           <w:tcPr>
-            <w:tcW w:type="dxa" w:w="5233"/>
+            <w:tcW w:type="dxa" w:w="5417"/>
           </w:tcPr>
           <w:p>
             <w:pPr>
               <w:bidi w:val="1"/>
-              <w:jc w:val="right"/>
             </w:pPr>
             <w:r>
-              <w:rPr>
-                <w:rFonts w:ascii="Arial" w:hAnsi="Arial" w:cs="Arial"/>
-                <w:b w:val="0"/>
-                <w:sz w:val="19"/>
-              </w:rPr>
               <w:t>כתובת: הרב אפריאט 6, רמלה</w:t>
             </w:r>
           </w:p>
@@ -444,105 +701,104 @@
       </w:tr>
     </w:tbl>
     <w:p/>
-    <w:p>
-      <w:pPr>
-        <w:bidi w:val="1"/>
-        <w:jc w:val="center"/>
-      </w:pPr>
-      <w:r>
-        <w:rPr>
-          <w:rFonts w:ascii="Arial" w:hAnsi="Arial" w:cs="Arial"/>
-          <w:b/>
-          <w:sz w:val="24"/>
-        </w:rPr>
-        <w:t>אישור מחלה</w:t>
-      </w:r>
-    </w:p>
-    <w:p/>
-    <w:p>
-      <w:pPr>
-        <w:jc w:val="left"/>
-      </w:pPr>
-      <w:r>
-        <w:rPr>
-          <w:rFonts w:ascii="Arial" w:hAnsi="Arial" w:cs="Arial"/>
-          <w:b w:val="0"/>
-          <w:sz w:val="16"/>
-        </w:rPr>
-        <w:t>ET4D-CV5-ZKC-6R82-449XH</w:t>
-      </w:r>
-    </w:p>
-    <w:p/>
-    <w:p>
-      <w:pPr>
-        <w:bidi w:val="1"/>
-        <w:jc w:val="right"/>
-      </w:pPr>
-      <w:r>
-        <w:rPr>
-          <w:rFonts w:ascii="Arial" w:hAnsi="Arial" w:cs="Arial"/>
-          <w:b w:val="0"/>
-          <w:sz w:val="19"/>
-        </w:rPr>
-        <w:t>הנני לאשר כי הנ"ל חלה/תה, האבחנה מפורטת ברשומה הרפואית.</w:t>
-      </w:r>
-    </w:p>
-    <w:p/>
-    <w:p>
-      <w:pPr>
-        <w:bidi w:val="1"/>
-        <w:jc w:val="right"/>
-      </w:pPr>
-      <w:r>
-        <w:rPr>
-          <w:rFonts w:ascii="Arial" w:hAnsi="Arial" w:cs="Arial"/>
-          <w:b w:val="0"/>
-          <w:sz w:val="19"/>
-        </w:rPr>
-        <w:t>אינו/ה מסוגל/ת לעבוד מיום: 24/08/2026 עד יום: 27/08/2026 סה"כ: 4 ימים.</w:t>
-      </w:r>
-    </w:p>
-    <w:p/>
-    <w:p/>
     <w:tbl>
       <w:tblPr>
         <w:tblW w:type="auto" w:w="0"/>
         <w:tblLook w:firstColumn="1" w:firstRow="1" w:lastColumn="0" w:lastRow="0" w:noHBand="0" w:noVBand="1" w:val="04A0"/>
-        <w:tblBorders>
-          <w:top w:val="none" w:sz="0" w:space="0" w:color="auto"/>
-          <w:left w:val="none" w:sz="0" w:space="0" w:color="auto"/>
-          <w:bottom w:val="none" w:sz="0" w:space="0" w:color="auto"/>
-          <w:right w:val="none" w:sz="0" w:space="0" w:color="auto"/>
-          <w:insideH w:val="none" w:sz="0" w:space="0" w:color="auto"/>
-          <w:insideV w:val="none" w:sz="0" w:space="0" w:color="auto"/>
-        </w:tblBorders>
       </w:tblPr>
       <w:tblGrid>
-        <w:gridCol w:w="5233"/>
-        <w:gridCol w:w="5233"/>
+        <w:gridCol w:w="5417"/>
+        <w:gridCol w:w="5417"/>
       </w:tblGrid>
       <w:tr>
         <w:tc>
           <w:tcPr>
-            <w:tcW w:type="dxa" w:w="5233"/>
-          </w:tcPr>
-          <w:p/>
-        </w:tc>
-        <w:tc>
-          <w:tcPr>
-            <w:tcW w:type="dxa" w:w="5233"/>
+            <w:tcW w:type="dxa" w:w="5417"/>
           </w:tcPr>
           <w:p>
             <w:pPr>
               <w:bidi w:val="1"/>
-              <w:jc w:val="right"/>
             </w:pPr>
             <w:r>
-              <w:rPr>
-                <w:rFonts w:ascii="Arial" w:hAnsi="Arial" w:cs="Arial"/>
-                <w:b w:val="0"/>
-                <w:sz w:val="19"/>
-              </w:rPr>
+              <w:t>מחלה</w:t>
+            </w:r>
+          </w:p>
+        </w:tc>
+        <w:tc>
+          <w:tcPr>
+            <w:tcW w:type="dxa" w:w="5417"/>
+          </w:tcPr>
+          <w:p>
+            <w:pPr>
+              <w:bidi w:val="1"/>
+            </w:pPr>
+            <w:r>
+              <w:t>אישור</w:t>
+            </w:r>
+          </w:p>
+        </w:tc>
+      </w:tr>
+    </w:tbl>
+    <w:tbl>
+      <w:tblPr>
+        <w:tblW w:type="auto" w:w="0"/>
+        <w:tblLook w:firstColumn="1" w:firstRow="1" w:lastColumn="0" w:lastRow="0" w:noHBand="0" w:noVBand="1" w:val="04A0"/>
+      </w:tblPr>
+      <w:tblGrid>
+        <w:gridCol w:w="2709"/>
+        <w:gridCol w:w="2709"/>
+        <w:gridCol w:w="2709"/>
+        <w:gridCol w:w="2709"/>
+      </w:tblGrid>
+      <w:tr>
+        <w:tc>
+          <w:tcPr>
+            <w:tcW w:type="dxa" w:w="2709"/>
+          </w:tcPr>
+          <w:p>
+            <w:pPr>
+              <w:bidi w:val="1"/>
+            </w:pPr>
+            <w:r>
+              <w:t>31/08/2026</w:t>
+            </w:r>
+          </w:p>
+        </w:tc>
+        <w:tc>
+          <w:tcPr>
+            <w:tcW w:type="dxa" w:w="2709"/>
+          </w:tcPr>
+          <w:p>
+            <w:pPr>
+              <w:bidi w:val="1"/>
+            </w:pPr>
+            <w:r>
+              <w:t>31/08/2026</w:t>
+            </w:r>
+          </w:p>
+        </w:tc>
+        <w:tc>
+          <w:tcPr>
+            <w:tcW w:type="dxa" w:w="2709"/>
+          </w:tcPr>
+          <w:p>
+            <w:pPr>
+              <w:bidi w:val="1"/>
+            </w:pPr>
+            <w:r>
+              <w:t>31/08/2026</w:t>
+            </w:r>
+          </w:p>
+        </w:tc>
+        <w:tc>
+          <w:tcPr>
+            <w:tcW w:type="dxa" w:w="2709"/>
+          </w:tcPr>
+          <w:p>
+            <w:pPr>
+              <w:bidi w:val="1"/>
+            </w:pPr>
+            <w:r>
               <w:t>31/08/2026</w:t>
             </w:r>
           </w:p>
@@ -551,34 +807,370 @@
       <w:tr>
         <w:tc>
           <w:tcPr>
-            <w:tcW w:type="dxa" w:w="5233"/>
+            <w:tcW w:type="dxa" w:w="2709"/>
           </w:tcPr>
           <w:p>
             <w:pPr>
               <w:bidi w:val="1"/>
-              <w:jc w:val="right"/>
             </w:pPr>
             <w:r>
-              <w:rPr>
-                <w:rFonts w:ascii="Arial" w:hAnsi="Arial" w:cs="Arial"/>
-                <w:b w:val="0"/>
-                <w:sz w:val="19"/>
-              </w:rPr>
-              <w:t>תאריך חתימה וחותמת הרופא</w:t>
+              <w:t>הרופא</w:t>
             </w:r>
           </w:p>
         </w:tc>
         <w:tc>
           <w:tcPr>
-            <w:tcW w:type="dxa" w:w="5233"/>
+            <w:tcW w:type="dxa" w:w="2709"/>
           </w:tcPr>
-          <w:p/>
+          <w:p>
+            <w:pPr>
+              <w:bidi w:val="1"/>
+            </w:pPr>
+            <w:r>
+              <w:t>וחותמת</w:t>
+            </w:r>
+          </w:p>
+        </w:tc>
+        <w:tc>
+          <w:tcPr>
+            <w:tcW w:type="dxa" w:w="2709"/>
+          </w:tcPr>
+          <w:p>
+            <w:pPr>
+              <w:bidi w:val="1"/>
+            </w:pPr>
+            <w:r>
+              <w:t>חתימה</w:t>
+            </w:r>
+          </w:p>
+        </w:tc>
+        <w:tc>
+          <w:tcPr>
+            <w:tcW w:type="dxa" w:w="2709"/>
+          </w:tcPr>
+          <w:p>
+            <w:pPr>
+              <w:bidi w:val="1"/>
+            </w:pPr>
+            <w:r>
+              <w:t>תאריך</w:t>
+            </w:r>
+          </w:p>
+        </w:tc>
+      </w:tr>
+    </w:tbl>
+    <w:tbl>
+      <w:tblPr>
+        <w:tblW w:type="auto" w:w="0"/>
+        <w:tblLook w:firstColumn="1" w:firstRow="1" w:lastColumn="0" w:lastRow="0" w:noHBand="0" w:noVBand="1" w:val="04A0"/>
+      </w:tblPr>
+      <w:tblGrid>
+        <w:gridCol w:w="985"/>
+        <w:gridCol w:w="985"/>
+        <w:gridCol w:w="985"/>
+        <w:gridCol w:w="985"/>
+        <w:gridCol w:w="985"/>
+        <w:gridCol w:w="985"/>
+        <w:gridCol w:w="985"/>
+        <w:gridCol w:w="985"/>
+        <w:gridCol w:w="985"/>
+        <w:gridCol w:w="985"/>
+        <w:gridCol w:w="985"/>
+      </w:tblGrid>
+      <w:tr>
+        <w:tc>
+          <w:tcPr>
+            <w:tcW w:type="dxa" w:w="985"/>
+          </w:tcPr>
+          <w:p>
+            <w:pPr>
+              <w:bidi w:val="1"/>
+            </w:pPr>
+            <w:r>
+              <w:t>4ימים.</w:t>
+            </w:r>
+          </w:p>
+        </w:tc>
+        <w:tc>
+          <w:tcPr>
+            <w:tcW w:type="dxa" w:w="985"/>
+          </w:tcPr>
+          <w:p>
+            <w:pPr>
+              <w:bidi w:val="1"/>
+            </w:pPr>
+            <w:r>
+              <w:t>הרפואית.</w:t>
+            </w:r>
+          </w:p>
+        </w:tc>
+        <w:tc>
+          <w:tcPr>
+            <w:tcW w:type="dxa" w:w="985"/>
+          </w:tcPr>
+          <w:p>
+            <w:pPr>
+              <w:bidi w:val="1"/>
+            </w:pPr>
+            <w:r>
+              <w:t>ברשומה</w:t>
+            </w:r>
+          </w:p>
+        </w:tc>
+        <w:tc>
+          <w:tcPr>
+            <w:tcW w:type="dxa" w:w="985"/>
+          </w:tcPr>
+          <w:p>
+            <w:pPr>
+              <w:bidi w:val="1"/>
+            </w:pPr>
+            <w:r>
+              <w:t>ברשומה</w:t>
+            </w:r>
+          </w:p>
+        </w:tc>
+        <w:tc>
+          <w:tcPr>
+            <w:tcW w:type="dxa" w:w="985"/>
+          </w:tcPr>
+          <w:p>
+            <w:pPr>
+              <w:bidi w:val="1"/>
+            </w:pPr>
+            <w:r>
+              <w:t>מפורטת</w:t>
+            </w:r>
+          </w:p>
+        </w:tc>
+        <w:tc>
+          <w:tcPr>
+            <w:tcW w:type="dxa" w:w="985"/>
+          </w:tcPr>
+          <w:p>
+            <w:pPr>
+              <w:bidi w:val="1"/>
+            </w:pPr>
+            <w:r>
+              <w:t>חלה/תה ,האבחנה</w:t>
+            </w:r>
+          </w:p>
+        </w:tc>
+        <w:tc>
+          <w:tcPr>
+            <w:tcW w:type="dxa" w:w="985"/>
+          </w:tcPr>
+          <w:p>
+            <w:pPr>
+              <w:bidi w:val="1"/>
+            </w:pPr>
+            <w:r>
+              <w:t>חלה/תה ,האבחנה</w:t>
+            </w:r>
+          </w:p>
+        </w:tc>
+        <w:tc>
+          <w:tcPr>
+            <w:tcW w:type="dxa" w:w="985"/>
+          </w:tcPr>
+          <w:p>
+            <w:pPr>
+              <w:bidi w:val="1"/>
+            </w:pPr>
+            <w:r>
+              <w:t>חלה/תה ,האבחנה</w:t>
+            </w:r>
+          </w:p>
+        </w:tc>
+        <w:tc>
+          <w:tcPr>
+            <w:tcW w:type="dxa" w:w="985"/>
+          </w:tcPr>
+          <w:p>
+            <w:pPr>
+              <w:bidi w:val="1"/>
+            </w:pPr>
+            <w:r>
+              <w:t>הנ"ל</w:t>
+            </w:r>
+          </w:p>
+        </w:tc>
+        <w:tc>
+          <w:tcPr>
+            <w:tcW w:type="dxa" w:w="985"/>
+          </w:tcPr>
+          <w:p>
+            <w:pPr>
+              <w:bidi w:val="1"/>
+            </w:pPr>
+            <w:r>
+              <w:t>כי רשאל</w:t>
+            </w:r>
+          </w:p>
+        </w:tc>
+        <w:tc>
+          <w:tcPr>
+            <w:tcW w:type="dxa" w:w="985"/>
+          </w:tcPr>
+          <w:p>
+            <w:pPr>
+              <w:bidi w:val="1"/>
+            </w:pPr>
+            <w:r>
+              <w:t>הנני</w:t>
+            </w:r>
+          </w:p>
+        </w:tc>
+      </w:tr>
+      <w:tr>
+        <w:tc>
+          <w:tcPr>
+            <w:tcW w:type="dxa" w:w="985"/>
+          </w:tcPr>
+          <w:p>
+            <w:pPr>
+              <w:bidi w:val="1"/>
+            </w:pPr>
+            <w:r>
+              <w:t>4ימים.</w:t>
+            </w:r>
+          </w:p>
+        </w:tc>
+        <w:tc>
+          <w:tcPr>
+            <w:tcW w:type="dxa" w:w="985"/>
+          </w:tcPr>
+          <w:p>
+            <w:pPr>
+              <w:bidi w:val="1"/>
+            </w:pPr>
+            <w:r>
+              <w:t>27/08/2026סה"כ:</w:t>
+            </w:r>
+          </w:p>
+        </w:tc>
+        <w:tc>
+          <w:tcPr>
+            <w:tcW w:type="dxa" w:w="985"/>
+          </w:tcPr>
+          <w:p>
+            <w:pPr>
+              <w:bidi w:val="1"/>
+            </w:pPr>
+            <w:r>
+              <w:t>יום:</w:t>
+            </w:r>
+          </w:p>
+        </w:tc>
+        <w:tc>
+          <w:tcPr>
+            <w:tcW w:type="dxa" w:w="985"/>
+          </w:tcPr>
+          <w:p>
+            <w:pPr>
+              <w:bidi w:val="1"/>
+            </w:pPr>
+            <w:r>
+              <w:t>24/08/2026עד</w:t>
+            </w:r>
+          </w:p>
+        </w:tc>
+        <w:tc>
+          <w:tcPr>
+            <w:tcW w:type="dxa" w:w="985"/>
+          </w:tcPr>
+          <w:p>
+            <w:pPr>
+              <w:bidi w:val="1"/>
+            </w:pPr>
+            <w:r>
+              <w:t>24/08/2026עד</w:t>
+            </w:r>
+          </w:p>
+        </w:tc>
+        <w:tc>
+          <w:tcPr>
+            <w:tcW w:type="dxa" w:w="985"/>
+          </w:tcPr>
+          <w:p>
+            <w:pPr>
+              <w:bidi w:val="1"/>
+            </w:pPr>
+            <w:r>
+              <w:t>24/08/2026עד</w:t>
+            </w:r>
+          </w:p>
+        </w:tc>
+        <w:tc>
+          <w:tcPr>
+            <w:tcW w:type="dxa" w:w="985"/>
+          </w:tcPr>
+          <w:p>
+            <w:pPr>
+              <w:bidi w:val="1"/>
+            </w:pPr>
+            <w:r>
+              <w:t>מיום:</w:t>
+            </w:r>
+          </w:p>
+        </w:tc>
+        <w:tc>
+          <w:tcPr>
+            <w:tcW w:type="dxa" w:w="985"/>
+          </w:tcPr>
+          <w:p>
+            <w:pPr>
+              <w:bidi w:val="1"/>
+            </w:pPr>
+            <w:r>
+              <w:t>לעבוד</w:t>
+            </w:r>
+          </w:p>
+        </w:tc>
+        <w:tc>
+          <w:tcPr>
+            <w:tcW w:type="dxa" w:w="985"/>
+          </w:tcPr>
+          <w:p>
+            <w:pPr>
+              <w:bidi w:val="1"/>
+            </w:pPr>
+            <w:r>
+              <w:t>לעבוד</w:t>
+            </w:r>
+          </w:p>
+        </w:tc>
+        <w:tc>
+          <w:tcPr>
+            <w:tcW w:type="dxa" w:w="985"/>
+          </w:tcPr>
+          <w:p>
+            <w:pPr>
+              <w:bidi w:val="1"/>
+            </w:pPr>
+            <w:r>
+              <w:t>מסוגל/ת</w:t>
+            </w:r>
+          </w:p>
+        </w:tc>
+        <w:tc>
+          <w:tcPr>
+            <w:tcW w:type="dxa" w:w="985"/>
+          </w:tcPr>
+          <w:p>
+            <w:pPr>
+              <w:bidi w:val="1"/>
+            </w:pPr>
+            <w:r>
+              <w:t>אינו/ה</w:t>
+            </w:r>
+          </w:p>
         </w:tc>
       </w:tr>
     </w:tbl>
     <w:sectPr>
-      <w:pgSz w:w="11906" w:h="16838"/>
-      <w:pgMar w:top="720" w:right="720" w:bottom="720" w:left="720" w:header="720" w:footer="720" w:gutter="0"/>
+      <w:pgSz w:w="11905" w:h="16838"/>
+      <w:pgMar w:top="188" w:right="662" w:bottom="1440" w:left="408" w:header="720" w:footer="720" w:gutter="0"/>
       <w:cols w:space="720"/>
       <w:docGrid w:linePitch="360"/>
     </w:sectPr>

</xml_diff>

<commit_message>
Fix DOCX: pdf2docx layout with repaired patient table, no images
Co-authored-by: Ron Gurfinkel <RonBabaj@users.noreply.github.com>
</commit_message>
<xml_diff>
--- a/exports/medical_certificate.docx
+++ b/exports/medical_certificate.docx
@@ -4,26 +4,19 @@
   <w:body>
     <w:p>
       <w:pPr>
-        <w:bidi w:val="1"/>
-        <w:jc w:val="left"/>
+        <w:autoSpaceDN w:val="0"/>
+        <w:autoSpaceDE w:val="0"/>
+        <w:widowControl/>
+        <w:spacing w:line="186" w:lineRule="exact" w:before="0" w:after="0"/>
+        <w:ind w:left="0" w:right="0"/>
       </w:pPr>
-      <w:r>
-        <w:t>024125</w:t>
-      </w:r>
-    </w:p>
-    <w:p>
-      <w:pPr>
-        <w:bidi w:val="1"/>
-        <w:jc w:val="left"/>
-      </w:pPr>
-      <w:r>
-        <w:t xml:space="preserve">ET4D-CV5-ZKC-6R82-449XH </w:t>
-      </w:r>
     </w:p>
     <w:tbl>
       <w:tblPr>
         <w:tblW w:type="auto" w:w="0"/>
+        <w:tblLayout w:type="fixed"/>
         <w:tblLook w:firstColumn="1" w:firstRow="1" w:lastColumn="0" w:lastRow="0" w:noHBand="0" w:noVBand="1" w:val="04A0"/>
+        <w:tblInd w:w="92.00000000000003" w:type="dxa"/>
       </w:tblPr>
       <w:tblGrid>
         <w:gridCol w:w="1083"/>
@@ -38,133 +31,1243 @@
         <w:gridCol w:w="1083"/>
       </w:tblGrid>
       <w:tr>
+        <w:trPr>
+          <w:trHeight w:hRule="exact" w:val="266"/>
+        </w:trPr>
         <w:tc>
           <w:tcPr>
-            <w:tcW w:type="dxa" w:w="1083"/>
+            <w:tcW w:type="dxa" w:w="920"/>
+            <w:vMerge w:val="restart"/>
+            <w:tcBorders/>
+            <w:tcMar>
+              <w:start w:w="0" w:type="dxa"/>
+              <w:end w:w="0" w:type="dxa"/>
+            </w:tcMar>
+            <w:tcMar>
+              <w:start w:w="0" w:type="dxa"/>
+              <w:end w:w="0" w:type="dxa"/>
+            </w:tcMar>
+            <w:tcMar>
+              <w:start w:w="0" w:type="dxa"/>
+              <w:end w:w="0" w:type="dxa"/>
+            </w:tcMar>
           </w:tcPr>
           <w:p>
             <w:pPr>
-              <w:bidi w:val="1"/>
+              <w:autoSpaceDN w:val="0"/>
+              <w:autoSpaceDE w:val="0"/>
+              <w:widowControl/>
+              <w:spacing w:line="194" w:lineRule="exact" w:before="0" w:after="0"/>
+              <w:ind w:left="106" w:right="0" w:firstLine="0"/>
+              <w:jc w:val="left"/>
             </w:pPr>
             <w:r>
+              <w:rPr>
+                <w:w w:val="97.5"/>
+                <w:rFonts w:ascii="Arial Narrow" w:hAnsi="Arial Narrow" w:eastAsia="Arial Narrow"/>
+                <w:b w:val="0"/>
+                <w:i w:val="0"/>
+                <w:color w:val="000000"/>
+                <w:sz w:val="20"/>
+              </w:rPr>
               <w:t>31/08/2026</w:t>
             </w:r>
           </w:p>
         </w:tc>
         <w:tc>
           <w:tcPr>
-            <w:tcW w:type="dxa" w:w="1083"/>
+            <w:tcW w:type="dxa" w:w="782"/>
+            <w:tcBorders>
+              <w:end w:sz="5.600000000000023" w:val="single" w:color="#000000"/>
+            </w:tcBorders>
+            <w:tcMar>
+              <w:start w:w="0" w:type="dxa"/>
+              <w:end w:w="0" w:type="dxa"/>
+            </w:tcMar>
           </w:tcPr>
           <w:p>
             <w:pPr>
-              <w:bidi w:val="1"/>
+              <w:autoSpaceDN w:val="0"/>
+              <w:autoSpaceDE w:val="0"/>
+              <w:widowControl/>
+              <w:spacing w:line="194" w:lineRule="exact" w:before="0" w:after="0"/>
+              <w:ind w:left="30" w:right="0" w:firstLine="0"/>
+              <w:jc w:val="left"/>
             </w:pPr>
             <w:r>
-              <w:t>תאריך:</w:t>
+              <w:rPr>
+                <w:w w:val="97.5"/>
+                <w:rFonts w:ascii="Arial" w:hAnsi="Arial" w:eastAsia="Arial"/>
+                <w:b/>
+                <w:i w:val="0"/>
+                <w:color w:val="00008B"/>
+                <w:sz w:val="20"/>
+              </w:rPr>
+              <w:t>תאריך</w:t>
+            </w:r>
+            <w:r>
+              <w:rPr>
+                <w:w w:val="97.5"/>
+                <w:rFonts w:ascii="Arial" w:hAnsi="Arial" w:eastAsia="Arial"/>
+                <w:b/>
+                <w:i w:val="0"/>
+                <w:color w:val="00008B"/>
+                <w:sz w:val="20"/>
+              </w:rPr>
+              <w:t>:</w:t>
+            </w:r>
+          </w:p>
+        </w:tc>
+        <w:tc>
+          <w:tcPr>
+            <w:tcW w:type="dxa" w:w="314"/>
+            <w:vMerge w:val="restart"/>
+            <w:tcBorders>
+              <w:start w:sz="5.600000000000023" w:val="single" w:color="#000000"/>
+              <w:end w:sz="6.399999999999977" w:val="single" w:color="#000000"/>
+            </w:tcBorders>
+            <w:tcMar>
+              <w:start w:w="0" w:type="dxa"/>
+              <w:end w:w="0" w:type="dxa"/>
+            </w:tcMar>
+            <w:tcMar>
+              <w:start w:w="0" w:type="dxa"/>
+              <w:end w:w="0" w:type="dxa"/>
+            </w:tcMar>
+            <w:tcMar>
+              <w:start w:w="0" w:type="dxa"/>
+              <w:end w:w="0" w:type="dxa"/>
+            </w:tcMar>
+          </w:tcPr>
+          <w:p>
+            <w:pPr>
+              <w:autoSpaceDN w:val="0"/>
+              <w:autoSpaceDE w:val="0"/>
+              <w:widowControl/>
+              <w:spacing w:line="166" w:lineRule="exact" w:before="360" w:after="0"/>
+              <w:ind w:left="0" w:right="0" w:firstLine="0"/>
+              <w:jc w:val="center"/>
+            </w:pPr>
+            <w:r>
+              <w:rPr>
+                <w:w w:val="103.125"/>
+                <w:rFonts w:ascii="Arial" w:hAnsi="Arial" w:eastAsia="Arial"/>
+                <w:b w:val="0"/>
+                <w:i w:val="0"/>
+                <w:color w:val="00008B"/>
+                <w:sz w:val="16"/>
+              </w:rPr>
+              <w:t>גורם</w:t>
+            </w:r>
+          </w:p>
+        </w:tc>
+        <w:tc>
+          <w:tcPr>
+            <w:tcW w:type="dxa" w:w="256"/>
+            <w:vMerge w:val="restart"/>
+            <w:tcBorders>
+              <w:start w:sz="6.399999999999977" w:val="single" w:color="#000000"/>
+              <w:end w:sz="5.600000000000136" w:val="single" w:color="#000000"/>
+            </w:tcBorders>
+            <w:tcMar>
+              <w:start w:w="0" w:type="dxa"/>
+              <w:end w:w="0" w:type="dxa"/>
+            </w:tcMar>
+            <w:tcMar>
+              <w:start w:w="0" w:type="dxa"/>
+              <w:end w:w="0" w:type="dxa"/>
+            </w:tcMar>
+            <w:tcMar>
+              <w:start w:w="0" w:type="dxa"/>
+              <w:end w:w="0" w:type="dxa"/>
+            </w:tcMar>
+          </w:tcPr>
+          <w:p>
+            <w:pPr>
+              <w:autoSpaceDN w:val="0"/>
+              <w:autoSpaceDE w:val="0"/>
+              <w:widowControl/>
+              <w:spacing w:line="166" w:lineRule="exact" w:before="360" w:after="0"/>
+              <w:ind w:left="0" w:right="0" w:firstLine="0"/>
+              <w:jc w:val="center"/>
+            </w:pPr>
+            <w:r>
+              <w:rPr>
+                <w:w w:val="103.125"/>
+                <w:rFonts w:ascii="Arial" w:hAnsi="Arial" w:eastAsia="Arial"/>
+                <w:b w:val="0"/>
+                <w:i w:val="0"/>
+                <w:color w:val="00008B"/>
+                <w:sz w:val="16"/>
+              </w:rPr>
+              <w:t>מ</w:t>
+            </w:r>
+            <w:r>
+              <w:rPr>
+                <w:w w:val="103.125"/>
+                <w:rFonts w:ascii="Arial Narrow" w:hAnsi="Arial Narrow" w:eastAsia="Arial Narrow"/>
+                <w:b w:val="0"/>
+                <w:i w:val="0"/>
+                <w:color w:val="00008B"/>
+                <w:sz w:val="16"/>
+              </w:rPr>
+              <w:t>.</w:t>
+            </w:r>
+            <w:r>
+              <w:rPr>
+                <w:w w:val="103.125"/>
+                <w:rFonts w:ascii="Arial" w:hAnsi="Arial" w:eastAsia="Arial"/>
+                <w:b w:val="0"/>
+                <w:i w:val="0"/>
+                <w:color w:val="00008B"/>
+                <w:sz w:val="16"/>
+              </w:rPr>
+              <w:t>ר</w:t>
+            </w:r>
+          </w:p>
+        </w:tc>
+        <w:tc>
+          <w:tcPr>
+            <w:tcW w:type="dxa" w:w="3128"/>
+            <w:vMerge w:val="restart"/>
+            <w:tcBorders>
+              <w:start w:sz="5.600000000000136" w:val="single" w:color="#000000"/>
+            </w:tcBorders>
+            <w:tcMar>
+              <w:start w:w="0" w:type="dxa"/>
+              <w:end w:w="0" w:type="dxa"/>
+            </w:tcMar>
+            <w:tcMar>
+              <w:start w:w="0" w:type="dxa"/>
+              <w:end w:w="0" w:type="dxa"/>
+            </w:tcMar>
+            <w:tcMar>
+              <w:start w:w="0" w:type="dxa"/>
+              <w:end w:w="0" w:type="dxa"/>
+            </w:tcMar>
+          </w:tcPr>
+          <w:p>
+            <w:pPr>
+              <w:autoSpaceDN w:val="0"/>
+              <w:autoSpaceDE w:val="0"/>
+              <w:widowControl/>
+              <w:spacing w:line="240" w:lineRule="exact" w:before="6" w:after="0"/>
+              <w:ind w:left="0" w:right="16" w:firstLine="0"/>
+              <w:jc w:val="right"/>
+            </w:pPr>
+            <w:r>
+              <w:rPr>
+                <w:rFonts w:ascii="Arial" w:hAnsi="Arial" w:eastAsia="Arial"/>
+                <w:b/>
+                <w:i w:val="0"/>
+                <w:color w:val="000000"/>
+                <w:sz w:val="24"/>
+              </w:rPr>
+              <w:t>בריאות</w:t>
+            </w:r>
+          </w:p>
+        </w:tc>
+        <w:tc>
+          <w:tcPr>
+            <w:tcW w:type="dxa" w:w="720"/>
+            <w:vMerge w:val="restart"/>
+            <w:tcBorders/>
+            <w:tcMar>
+              <w:start w:w="0" w:type="dxa"/>
+              <w:end w:w="0" w:type="dxa"/>
+            </w:tcMar>
+            <w:tcMar>
+              <w:start w:w="0" w:type="dxa"/>
+              <w:end w:w="0" w:type="dxa"/>
+            </w:tcMar>
+            <w:tcMar>
+              <w:start w:w="0" w:type="dxa"/>
+              <w:end w:w="0" w:type="dxa"/>
+            </w:tcMar>
+          </w:tcPr>
+          <w:p>
+            <w:pPr>
+              <w:autoSpaceDN w:val="0"/>
+              <w:autoSpaceDE w:val="0"/>
+              <w:widowControl/>
+              <w:spacing w:line="240" w:lineRule="exact" w:before="6" w:after="0"/>
+              <w:ind w:left="0" w:right="0" w:firstLine="0"/>
+              <w:jc w:val="center"/>
+            </w:pPr>
+            <w:r>
+              <w:rPr>
+                <w:rFonts w:ascii="Arial" w:hAnsi="Arial" w:eastAsia="Arial"/>
+                <w:b/>
+                <w:i w:val="0"/>
+                <w:color w:val="000000"/>
+                <w:sz w:val="24"/>
+              </w:rPr>
+              <w:t>שירותי</w:t>
+            </w:r>
+          </w:p>
+        </w:tc>
+        <w:tc>
+          <w:tcPr>
+            <w:tcW w:type="dxa" w:w="1660"/>
+            <w:vMerge w:val="restart"/>
+            <w:tcBorders/>
+            <w:tcMar>
+              <w:start w:w="0" w:type="dxa"/>
+              <w:end w:w="0" w:type="dxa"/>
+            </w:tcMar>
+            <w:tcMar>
+              <w:start w:w="0" w:type="dxa"/>
+              <w:end w:w="0" w:type="dxa"/>
+            </w:tcMar>
+            <w:tcMar>
+              <w:start w:w="0" w:type="dxa"/>
+              <w:end w:w="0" w:type="dxa"/>
+            </w:tcMar>
+          </w:tcPr>
+          <w:p>
+            <w:pPr>
+              <w:autoSpaceDN w:val="0"/>
+              <w:autoSpaceDE w:val="0"/>
+              <w:widowControl/>
+              <w:spacing w:line="240" w:lineRule="exact" w:before="6" w:after="0"/>
+              <w:ind w:left="28" w:right="0" w:firstLine="0"/>
+              <w:jc w:val="left"/>
+            </w:pPr>
+            <w:r>
+              <w:rPr>
+                <w:rFonts w:ascii="Arial" w:hAnsi="Arial" w:eastAsia="Arial"/>
+                <w:b/>
+                <w:i w:val="0"/>
+                <w:color w:val="000000"/>
+                <w:sz w:val="24"/>
+              </w:rPr>
+              <w:t>מכבי</w:t>
+            </w:r>
+          </w:p>
+        </w:tc>
+        <w:tc>
+          <w:tcPr>
+            <w:tcW w:type="dxa" w:w="1980"/>
+            <w:gridSpan w:val="2"/>
+            <w:vMerge w:val="restart"/>
+            <w:tcBorders/>
+            <w:tcMar>
+              <w:start w:w="0" w:type="dxa"/>
+              <w:end w:w="0" w:type="dxa"/>
+            </w:tcMar>
+            <w:tcMar>
+              <w:start w:w="0" w:type="dxa"/>
+              <w:end w:w="0" w:type="dxa"/>
+            </w:tcMar>
+            <w:tcMar>
+              <w:start w:w="0" w:type="dxa"/>
+              <w:end w:w="0" w:type="dxa"/>
+            </w:tcMar>
+            <w:tcMar>
+              <w:start w:w="0" w:type="dxa"/>
+              <w:end w:w="0" w:type="dxa"/>
+            </w:tcMar>
+          </w:tcPr>
+          <w:p>
+            <w:pPr>
+              <w:autoSpaceDN w:val="0"/>
+              <w:autoSpaceDE w:val="0"/>
+              <w:widowControl/>
+              <w:spacing w:line="194" w:lineRule="exact" w:before="366" w:after="0"/>
+              <w:ind w:left="0" w:right="32" w:firstLine="0"/>
+              <w:jc w:val="right"/>
+            </w:pPr>
+            <w:r>
+              <w:rPr>
+                <w:w w:val="97.5"/>
+                <w:rFonts w:ascii="Arial" w:hAnsi="Arial" w:eastAsia="Arial"/>
+                <w:b/>
+                <w:i w:val="0"/>
+                <w:color w:val="000000"/>
+                <w:sz w:val="20"/>
+              </w:rPr>
+              <w:t>גלינה</w:t>
+            </w:r>
+          </w:p>
+        </w:tc>
+        <w:tc>
+          <w:tcPr>
+            <w:tcW w:type="dxa" w:w="960"/>
+            <w:vMerge w:val="restart"/>
+            <w:tcBorders/>
+            <w:tcMar>
+              <w:start w:w="0" w:type="dxa"/>
+              <w:end w:w="0" w:type="dxa"/>
+            </w:tcMar>
+            <w:tcMar>
+              <w:start w:w="0" w:type="dxa"/>
+              <w:end w:w="0" w:type="dxa"/>
+            </w:tcMar>
+          </w:tcPr>
+          <w:p>
+            <w:pPr>
+              <w:autoSpaceDN w:val="0"/>
+              <w:autoSpaceDE w:val="0"/>
+              <w:widowControl/>
+              <w:spacing w:line="194" w:lineRule="exact" w:before="366" w:after="0"/>
+              <w:ind w:left="0" w:right="0" w:firstLine="0"/>
+              <w:jc w:val="center"/>
+            </w:pPr>
+            <w:r>
+              <w:rPr>
+                <w:w w:val="97.5"/>
+                <w:rFonts w:ascii="Arial" w:hAnsi="Arial" w:eastAsia="Arial"/>
+                <w:b/>
+                <w:i w:val="0"/>
+                <w:color w:val="000000"/>
+                <w:sz w:val="20"/>
+              </w:rPr>
+              <w:t>דר</w:t>
+            </w:r>
+            <w:r>
+              <w:rPr>
+                <w:w w:val="97.5"/>
+                <w:rFonts w:ascii="Arial" w:hAnsi="Arial" w:eastAsia="Arial"/>
+                <w:b/>
+                <w:i w:val="0"/>
+                <w:color w:val="000000"/>
+                <w:sz w:val="20"/>
+              </w:rPr>
+              <w:t xml:space="preserve">' </w:t>
+            </w:r>
+            <w:r>
+              <w:rPr>
+                <w:w w:val="97.5"/>
+                <w:rFonts w:ascii="Arial" w:hAnsi="Arial" w:eastAsia="Arial"/>
+                <w:b/>
+                <w:i w:val="0"/>
+                <w:color w:val="000000"/>
+                <w:sz w:val="20"/>
+              </w:rPr>
+              <w:t>קגנוביץ</w:t>
+            </w:r>
+          </w:p>
+        </w:tc>
+      </w:tr>
+      <w:tr>
+        <w:trPr>
+          <w:trHeight w:hRule="exact" w:val="340"/>
+        </w:trPr>
+        <w:tc>
+          <w:tcPr>
+            <w:tcW w:type="dxa" w:w="1083"/>
+            <w:vMerge/>
+            <w:tcBorders/>
+          </w:tcPr>
+          <w:p/>
+        </w:tc>
+        <w:tc>
+          <w:tcPr>
+            <w:tcW w:type="dxa" w:w="782"/>
+            <w:vMerge w:val="restart"/>
+            <w:tcBorders>
+              <w:end w:sz="5.600000000000023" w:val="single" w:color="#000000"/>
+            </w:tcBorders>
+            <w:tcMar>
+              <w:start w:w="0" w:type="dxa"/>
+              <w:end w:w="0" w:type="dxa"/>
+            </w:tcMar>
+            <w:tcMar>
+              <w:start w:w="0" w:type="dxa"/>
+              <w:end w:w="0" w:type="dxa"/>
+            </w:tcMar>
+          </w:tcPr>
+          <w:p>
+            <w:pPr>
+              <w:autoSpaceDN w:val="0"/>
+              <w:autoSpaceDE w:val="0"/>
+              <w:widowControl/>
+              <w:spacing w:line="166" w:lineRule="exact" w:before="94" w:after="0"/>
+              <w:ind w:left="0" w:right="0" w:firstLine="0"/>
+              <w:jc w:val="right"/>
+            </w:pPr>
+            <w:r>
+              <w:rPr>
+                <w:w w:val="103.125"/>
+                <w:rFonts w:ascii="Arial" w:hAnsi="Arial" w:eastAsia="Arial"/>
+                <w:b w:val="0"/>
+                <w:i w:val="0"/>
+                <w:color w:val="00008B"/>
+                <w:sz w:val="16"/>
+              </w:rPr>
+              <w:t>מפנה</w:t>
             </w:r>
           </w:p>
         </w:tc>
         <w:tc>
           <w:tcPr>
             <w:tcW w:type="dxa" w:w="1083"/>
+            <w:vMerge/>
+            <w:tcBorders>
+              <w:start w:sz="5.600000000000023" w:val="single" w:color="#000000"/>
+              <w:end w:sz="6.399999999999977" w:val="single" w:color="#000000"/>
+            </w:tcBorders>
+          </w:tcPr>
+          <w:p/>
+        </w:tc>
+        <w:tc>
+          <w:tcPr>
+            <w:tcW w:type="dxa" w:w="1083"/>
+            <w:vMerge/>
+            <w:tcBorders>
+              <w:start w:sz="6.399999999999977" w:val="single" w:color="#000000"/>
+              <w:end w:sz="5.600000000000136" w:val="single" w:color="#000000"/>
+            </w:tcBorders>
+          </w:tcPr>
+          <w:p/>
+        </w:tc>
+        <w:tc>
+          <w:tcPr>
+            <w:tcW w:type="dxa" w:w="1083"/>
+            <w:vMerge/>
+            <w:tcBorders>
+              <w:start w:sz="5.600000000000136" w:val="single" w:color="#000000"/>
+            </w:tcBorders>
+          </w:tcPr>
+          <w:p/>
+        </w:tc>
+        <w:tc>
+          <w:tcPr>
+            <w:tcW w:type="dxa" w:w="1083"/>
+            <w:vMerge/>
+            <w:tcBorders/>
+          </w:tcPr>
+          <w:p/>
+        </w:tc>
+        <w:tc>
+          <w:tcPr>
+            <w:tcW w:type="dxa" w:w="1083"/>
+            <w:vMerge/>
+            <w:tcBorders/>
+          </w:tcPr>
+          <w:p/>
+        </w:tc>
+        <w:tc>
+          <w:tcPr>
+            <w:tcW w:type="dxa" w:w="2166"/>
+            <w:gridSpan w:val="2"/>
+            <w:vMerge/>
+            <w:tcBorders/>
+          </w:tcPr>
+          <w:p/>
+        </w:tc>
+        <w:tc>
+          <w:tcPr>
+            <w:tcW w:type="dxa" w:w="1083"/>
+            <w:vMerge/>
+            <w:tcBorders/>
+          </w:tcPr>
+          <w:p/>
+        </w:tc>
+      </w:tr>
+      <w:tr>
+        <w:trPr>
+          <w:trHeight w:hRule="exact" w:val="496"/>
+        </w:trPr>
+        <w:tc>
+          <w:tcPr>
+            <w:tcW w:type="dxa" w:w="1083"/>
+            <w:vMerge/>
+            <w:tcBorders/>
+          </w:tcPr>
+          <w:p/>
+        </w:tc>
+        <w:tc>
+          <w:tcPr>
+            <w:tcW w:type="dxa" w:w="1083"/>
+            <w:vMerge/>
+            <w:tcBorders>
+              <w:end w:sz="5.600000000000023" w:val="single" w:color="#000000"/>
+            </w:tcBorders>
+          </w:tcPr>
+          <w:p/>
+        </w:tc>
+        <w:tc>
+          <w:tcPr>
+            <w:tcW w:type="dxa" w:w="1083"/>
+            <w:vMerge/>
+            <w:tcBorders>
+              <w:start w:sz="5.600000000000023" w:val="single" w:color="#000000"/>
+              <w:end w:sz="6.399999999999977" w:val="single" w:color="#000000"/>
+            </w:tcBorders>
+          </w:tcPr>
+          <w:p/>
+        </w:tc>
+        <w:tc>
+          <w:tcPr>
+            <w:tcW w:type="dxa" w:w="1083"/>
+            <w:vMerge/>
+            <w:tcBorders>
+              <w:start w:sz="6.399999999999977" w:val="single" w:color="#000000"/>
+              <w:end w:sz="5.600000000000136" w:val="single" w:color="#000000"/>
+            </w:tcBorders>
+          </w:tcPr>
+          <w:p/>
+        </w:tc>
+        <w:tc>
+          <w:tcPr>
+            <w:tcW w:type="dxa" w:w="1083"/>
+            <w:vMerge/>
+            <w:tcBorders>
+              <w:start w:sz="5.600000000000136" w:val="single" w:color="#000000"/>
+            </w:tcBorders>
+          </w:tcPr>
+          <w:p/>
+        </w:tc>
+        <w:tc>
+          <w:tcPr>
+            <w:tcW w:type="dxa" w:w="1083"/>
+            <w:vMerge/>
+            <w:tcBorders/>
+          </w:tcPr>
+          <w:p/>
+        </w:tc>
+        <w:tc>
+          <w:tcPr>
+            <w:tcW w:type="dxa" w:w="1083"/>
+            <w:vMerge/>
+            <w:tcBorders/>
+          </w:tcPr>
+          <w:p/>
+        </w:tc>
+        <w:tc>
+          <w:tcPr>
+            <w:tcW w:type="dxa" w:w="1700"/>
+            <w:tcBorders/>
+            <w:tcMar>
+              <w:start w:w="0" w:type="dxa"/>
+              <w:end w:w="0" w:type="dxa"/>
+            </w:tcMar>
           </w:tcPr>
           <w:p>
             <w:pPr>
-              <w:bidi w:val="1"/>
+              <w:autoSpaceDN w:val="0"/>
+              <w:autoSpaceDE w:val="0"/>
+              <w:widowControl/>
+              <w:spacing w:line="196" w:lineRule="exact" w:before="82" w:after="0"/>
+              <w:ind w:left="0" w:right="20" w:firstLine="0"/>
+              <w:jc w:val="right"/>
             </w:pPr>
             <w:r>
-              <w:t>גורם</w:t>
+              <w:rPr>
+                <w:w w:val="97.5"/>
+                <w:rFonts w:ascii="Arial" w:hAnsi="Arial" w:eastAsia="Arial"/>
+                <w:b w:val="0"/>
+                <w:i w:val="0"/>
+                <w:color w:val="000000"/>
+                <w:sz w:val="20"/>
+              </w:rPr>
+              <w:t>וכללית</w:t>
             </w:r>
           </w:p>
         </w:tc>
         <w:tc>
           <w:tcPr>
-            <w:tcW w:type="dxa" w:w="1083"/>
+            <w:tcW w:type="dxa" w:w="1240"/>
+            <w:gridSpan w:val="2"/>
+            <w:tcBorders/>
+            <w:tcMar>
+              <w:start w:w="0" w:type="dxa"/>
+              <w:end w:w="0" w:type="dxa"/>
+            </w:tcMar>
+            <w:tcMar>
+              <w:start w:w="0" w:type="dxa"/>
+              <w:end w:w="0" w:type="dxa"/>
+            </w:tcMar>
           </w:tcPr>
           <w:p>
             <w:pPr>
-              <w:bidi w:val="1"/>
+              <w:autoSpaceDN w:val="0"/>
+              <w:autoSpaceDE w:val="0"/>
+              <w:widowControl/>
+              <w:spacing w:line="196" w:lineRule="exact" w:before="82" w:after="0"/>
+              <w:ind w:left="0" w:right="0" w:firstLine="0"/>
+              <w:jc w:val="center"/>
             </w:pPr>
             <w:r>
-              <w:t>מ.ר</w:t>
+              <w:rPr>
+                <w:w w:val="97.5"/>
+                <w:rFonts w:ascii="Arial" w:hAnsi="Arial" w:eastAsia="Arial"/>
+                <w:b w:val="0"/>
+                <w:i w:val="0"/>
+                <w:color w:val="000000"/>
+                <w:sz w:val="20"/>
+              </w:rPr>
+              <w:t>משפחה</w:t>
+            </w:r>
+            <w:r>
+              <w:rPr>
+                <w:w w:val="97.5"/>
+                <w:rFonts w:ascii="Arial Narrow" w:hAnsi="Arial Narrow" w:eastAsia="Arial Narrow"/>
+                <w:b w:val="0"/>
+                <w:i w:val="0"/>
+                <w:color w:val="000000"/>
+                <w:sz w:val="20"/>
+              </w:rPr>
+              <w:t xml:space="preserve"> ,</w:t>
+            </w:r>
+            <w:r>
+              <w:rPr>
+                <w:w w:val="97.5"/>
+                <w:rFonts w:ascii="Arial" w:hAnsi="Arial" w:eastAsia="Arial"/>
+                <w:b w:val="0"/>
+                <w:i w:val="0"/>
+                <w:color w:val="000000"/>
+                <w:sz w:val="20"/>
+              </w:rPr>
+              <w:t>פנימית</w:t>
+            </w:r>
+          </w:p>
+        </w:tc>
+      </w:tr>
+    </w:tbl>
+    <w:p>
+      <w:pPr>
+        <w:autoSpaceDN w:val="0"/>
+        <w:autoSpaceDE w:val="0"/>
+        <w:widowControl/>
+        <w:spacing w:line="224" w:lineRule="exact" w:before="32" w:after="52"/>
+        <w:ind w:left="1852" w:right="0" w:firstLine="0"/>
+        <w:jc w:val="left"/>
+      </w:pPr>
+      <w:r>
+        <w:rPr>
+          <w:w w:val="102.27272727272727"/>
+          <w:rFonts w:ascii="Arial Narrow" w:hAnsi="Arial Narrow" w:eastAsia="Arial Narrow"/>
+          <w:b w:val="0"/>
+          <w:i w:val="0"/>
+          <w:color w:val="000000"/>
+          <w:sz w:val="22"/>
+        </w:rPr>
+        <w:t>024125</w:t>
+      </w:r>
+    </w:p>
+    <w:tbl>
+      <w:tblPr>
+        <w:tblW w:type="auto" w:w="0"/>
+        <w:tblLayout w:type="fixed"/>
+        <w:tblLook w:firstColumn="1" w:firstRow="1" w:lastColumn="0" w:lastRow="0" w:noHBand="0" w:noVBand="1" w:val="04A0"/>
+        <w:tblInd w:w="2092.0" w:type="dxa"/>
+      </w:tblPr>
+      <w:tblGrid>
+        <w:gridCol w:w="3612"/>
+        <w:gridCol w:w="3612"/>
+        <w:gridCol w:w="3612"/>
+      </w:tblGrid>
+      <w:tr>
+        <w:trPr>
+          <w:trHeight w:hRule="exact" w:val="316"/>
+        </w:trPr>
+        <w:tc>
+          <w:tcPr>
+            <w:tcW w:type="dxa" w:w="3700"/>
+            <w:gridSpan w:val="2"/>
+            <w:tcBorders/>
+            <w:tcMar>
+              <w:start w:w="0" w:type="dxa"/>
+              <w:end w:w="0" w:type="dxa"/>
+            </w:tcMar>
+            <w:tcMar>
+              <w:start w:w="0" w:type="dxa"/>
+              <w:end w:w="0" w:type="dxa"/>
+            </w:tcMar>
+          </w:tcPr>
+          <w:p>
+            <w:pPr>
+              <w:autoSpaceDN w:val="0"/>
+              <w:autoSpaceDE w:val="0"/>
+              <w:widowControl/>
+              <w:spacing w:line="194" w:lineRule="exact" w:before="50" w:after="0"/>
+              <w:ind w:left="0" w:right="114" w:firstLine="0"/>
+              <w:jc w:val="right"/>
+            </w:pPr>
+            <w:r>
+              <w:rPr>
+                <w:w w:val="97.5"/>
+                <w:rFonts w:ascii="Arial Narrow" w:hAnsi="Arial Narrow" w:eastAsia="Arial Narrow"/>
+                <w:b w:val="0"/>
+                <w:i w:val="0"/>
+                <w:color w:val="000000"/>
+                <w:sz w:val="20"/>
+              </w:rPr>
+              <w:t>08-9257689</w:t>
             </w:r>
           </w:p>
         </w:tc>
         <w:tc>
           <w:tcPr>
-            <w:tcW w:type="dxa" w:w="1083"/>
+            <w:tcW w:type="dxa" w:w="2840"/>
+            <w:tcBorders/>
+            <w:tcMar>
+              <w:start w:w="0" w:type="dxa"/>
+              <w:end w:w="0" w:type="dxa"/>
+            </w:tcMar>
           </w:tcPr>
           <w:p>
             <w:pPr>
-              <w:bidi w:val="1"/>
+              <w:autoSpaceDN w:val="0"/>
+              <w:autoSpaceDE w:val="0"/>
+              <w:widowControl/>
+              <w:spacing w:line="194" w:lineRule="exact" w:before="50" w:after="0"/>
+              <w:ind w:left="142" w:right="0" w:firstLine="0"/>
+              <w:jc w:val="left"/>
             </w:pPr>
             <w:r>
-              <w:t>בריאות</w:t>
+              <w:rPr>
+                <w:w w:val="97.5"/>
+                <w:rFonts w:ascii="Arial" w:hAnsi="Arial" w:eastAsia="Arial"/>
+                <w:b/>
+                <w:i w:val="0"/>
+                <w:color w:val="00008B"/>
+                <w:sz w:val="20"/>
+              </w:rPr>
+              <w:t>טלפון</w:t>
+            </w:r>
+            <w:r>
+              <w:rPr>
+                <w:w w:val="97.5"/>
+                <w:rFonts w:ascii="Arial" w:hAnsi="Arial" w:eastAsia="Arial"/>
+                <w:b/>
+                <w:i w:val="0"/>
+                <w:color w:val="00008B"/>
+                <w:sz w:val="20"/>
+              </w:rPr>
+              <w:t>:</w:t>
+            </w:r>
+          </w:p>
+        </w:tc>
+      </w:tr>
+      <w:tr>
+        <w:trPr>
+          <w:trHeight w:hRule="exact" w:val="340"/>
+        </w:trPr>
+        <w:tc>
+          <w:tcPr>
+            <w:tcW w:type="dxa" w:w="3700"/>
+            <w:gridSpan w:val="2"/>
+            <w:tcBorders/>
+            <w:tcMar>
+              <w:start w:w="0" w:type="dxa"/>
+              <w:end w:w="0" w:type="dxa"/>
+            </w:tcMar>
+            <w:tcMar>
+              <w:start w:w="0" w:type="dxa"/>
+              <w:end w:w="0" w:type="dxa"/>
+            </w:tcMar>
+          </w:tcPr>
+          <w:p>
+            <w:pPr>
+              <w:autoSpaceDN w:val="0"/>
+              <w:autoSpaceDE w:val="0"/>
+              <w:widowControl/>
+              <w:spacing w:line="194" w:lineRule="exact" w:before="92" w:after="0"/>
+              <w:ind w:left="0" w:right="114" w:firstLine="0"/>
+              <w:jc w:val="right"/>
+            </w:pPr>
+            <w:r>
+              <w:rPr>
+                <w:w w:val="97.5"/>
+                <w:rFonts w:ascii="Arial Narrow" w:hAnsi="Arial Narrow" w:eastAsia="Arial Narrow"/>
+                <w:b w:val="0"/>
+                <w:i w:val="0"/>
+                <w:color w:val="000000"/>
+                <w:sz w:val="20"/>
+              </w:rPr>
+              <w:t>08-9257689</w:t>
             </w:r>
           </w:p>
         </w:tc>
         <w:tc>
           <w:tcPr>
-            <w:tcW w:type="dxa" w:w="1083"/>
+            <w:tcW w:type="dxa" w:w="2840"/>
+            <w:tcBorders/>
+            <w:tcMar>
+              <w:start w:w="0" w:type="dxa"/>
+              <w:end w:w="0" w:type="dxa"/>
+            </w:tcMar>
           </w:tcPr>
           <w:p>
             <w:pPr>
-              <w:bidi w:val="1"/>
+              <w:autoSpaceDN w:val="0"/>
+              <w:autoSpaceDE w:val="0"/>
+              <w:widowControl/>
+              <w:spacing w:line="194" w:lineRule="exact" w:before="92" w:after="0"/>
+              <w:ind w:left="236" w:right="0" w:firstLine="0"/>
+              <w:jc w:val="left"/>
             </w:pPr>
             <w:r>
-              <w:t>שירותי</w:t>
+              <w:rPr>
+                <w:w w:val="97.5"/>
+                <w:rFonts w:ascii="Arial" w:hAnsi="Arial" w:eastAsia="Arial"/>
+                <w:b/>
+                <w:i w:val="0"/>
+                <w:color w:val="00008B"/>
+                <w:sz w:val="20"/>
+              </w:rPr>
+              <w:t>פקס</w:t>
+            </w:r>
+            <w:r>
+              <w:rPr>
+                <w:w w:val="97.5"/>
+                <w:rFonts w:ascii="Arial" w:hAnsi="Arial" w:eastAsia="Arial"/>
+                <w:b/>
+                <w:i w:val="0"/>
+                <w:color w:val="00008B"/>
+                <w:sz w:val="20"/>
+              </w:rPr>
+              <w:t>:</w:t>
+            </w:r>
+          </w:p>
+        </w:tc>
+      </w:tr>
+      <w:tr>
+        <w:trPr>
+          <w:trHeight w:hRule="exact" w:val="320"/>
+        </w:trPr>
+        <w:tc>
+          <w:tcPr>
+            <w:tcW w:type="dxa" w:w="3160"/>
+            <w:tcBorders/>
+            <w:tcMar>
+              <w:start w:w="0" w:type="dxa"/>
+              <w:end w:w="0" w:type="dxa"/>
+            </w:tcMar>
+          </w:tcPr>
+          <w:p>
+            <w:pPr>
+              <w:autoSpaceDN w:val="0"/>
+              <w:autoSpaceDE w:val="0"/>
+              <w:widowControl/>
+              <w:spacing w:line="194" w:lineRule="exact" w:before="66" w:after="0"/>
+              <w:ind w:left="0" w:right="16" w:firstLine="0"/>
+              <w:jc w:val="right"/>
+            </w:pPr>
+            <w:r>
+              <w:rPr>
+                <w:w w:val="97.5"/>
+                <w:rFonts w:ascii="Arial Narrow" w:hAnsi="Arial Narrow" w:eastAsia="Arial Narrow"/>
+                <w:b w:val="0"/>
+                <w:i w:val="0"/>
+                <w:color w:val="000000"/>
+                <w:sz w:val="20"/>
+              </w:rPr>
+              <w:t xml:space="preserve"> ,</w:t>
+            </w:r>
+            <w:r>
+              <w:rPr>
+                <w:w w:val="97.5"/>
+                <w:rFonts w:ascii="Arial" w:hAnsi="Arial" w:eastAsia="Arial"/>
+                <w:b w:val="0"/>
+                <w:i w:val="0"/>
+                <w:color w:val="000000"/>
+                <w:sz w:val="20"/>
+              </w:rPr>
+              <w:t>רמלה</w:t>
+            </w:r>
+            <w:r>
+              <w:rPr>
+                <w:w w:val="97.5"/>
+                <w:rFonts w:ascii="Arial" w:hAnsi="Arial" w:eastAsia="Arial"/>
+                <w:b w:val="0"/>
+                <w:i w:val="0"/>
+                <w:color w:val="000000"/>
+                <w:sz w:val="20"/>
+              </w:rPr>
+              <w:t>יאיר</w:t>
+            </w:r>
+            <w:r>
+              <w:rPr>
+                <w:w w:val="97.5"/>
+                <w:rFonts w:ascii="Arial Narrow" w:hAnsi="Arial Narrow" w:eastAsia="Arial Narrow"/>
+                <w:b w:val="0"/>
+                <w:i w:val="0"/>
+                <w:color w:val="000000"/>
+                <w:sz w:val="20"/>
+              </w:rPr>
+              <w:t>14</w:t>
             </w:r>
           </w:p>
         </w:tc>
         <w:tc>
           <w:tcPr>
-            <w:tcW w:type="dxa" w:w="1083"/>
+            <w:tcW w:type="dxa" w:w="3380"/>
+            <w:gridSpan w:val="2"/>
+            <w:tcBorders/>
+            <w:tcMar>
+              <w:start w:w="0" w:type="dxa"/>
+              <w:end w:w="0" w:type="dxa"/>
+            </w:tcMar>
+            <w:tcMar>
+              <w:start w:w="0" w:type="dxa"/>
+              <w:end w:w="0" w:type="dxa"/>
+            </w:tcMar>
           </w:tcPr>
           <w:p>
             <w:pPr>
+              <w:autoSpaceDN w:val="0"/>
+              <w:autoSpaceDE w:val="0"/>
+              <w:widowControl/>
+              <w:spacing w:line="194" w:lineRule="exact" w:before="66" w:after="0"/>
+              <w:ind w:left="28" w:right="0" w:firstLine="0"/>
+              <w:jc w:val="left"/>
+            </w:pPr>
+            <w:r>
+              <w:rPr>
+                <w:w w:val="97.5"/>
+                <w:rFonts w:ascii="Arial" w:hAnsi="Arial" w:eastAsia="Arial"/>
+                <w:b/>
+                <w:i w:val="0"/>
+                <w:color w:val="00008B"/>
+                <w:sz w:val="20"/>
+              </w:rPr>
+              <w:t>כתובת</w:t>
+            </w:r>
+            <w:r>
+              <w:rPr>
+                <w:w w:val="97.5"/>
+                <w:rFonts w:ascii="Arial" w:hAnsi="Arial" w:eastAsia="Arial"/>
+                <w:b/>
+                <w:i w:val="0"/>
+                <w:color w:val="00008B"/>
+                <w:sz w:val="20"/>
+              </w:rPr>
+              <w:t>:</w:t>
+            </w:r>
+            <w:r>
+              <w:rPr>
+                <w:w w:val="97.5"/>
+                <w:rFonts w:ascii="Arial" w:hAnsi="Arial" w:eastAsia="Arial"/>
+                <w:b w:val="0"/>
+                <w:i w:val="0"/>
+                <w:color w:val="000000"/>
+                <w:sz w:val="20"/>
+              </w:rPr>
+              <w:t>שטרן</w:t>
+            </w:r>
+          </w:p>
+        </w:tc>
+      </w:tr>
+    </w:tbl>
+    <w:p>
+      <w:pPr>
+        <w:autoSpaceDN w:val="0"/>
+        <w:autoSpaceDE w:val="0"/>
+        <w:widowControl/>
+        <w:spacing w:line="40" w:lineRule="exact" w:before="0" w:after="0"/>
+        <w:ind w:left="0" w:right="0"/>
+      </w:pPr>
+    </w:p>
+    <w:tbl>
+      <w:tblGrid>
+        <w:gridCol w:w="1083"/>
+        <w:gridCol w:w="1083"/>
+        <w:gridCol w:w="1083"/>
+        <w:gridCol w:w="1083"/>
+        <w:gridCol w:w="1083"/>
+        <w:gridCol w:w="1083"/>
+        <w:gridCol w:w="1083"/>
+        <w:gridCol w:w="1083"/>
+        <w:gridCol w:w="1083"/>
+        <w:gridCol w:w="1083"/>
+      </w:tblGrid>
+      <w:tblPr>
+        <w:tblW w:type="auto" w:w="0"/>
+        <w:tblLook w:firstColumn="1" w:firstRow="1" w:lastColumn="0" w:lastRow="0" w:noHBand="0" w:noVBand="1" w:val="04A0"/>
+      </w:tblPr>
+      <w:tr>
+        <w:tc>
+          <w:tcPr>
+            <w:tcW w:type="dxa" w:w="864"/>
+          </w:tcPr>
+          <w:p>
+            <w:pPr>
+              <w:jc w:val="left"/>
               <w:bidi w:val="1"/>
             </w:pPr>
             <w:r>
-              <w:t>מכבי</w:t>
+              <w:rPr>
+                <w:rFonts w:ascii="Arial Narrow" w:hAnsi="Arial Narrow"/>
+                <w:b w:val="0"/>
+                <w:i w:val="0"/>
+                <w:sz w:val="20"/>
+              </w:rPr>
             </w:r>
           </w:p>
         </w:tc>
         <w:tc>
           <w:tcPr>
-            <w:tcW w:type="dxa" w:w="1083"/>
+            <w:tcW w:type="dxa" w:w="864"/>
           </w:tcPr>
           <w:p>
             <w:pPr>
+              <w:jc w:val="left"/>
               <w:bidi w:val="1"/>
             </w:pPr>
             <w:r>
-              <w:t>גלינה</w:t>
+              <w:rPr>
+                <w:rFonts w:ascii="Arial" w:hAnsi="Arial"/>
+                <w:b/>
+                <w:i w:val="0"/>
+                <w:sz w:val="20"/>
+              </w:rPr>
             </w:r>
           </w:p>
         </w:tc>
         <w:tc>
           <w:tcPr>
-            <w:tcW w:type="dxa" w:w="1083"/>
+            <w:tcW w:type="dxa" w:w="864"/>
           </w:tcPr>
           <w:p>
             <w:pPr>
+              <w:jc w:val="center"/>
               <w:bidi w:val="1"/>
             </w:pPr>
             <w:r>
-              <w:t>גלינה</w:t>
+              <w:rPr>
+                <w:rFonts w:ascii="Arial" w:hAnsi="Arial"/>
+                <w:b w:val="0"/>
+                <w:i w:val="0"/>
+                <w:sz w:val="16"/>
+              </w:rPr>
             </w:r>
           </w:p>
         </w:tc>
         <w:tc>
           <w:tcPr>
-            <w:tcW w:type="dxa" w:w="1083"/>
+            <w:tcW w:type="dxa" w:w="864"/>
           </w:tcPr>
           <w:p>
             <w:pPr>
+              <w:jc w:val="center"/>
               <w:bidi w:val="1"/>
             </w:pPr>
             <w:r>
-              <w:t>דר' קגנוביץ</w:t>
+              <w:rPr>
+                <w:rFonts w:ascii="Arial" w:hAnsi="Arial"/>
+                <w:b w:val="0"/>
+                <w:i w:val="0"/>
+                <w:sz w:val="16"/>
+              </w:rPr>
+            </w:r>
+          </w:p>
+        </w:tc>
+        <w:tc>
+          <w:tcPr>
+            <w:tcW w:type="dxa" w:w="864"/>
+          </w:tcPr>
+          <w:p>
+            <w:pPr>
+              <w:jc w:val="right"/>
+              <w:bidi w:val="1"/>
+            </w:pPr>
+            <w:r>
+              <w:rPr>
+                <w:rFonts w:ascii="Arial" w:hAnsi="Arial"/>
+                <w:b/>
+                <w:i w:val="0"/>
+                <w:sz w:val="24"/>
+              </w:rPr>
+            </w:r>
+          </w:p>
+        </w:tc>
+        <w:tc>
+          <w:tcPr>
+            <w:tcW w:type="dxa" w:w="864"/>
+          </w:tcPr>
+          <w:p>
+            <w:pPr>
+              <w:jc w:val="center"/>
+              <w:bidi w:val="1"/>
+            </w:pPr>
+            <w:r>
+              <w:rPr>
+                <w:rFonts w:ascii="Arial" w:hAnsi="Arial"/>
+                <w:b/>
+                <w:i w:val="0"/>
+                <w:sz w:val="24"/>
+              </w:rPr>
+            </w:r>
+          </w:p>
+        </w:tc>
+        <w:tc>
+          <w:tcPr>
+            <w:tcW w:type="dxa" w:w="864"/>
+          </w:tcPr>
+          <w:p>
+            <w:pPr>
+              <w:jc w:val="left"/>
+              <w:bidi w:val="1"/>
+            </w:pPr>
+            <w:r>
+              <w:rPr>
+                <w:rFonts w:ascii="Arial" w:hAnsi="Arial"/>
+                <w:b/>
+                <w:i w:val="0"/>
+                <w:sz w:val="24"/>
+              </w:rPr>
+            </w:r>
+          </w:p>
+        </w:tc>
+        <w:tc>
+          <w:tcPr>
+            <w:tcW w:type="dxa" w:w="864"/>
+          </w:tcPr>
+          <w:p>
+            <w:pPr>
+              <w:jc w:val="right"/>
+              <w:bidi w:val="1"/>
+            </w:pPr>
+            <w:r>
+              <w:rPr>
+                <w:rFonts w:ascii="Arial" w:hAnsi="Arial"/>
+                <w:b/>
+                <w:i w:val="0"/>
+                <w:sz w:val="20"/>
+              </w:rPr>
+            </w:r>
+          </w:p>
+        </w:tc>
+        <w:tc>
+          <w:tcPr>
+            <w:tcW w:type="dxa" w:w="864"/>
+          </w:tcPr>
+          <w:p>
+            <w:pPr>
+              <w:jc w:val="right"/>
+              <w:bidi w:val="1"/>
+            </w:pPr>
+            <w:r>
+              <w:rPr>
+                <w:rFonts w:ascii="Arial" w:hAnsi="Arial"/>
+                <w:b/>
+                <w:i w:val="0"/>
+                <w:sz w:val="20"/>
+              </w:rPr>
+              <w:t>פרטיהנבדק:</w:t>
+            </w:r>
+          </w:p>
+        </w:tc>
+        <w:tc>
+          <w:tcPr>
+            <w:tcW w:type="dxa" w:w="864"/>
+          </w:tcPr>
+          <w:p>
+            <w:pPr>
+              <w:jc w:val="center"/>
+              <w:bidi w:val="1"/>
+            </w:pPr>
+            <w:r>
+              <w:rPr>
+                <w:rFonts w:ascii="Arial" w:hAnsi="Arial"/>
+                <w:b/>
+                <w:i w:val="0"/>
+                <w:sz w:val="20"/>
+              </w:rPr>
             </w:r>
           </w:p>
         </w:tc>
@@ -172,131 +1275,196 @@
       <w:tr>
         <w:tc>
           <w:tcPr>
-            <w:tcW w:type="dxa" w:w="1083"/>
+            <w:tcW w:type="dxa" w:w="864"/>
           </w:tcPr>
           <w:p>
             <w:pPr>
+              <w:jc w:val="left"/>
               <w:bidi w:val="1"/>
             </w:pPr>
             <w:r>
-              <w:t>31/08/2026</w:t>
+              <w:rPr>
+                <w:rFonts w:ascii="Arial Narrow" w:hAnsi="Arial Narrow"/>
+                <w:b w:val="0"/>
+                <w:i w:val="0"/>
+                <w:sz w:val="20"/>
+              </w:rPr>
             </w:r>
           </w:p>
         </w:tc>
         <w:tc>
           <w:tcPr>
-            <w:tcW w:type="dxa" w:w="1083"/>
+            <w:tcW w:type="dxa" w:w="864"/>
           </w:tcPr>
           <w:p>
             <w:pPr>
+              <w:jc w:val="left"/>
               <w:bidi w:val="1"/>
             </w:pPr>
             <w:r>
-              <w:t>מפנה</w:t>
+              <w:rPr>
+                <w:rFonts w:ascii="Arial" w:hAnsi="Arial"/>
+                <w:b/>
+                <w:i w:val="0"/>
+                <w:sz w:val="20"/>
+              </w:rPr>
+              <w:t>ת.ז:.215359910</w:t>
             </w:r>
           </w:p>
         </w:tc>
         <w:tc>
           <w:tcPr>
-            <w:tcW w:type="dxa" w:w="1083"/>
+            <w:tcW w:type="dxa" w:w="864"/>
           </w:tcPr>
           <w:p>
             <w:pPr>
+              <w:jc w:val="center"/>
               <w:bidi w:val="1"/>
             </w:pPr>
             <w:r>
-              <w:t>גורם</w:t>
+              <w:rPr>
+                <w:rFonts w:ascii="Arial" w:hAnsi="Arial"/>
+                <w:b w:val="0"/>
+                <w:i w:val="0"/>
+                <w:sz w:val="16"/>
+              </w:rPr>
             </w:r>
           </w:p>
         </w:tc>
         <w:tc>
           <w:tcPr>
-            <w:tcW w:type="dxa" w:w="1083"/>
+            <w:tcW w:type="dxa" w:w="864"/>
           </w:tcPr>
           <w:p>
             <w:pPr>
+              <w:jc w:val="center"/>
               <w:bidi w:val="1"/>
             </w:pPr>
             <w:r>
-              <w:t>מ.ר</w:t>
+              <w:rPr>
+                <w:rFonts w:ascii="Arial" w:hAnsi="Arial"/>
+                <w:b w:val="0"/>
+                <w:i w:val="0"/>
+                <w:sz w:val="16"/>
+              </w:rPr>
+              <w:t>פרטי:רון</w:t>
             </w:r>
           </w:p>
         </w:tc>
         <w:tc>
           <w:tcPr>
-            <w:tcW w:type="dxa" w:w="1083"/>
+            <w:tcW w:type="dxa" w:w="864"/>
           </w:tcPr>
           <w:p>
             <w:pPr>
+              <w:jc w:val="right"/>
               <w:bidi w:val="1"/>
             </w:pPr>
             <w:r>
-              <w:t>בריאות</w:t>
+              <w:rPr>
+                <w:rFonts w:ascii="Arial" w:hAnsi="Arial"/>
+                <w:b/>
+                <w:i w:val="0"/>
+                <w:sz w:val="24"/>
+              </w:rPr>
+              <w:t>שם</w:t>
             </w:r>
           </w:p>
         </w:tc>
         <w:tc>
           <w:tcPr>
-            <w:tcW w:type="dxa" w:w="1083"/>
+            <w:tcW w:type="dxa" w:w="864"/>
           </w:tcPr>
           <w:p>
             <w:pPr>
+              <w:jc w:val="center"/>
               <w:bidi w:val="1"/>
             </w:pPr>
             <w:r>
-              <w:t>שירותי</w:t>
+              <w:rPr>
+                <w:rFonts w:ascii="Arial" w:hAnsi="Arial"/>
+                <w:b/>
+                <w:i w:val="0"/>
+                <w:sz w:val="24"/>
+              </w:rPr>
+              <w:t>גורפינקל</w:t>
             </w:r>
           </w:p>
         </w:tc>
         <w:tc>
           <w:tcPr>
-            <w:tcW w:type="dxa" w:w="1083"/>
+            <w:tcW w:type="dxa" w:w="864"/>
           </w:tcPr>
           <w:p>
             <w:pPr>
+              <w:jc w:val="left"/>
               <w:bidi w:val="1"/>
             </w:pPr>
             <w:r>
-              <w:t>מכבי</w:t>
+              <w:rPr>
+                <w:rFonts w:ascii="Arial" w:hAnsi="Arial"/>
+                <w:b/>
+                <w:i w:val="0"/>
+                <w:sz w:val="24"/>
+              </w:rPr>
+              <w:t>החפשמ םש:</w:t>
             </w:r>
           </w:p>
         </w:tc>
         <w:tc>
           <w:tcPr>
-            <w:tcW w:type="dxa" w:w="1083"/>
+            <w:tcW w:type="dxa" w:w="864"/>
           </w:tcPr>
           <w:p>
             <w:pPr>
+              <w:jc w:val="right"/>
               <w:bidi w:val="1"/>
             </w:pPr>
             <w:r>
-              <w:t>גלינה</w:t>
+              <w:rPr>
+                <w:rFonts w:ascii="Arial" w:hAnsi="Arial"/>
+                <w:b/>
+                <w:i w:val="0"/>
+                <w:sz w:val="20"/>
+              </w:rPr>
             </w:r>
           </w:p>
         </w:tc>
         <w:tc>
           <w:tcPr>
-            <w:tcW w:type="dxa" w:w="1083"/>
+            <w:tcW w:type="dxa" w:w="864"/>
           </w:tcPr>
           <w:p>
             <w:pPr>
+              <w:jc w:val="right"/>
               <w:bidi w:val="1"/>
             </w:pPr>
             <w:r>
-              <w:t>גלינה</w:t>
+              <w:rPr>
+                <w:rFonts w:ascii="Arial" w:hAnsi="Arial"/>
+                <w:b/>
+                <w:i w:val="0"/>
+                <w:sz w:val="20"/>
+              </w:rPr>
             </w:r>
           </w:p>
         </w:tc>
         <w:tc>
           <w:tcPr>
-            <w:tcW w:type="dxa" w:w="1083"/>
+            <w:tcW w:type="dxa" w:w="864"/>
           </w:tcPr>
           <w:p>
             <w:pPr>
+              <w:jc w:val="center"/>
               <w:bidi w:val="1"/>
             </w:pPr>
             <w:r>
-              <w:t>דר' קגנוביץ</w:t>
+              <w:rPr>
+                <w:rFonts w:ascii="Arial" w:hAnsi="Arial"/>
+                <w:b/>
+                <w:i w:val="0"/>
+                <w:sz w:val="20"/>
+              </w:rPr>
             </w:r>
           </w:p>
         </w:tc>
@@ -304,183 +1472,198 @@
       <w:tr>
         <w:tc>
           <w:tcPr>
-            <w:tcW w:type="dxa" w:w="1083"/>
+            <w:tcW w:type="dxa" w:w="864"/>
           </w:tcPr>
           <w:p>
             <w:pPr>
+              <w:jc w:val="left"/>
               <w:bidi w:val="1"/>
             </w:pPr>
             <w:r>
-              <w:t>31/08/2026</w:t>
+              <w:rPr>
+                <w:rFonts w:ascii="Arial Narrow" w:hAnsi="Arial Narrow"/>
+                <w:b w:val="0"/>
+                <w:i w:val="0"/>
+                <w:sz w:val="20"/>
+              </w:rPr>
             </w:r>
           </w:p>
         </w:tc>
         <w:tc>
           <w:tcPr>
-            <w:tcW w:type="dxa" w:w="1083"/>
+            <w:tcW w:type="dxa" w:w="864"/>
           </w:tcPr>
           <w:p>
             <w:pPr>
+              <w:jc w:val="left"/>
               <w:bidi w:val="1"/>
             </w:pPr>
             <w:r>
-              <w:t>מפנה</w:t>
+              <w:rPr>
+                <w:rFonts w:ascii="Arial" w:hAnsi="Arial"/>
+                <w:b/>
+                <w:i w:val="0"/>
+                <w:sz w:val="20"/>
+              </w:rPr>
+              <w:t>נייד:0522460193</w:t>
             </w:r>
           </w:p>
         </w:tc>
         <w:tc>
           <w:tcPr>
-            <w:tcW w:type="dxa" w:w="1083"/>
+            <w:tcW w:type="dxa" w:w="864"/>
           </w:tcPr>
           <w:p>
             <w:pPr>
+              <w:jc w:val="center"/>
               <w:bidi w:val="1"/>
             </w:pPr>
             <w:r>
-              <w:t>גורם</w:t>
+              <w:rPr>
+                <w:rFonts w:ascii="Arial" w:hAnsi="Arial"/>
+                <w:b w:val="0"/>
+                <w:i w:val="0"/>
+                <w:sz w:val="16"/>
+              </w:rPr>
+              <w:t>טל.עבודה/</w:t>
             </w:r>
           </w:p>
         </w:tc>
         <w:tc>
           <w:tcPr>
-            <w:tcW w:type="dxa" w:w="1083"/>
+            <w:tcW w:type="dxa" w:w="864"/>
           </w:tcPr>
           <w:p>
             <w:pPr>
+              <w:jc w:val="center"/>
               <w:bidi w:val="1"/>
             </w:pPr>
             <w:r>
-              <w:t>מ.ר</w:t>
+              <w:rPr>
+                <w:rFonts w:ascii="Arial" w:hAnsi="Arial"/>
+                <w:b w:val="0"/>
+                <w:i w:val="0"/>
+                <w:sz w:val="16"/>
+              </w:rPr>
+              <w:t>08-9244787</w:t>
             </w:r>
           </w:p>
         </w:tc>
         <w:tc>
           <w:tcPr>
-            <w:tcW w:type="dxa" w:w="1083"/>
+            <w:tcW w:type="dxa" w:w="864"/>
           </w:tcPr>
           <w:p>
             <w:pPr>
+              <w:jc w:val="right"/>
               <w:bidi w:val="1"/>
             </w:pPr>
             <w:r>
-              <w:t>בריאות</w:t>
+              <w:rPr>
+                <w:rFonts w:ascii="Arial" w:hAnsi="Arial"/>
+                <w:b/>
+                <w:i w:val="0"/>
+                <w:sz w:val="24"/>
+              </w:rPr>
+              <w:t>טלפון:</w:t>
             </w:r>
           </w:p>
         </w:tc>
         <w:tc>
           <w:tcPr>
-            <w:tcW w:type="dxa" w:w="1083"/>
+            <w:tcW w:type="dxa" w:w="864"/>
           </w:tcPr>
           <w:p>
             <w:pPr>
+              <w:jc w:val="center"/>
               <w:bidi w:val="1"/>
             </w:pPr>
             <w:r>
-              <w:t>שירותי</w:t>
+              <w:rPr>
+                <w:rFonts w:ascii="Arial" w:hAnsi="Arial"/>
+                <w:b/>
+                <w:i w:val="0"/>
+                <w:sz w:val="24"/>
+              </w:rPr>
+              <w:t>30/05/2005מין:ז</w:t>
             </w:r>
           </w:p>
         </w:tc>
         <w:tc>
           <w:tcPr>
-            <w:tcW w:type="dxa" w:w="1083"/>
+            <w:tcW w:type="dxa" w:w="864"/>
           </w:tcPr>
           <w:p>
             <w:pPr>
+              <w:jc w:val="left"/>
               <w:bidi w:val="1"/>
             </w:pPr>
             <w:r>
-              <w:t>מכבי</w:t>
+              <w:rPr>
+                <w:rFonts w:ascii="Arial" w:hAnsi="Arial"/>
+                <w:b/>
+                <w:i w:val="0"/>
+                <w:sz w:val="24"/>
+              </w:rPr>
+              <w:t>:</w:t>
             </w:r>
           </w:p>
         </w:tc>
         <w:tc>
           <w:tcPr>
-            <w:tcW w:type="dxa" w:w="1083"/>
+            <w:tcW w:type="dxa" w:w="864"/>
           </w:tcPr>
           <w:p>
             <w:pPr>
+              <w:jc w:val="right"/>
               <w:bidi w:val="1"/>
             </w:pPr>
             <w:r>
-              <w:t>וכללית</w:t>
+              <w:rPr>
+                <w:rFonts w:ascii="Arial" w:hAnsi="Arial"/>
+                <w:b/>
+                <w:i w:val="0"/>
+                <w:sz w:val="20"/>
+              </w:rPr>
+              <w:t>ת.לידה</w:t>
             </w:r>
           </w:p>
         </w:tc>
         <w:tc>
           <w:tcPr>
-            <w:tcW w:type="dxa" w:w="1083"/>
+            <w:tcW w:type="dxa" w:w="864"/>
           </w:tcPr>
           <w:p>
             <w:pPr>
+              <w:jc w:val="right"/>
               <w:bidi w:val="1"/>
             </w:pPr>
             <w:r>
-              <w:t>משפחה ,פנימית</w:t>
+              <w:rPr>
+                <w:rFonts w:ascii="Arial" w:hAnsi="Arial"/>
+                <w:b/>
+                <w:i w:val="0"/>
+                <w:sz w:val="20"/>
+              </w:rPr>
             </w:r>
           </w:p>
         </w:tc>
         <w:tc>
           <w:tcPr>
-            <w:tcW w:type="dxa" w:w="1083"/>
+            <w:tcW w:type="dxa" w:w="864"/>
           </w:tcPr>
           <w:p>
             <w:pPr>
+              <w:jc w:val="center"/>
               <w:bidi w:val="1"/>
             </w:pPr>
             <w:r>
-              <w:t>משפחה ,פנימית</w:t>
-            </w:r>
-          </w:p>
-        </w:tc>
-      </w:tr>
-    </w:tbl>
-    <w:tbl>
-      <w:tblPr>
-        <w:tblW w:type="auto" w:w="0"/>
-        <w:tblLook w:firstColumn="1" w:firstRow="1" w:lastColumn="0" w:lastRow="0" w:noHBand="0" w:noVBand="1" w:val="04A0"/>
-      </w:tblPr>
-      <w:tblGrid>
-        <w:gridCol w:w="3612"/>
-        <w:gridCol w:w="3612"/>
-        <w:gridCol w:w="3612"/>
-      </w:tblGrid>
-      <w:tr>
-        <w:tc>
-          <w:tcPr>
-            <w:tcW w:type="dxa" w:w="3612"/>
-          </w:tcPr>
-          <w:p>
-            <w:pPr>
-              <w:bidi w:val="1"/>
-            </w:pPr>
-            <w:r>
-              <w:t>08-9257689</w:t>
-            </w:r>
-          </w:p>
-        </w:tc>
-        <w:tc>
-          <w:tcPr>
-            <w:tcW w:type="dxa" w:w="3612"/>
-          </w:tcPr>
-          <w:p>
-            <w:pPr>
-              <w:bidi w:val="1"/>
-            </w:pPr>
-            <w:r>
-              <w:t>08-9257689</w:t>
-            </w:r>
-          </w:p>
-        </w:tc>
-        <w:tc>
-          <w:tcPr>
-            <w:tcW w:type="dxa" w:w="3612"/>
-          </w:tcPr>
-          <w:p>
-            <w:pPr>
-              <w:bidi w:val="1"/>
-            </w:pPr>
-            <w:r>
-              <w:t>טלפון:</w:t>
+              <w:rPr>
+                <w:rFonts w:ascii="Arial" w:hAnsi="Arial"/>
+                <w:b/>
+                <w:i w:val="0"/>
+                <w:sz w:val="20"/>
+              </w:rPr>
             </w:r>
           </w:p>
         </w:tc>
@@ -488,40 +1671,195 @@
       <w:tr>
         <w:tc>
           <w:tcPr>
-            <w:tcW w:type="dxa" w:w="3612"/>
+            <w:tcW w:type="dxa" w:w="864"/>
           </w:tcPr>
           <w:p>
             <w:pPr>
+              <w:jc w:val="left"/>
               <w:bidi w:val="1"/>
             </w:pPr>
             <w:r>
-              <w:t>08-9257689</w:t>
+              <w:rPr>
+                <w:rFonts w:ascii="Arial Narrow" w:hAnsi="Arial Narrow"/>
+                <w:b w:val="0"/>
+                <w:i w:val="0"/>
+                <w:sz w:val="20"/>
+              </w:rPr>
             </w:r>
           </w:p>
         </w:tc>
         <w:tc>
           <w:tcPr>
-            <w:tcW w:type="dxa" w:w="3612"/>
+            <w:tcW w:type="dxa" w:w="864"/>
           </w:tcPr>
           <w:p>
             <w:pPr>
+              <w:jc w:val="left"/>
               <w:bidi w:val="1"/>
             </w:pPr>
             <w:r>
-              <w:t>08-9257689</w:t>
+              <w:rPr>
+                <w:rFonts w:ascii="Arial" w:hAnsi="Arial"/>
+                <w:b/>
+                <w:i w:val="0"/>
+                <w:sz w:val="20"/>
+              </w:rPr>
+              <w:t>מיקוד7228212</w:t>
             </w:r>
           </w:p>
         </w:tc>
         <w:tc>
           <w:tcPr>
-            <w:tcW w:type="dxa" w:w="3612"/>
+            <w:tcW w:type="dxa" w:w="864"/>
           </w:tcPr>
           <w:p>
             <w:pPr>
+              <w:jc w:val="center"/>
               <w:bidi w:val="1"/>
             </w:pPr>
             <w:r>
-              <w:t>פקס:</w:t>
+              <w:rPr>
+                <w:rFonts w:ascii="Arial" w:hAnsi="Arial"/>
+                <w:b w:val="0"/>
+                <w:i w:val="0"/>
+                <w:sz w:val="16"/>
+              </w:rPr>
+            </w:r>
+          </w:p>
+        </w:tc>
+        <w:tc>
+          <w:tcPr>
+            <w:tcW w:type="dxa" w:w="864"/>
+          </w:tcPr>
+          <w:p>
+            <w:pPr>
+              <w:jc w:val="center"/>
+              <w:bidi w:val="1"/>
+            </w:pPr>
+            <w:r>
+              <w:rPr>
+                <w:rFonts w:ascii="Arial" w:hAnsi="Arial"/>
+                <w:b w:val="0"/>
+                <w:i w:val="0"/>
+                <w:sz w:val="16"/>
+              </w:rPr>
+            </w:r>
+          </w:p>
+        </w:tc>
+        <w:tc>
+          <w:tcPr>
+            <w:tcW w:type="dxa" w:w="864"/>
+          </w:tcPr>
+          <w:p>
+            <w:pPr>
+              <w:jc w:val="right"/>
+              <w:bidi w:val="1"/>
+            </w:pPr>
+            <w:r>
+              <w:rPr>
+                <w:rFonts w:ascii="Arial" w:hAnsi="Arial"/>
+                <w:b/>
+                <w:i w:val="0"/>
+                <w:sz w:val="24"/>
+              </w:rPr>
+            </w:r>
+          </w:p>
+        </w:tc>
+        <w:tc>
+          <w:tcPr>
+            <w:tcW w:type="dxa" w:w="864"/>
+          </w:tcPr>
+          <w:p>
+            <w:pPr>
+              <w:jc w:val="center"/>
+              <w:bidi w:val="1"/>
+            </w:pPr>
+            <w:r>
+              <w:rPr>
+                <w:rFonts w:ascii="Arial" w:hAnsi="Arial"/>
+                <w:b/>
+                <w:i w:val="0"/>
+                <w:sz w:val="24"/>
+              </w:rPr>
+              <w:t>אפריאט6 ,רמלה</w:t>
+            </w:r>
+          </w:p>
+        </w:tc>
+        <w:tc>
+          <w:tcPr>
+            <w:tcW w:type="dxa" w:w="864"/>
+          </w:tcPr>
+          <w:p>
+            <w:pPr>
+              <w:jc w:val="left"/>
+              <w:bidi w:val="1"/>
+            </w:pPr>
+            <w:r>
+              <w:rPr>
+                <w:rFonts w:ascii="Arial" w:hAnsi="Arial"/>
+                <w:b/>
+                <w:i w:val="0"/>
+                <w:sz w:val="24"/>
+              </w:rPr>
+              <w:t>הרב</w:t>
+            </w:r>
+          </w:p>
+        </w:tc>
+        <w:tc>
+          <w:tcPr>
+            <w:tcW w:type="dxa" w:w="864"/>
+          </w:tcPr>
+          <w:p>
+            <w:pPr>
+              <w:jc w:val="right"/>
+              <w:bidi w:val="1"/>
+            </w:pPr>
+            <w:r>
+              <w:rPr>
+                <w:rFonts w:ascii="Arial" w:hAnsi="Arial"/>
+                <w:b/>
+                <w:i w:val="0"/>
+                <w:sz w:val="20"/>
+              </w:rPr>
+              <w:t>כתובת:</w:t>
+            </w:r>
+          </w:p>
+        </w:tc>
+        <w:tc>
+          <w:tcPr>
+            <w:tcW w:type="dxa" w:w="864"/>
+          </w:tcPr>
+          <w:p>
+            <w:pPr>
+              <w:jc w:val="right"/>
+              <w:bidi w:val="1"/>
+            </w:pPr>
+            <w:r>
+              <w:rPr>
+                <w:rFonts w:ascii="Arial" w:hAnsi="Arial"/>
+                <w:b/>
+                <w:i w:val="0"/>
+                <w:sz w:val="20"/>
+              </w:rPr>
+            </w:r>
+          </w:p>
+        </w:tc>
+        <w:tc>
+          <w:tcPr>
+            <w:tcW w:type="dxa" w:w="864"/>
+          </w:tcPr>
+          <w:p>
+            <w:pPr>
+              <w:jc w:val="center"/>
+              <w:bidi w:val="1"/>
+            </w:pPr>
+            <w:r>
+              <w:rPr>
+                <w:rFonts w:ascii="Arial" w:hAnsi="Arial"/>
+                <w:b/>
+                <w:i w:val="0"/>
+                <w:sz w:val="20"/>
+              </w:rPr>
             </w:r>
           </w:p>
         </w:tc>
@@ -529,220 +1867,298 @@
       <w:tr>
         <w:tc>
           <w:tcPr>
-            <w:tcW w:type="dxa" w:w="3612"/>
+            <w:tcW w:type="dxa" w:w="864"/>
           </w:tcPr>
           <w:p>
             <w:pPr>
+              <w:jc w:val="left"/>
               <w:bidi w:val="1"/>
             </w:pPr>
             <w:r>
-              <w:t xml:space="preserve"> ,רמלהיאיר14</w:t>
+              <w:rPr>
+                <w:rFonts w:ascii="Arial Narrow" w:hAnsi="Arial Narrow"/>
+                <w:b w:val="0"/>
+                <w:i w:val="0"/>
+                <w:sz w:val="20"/>
+              </w:rPr>
             </w:r>
           </w:p>
         </w:tc>
         <w:tc>
           <w:tcPr>
-            <w:tcW w:type="dxa" w:w="3612"/>
+            <w:tcW w:type="dxa" w:w="864"/>
           </w:tcPr>
           <w:p>
             <w:pPr>
+              <w:jc w:val="left"/>
               <w:bidi w:val="1"/>
             </w:pPr>
             <w:r>
-              <w:t>כתובת:שטרן</w:t>
+              <w:rPr>
+                <w:rFonts w:ascii="Arial" w:hAnsi="Arial"/>
+                <w:b/>
+                <w:i w:val="0"/>
+                <w:sz w:val="20"/>
+              </w:rPr>
             </w:r>
           </w:p>
         </w:tc>
         <w:tc>
           <w:tcPr>
-            <w:tcW w:type="dxa" w:w="3612"/>
+            <w:tcW w:type="dxa" w:w="864"/>
           </w:tcPr>
           <w:p>
             <w:pPr>
+              <w:jc w:val="center"/>
               <w:bidi w:val="1"/>
             </w:pPr>
             <w:r>
-              <w:t>כתובת:שטרן</w:t>
+              <w:rPr>
+                <w:rFonts w:ascii="Arial" w:hAnsi="Arial"/>
+                <w:b w:val="0"/>
+                <w:i w:val="0"/>
+                <w:sz w:val="16"/>
+              </w:rPr>
+            </w:r>
+          </w:p>
+        </w:tc>
+        <w:tc>
+          <w:tcPr>
+            <w:tcW w:type="dxa" w:w="864"/>
+          </w:tcPr>
+          <w:p>
+            <w:pPr>
+              <w:jc w:val="center"/>
+              <w:bidi w:val="1"/>
+            </w:pPr>
+            <w:r>
+              <w:rPr>
+                <w:rFonts w:ascii="Arial" w:hAnsi="Arial"/>
+                <w:b w:val="0"/>
+                <w:i w:val="0"/>
+                <w:sz w:val="16"/>
+              </w:rPr>
+            </w:r>
+          </w:p>
+        </w:tc>
+        <w:tc>
+          <w:tcPr>
+            <w:tcW w:type="dxa" w:w="864"/>
+          </w:tcPr>
+          <w:p>
+            <w:pPr>
+              <w:jc w:val="right"/>
+              <w:bidi w:val="1"/>
+            </w:pPr>
+            <w:r>
+              <w:rPr>
+                <w:rFonts w:ascii="Arial" w:hAnsi="Arial"/>
+                <w:b/>
+                <w:i w:val="0"/>
+                <w:sz w:val="24"/>
+              </w:rPr>
+            </w:r>
+          </w:p>
+        </w:tc>
+        <w:tc>
+          <w:tcPr>
+            <w:tcW w:type="dxa" w:w="864"/>
+          </w:tcPr>
+          <w:p>
+            <w:pPr>
+              <w:jc w:val="center"/>
+              <w:bidi w:val="1"/>
+            </w:pPr>
+            <w:r>
+              <w:rPr>
+                <w:rFonts w:ascii="Arial" w:hAnsi="Arial"/>
+                <w:b/>
+                <w:i w:val="0"/>
+                <w:sz w:val="24"/>
+              </w:rPr>
+            </w:r>
+          </w:p>
+        </w:tc>
+        <w:tc>
+          <w:tcPr>
+            <w:tcW w:type="dxa" w:w="864"/>
+          </w:tcPr>
+          <w:p>
+            <w:pPr>
+              <w:jc w:val="left"/>
+              <w:bidi w:val="1"/>
+            </w:pPr>
+            <w:r>
+              <w:rPr>
+                <w:rFonts w:ascii="Arial" w:hAnsi="Arial"/>
+                <w:b/>
+                <w:i w:val="0"/>
+                <w:sz w:val="24"/>
+              </w:rPr>
+            </w:r>
+          </w:p>
+        </w:tc>
+        <w:tc>
+          <w:tcPr>
+            <w:tcW w:type="dxa" w:w="864"/>
+          </w:tcPr>
+          <w:p>
+            <w:pPr>
+              <w:jc w:val="right"/>
+              <w:bidi w:val="1"/>
+            </w:pPr>
+            <w:r>
+              <w:rPr>
+                <w:rFonts w:ascii="Arial" w:hAnsi="Arial"/>
+                <w:b/>
+                <w:i w:val="0"/>
+                <w:sz w:val="20"/>
+              </w:rPr>
+              <w:t>0215359910</w:t>
+            </w:r>
+          </w:p>
+        </w:tc>
+        <w:tc>
+          <w:tcPr>
+            <w:tcW w:type="dxa" w:w="864"/>
+          </w:tcPr>
+          <w:p>
+            <w:pPr>
+              <w:jc w:val="right"/>
+              <w:bidi w:val="1"/>
+            </w:pPr>
+            <w:r>
+              <w:rPr>
+                <w:rFonts w:ascii="Arial" w:hAnsi="Arial"/>
+                <w:b/>
+                <w:i w:val="0"/>
+                <w:sz w:val="20"/>
+              </w:rPr>
+            </w:r>
+          </w:p>
+        </w:tc>
+        <w:tc>
+          <w:tcPr>
+            <w:tcW w:type="dxa" w:w="864"/>
+          </w:tcPr>
+          <w:p>
+            <w:pPr>
+              <w:jc w:val="center"/>
+              <w:bidi w:val="1"/>
+            </w:pPr>
+            <w:r>
+              <w:rPr>
+                <w:rFonts w:ascii="Arial" w:hAnsi="Arial"/>
+                <w:b/>
+                <w:i w:val="0"/>
+                <w:sz w:val="20"/>
+              </w:rPr>
             </w:r>
           </w:p>
         </w:tc>
       </w:tr>
     </w:tbl>
-    <w:p/>
     <w:p>
       <w:pPr>
-        <w:bidi w:val="1"/>
-        <w:jc w:val="right"/>
+        <w:autoSpaceDN w:val="0"/>
+        <w:autoSpaceDE w:val="0"/>
+        <w:widowControl/>
+        <w:spacing w:line="20" w:lineRule="exact" w:before="0" w:after="0"/>
+        <w:ind w:left="0" w:right="0"/>
       </w:pPr>
-      <w:r>
-        <w:t>פרטי הנבדק:</w:t>
-      </w:r>
     </w:p>
     <w:tbl>
       <w:tblPr>
         <w:tblW w:type="auto" w:w="0"/>
+        <w:tblLayout w:type="fixed"/>
         <w:tblLook w:firstColumn="1" w:firstRow="1" w:lastColumn="0" w:lastRow="0" w:noHBand="0" w:noVBand="1" w:val="04A0"/>
+        <w:tblInd w:w="2672.0" w:type="dxa"/>
       </w:tblPr>
       <w:tblGrid>
         <w:gridCol w:w="5417"/>
         <w:gridCol w:w="5417"/>
       </w:tblGrid>
       <w:tr>
+        <w:trPr>
+          <w:trHeight w:hRule="exact" w:val="326"/>
+        </w:trPr>
         <w:tc>
           <w:tcPr>
-            <w:tcW w:type="dxa" w:w="5417"/>
+            <w:tcW w:type="dxa" w:w="3260"/>
+            <w:tcBorders/>
+            <w:tcMar>
+              <w:start w:w="0" w:type="dxa"/>
+              <w:end w:w="0" w:type="dxa"/>
+            </w:tcMar>
           </w:tcPr>
           <w:p>
             <w:pPr>
-              <w:bidi w:val="1"/>
+              <w:autoSpaceDN w:val="0"/>
+              <w:autoSpaceDE w:val="0"/>
+              <w:widowControl/>
+              <w:spacing w:line="240" w:lineRule="exact" w:before="60" w:after="0"/>
+              <w:ind w:left="0" w:right="12" w:firstLine="0"/>
+              <w:jc w:val="right"/>
             </w:pPr>
             <w:r>
-              <w:t>שם פרטי: רון</w:t>
-            </w:r>
-          </w:p>
-        </w:tc>
-        <w:tc>
-          <w:tcPr>
-            <w:tcW w:type="dxa" w:w="5417"/>
-          </w:tcPr>
-          <w:p>
-            <w:pPr>
-              <w:bidi w:val="1"/>
-            </w:pPr>
-            <w:r>
-              <w:t>שם משפחה: גורפינקל</w:t>
-            </w:r>
-          </w:p>
-        </w:tc>
-      </w:tr>
-      <w:tr>
-        <w:tc>
-          <w:tcPr>
-            <w:tcW w:type="dxa" w:w="5417"/>
-          </w:tcPr>
-          <w:p>
-            <w:pPr>
-              <w:bidi w:val="1"/>
-            </w:pPr>
-            <w:r>
-              <w:t>0215359910</w:t>
-            </w:r>
-          </w:p>
-        </w:tc>
-        <w:tc>
-          <w:tcPr>
-            <w:tcW w:type="dxa" w:w="5417"/>
-          </w:tcPr>
-          <w:p>
-            <w:pPr>
-              <w:bidi w:val="1"/>
-            </w:pPr>
-            <w:r>
-              <w:t>ת.ז.: 215359910</w:t>
-            </w:r>
-          </w:p>
-        </w:tc>
-      </w:tr>
-      <w:tr>
-        <w:tc>
-          <w:tcPr>
-            <w:tcW w:type="dxa" w:w="5417"/>
-          </w:tcPr>
-          <w:p>
-            <w:pPr>
-              <w:bidi w:val="1"/>
-            </w:pPr>
-            <w:r>
-              <w:t>טלפון: 08-9244787  טל. עבודה/נייד: 0522460193</w:t>
-            </w:r>
-          </w:p>
-        </w:tc>
-        <w:tc>
-          <w:tcPr>
-            <w:tcW w:type="dxa" w:w="5417"/>
-          </w:tcPr>
-          <w:p>
-            <w:pPr>
-              <w:bidi w:val="1"/>
-            </w:pPr>
-            <w:r>
-              <w:t>ת.לידה: 30/05/2005  מין: ז</w:t>
-            </w:r>
-          </w:p>
-        </w:tc>
-      </w:tr>
-      <w:tr>
-        <w:tc>
-          <w:tcPr>
-            <w:tcW w:type="dxa" w:w="5417"/>
-          </w:tcPr>
-          <w:p>
-            <w:pPr>
-              <w:bidi w:val="1"/>
-            </w:pPr>
-            <w:r>
-              <w:t>מיקוד 7228212</w:t>
-            </w:r>
-          </w:p>
-        </w:tc>
-        <w:tc>
-          <w:tcPr>
-            <w:tcW w:type="dxa" w:w="5417"/>
-          </w:tcPr>
-          <w:p>
-            <w:pPr>
-              <w:bidi w:val="1"/>
-            </w:pPr>
-            <w:r>
-              <w:t>כתובת: הרב אפריאט 6, רמלה</w:t>
-            </w:r>
-          </w:p>
-        </w:tc>
-      </w:tr>
-    </w:tbl>
-    <w:p/>
-    <w:tbl>
-      <w:tblPr>
-        <w:tblW w:type="auto" w:w="0"/>
-        <w:tblLook w:firstColumn="1" w:firstRow="1" w:lastColumn="0" w:lastRow="0" w:noHBand="0" w:noVBand="1" w:val="04A0"/>
-      </w:tblPr>
-      <w:tblGrid>
-        <w:gridCol w:w="5417"/>
-        <w:gridCol w:w="5417"/>
-      </w:tblGrid>
-      <w:tr>
-        <w:tc>
-          <w:tcPr>
-            <w:tcW w:type="dxa" w:w="5417"/>
-          </w:tcPr>
-          <w:p>
-            <w:pPr>
-              <w:bidi w:val="1"/>
-            </w:pPr>
-            <w:r>
+              <w:rPr>
+                <w:rFonts w:ascii="Arial" w:hAnsi="Arial" w:eastAsia="Arial"/>
+                <w:b/>
+                <w:i w:val="0"/>
+                <w:color w:val="000000"/>
+                <w:sz w:val="24"/>
+              </w:rPr>
               <w:t>מחלה</w:t>
             </w:r>
           </w:p>
         </w:tc>
         <w:tc>
           <w:tcPr>
-            <w:tcW w:type="dxa" w:w="5417"/>
+            <w:tcW w:type="dxa" w:w="2740"/>
+            <w:tcBorders/>
+            <w:tcMar>
+              <w:start w:w="0" w:type="dxa"/>
+              <w:end w:w="0" w:type="dxa"/>
+            </w:tcMar>
           </w:tcPr>
           <w:p>
             <w:pPr>
-              <w:bidi w:val="1"/>
+              <w:autoSpaceDN w:val="0"/>
+              <w:autoSpaceDE w:val="0"/>
+              <w:widowControl/>
+              <w:spacing w:line="240" w:lineRule="exact" w:before="60" w:after="0"/>
+              <w:ind w:left="42" w:right="0" w:firstLine="0"/>
+              <w:jc w:val="left"/>
             </w:pPr>
             <w:r>
+              <w:rPr>
+                <w:rFonts w:ascii="Arial" w:hAnsi="Arial" w:eastAsia="Arial"/>
+                <w:b/>
+                <w:i w:val="0"/>
+                <w:color w:val="000000"/>
+                <w:sz w:val="24"/>
+              </w:rPr>
               <w:t>אישור</w:t>
             </w:r>
           </w:p>
         </w:tc>
       </w:tr>
     </w:tbl>
+    <w:p>
+      <w:pPr>
+        <w:autoSpaceDN w:val="0"/>
+        <w:autoSpaceDE w:val="0"/>
+        <w:widowControl/>
+        <w:spacing w:line="20" w:lineRule="exact" w:before="0" w:after="0"/>
+        <w:ind w:left="0" w:right="0"/>
+      </w:pPr>
+    </w:p>
     <w:tbl>
       <w:tblPr>
         <w:tblW w:type="auto" w:w="0"/>
+        <w:tblLayout w:type="fixed"/>
         <w:tblLook w:firstColumn="1" w:firstRow="1" w:lastColumn="0" w:lastRow="0" w:noHBand="0" w:noVBand="1" w:val="04A0"/>
+        <w:tblInd w:w="720.0" w:type="dxa"/>
       </w:tblPr>
       <w:tblGrid>
         <w:gridCol w:w="2709"/>
@@ -751,118 +2167,222 @@
         <w:gridCol w:w="2709"/>
       </w:tblGrid>
       <w:tr>
+        <w:trPr>
+          <w:trHeight w:hRule="exact" w:val="2864"/>
+        </w:trPr>
         <w:tc>
           <w:tcPr>
-            <w:tcW w:type="dxa" w:w="2709"/>
+            <w:tcW w:type="dxa" w:w="10006"/>
+            <w:gridSpan w:val="4"/>
+            <w:tcBorders>
+              <w:top w:sz="6.400000000000091" w:val="single" w:color="#000000"/>
+              <w:bottom w:sz="6.0" w:val="single" w:color="#00008A"/>
+            </w:tcBorders>
+            <w:tcMar>
+              <w:start w:w="0" w:type="dxa"/>
+              <w:end w:w="0" w:type="dxa"/>
+            </w:tcMar>
+            <w:tcMar>
+              <w:start w:w="0" w:type="dxa"/>
+              <w:end w:w="0" w:type="dxa"/>
+            </w:tcMar>
+            <w:tcMar>
+              <w:start w:w="0" w:type="dxa"/>
+              <w:end w:w="0" w:type="dxa"/>
+            </w:tcMar>
+            <w:tcMar>
+              <w:start w:w="0" w:type="dxa"/>
+              <w:end w:w="0" w:type="dxa"/>
+            </w:tcMar>
           </w:tcPr>
           <w:p>
             <w:pPr>
-              <w:bidi w:val="1"/>
+              <w:autoSpaceDN w:val="0"/>
+              <w:autoSpaceDE w:val="0"/>
+              <w:widowControl/>
+              <w:spacing w:line="196" w:lineRule="exact" w:before="2478" w:after="0"/>
+              <w:ind w:left="0" w:right="424" w:firstLine="0"/>
+              <w:jc w:val="right"/>
             </w:pPr>
             <w:r>
-              <w:t>31/08/2026</w:t>
-            </w:r>
-          </w:p>
-        </w:tc>
-        <w:tc>
-          <w:tcPr>
-            <w:tcW w:type="dxa" w:w="2709"/>
-          </w:tcPr>
-          <w:p>
-            <w:pPr>
-              <w:bidi w:val="1"/>
-            </w:pPr>
-            <w:r>
-              <w:t>31/08/2026</w:t>
-            </w:r>
-          </w:p>
-        </w:tc>
-        <w:tc>
-          <w:tcPr>
-            <w:tcW w:type="dxa" w:w="2709"/>
-          </w:tcPr>
-          <w:p>
-            <w:pPr>
-              <w:bidi w:val="1"/>
-            </w:pPr>
-            <w:r>
-              <w:t>31/08/2026</w:t>
-            </w:r>
-          </w:p>
-        </w:tc>
-        <w:tc>
-          <w:tcPr>
-            <w:tcW w:type="dxa" w:w="2709"/>
-          </w:tcPr>
-          <w:p>
-            <w:pPr>
-              <w:bidi w:val="1"/>
-            </w:pPr>
-            <w:r>
+              <w:rPr>
+                <w:w w:val="97.5"/>
+                <w:rFonts w:ascii="Arial Narrow" w:hAnsi="Arial Narrow" w:eastAsia="Arial Narrow"/>
+                <w:b w:val="0"/>
+                <w:i w:val="0"/>
+                <w:color w:val="000000"/>
+                <w:sz w:val="20"/>
+              </w:rPr>
               <w:t>31/08/2026</w:t>
             </w:r>
           </w:p>
         </w:tc>
       </w:tr>
       <w:tr>
+        <w:trPr>
+          <w:trHeight w:hRule="exact" w:val="372"/>
+        </w:trPr>
         <w:tc>
           <w:tcPr>
-            <w:tcW w:type="dxa" w:w="2709"/>
+            <w:tcW w:type="dxa" w:w="932"/>
+            <w:tcBorders>
+              <w:top w:sz="6.0" w:val="single" w:color="#00008A"/>
+            </w:tcBorders>
+            <w:tcMar>
+              <w:start w:w="0" w:type="dxa"/>
+              <w:end w:w="0" w:type="dxa"/>
+            </w:tcMar>
           </w:tcPr>
           <w:p>
             <w:pPr>
-              <w:bidi w:val="1"/>
+              <w:autoSpaceDN w:val="0"/>
+              <w:autoSpaceDE w:val="0"/>
+              <w:widowControl/>
+              <w:spacing w:line="196" w:lineRule="exact" w:before="168" w:after="0"/>
+              <w:ind w:left="0" w:right="12" w:firstLine="0"/>
+              <w:jc w:val="right"/>
             </w:pPr>
             <w:r>
+              <w:rPr>
+                <w:w w:val="97.5"/>
+                <w:rFonts w:ascii="Arial" w:hAnsi="Arial" w:eastAsia="Arial"/>
+                <w:b/>
+                <w:i w:val="0"/>
+                <w:color w:val="00008B"/>
+                <w:sz w:val="20"/>
+              </w:rPr>
               <w:t>הרופא</w:t>
             </w:r>
           </w:p>
         </w:tc>
         <w:tc>
           <w:tcPr>
-            <w:tcW w:type="dxa" w:w="2709"/>
+            <w:tcW w:type="dxa" w:w="660"/>
+            <w:tcBorders>
+              <w:top w:sz="6.0" w:val="single" w:color="#00008A"/>
+            </w:tcBorders>
+            <w:tcMar>
+              <w:start w:w="0" w:type="dxa"/>
+              <w:end w:w="0" w:type="dxa"/>
+            </w:tcMar>
           </w:tcPr>
           <w:p>
             <w:pPr>
-              <w:bidi w:val="1"/>
+              <w:autoSpaceDN w:val="0"/>
+              <w:autoSpaceDE w:val="0"/>
+              <w:widowControl/>
+              <w:spacing w:line="196" w:lineRule="exact" w:before="168" w:after="0"/>
+              <w:ind w:left="0" w:right="0" w:firstLine="0"/>
+              <w:jc w:val="center"/>
             </w:pPr>
             <w:r>
+              <w:rPr>
+                <w:w w:val="97.5"/>
+                <w:rFonts w:ascii="Arial" w:hAnsi="Arial" w:eastAsia="Arial"/>
+                <w:b/>
+                <w:i w:val="0"/>
+                <w:color w:val="00008B"/>
+                <w:sz w:val="20"/>
+              </w:rPr>
               <w:t>וחותמת</w:t>
             </w:r>
           </w:p>
         </w:tc>
         <w:tc>
           <w:tcPr>
-            <w:tcW w:type="dxa" w:w="2709"/>
+            <w:tcW w:type="dxa" w:w="4230"/>
+            <w:tcBorders>
+              <w:top w:sz="6.0" w:val="single" w:color="#00008A"/>
+            </w:tcBorders>
+            <w:tcMar>
+              <w:start w:w="0" w:type="dxa"/>
+              <w:end w:w="0" w:type="dxa"/>
+            </w:tcMar>
           </w:tcPr>
           <w:p>
             <w:pPr>
-              <w:bidi w:val="1"/>
+              <w:autoSpaceDN w:val="0"/>
+              <w:autoSpaceDE w:val="0"/>
+              <w:widowControl/>
+              <w:spacing w:line="196" w:lineRule="exact" w:before="168" w:after="0"/>
+              <w:ind w:left="28" w:right="0" w:firstLine="0"/>
+              <w:jc w:val="left"/>
             </w:pPr>
             <w:r>
+              <w:rPr>
+                <w:w w:val="97.5"/>
+                <w:rFonts w:ascii="Arial" w:hAnsi="Arial" w:eastAsia="Arial"/>
+                <w:b/>
+                <w:i w:val="0"/>
+                <w:color w:val="00008B"/>
+                <w:sz w:val="20"/>
+              </w:rPr>
               <w:t>חתימה</w:t>
             </w:r>
           </w:p>
         </w:tc>
         <w:tc>
           <w:tcPr>
-            <w:tcW w:type="dxa" w:w="2709"/>
+            <w:tcW w:type="dxa" w:w="4184"/>
+            <w:tcBorders>
+              <w:top w:sz="6.0" w:val="single" w:color="#00008A"/>
+            </w:tcBorders>
+            <w:tcMar>
+              <w:start w:w="0" w:type="dxa"/>
+              <w:end w:w="0" w:type="dxa"/>
+            </w:tcMar>
           </w:tcPr>
           <w:p>
             <w:pPr>
-              <w:bidi w:val="1"/>
+              <w:autoSpaceDN w:val="0"/>
+              <w:autoSpaceDE w:val="0"/>
+              <w:widowControl/>
+              <w:spacing w:line="196" w:lineRule="exact" w:before="168" w:after="0"/>
+              <w:ind w:left="0" w:right="384" w:firstLine="0"/>
+              <w:jc w:val="right"/>
             </w:pPr>
             <w:r>
+              <w:rPr>
+                <w:w w:val="97.5"/>
+                <w:rFonts w:ascii="Arial" w:hAnsi="Arial" w:eastAsia="Arial"/>
+                <w:b/>
+                <w:i w:val="0"/>
+                <w:color w:val="00008B"/>
+                <w:sz w:val="20"/>
+              </w:rPr>
               <w:t>תאריך</w:t>
             </w:r>
           </w:p>
         </w:tc>
       </w:tr>
     </w:tbl>
+    <w:p>
+      <w:pPr>
+        <w:autoSpaceDN w:val="0"/>
+        <w:autoSpaceDE w:val="0"/>
+        <w:widowControl/>
+        <w:spacing w:line="16" w:lineRule="exact" w:before="0" w:after="42"/>
+        <w:ind w:left="196" w:right="0" w:firstLine="0"/>
+        <w:jc w:val="left"/>
+      </w:pPr>
+      <w:r>
+        <w:rPr>
+          <w:w w:val="75.0"/>
+          <w:rFonts w:ascii="Segoe UI" w:hAnsi="Segoe UI" w:eastAsia="Segoe UI"/>
+          <w:b w:val="0"/>
+          <w:i w:val="0"/>
+          <w:color w:val="FFFFFF"/>
+          <w:sz w:val="2"/>
+        </w:rPr>
+        <w:t xml:space="preserve">ET4D-CV5-ZKC-6R82-449XH </w:t>
+      </w:r>
+    </w:p>
     <w:tbl>
       <w:tblPr>
         <w:tblW w:type="auto" w:w="0"/>
+        <w:tblLayout w:type="fixed"/>
         <w:tblLook w:firstColumn="1" w:firstRow="1" w:lastColumn="0" w:lastRow="0" w:noHBand="0" w:noVBand="1" w:val="04A0"/>
+        <w:tblInd w:w="1772.0" w:type="dxa"/>
       </w:tblPr>
       <w:tblGrid>
         <w:gridCol w:w="985"/>
@@ -878,300 +2398,755 @@
         <w:gridCol w:w="985"/>
       </w:tblGrid>
       <w:tr>
+        <w:trPr>
+          <w:trHeight w:hRule="exact" w:val="616"/>
+        </w:trPr>
         <w:tc>
           <w:tcPr>
-            <w:tcW w:type="dxa" w:w="985"/>
+            <w:tcW w:type="dxa" w:w="2600"/>
+            <w:vMerge w:val="restart"/>
+            <w:tcBorders/>
+            <w:tcMar>
+              <w:start w:w="0" w:type="dxa"/>
+              <w:end w:w="0" w:type="dxa"/>
+            </w:tcMar>
+            <w:tcMar>
+              <w:start w:w="0" w:type="dxa"/>
+              <w:end w:w="0" w:type="dxa"/>
+            </w:tcMar>
           </w:tcPr>
           <w:p>
             <w:pPr>
-              <w:bidi w:val="1"/>
+              <w:autoSpaceDN w:val="0"/>
+              <w:autoSpaceDE w:val="0"/>
+              <w:widowControl/>
+              <w:spacing w:line="196" w:lineRule="exact" w:before="1000" w:after="0"/>
+              <w:ind w:left="0" w:right="30" w:firstLine="0"/>
+              <w:jc w:val="right"/>
             </w:pPr>
             <w:r>
-              <w:t>4ימים.</w:t>
+              <w:rPr>
+                <w:w w:val="97.5"/>
+                <w:rFonts w:ascii="Arial Narrow" w:hAnsi="Arial Narrow" w:eastAsia="Arial Narrow"/>
+                <w:b w:val="0"/>
+                <w:i w:val="0"/>
+                <w:color w:val="000000"/>
+                <w:sz w:val="20"/>
+              </w:rPr>
+              <w:t>4</w:t>
+            </w:r>
+            <w:r>
+              <w:rPr>
+                <w:w w:val="97.5"/>
+                <w:rFonts w:ascii="Arial" w:hAnsi="Arial" w:eastAsia="Arial"/>
+                <w:b/>
+                <w:i w:val="0"/>
+                <w:color w:val="00008B"/>
+                <w:sz w:val="20"/>
+              </w:rPr>
+              <w:t>ימים</w:t>
+            </w:r>
+            <w:r>
+              <w:rPr>
+                <w:w w:val="97.5"/>
+                <w:rFonts w:ascii="Arial" w:hAnsi="Arial" w:eastAsia="Arial"/>
+                <w:b/>
+                <w:i w:val="0"/>
+                <w:color w:val="00008B"/>
+                <w:sz w:val="20"/>
+              </w:rPr>
+              <w:t>.</w:t>
             </w:r>
           </w:p>
         </w:tc>
         <w:tc>
           <w:tcPr>
-            <w:tcW w:type="dxa" w:w="985"/>
+            <w:tcW w:type="dxa" w:w="1900"/>
+            <w:tcBorders/>
+            <w:tcMar>
+              <w:start w:w="0" w:type="dxa"/>
+              <w:end w:w="0" w:type="dxa"/>
+            </w:tcMar>
           </w:tcPr>
           <w:p>
             <w:pPr>
-              <w:bidi w:val="1"/>
+              <w:autoSpaceDN w:val="0"/>
+              <w:autoSpaceDE w:val="0"/>
+              <w:widowControl/>
+              <w:spacing w:line="194" w:lineRule="exact" w:before="42" w:after="0"/>
+              <w:ind w:left="0" w:right="6" w:firstLine="0"/>
+              <w:jc w:val="right"/>
             </w:pPr>
             <w:r>
-              <w:t>הרפואית.</w:t>
+              <w:rPr>
+                <w:w w:val="97.5"/>
+                <w:rFonts w:ascii="Arial" w:hAnsi="Arial" w:eastAsia="Arial"/>
+                <w:b/>
+                <w:i w:val="0"/>
+                <w:color w:val="00008B"/>
+                <w:sz w:val="20"/>
+              </w:rPr>
+              <w:t>הרפואית</w:t>
+            </w:r>
+            <w:r>
+              <w:rPr>
+                <w:w w:val="97.5"/>
+                <w:rFonts w:ascii="Arial" w:hAnsi="Arial" w:eastAsia="Arial"/>
+                <w:b/>
+                <w:i w:val="0"/>
+                <w:color w:val="00008B"/>
+                <w:sz w:val="20"/>
+              </w:rPr>
+              <w:t>.</w:t>
             </w:r>
           </w:p>
         </w:tc>
         <w:tc>
           <w:tcPr>
-            <w:tcW w:type="dxa" w:w="985"/>
+            <w:tcW w:type="dxa" w:w="700"/>
+            <w:gridSpan w:val="2"/>
+            <w:tcBorders/>
+            <w:tcMar>
+              <w:start w:w="0" w:type="dxa"/>
+              <w:end w:w="0" w:type="dxa"/>
+            </w:tcMar>
+            <w:tcMar>
+              <w:start w:w="0" w:type="dxa"/>
+              <w:end w:w="0" w:type="dxa"/>
+            </w:tcMar>
           </w:tcPr>
           <w:p>
             <w:pPr>
-              <w:bidi w:val="1"/>
+              <w:autoSpaceDN w:val="0"/>
+              <w:autoSpaceDE w:val="0"/>
+              <w:widowControl/>
+              <w:spacing w:line="194" w:lineRule="exact" w:before="42" w:after="0"/>
+              <w:ind w:left="0" w:right="0" w:firstLine="0"/>
+              <w:jc w:val="center"/>
             </w:pPr>
             <w:r>
+              <w:rPr>
+                <w:w w:val="97.5"/>
+                <w:rFonts w:ascii="Arial" w:hAnsi="Arial" w:eastAsia="Arial"/>
+                <w:b/>
+                <w:i w:val="0"/>
+                <w:color w:val="00008B"/>
+                <w:sz w:val="20"/>
+              </w:rPr>
               <w:t>ברשומה</w:t>
             </w:r>
           </w:p>
         </w:tc>
         <w:tc>
           <w:tcPr>
-            <w:tcW w:type="dxa" w:w="985"/>
+            <w:tcW w:type="dxa" w:w="700"/>
+            <w:tcBorders/>
+            <w:tcMar>
+              <w:start w:w="0" w:type="dxa"/>
+              <w:end w:w="0" w:type="dxa"/>
+            </w:tcMar>
           </w:tcPr>
           <w:p>
             <w:pPr>
-              <w:bidi w:val="1"/>
+              <w:autoSpaceDN w:val="0"/>
+              <w:autoSpaceDE w:val="0"/>
+              <w:widowControl/>
+              <w:spacing w:line="194" w:lineRule="exact" w:before="42" w:after="0"/>
+              <w:ind w:left="0" w:right="0" w:firstLine="0"/>
+              <w:jc w:val="center"/>
             </w:pPr>
             <w:r>
-              <w:t>ברשומה</w:t>
-            </w:r>
-          </w:p>
-        </w:tc>
-        <w:tc>
-          <w:tcPr>
-            <w:tcW w:type="dxa" w:w="985"/>
-          </w:tcPr>
-          <w:p>
-            <w:pPr>
-              <w:bidi w:val="1"/>
-            </w:pPr>
-            <w:r>
+              <w:rPr>
+                <w:w w:val="97.5"/>
+                <w:rFonts w:ascii="Arial" w:hAnsi="Arial" w:eastAsia="Arial"/>
+                <w:b/>
+                <w:i w:val="0"/>
+                <w:color w:val="00008B"/>
+                <w:sz w:val="20"/>
+              </w:rPr>
               <w:t>מפורטת</w:t>
             </w:r>
           </w:p>
         </w:tc>
         <w:tc>
           <w:tcPr>
-            <w:tcW w:type="dxa" w:w="985"/>
+            <w:tcW w:type="dxa" w:w="1470"/>
+            <w:gridSpan w:val="3"/>
+            <w:tcBorders/>
+            <w:tcMar>
+              <w:start w:w="0" w:type="dxa"/>
+              <w:end w:w="0" w:type="dxa"/>
+            </w:tcMar>
+            <w:tcMar>
+              <w:start w:w="0" w:type="dxa"/>
+              <w:end w:w="0" w:type="dxa"/>
+            </w:tcMar>
+            <w:tcMar>
+              <w:start w:w="0" w:type="dxa"/>
+              <w:end w:w="0" w:type="dxa"/>
+            </w:tcMar>
           </w:tcPr>
           <w:p>
             <w:pPr>
-              <w:bidi w:val="1"/>
+              <w:autoSpaceDN w:val="0"/>
+              <w:autoSpaceDE w:val="0"/>
+              <w:widowControl/>
+              <w:spacing w:line="194" w:lineRule="exact" w:before="42" w:after="0"/>
+              <w:ind w:left="0" w:right="0" w:firstLine="0"/>
+              <w:jc w:val="center"/>
             </w:pPr>
             <w:r>
-              <w:t>חלה/תה ,האבחנה</w:t>
+              <w:rPr>
+                <w:w w:val="97.5"/>
+                <w:rFonts w:ascii="Arial" w:hAnsi="Arial" w:eastAsia="Arial"/>
+                <w:b/>
+                <w:i w:val="0"/>
+                <w:color w:val="00008B"/>
+                <w:sz w:val="20"/>
+              </w:rPr>
+              <w:t>חלה</w:t>
+            </w:r>
+            <w:r>
+              <w:rPr>
+                <w:w w:val="97.5"/>
+                <w:rFonts w:ascii="Arial" w:hAnsi="Arial" w:eastAsia="Arial"/>
+                <w:b/>
+                <w:i w:val="0"/>
+                <w:color w:val="00008B"/>
+                <w:sz w:val="20"/>
+              </w:rPr>
+              <w:t>/</w:t>
+            </w:r>
+            <w:r>
+              <w:rPr>
+                <w:w w:val="97.5"/>
+                <w:rFonts w:ascii="Arial" w:hAnsi="Arial" w:eastAsia="Arial"/>
+                <w:b/>
+                <w:i w:val="0"/>
+                <w:color w:val="00008B"/>
+                <w:sz w:val="20"/>
+              </w:rPr>
+              <w:t>תה</w:t>
+            </w:r>
+            <w:r>
+              <w:rPr>
+                <w:w w:val="97.5"/>
+                <w:rFonts w:ascii="Arial" w:hAnsi="Arial" w:eastAsia="Arial"/>
+                <w:b/>
+                <w:i w:val="0"/>
+                <w:color w:val="00008B"/>
+                <w:sz w:val="20"/>
+              </w:rPr>
+              <w:t xml:space="preserve"> ,</w:t>
+            </w:r>
+            <w:r>
+              <w:rPr>
+                <w:w w:val="97.5"/>
+                <w:rFonts w:ascii="Arial" w:hAnsi="Arial" w:eastAsia="Arial"/>
+                <w:b/>
+                <w:i w:val="0"/>
+                <w:color w:val="00008B"/>
+                <w:sz w:val="20"/>
+              </w:rPr>
+              <w:t>האבחנה</w:t>
             </w:r>
           </w:p>
         </w:tc>
         <w:tc>
           <w:tcPr>
-            <w:tcW w:type="dxa" w:w="985"/>
+            <w:tcW w:type="dxa" w:w="410"/>
+            <w:tcBorders/>
+            <w:tcMar>
+              <w:start w:w="0" w:type="dxa"/>
+              <w:end w:w="0" w:type="dxa"/>
+            </w:tcMar>
           </w:tcPr>
           <w:p>
             <w:pPr>
-              <w:bidi w:val="1"/>
+              <w:autoSpaceDN w:val="0"/>
+              <w:autoSpaceDE w:val="0"/>
+              <w:widowControl/>
+              <w:spacing w:line="194" w:lineRule="exact" w:before="42" w:after="0"/>
+              <w:ind w:left="0" w:right="0" w:firstLine="0"/>
+              <w:jc w:val="center"/>
             </w:pPr>
             <w:r>
-              <w:t>חלה/תה ,האבחנה</w:t>
+              <w:rPr>
+                <w:w w:val="97.5"/>
+                <w:rFonts w:ascii="Arial" w:hAnsi="Arial" w:eastAsia="Arial"/>
+                <w:b/>
+                <w:i w:val="0"/>
+                <w:color w:val="00008B"/>
+                <w:sz w:val="20"/>
+              </w:rPr>
+              <w:t>הנ</w:t>
+            </w:r>
+            <w:r>
+              <w:rPr>
+                <w:w w:val="97.5"/>
+                <w:rFonts w:ascii="Arial" w:hAnsi="Arial" w:eastAsia="Arial"/>
+                <w:b/>
+                <w:i w:val="0"/>
+                <w:color w:val="00008B"/>
+                <w:sz w:val="20"/>
+              </w:rPr>
+              <w:t>"</w:t>
+            </w:r>
+            <w:r>
+              <w:rPr>
+                <w:w w:val="97.5"/>
+                <w:rFonts w:ascii="Arial" w:hAnsi="Arial" w:eastAsia="Arial"/>
+                <w:b/>
+                <w:i w:val="0"/>
+                <w:color w:val="00008B"/>
+                <w:sz w:val="20"/>
+              </w:rPr>
+              <w:t>ל</w:t>
             </w:r>
           </w:p>
         </w:tc>
         <w:tc>
           <w:tcPr>
-            <w:tcW w:type="dxa" w:w="985"/>
+            <w:tcW w:type="dxa" w:w="700"/>
+            <w:tcBorders/>
+            <w:tcMar>
+              <w:start w:w="0" w:type="dxa"/>
+              <w:end w:w="0" w:type="dxa"/>
+            </w:tcMar>
           </w:tcPr>
           <w:p>
             <w:pPr>
-              <w:bidi w:val="1"/>
+              <w:autoSpaceDN w:val="0"/>
+              <w:autoSpaceDE w:val="0"/>
+              <w:widowControl/>
+              <w:spacing w:line="194" w:lineRule="exact" w:before="42" w:after="0"/>
+              <w:ind w:left="0" w:right="0" w:firstLine="0"/>
+              <w:jc w:val="center"/>
             </w:pPr>
             <w:r>
-              <w:t>חלה/תה ,האבחנה</w:t>
-            </w:r>
-          </w:p>
-        </w:tc>
-        <w:tc>
-          <w:tcPr>
-            <w:tcW w:type="dxa" w:w="985"/>
-          </w:tcPr>
-          <w:p>
-            <w:pPr>
-              <w:bidi w:val="1"/>
-            </w:pPr>
-            <w:r>
-              <w:t>הנ"ל</w:t>
-            </w:r>
-          </w:p>
-        </w:tc>
-        <w:tc>
-          <w:tcPr>
-            <w:tcW w:type="dxa" w:w="985"/>
-          </w:tcPr>
-          <w:p>
-            <w:pPr>
-              <w:bidi w:val="1"/>
-            </w:pPr>
-            <w:r>
+              <w:rPr>
+                <w:w w:val="97.5"/>
+                <w:rFonts w:ascii="Arial" w:hAnsi="Arial" w:eastAsia="Arial"/>
+                <w:b/>
+                <w:i w:val="0"/>
+                <w:color w:val="00008B"/>
+                <w:sz w:val="20"/>
+              </w:rPr>
               <w:t>כי רשאל</w:t>
             </w:r>
           </w:p>
         </w:tc>
         <w:tc>
           <w:tcPr>
-            <w:tcW w:type="dxa" w:w="985"/>
+            <w:tcW w:type="dxa" w:w="540"/>
+            <w:tcBorders/>
+            <w:tcMar>
+              <w:start w:w="0" w:type="dxa"/>
+              <w:end w:w="0" w:type="dxa"/>
+            </w:tcMar>
           </w:tcPr>
           <w:p>
             <w:pPr>
-              <w:bidi w:val="1"/>
+              <w:autoSpaceDN w:val="0"/>
+              <w:autoSpaceDE w:val="0"/>
+              <w:widowControl/>
+              <w:spacing w:line="194" w:lineRule="exact" w:before="42" w:after="0"/>
+              <w:ind w:left="16" w:right="0" w:firstLine="0"/>
+              <w:jc w:val="left"/>
             </w:pPr>
             <w:r>
+              <w:rPr>
+                <w:w w:val="97.5"/>
+                <w:rFonts w:ascii="Arial" w:hAnsi="Arial" w:eastAsia="Arial"/>
+                <w:b/>
+                <w:i w:val="0"/>
+                <w:color w:val="00008B"/>
+                <w:sz w:val="20"/>
+              </w:rPr>
               <w:t>הנני</w:t>
             </w:r>
           </w:p>
         </w:tc>
       </w:tr>
       <w:tr>
+        <w:trPr>
+          <w:trHeight w:hRule="exact" w:val="620"/>
+        </w:trPr>
         <w:tc>
           <w:tcPr>
             <w:tcW w:type="dxa" w:w="985"/>
+            <w:vMerge/>
+            <w:tcBorders/>
+          </w:tcPr>
+          <w:p/>
+        </w:tc>
+        <w:tc>
+          <w:tcPr>
+            <w:tcW w:type="dxa" w:w="1900"/>
+            <w:tcBorders/>
+            <w:tcMar>
+              <w:start w:w="0" w:type="dxa"/>
+              <w:end w:w="0" w:type="dxa"/>
+            </w:tcMar>
           </w:tcPr>
           <w:p>
             <w:pPr>
-              <w:bidi w:val="1"/>
+              <w:autoSpaceDN w:val="0"/>
+              <w:autoSpaceDE w:val="0"/>
+              <w:widowControl/>
+              <w:spacing w:line="196" w:lineRule="exact" w:before="384" w:after="0"/>
+              <w:ind w:left="62" w:right="0" w:firstLine="0"/>
+              <w:jc w:val="left"/>
             </w:pPr>
             <w:r>
-              <w:t>4ימים.</w:t>
+              <w:rPr>
+                <w:w w:val="97.5"/>
+                <w:rFonts w:ascii="Arial Narrow" w:hAnsi="Arial Narrow" w:eastAsia="Arial Narrow"/>
+                <w:b w:val="0"/>
+                <w:i w:val="0"/>
+                <w:color w:val="000000"/>
+                <w:sz w:val="20"/>
+              </w:rPr>
+              <w:t>27/08/2026</w:t>
+            </w:r>
+            <w:r>
+              <w:rPr>
+                <w:w w:val="97.5"/>
+                <w:rFonts w:ascii="Arial" w:hAnsi="Arial" w:eastAsia="Arial"/>
+                <w:b/>
+                <w:i w:val="0"/>
+                <w:color w:val="00008B"/>
+                <w:sz w:val="20"/>
+              </w:rPr>
+              <w:t>סה</w:t>
+            </w:r>
+            <w:r>
+              <w:rPr>
+                <w:w w:val="97.5"/>
+                <w:rFonts w:ascii="Arial" w:hAnsi="Arial" w:eastAsia="Arial"/>
+                <w:b/>
+                <w:i w:val="0"/>
+                <w:color w:val="00008B"/>
+                <w:sz w:val="20"/>
+              </w:rPr>
+              <w:t>"</w:t>
+            </w:r>
+            <w:r>
+              <w:rPr>
+                <w:w w:val="97.5"/>
+                <w:rFonts w:ascii="Arial" w:hAnsi="Arial" w:eastAsia="Arial"/>
+                <w:b/>
+                <w:i w:val="0"/>
+                <w:color w:val="00008B"/>
+                <w:sz w:val="20"/>
+              </w:rPr>
+              <w:t>כ</w:t>
+            </w:r>
+            <w:r>
+              <w:rPr>
+                <w:w w:val="97.5"/>
+                <w:rFonts w:ascii="Arial" w:hAnsi="Arial" w:eastAsia="Arial"/>
+                <w:b/>
+                <w:i w:val="0"/>
+                <w:color w:val="00008B"/>
+                <w:sz w:val="20"/>
+              </w:rPr>
+              <w:t>:</w:t>
             </w:r>
           </w:p>
         </w:tc>
         <w:tc>
           <w:tcPr>
-            <w:tcW w:type="dxa" w:w="985"/>
+            <w:tcW w:type="dxa" w:w="460"/>
+            <w:tcBorders/>
+            <w:tcMar>
+              <w:start w:w="0" w:type="dxa"/>
+              <w:end w:w="0" w:type="dxa"/>
+            </w:tcMar>
           </w:tcPr>
           <w:p>
             <w:pPr>
-              <w:bidi w:val="1"/>
+              <w:autoSpaceDN w:val="0"/>
+              <w:autoSpaceDE w:val="0"/>
+              <w:widowControl/>
+              <w:spacing w:line="196" w:lineRule="exact" w:before="384" w:after="0"/>
+              <w:ind w:left="0" w:right="22" w:firstLine="0"/>
+              <w:jc w:val="right"/>
             </w:pPr>
             <w:r>
-              <w:t>27/08/2026סה"כ:</w:t>
+              <w:rPr>
+                <w:w w:val="97.5"/>
+                <w:rFonts w:ascii="Arial" w:hAnsi="Arial" w:eastAsia="Arial"/>
+                <w:b/>
+                <w:i w:val="0"/>
+                <w:color w:val="00008B"/>
+                <w:sz w:val="20"/>
+              </w:rPr>
+              <w:t>יום</w:t>
+            </w:r>
+            <w:r>
+              <w:rPr>
+                <w:w w:val="97.5"/>
+                <w:rFonts w:ascii="Arial" w:hAnsi="Arial" w:eastAsia="Arial"/>
+                <w:b/>
+                <w:i w:val="0"/>
+                <w:color w:val="00008B"/>
+                <w:sz w:val="20"/>
+              </w:rPr>
+              <w:t>:</w:t>
             </w:r>
           </w:p>
         </w:tc>
         <w:tc>
           <w:tcPr>
-            <w:tcW w:type="dxa" w:w="985"/>
+            <w:tcW w:type="dxa" w:w="1700"/>
+            <w:gridSpan w:val="3"/>
+            <w:tcBorders/>
+            <w:tcMar>
+              <w:start w:w="0" w:type="dxa"/>
+              <w:end w:w="0" w:type="dxa"/>
+            </w:tcMar>
+            <w:tcMar>
+              <w:start w:w="0" w:type="dxa"/>
+              <w:end w:w="0" w:type="dxa"/>
+            </w:tcMar>
+            <w:tcMar>
+              <w:start w:w="0" w:type="dxa"/>
+              <w:end w:w="0" w:type="dxa"/>
+            </w:tcMar>
           </w:tcPr>
           <w:p>
             <w:pPr>
-              <w:bidi w:val="1"/>
+              <w:autoSpaceDN w:val="0"/>
+              <w:autoSpaceDE w:val="0"/>
+              <w:widowControl/>
+              <w:spacing w:line="196" w:lineRule="exact" w:before="384" w:after="0"/>
+              <w:ind w:left="22" w:right="0" w:firstLine="0"/>
+              <w:jc w:val="left"/>
             </w:pPr>
             <w:r>
-              <w:t>יום:</w:t>
+              <w:rPr>
+                <w:w w:val="97.5"/>
+                <w:rFonts w:ascii="Arial Narrow" w:hAnsi="Arial Narrow" w:eastAsia="Arial Narrow"/>
+                <w:b w:val="0"/>
+                <w:i w:val="0"/>
+                <w:color w:val="000000"/>
+                <w:sz w:val="20"/>
+              </w:rPr>
+              <w:t>24/08/2026</w:t>
+            </w:r>
+            <w:r>
+              <w:rPr>
+                <w:w w:val="97.5"/>
+                <w:rFonts w:ascii="Arial" w:hAnsi="Arial" w:eastAsia="Arial"/>
+                <w:b/>
+                <w:i w:val="0"/>
+                <w:color w:val="00008B"/>
+                <w:sz w:val="20"/>
+              </w:rPr>
+              <w:t>עד</w:t>
             </w:r>
           </w:p>
         </w:tc>
         <w:tc>
           <w:tcPr>
-            <w:tcW w:type="dxa" w:w="985"/>
+            <w:tcW w:type="dxa" w:w="660"/>
+            <w:tcBorders/>
+            <w:tcMar>
+              <w:start w:w="0" w:type="dxa"/>
+              <w:end w:w="0" w:type="dxa"/>
+            </w:tcMar>
           </w:tcPr>
           <w:p>
             <w:pPr>
-              <w:bidi w:val="1"/>
+              <w:autoSpaceDN w:val="0"/>
+              <w:autoSpaceDE w:val="0"/>
+              <w:widowControl/>
+              <w:spacing w:line="196" w:lineRule="exact" w:before="384" w:after="0"/>
+              <w:ind w:left="0" w:right="56" w:firstLine="0"/>
+              <w:jc w:val="right"/>
             </w:pPr>
             <w:r>
-              <w:t>24/08/2026עד</w:t>
+              <w:rPr>
+                <w:w w:val="97.5"/>
+                <w:rFonts w:ascii="Arial" w:hAnsi="Arial" w:eastAsia="Arial"/>
+                <w:b/>
+                <w:i w:val="0"/>
+                <w:color w:val="00008B"/>
+                <w:sz w:val="20"/>
+              </w:rPr>
+              <w:t>מיום</w:t>
+            </w:r>
+            <w:r>
+              <w:rPr>
+                <w:w w:val="97.5"/>
+                <w:rFonts w:ascii="Arial" w:hAnsi="Arial" w:eastAsia="Arial"/>
+                <w:b/>
+                <w:i w:val="0"/>
+                <w:color w:val="00008B"/>
+                <w:sz w:val="20"/>
+              </w:rPr>
+              <w:t>:</w:t>
             </w:r>
           </w:p>
         </w:tc>
         <w:tc>
           <w:tcPr>
-            <w:tcW w:type="dxa" w:w="985"/>
+            <w:tcW w:type="dxa" w:w="460"/>
+            <w:gridSpan w:val="2"/>
+            <w:tcBorders/>
+            <w:tcMar>
+              <w:start w:w="0" w:type="dxa"/>
+              <w:end w:w="0" w:type="dxa"/>
+            </w:tcMar>
+            <w:tcMar>
+              <w:start w:w="0" w:type="dxa"/>
+              <w:end w:w="0" w:type="dxa"/>
+            </w:tcMar>
           </w:tcPr>
           <w:p>
             <w:pPr>
-              <w:bidi w:val="1"/>
+              <w:autoSpaceDN w:val="0"/>
+              <w:autoSpaceDE w:val="0"/>
+              <w:widowControl/>
+              <w:spacing w:line="196" w:lineRule="exact" w:before="384" w:after="0"/>
+              <w:ind w:left="0" w:right="0" w:firstLine="0"/>
+              <w:jc w:val="center"/>
             </w:pPr>
             <w:r>
-              <w:t>24/08/2026עד</w:t>
-            </w:r>
-          </w:p>
-        </w:tc>
-        <w:tc>
-          <w:tcPr>
-            <w:tcW w:type="dxa" w:w="985"/>
-          </w:tcPr>
-          <w:p>
-            <w:pPr>
-              <w:bidi w:val="1"/>
-            </w:pPr>
-            <w:r>
-              <w:t>24/08/2026עד</w:t>
-            </w:r>
-          </w:p>
-        </w:tc>
-        <w:tc>
-          <w:tcPr>
-            <w:tcW w:type="dxa" w:w="985"/>
-          </w:tcPr>
-          <w:p>
-            <w:pPr>
-              <w:bidi w:val="1"/>
-            </w:pPr>
-            <w:r>
-              <w:t>מיום:</w:t>
-            </w:r>
-          </w:p>
-        </w:tc>
-        <w:tc>
-          <w:tcPr>
-            <w:tcW w:type="dxa" w:w="985"/>
-          </w:tcPr>
-          <w:p>
-            <w:pPr>
-              <w:bidi w:val="1"/>
-            </w:pPr>
-            <w:r>
+              <w:rPr>
+                <w:w w:val="97.5"/>
+                <w:rFonts w:ascii="Arial" w:hAnsi="Arial" w:eastAsia="Arial"/>
+                <w:b/>
+                <w:i w:val="0"/>
+                <w:color w:val="00008B"/>
+                <w:sz w:val="20"/>
+              </w:rPr>
               <w:t>לעבוד</w:t>
             </w:r>
           </w:p>
         </w:tc>
         <w:tc>
           <w:tcPr>
-            <w:tcW w:type="dxa" w:w="985"/>
+            <w:tcW w:type="dxa" w:w="700"/>
+            <w:tcBorders/>
+            <w:tcMar>
+              <w:start w:w="0" w:type="dxa"/>
+              <w:end w:w="0" w:type="dxa"/>
+            </w:tcMar>
           </w:tcPr>
           <w:p>
             <w:pPr>
-              <w:bidi w:val="1"/>
+              <w:autoSpaceDN w:val="0"/>
+              <w:autoSpaceDE w:val="0"/>
+              <w:widowControl/>
+              <w:spacing w:line="196" w:lineRule="exact" w:before="384" w:after="0"/>
+              <w:ind w:left="0" w:right="0" w:firstLine="0"/>
+              <w:jc w:val="center"/>
             </w:pPr>
             <w:r>
-              <w:t>לעבוד</w:t>
+              <w:rPr>
+                <w:w w:val="97.5"/>
+                <w:rFonts w:ascii="Arial" w:hAnsi="Arial" w:eastAsia="Arial"/>
+                <w:b/>
+                <w:i w:val="0"/>
+                <w:color w:val="00008B"/>
+                <w:sz w:val="20"/>
+              </w:rPr>
+              <w:t>מסוגל</w:t>
+            </w:r>
+            <w:r>
+              <w:rPr>
+                <w:w w:val="97.5"/>
+                <w:rFonts w:ascii="Arial" w:hAnsi="Arial" w:eastAsia="Arial"/>
+                <w:b/>
+                <w:i w:val="0"/>
+                <w:color w:val="00008B"/>
+                <w:sz w:val="20"/>
+              </w:rPr>
+              <w:t>/</w:t>
+            </w:r>
+            <w:r>
+              <w:rPr>
+                <w:w w:val="97.5"/>
+                <w:rFonts w:ascii="Arial" w:hAnsi="Arial" w:eastAsia="Arial"/>
+                <w:b/>
+                <w:i w:val="0"/>
+                <w:color w:val="00008B"/>
+                <w:sz w:val="20"/>
+              </w:rPr>
+              <w:t>ת</w:t>
             </w:r>
           </w:p>
         </w:tc>
         <w:tc>
           <w:tcPr>
-            <w:tcW w:type="dxa" w:w="985"/>
+            <w:tcW w:type="dxa" w:w="540"/>
+            <w:tcBorders/>
+            <w:tcMar>
+              <w:start w:w="0" w:type="dxa"/>
+              <w:end w:w="0" w:type="dxa"/>
+            </w:tcMar>
           </w:tcPr>
           <w:p>
             <w:pPr>
-              <w:bidi w:val="1"/>
+              <w:autoSpaceDN w:val="0"/>
+              <w:autoSpaceDE w:val="0"/>
+              <w:widowControl/>
+              <w:spacing w:line="196" w:lineRule="exact" w:before="384" w:after="0"/>
+              <w:ind w:left="0" w:right="0" w:firstLine="0"/>
+              <w:jc w:val="center"/>
             </w:pPr>
             <w:r>
-              <w:t>מסוגל/ת</w:t>
+              <w:rPr>
+                <w:w w:val="97.5"/>
+                <w:rFonts w:ascii="Arial" w:hAnsi="Arial" w:eastAsia="Arial"/>
+                <w:b/>
+                <w:i w:val="0"/>
+                <w:color w:val="00008B"/>
+                <w:sz w:val="20"/>
+              </w:rPr>
+              <w:t>אינו</w:t>
             </w:r>
-          </w:p>
-        </w:tc>
-        <w:tc>
-          <w:tcPr>
-            <w:tcW w:type="dxa" w:w="985"/>
-          </w:tcPr>
-          <w:p>
-            <w:pPr>
-              <w:bidi w:val="1"/>
-            </w:pPr>
             <w:r>
-              <w:t>אינו/ה</w:t>
+              <w:rPr>
+                <w:w w:val="97.5"/>
+                <w:rFonts w:ascii="Arial" w:hAnsi="Arial" w:eastAsia="Arial"/>
+                <w:b/>
+                <w:i w:val="0"/>
+                <w:color w:val="00008B"/>
+                <w:sz w:val="20"/>
+              </w:rPr>
+              <w:t>/</w:t>
+            </w:r>
+            <w:r>
+              <w:rPr>
+                <w:w w:val="97.5"/>
+                <w:rFonts w:ascii="Arial" w:hAnsi="Arial" w:eastAsia="Arial"/>
+                <w:b/>
+                <w:i w:val="0"/>
+                <w:color w:val="00008B"/>
+                <w:sz w:val="20"/>
+              </w:rPr>
+              <w:t>ה</w:t>
             </w:r>
           </w:p>
         </w:tc>
       </w:tr>
     </w:tbl>
+    <w:p>
+      <w:pPr>
+        <w:autoSpaceDN w:val="0"/>
+        <w:autoSpaceDE w:val="0"/>
+        <w:widowControl/>
+        <w:spacing w:line="14" w:lineRule="exact" w:before="0" w:after="0"/>
+        <w:ind w:left="0" w:right="0"/>
+      </w:pPr>
+    </w:p>
     <w:sectPr>
       <w:pgSz w:w="11905" w:h="16838"/>
       <w:pgMar w:top="188" w:right="662" w:bottom="1440" w:left="408" w:header="720" w:footer="720" w:gutter="0"/>
-      <w:cols w:space="720"/>
+      <w:cols/>
       <w:docGrid w:linePitch="360"/>
     </w:sectPr>
   </w:body>

</xml_diff>

<commit_message>
Add Word PDF output organizer and structured certificate template
Co-authored-by: Ron Gurfinkel <RonBabaj@users.noreply.github.com>
</commit_message>
<xml_diff>
--- a/exports/medical_certificate.docx
+++ b/exports/medical_certificate.docx
@@ -2,725 +2,156 @@
 <file path=word/document.xml><?xml version="1.0" encoding="utf-8"?>
 <w:document xmlns:wpc="http://schemas.microsoft.com/office/word/2010/wordprocessingCanvas" xmlns:mo="http://schemas.microsoft.com/office/mac/office/2008/main" xmlns:mc="http://schemas.openxmlformats.org/markup-compatibility/2006" xmlns:mv="urn:schemas-microsoft-com:mac:vml" xmlns:o="urn:schemas-microsoft-com:office:office" xmlns:r="http://schemas.openxmlformats.org/officeDocument/2006/relationships" xmlns:m="http://schemas.openxmlformats.org/officeDocument/2006/math" xmlns:v="urn:schemas-microsoft-com:vml" xmlns:wp14="http://schemas.microsoft.com/office/word/2010/wordprocessingDrawing" xmlns:wp="http://schemas.openxmlformats.org/drawingml/2006/wordprocessingDrawing" xmlns:w10="urn:schemas-microsoft-com:office:word" xmlns:w="http://schemas.openxmlformats.org/wordprocessingml/2006/main" xmlns:w14="http://schemas.microsoft.com/office/word/2010/wordml" xmlns:wpg="http://schemas.microsoft.com/office/word/2010/wordprocessingGroup" xmlns:wpi="http://schemas.microsoft.com/office/word/2010/wordprocessingInk" xmlns:wne="http://schemas.microsoft.com/office/word/2006/wordml" xmlns:wps="http://schemas.microsoft.com/office/word/2010/wordprocessingShape" mc:Ignorable="w14 wp14">
   <w:body>
-    <w:p>
-      <w:pPr>
-        <w:autoSpaceDN w:val="0"/>
-        <w:autoSpaceDE w:val="0"/>
-        <w:widowControl/>
-        <w:spacing w:line="186" w:lineRule="exact" w:before="0" w:after="0"/>
-        <w:ind w:left="0" w:right="0"/>
-      </w:pPr>
-    </w:p>
     <w:tbl>
       <w:tblPr>
         <w:tblW w:type="auto" w:w="0"/>
-        <w:tblLayout w:type="fixed"/>
+        <w:jc w:val="center"/>
         <w:tblLook w:firstColumn="1" w:firstRow="1" w:lastColumn="0" w:lastRow="0" w:noHBand="0" w:noVBand="1" w:val="04A0"/>
-        <w:tblInd w:w="92.00000000000003" w:type="dxa"/>
       </w:tblPr>
       <w:tblGrid>
-        <w:gridCol w:w="1083"/>
-        <w:gridCol w:w="1083"/>
-        <w:gridCol w:w="1083"/>
-        <w:gridCol w:w="1083"/>
-        <w:gridCol w:w="1083"/>
-        <w:gridCol w:w="1083"/>
-        <w:gridCol w:w="1083"/>
-        <w:gridCol w:w="1083"/>
-        <w:gridCol w:w="1083"/>
-        <w:gridCol w:w="1083"/>
+        <w:gridCol w:w="3213"/>
+        <w:gridCol w:w="3213"/>
+        <w:gridCol w:w="3213"/>
       </w:tblGrid>
       <w:tr>
-        <w:trPr>
-          <w:trHeight w:hRule="exact" w:val="266"/>
-        </w:trPr>
         <w:tc>
           <w:tcPr>
-            <w:tcW w:type="dxa" w:w="920"/>
-            <w:vMerge w:val="restart"/>
-            <w:tcBorders/>
-            <w:tcMar>
-              <w:start w:w="0" w:type="dxa"/>
-              <w:end w:w="0" w:type="dxa"/>
-            </w:tcMar>
-            <w:tcMar>
-              <w:start w:w="0" w:type="dxa"/>
-              <w:end w:w="0" w:type="dxa"/>
-            </w:tcMar>
-            <w:tcMar>
-              <w:start w:w="0" w:type="dxa"/>
-              <w:end w:w="0" w:type="dxa"/>
-            </w:tcMar>
+            <w:tcW w:type="dxa" w:w="3213"/>
+            <w:tcBorders>
+              <w:top w:val="nil" w:sz="8" w:space="0" w:color="003399"/>
+              <w:bottom w:val="nil" w:sz="8" w:space="0" w:color="003399"/>
+              <w:left w:val="nil" w:sz="8" w:space="0" w:color="003399"/>
+              <w:right w:val="nil" w:sz="8" w:space="0" w:color="003399"/>
+            </w:tcBorders>
           </w:tcPr>
           <w:p>
             <w:pPr>
-              <w:autoSpaceDN w:val="0"/>
-              <w:autoSpaceDE w:val="0"/>
-              <w:widowControl/>
-              <w:spacing w:line="194" w:lineRule="exact" w:before="0" w:after="0"/>
-              <w:ind w:left="106" w:right="0" w:firstLine="0"/>
-              <w:jc w:val="left"/>
+              <w:bidi w:val="1"/>
+              <w:jc w:val="right"/>
             </w:pPr>
             <w:r>
               <w:rPr>
-                <w:w w:val="97.5"/>
-                <w:rFonts w:ascii="Arial Narrow" w:hAnsi="Arial Narrow" w:eastAsia="Arial Narrow"/>
+                <w:rFonts w:ascii="Arial" w:hAnsi="Arial" w:cs="Arial"/>
                 <w:b w:val="0"/>
-                <w:i w:val="0"/>
-                <w:color w:val="000000"/>
+                <w:color w:val="003399"/>
                 <w:sz w:val="20"/>
+                <w:u w:val="none"/>
               </w:rPr>
-              <w:t>31/08/2026</w:t>
+              <w:t>דר' קגנוביץ גלינה</w:t>
+            </w:r>
+          </w:p>
+          <w:p>
+            <w:pPr>
+              <w:bidi w:val="1"/>
+              <w:jc w:val="right"/>
+            </w:pPr>
+            <w:r>
+              <w:rPr>
+                <w:rFonts w:ascii="Arial" w:hAnsi="Arial" w:cs="Arial"/>
+                <w:b w:val="0"/>
+                <w:color w:val="003399"/>
+                <w:sz w:val="20"/>
+                <w:u w:val="none"/>
+              </w:rPr>
+              <w:t>משפחה, פנימית וכללית</w:t>
             </w:r>
           </w:p>
         </w:tc>
         <w:tc>
           <w:tcPr>
-            <w:tcW w:type="dxa" w:w="782"/>
+            <w:tcW w:type="dxa" w:w="3213"/>
             <w:tcBorders>
-              <w:end w:sz="5.600000000000023" w:val="single" w:color="#000000"/>
+              <w:top w:val="nil" w:sz="8" w:space="0" w:color="003399"/>
+              <w:bottom w:val="nil" w:sz="8" w:space="0" w:color="003399"/>
+              <w:left w:val="nil" w:sz="8" w:space="0" w:color="003399"/>
+              <w:right w:val="nil" w:sz="8" w:space="0" w:color="003399"/>
             </w:tcBorders>
-            <w:tcMar>
-              <w:start w:w="0" w:type="dxa"/>
-              <w:end w:w="0" w:type="dxa"/>
-            </w:tcMar>
           </w:tcPr>
           <w:p>
             <w:pPr>
-              <w:autoSpaceDN w:val="0"/>
-              <w:autoSpaceDE w:val="0"/>
-              <w:widowControl/>
-              <w:spacing w:line="194" w:lineRule="exact" w:before="0" w:after="0"/>
-              <w:ind w:left="30" w:right="0" w:firstLine="0"/>
-              <w:jc w:val="left"/>
+              <w:jc w:val="center"/>
             </w:pPr>
             <w:r>
               <w:rPr>
-                <w:w w:val="97.5"/>
-                <w:rFonts w:ascii="Arial" w:hAnsi="Arial" w:eastAsia="Arial"/>
+                <w:rFonts w:ascii="Arial" w:hAnsi="Arial" w:cs="Arial"/>
                 <w:b/>
-                <w:i w:val="0"/>
-                <w:color w:val="00008B"/>
-                <w:sz w:val="20"/>
+                <w:color w:val="003399"/>
+                <w:sz w:val="28"/>
+                <w:u w:val="none"/>
               </w:rPr>
-              <w:t>תאריך</w:t>
+              <w:t>מכבי</w:t>
             </w:r>
+          </w:p>
+          <w:p>
+            <w:pPr>
+              <w:jc w:val="center"/>
+            </w:pPr>
             <w:r>
               <w:rPr>
-                <w:w w:val="97.5"/>
-                <w:rFonts w:ascii="Arial" w:hAnsi="Arial" w:eastAsia="Arial"/>
+                <w:rFonts w:ascii="Arial" w:hAnsi="Arial" w:cs="Arial"/>
                 <w:b/>
-                <w:i w:val="0"/>
-                <w:color w:val="00008B"/>
-                <w:sz w:val="20"/>
+                <w:color w:val="003399"/>
+                <w:sz w:val="28"/>
+                <w:u w:val="none"/>
               </w:rPr>
-              <w:t>:</w:t>
+              <w:t>שירותי בריאות</w:t>
             </w:r>
           </w:p>
         </w:tc>
         <w:tc>
           <w:tcPr>
-            <w:tcW w:type="dxa" w:w="314"/>
-            <w:vMerge w:val="restart"/>
+            <w:tcW w:type="dxa" w:w="3213"/>
             <w:tcBorders>
-              <w:start w:sz="5.600000000000023" w:val="single" w:color="#000000"/>
-              <w:end w:sz="6.399999999999977" w:val="single" w:color="#000000"/>
+              <w:top w:val="nil" w:sz="8" w:space="0" w:color="003399"/>
+              <w:bottom w:val="nil" w:sz="8" w:space="0" w:color="003399"/>
+              <w:left w:val="nil" w:sz="8" w:space="0" w:color="003399"/>
+              <w:right w:val="nil" w:sz="8" w:space="0" w:color="003399"/>
             </w:tcBorders>
-            <w:tcMar>
-              <w:start w:w="0" w:type="dxa"/>
-              <w:end w:w="0" w:type="dxa"/>
-            </w:tcMar>
-            <w:tcMar>
-              <w:start w:w="0" w:type="dxa"/>
-              <w:end w:w="0" w:type="dxa"/>
-            </w:tcMar>
-            <w:tcMar>
-              <w:start w:w="0" w:type="dxa"/>
-              <w:end w:w="0" w:type="dxa"/>
-            </w:tcMar>
           </w:tcPr>
           <w:p>
             <w:pPr>
-              <w:autoSpaceDN w:val="0"/>
-              <w:autoSpaceDE w:val="0"/>
-              <w:widowControl/>
-              <w:spacing w:line="166" w:lineRule="exact" w:before="360" w:after="0"/>
-              <w:ind w:left="0" w:right="0" w:firstLine="0"/>
-              <w:jc w:val="center"/>
-            </w:pPr>
-            <w:r>
-              <w:rPr>
-                <w:w w:val="103.125"/>
-                <w:rFonts w:ascii="Arial" w:hAnsi="Arial" w:eastAsia="Arial"/>
-                <w:b w:val="0"/>
-                <w:i w:val="0"/>
-                <w:color w:val="00008B"/>
-                <w:sz w:val="16"/>
-              </w:rPr>
-              <w:t>גורם</w:t>
-            </w:r>
-          </w:p>
-        </w:tc>
-        <w:tc>
-          <w:tcPr>
-            <w:tcW w:type="dxa" w:w="256"/>
-            <w:vMerge w:val="restart"/>
-            <w:tcBorders>
-              <w:start w:sz="6.399999999999977" w:val="single" w:color="#000000"/>
-              <w:end w:sz="5.600000000000136" w:val="single" w:color="#000000"/>
-            </w:tcBorders>
-            <w:tcMar>
-              <w:start w:w="0" w:type="dxa"/>
-              <w:end w:w="0" w:type="dxa"/>
-            </w:tcMar>
-            <w:tcMar>
-              <w:start w:w="0" w:type="dxa"/>
-              <w:end w:w="0" w:type="dxa"/>
-            </w:tcMar>
-            <w:tcMar>
-              <w:start w:w="0" w:type="dxa"/>
-              <w:end w:w="0" w:type="dxa"/>
-            </w:tcMar>
-          </w:tcPr>
-          <w:p>
-            <w:pPr>
-              <w:autoSpaceDN w:val="0"/>
-              <w:autoSpaceDE w:val="0"/>
-              <w:widowControl/>
-              <w:spacing w:line="166" w:lineRule="exact" w:before="360" w:after="0"/>
-              <w:ind w:left="0" w:right="0" w:firstLine="0"/>
-              <w:jc w:val="center"/>
-            </w:pPr>
-            <w:r>
-              <w:rPr>
-                <w:w w:val="103.125"/>
-                <w:rFonts w:ascii="Arial" w:hAnsi="Arial" w:eastAsia="Arial"/>
-                <w:b w:val="0"/>
-                <w:i w:val="0"/>
-                <w:color w:val="00008B"/>
-                <w:sz w:val="16"/>
-              </w:rPr>
-              <w:t>מ</w:t>
-            </w:r>
-            <w:r>
-              <w:rPr>
-                <w:w w:val="103.125"/>
-                <w:rFonts w:ascii="Arial Narrow" w:hAnsi="Arial Narrow" w:eastAsia="Arial Narrow"/>
-                <w:b w:val="0"/>
-                <w:i w:val="0"/>
-                <w:color w:val="00008B"/>
-                <w:sz w:val="16"/>
-              </w:rPr>
-              <w:t>.</w:t>
-            </w:r>
-            <w:r>
-              <w:rPr>
-                <w:w w:val="103.125"/>
-                <w:rFonts w:ascii="Arial" w:hAnsi="Arial" w:eastAsia="Arial"/>
-                <w:b w:val="0"/>
-                <w:i w:val="0"/>
-                <w:color w:val="00008B"/>
-                <w:sz w:val="16"/>
-              </w:rPr>
-              <w:t>ר</w:t>
-            </w:r>
-          </w:p>
-        </w:tc>
-        <w:tc>
-          <w:tcPr>
-            <w:tcW w:type="dxa" w:w="3128"/>
-            <w:vMerge w:val="restart"/>
-            <w:tcBorders>
-              <w:start w:sz="5.600000000000136" w:val="single" w:color="#000000"/>
-            </w:tcBorders>
-            <w:tcMar>
-              <w:start w:w="0" w:type="dxa"/>
-              <w:end w:w="0" w:type="dxa"/>
-            </w:tcMar>
-            <w:tcMar>
-              <w:start w:w="0" w:type="dxa"/>
-              <w:end w:w="0" w:type="dxa"/>
-            </w:tcMar>
-            <w:tcMar>
-              <w:start w:w="0" w:type="dxa"/>
-              <w:end w:w="0" w:type="dxa"/>
-            </w:tcMar>
-          </w:tcPr>
-          <w:p>
-            <w:pPr>
-              <w:autoSpaceDN w:val="0"/>
-              <w:autoSpaceDE w:val="0"/>
-              <w:widowControl/>
-              <w:spacing w:line="240" w:lineRule="exact" w:before="6" w:after="0"/>
-              <w:ind w:left="0" w:right="16" w:firstLine="0"/>
-              <w:jc w:val="right"/>
-            </w:pPr>
-            <w:r>
-              <w:rPr>
-                <w:rFonts w:ascii="Arial" w:hAnsi="Arial" w:eastAsia="Arial"/>
-                <w:b/>
-                <w:i w:val="0"/>
-                <w:color w:val="000000"/>
-                <w:sz w:val="24"/>
-              </w:rPr>
-              <w:t>בריאות</w:t>
-            </w:r>
-          </w:p>
-        </w:tc>
-        <w:tc>
-          <w:tcPr>
-            <w:tcW w:type="dxa" w:w="720"/>
-            <w:vMerge w:val="restart"/>
-            <w:tcBorders/>
-            <w:tcMar>
-              <w:start w:w="0" w:type="dxa"/>
-              <w:end w:w="0" w:type="dxa"/>
-            </w:tcMar>
-            <w:tcMar>
-              <w:start w:w="0" w:type="dxa"/>
-              <w:end w:w="0" w:type="dxa"/>
-            </w:tcMar>
-            <w:tcMar>
-              <w:start w:w="0" w:type="dxa"/>
-              <w:end w:w="0" w:type="dxa"/>
-            </w:tcMar>
-          </w:tcPr>
-          <w:p>
-            <w:pPr>
-              <w:autoSpaceDN w:val="0"/>
-              <w:autoSpaceDE w:val="0"/>
-              <w:widowControl/>
-              <w:spacing w:line="240" w:lineRule="exact" w:before="6" w:after="0"/>
-              <w:ind w:left="0" w:right="0" w:firstLine="0"/>
-              <w:jc w:val="center"/>
-            </w:pPr>
-            <w:r>
-              <w:rPr>
-                <w:rFonts w:ascii="Arial" w:hAnsi="Arial" w:eastAsia="Arial"/>
-                <w:b/>
-                <w:i w:val="0"/>
-                <w:color w:val="000000"/>
-                <w:sz w:val="24"/>
-              </w:rPr>
-              <w:t>שירותי</w:t>
-            </w:r>
-          </w:p>
-        </w:tc>
-        <w:tc>
-          <w:tcPr>
-            <w:tcW w:type="dxa" w:w="1660"/>
-            <w:vMerge w:val="restart"/>
-            <w:tcBorders/>
-            <w:tcMar>
-              <w:start w:w="0" w:type="dxa"/>
-              <w:end w:w="0" w:type="dxa"/>
-            </w:tcMar>
-            <w:tcMar>
-              <w:start w:w="0" w:type="dxa"/>
-              <w:end w:w="0" w:type="dxa"/>
-            </w:tcMar>
-            <w:tcMar>
-              <w:start w:w="0" w:type="dxa"/>
-              <w:end w:w="0" w:type="dxa"/>
-            </w:tcMar>
-          </w:tcPr>
-          <w:p>
-            <w:pPr>
-              <w:autoSpaceDN w:val="0"/>
-              <w:autoSpaceDE w:val="0"/>
-              <w:widowControl/>
-              <w:spacing w:line="240" w:lineRule="exact" w:before="6" w:after="0"/>
-              <w:ind w:left="28" w:right="0" w:firstLine="0"/>
+              <w:bidi w:val="1"/>
               <w:jc w:val="left"/>
             </w:pPr>
             <w:r>
               <w:rPr>
-                <w:rFonts w:ascii="Arial" w:hAnsi="Arial" w:eastAsia="Arial"/>
-                <w:b/>
-                <w:i w:val="0"/>
-                <w:color w:val="000000"/>
-                <w:sz w:val="24"/>
+                <w:rFonts w:ascii="Arial" w:hAnsi="Arial" w:cs="Arial"/>
+                <w:b w:val="0"/>
+                <w:color w:val="003399"/>
+                <w:sz w:val="20"/>
+                <w:u w:val="none"/>
               </w:rPr>
-              <w:t>מכבי</w:t>
+              <w:t>תאריך: 31/08/2026</w:t>
             </w:r>
           </w:p>
-        </w:tc>
-        <w:tc>
-          <w:tcPr>
-            <w:tcW w:type="dxa" w:w="1980"/>
-            <w:gridSpan w:val="2"/>
-            <w:vMerge w:val="restart"/>
-            <w:tcBorders/>
-            <w:tcMar>
-              <w:start w:w="0" w:type="dxa"/>
-              <w:end w:w="0" w:type="dxa"/>
-            </w:tcMar>
-            <w:tcMar>
-              <w:start w:w="0" w:type="dxa"/>
-              <w:end w:w="0" w:type="dxa"/>
-            </w:tcMar>
-            <w:tcMar>
-              <w:start w:w="0" w:type="dxa"/>
-              <w:end w:w="0" w:type="dxa"/>
-            </w:tcMar>
-            <w:tcMar>
-              <w:start w:w="0" w:type="dxa"/>
-              <w:end w:w="0" w:type="dxa"/>
-            </w:tcMar>
-          </w:tcPr>
           <w:p>
             <w:pPr>
-              <w:autoSpaceDN w:val="0"/>
-              <w:autoSpaceDE w:val="0"/>
-              <w:widowControl/>
-              <w:spacing w:line="194" w:lineRule="exact" w:before="366" w:after="0"/>
-              <w:ind w:left="0" w:right="32" w:firstLine="0"/>
-              <w:jc w:val="right"/>
+              <w:bidi w:val="1"/>
+              <w:jc w:val="left"/>
             </w:pPr>
             <w:r>
               <w:rPr>
-                <w:w w:val="97.5"/>
-                <w:rFonts w:ascii="Arial" w:hAnsi="Arial" w:eastAsia="Arial"/>
-                <w:b/>
-                <w:i w:val="0"/>
-                <w:color w:val="000000"/>
+                <w:rFonts w:ascii="Arial" w:hAnsi="Arial" w:cs="Arial"/>
+                <w:b w:val="0"/>
+                <w:color w:val="003399"/>
                 <w:sz w:val="20"/>
+                <w:u w:val="none"/>
               </w:rPr>
-              <w:t>גלינה</w:t>
+              <w:t>מ.ר גורם מפנה:</w:t>
             </w:r>
           </w:p>
-        </w:tc>
-        <w:tc>
-          <w:tcPr>
-            <w:tcW w:type="dxa" w:w="960"/>
-            <w:vMerge w:val="restart"/>
-            <w:tcBorders/>
-            <w:tcMar>
-              <w:start w:w="0" w:type="dxa"/>
-              <w:end w:w="0" w:type="dxa"/>
-            </w:tcMar>
-            <w:tcMar>
-              <w:start w:w="0" w:type="dxa"/>
-              <w:end w:w="0" w:type="dxa"/>
-            </w:tcMar>
-          </w:tcPr>
           <w:p>
             <w:pPr>
-              <w:autoSpaceDN w:val="0"/>
-              <w:autoSpaceDE w:val="0"/>
-              <w:widowControl/>
-              <w:spacing w:line="194" w:lineRule="exact" w:before="366" w:after="0"/>
-              <w:ind w:left="0" w:right="0" w:firstLine="0"/>
-              <w:jc w:val="center"/>
+              <w:jc w:val="left"/>
             </w:pPr>
             <w:r>
               <w:rPr>
-                <w:w w:val="97.5"/>
-                <w:rFonts w:ascii="Arial" w:hAnsi="Arial" w:eastAsia="Arial"/>
+                <w:rFonts w:ascii="Arial" w:hAnsi="Arial" w:cs="Arial"/>
                 <w:b/>
-                <w:i w:val="0"/>
-                <w:color w:val="000000"/>
-                <w:sz w:val="20"/>
+                <w:sz w:val="22"/>
+                <w:u w:val="none"/>
               </w:rPr>
-              <w:t>דר</w:t>
-            </w:r>
-            <w:r>
-              <w:rPr>
-                <w:w w:val="97.5"/>
-                <w:rFonts w:ascii="Arial" w:hAnsi="Arial" w:eastAsia="Arial"/>
-                <w:b/>
-                <w:i w:val="0"/>
-                <w:color w:val="000000"/>
-                <w:sz w:val="20"/>
-              </w:rPr>
-              <w:t xml:space="preserve">' </w:t>
-            </w:r>
-            <w:r>
-              <w:rPr>
-                <w:w w:val="97.5"/>
-                <w:rFonts w:ascii="Arial" w:hAnsi="Arial" w:eastAsia="Arial"/>
-                <w:b/>
-                <w:i w:val="0"/>
-                <w:color w:val="000000"/>
-                <w:sz w:val="20"/>
-              </w:rPr>
-              <w:t>קגנוביץ</w:t>
-            </w:r>
-          </w:p>
-        </w:tc>
-      </w:tr>
-      <w:tr>
-        <w:trPr>
-          <w:trHeight w:hRule="exact" w:val="340"/>
-        </w:trPr>
-        <w:tc>
-          <w:tcPr>
-            <w:tcW w:type="dxa" w:w="1083"/>
-            <w:vMerge/>
-            <w:tcBorders/>
-          </w:tcPr>
-          <w:p/>
-        </w:tc>
-        <w:tc>
-          <w:tcPr>
-            <w:tcW w:type="dxa" w:w="782"/>
-            <w:vMerge w:val="restart"/>
-            <w:tcBorders>
-              <w:end w:sz="5.600000000000023" w:val="single" w:color="#000000"/>
-            </w:tcBorders>
-            <w:tcMar>
-              <w:start w:w="0" w:type="dxa"/>
-              <w:end w:w="0" w:type="dxa"/>
-            </w:tcMar>
-            <w:tcMar>
-              <w:start w:w="0" w:type="dxa"/>
-              <w:end w:w="0" w:type="dxa"/>
-            </w:tcMar>
-          </w:tcPr>
-          <w:p>
-            <w:pPr>
-              <w:autoSpaceDN w:val="0"/>
-              <w:autoSpaceDE w:val="0"/>
-              <w:widowControl/>
-              <w:spacing w:line="166" w:lineRule="exact" w:before="94" w:after="0"/>
-              <w:ind w:left="0" w:right="0" w:firstLine="0"/>
-              <w:jc w:val="right"/>
-            </w:pPr>
-            <w:r>
-              <w:rPr>
-                <w:w w:val="103.125"/>
-                <w:rFonts w:ascii="Arial" w:hAnsi="Arial" w:eastAsia="Arial"/>
-                <w:b w:val="0"/>
-                <w:i w:val="0"/>
-                <w:color w:val="00008B"/>
-                <w:sz w:val="16"/>
-              </w:rPr>
-              <w:t>מפנה</w:t>
-            </w:r>
-          </w:p>
-        </w:tc>
-        <w:tc>
-          <w:tcPr>
-            <w:tcW w:type="dxa" w:w="1083"/>
-            <w:vMerge/>
-            <w:tcBorders>
-              <w:start w:sz="5.600000000000023" w:val="single" w:color="#000000"/>
-              <w:end w:sz="6.399999999999977" w:val="single" w:color="#000000"/>
-            </w:tcBorders>
-          </w:tcPr>
-          <w:p/>
-        </w:tc>
-        <w:tc>
-          <w:tcPr>
-            <w:tcW w:type="dxa" w:w="1083"/>
-            <w:vMerge/>
-            <w:tcBorders>
-              <w:start w:sz="6.399999999999977" w:val="single" w:color="#000000"/>
-              <w:end w:sz="5.600000000000136" w:val="single" w:color="#000000"/>
-            </w:tcBorders>
-          </w:tcPr>
-          <w:p/>
-        </w:tc>
-        <w:tc>
-          <w:tcPr>
-            <w:tcW w:type="dxa" w:w="1083"/>
-            <w:vMerge/>
-            <w:tcBorders>
-              <w:start w:sz="5.600000000000136" w:val="single" w:color="#000000"/>
-            </w:tcBorders>
-          </w:tcPr>
-          <w:p/>
-        </w:tc>
-        <w:tc>
-          <w:tcPr>
-            <w:tcW w:type="dxa" w:w="1083"/>
-            <w:vMerge/>
-            <w:tcBorders/>
-          </w:tcPr>
-          <w:p/>
-        </w:tc>
-        <w:tc>
-          <w:tcPr>
-            <w:tcW w:type="dxa" w:w="1083"/>
-            <w:vMerge/>
-            <w:tcBorders/>
-          </w:tcPr>
-          <w:p/>
-        </w:tc>
-        <w:tc>
-          <w:tcPr>
-            <w:tcW w:type="dxa" w:w="2166"/>
-            <w:gridSpan w:val="2"/>
-            <w:vMerge/>
-            <w:tcBorders/>
-          </w:tcPr>
-          <w:p/>
-        </w:tc>
-        <w:tc>
-          <w:tcPr>
-            <w:tcW w:type="dxa" w:w="1083"/>
-            <w:vMerge/>
-            <w:tcBorders/>
-          </w:tcPr>
-          <w:p/>
-        </w:tc>
-      </w:tr>
-      <w:tr>
-        <w:trPr>
-          <w:trHeight w:hRule="exact" w:val="496"/>
-        </w:trPr>
-        <w:tc>
-          <w:tcPr>
-            <w:tcW w:type="dxa" w:w="1083"/>
-            <w:vMerge/>
-            <w:tcBorders/>
-          </w:tcPr>
-          <w:p/>
-        </w:tc>
-        <w:tc>
-          <w:tcPr>
-            <w:tcW w:type="dxa" w:w="1083"/>
-            <w:vMerge/>
-            <w:tcBorders>
-              <w:end w:sz="5.600000000000023" w:val="single" w:color="#000000"/>
-            </w:tcBorders>
-          </w:tcPr>
-          <w:p/>
-        </w:tc>
-        <w:tc>
-          <w:tcPr>
-            <w:tcW w:type="dxa" w:w="1083"/>
-            <w:vMerge/>
-            <w:tcBorders>
-              <w:start w:sz="5.600000000000023" w:val="single" w:color="#000000"/>
-              <w:end w:sz="6.399999999999977" w:val="single" w:color="#000000"/>
-            </w:tcBorders>
-          </w:tcPr>
-          <w:p/>
-        </w:tc>
-        <w:tc>
-          <w:tcPr>
-            <w:tcW w:type="dxa" w:w="1083"/>
-            <w:vMerge/>
-            <w:tcBorders>
-              <w:start w:sz="6.399999999999977" w:val="single" w:color="#000000"/>
-              <w:end w:sz="5.600000000000136" w:val="single" w:color="#000000"/>
-            </w:tcBorders>
-          </w:tcPr>
-          <w:p/>
-        </w:tc>
-        <w:tc>
-          <w:tcPr>
-            <w:tcW w:type="dxa" w:w="1083"/>
-            <w:vMerge/>
-            <w:tcBorders>
-              <w:start w:sz="5.600000000000136" w:val="single" w:color="#000000"/>
-            </w:tcBorders>
-          </w:tcPr>
-          <w:p/>
-        </w:tc>
-        <w:tc>
-          <w:tcPr>
-            <w:tcW w:type="dxa" w:w="1083"/>
-            <w:vMerge/>
-            <w:tcBorders/>
-          </w:tcPr>
-          <w:p/>
-        </w:tc>
-        <w:tc>
-          <w:tcPr>
-            <w:tcW w:type="dxa" w:w="1083"/>
-            <w:vMerge/>
-            <w:tcBorders/>
-          </w:tcPr>
-          <w:p/>
-        </w:tc>
-        <w:tc>
-          <w:tcPr>
-            <w:tcW w:type="dxa" w:w="1700"/>
-            <w:tcBorders/>
-            <w:tcMar>
-              <w:start w:w="0" w:type="dxa"/>
-              <w:end w:w="0" w:type="dxa"/>
-            </w:tcMar>
-          </w:tcPr>
-          <w:p>
-            <w:pPr>
-              <w:autoSpaceDN w:val="0"/>
-              <w:autoSpaceDE w:val="0"/>
-              <w:widowControl/>
-              <w:spacing w:line="196" w:lineRule="exact" w:before="82" w:after="0"/>
-              <w:ind w:left="0" w:right="20" w:firstLine="0"/>
-              <w:jc w:val="right"/>
-            </w:pPr>
-            <w:r>
-              <w:rPr>
-                <w:w w:val="97.5"/>
-                <w:rFonts w:ascii="Arial" w:hAnsi="Arial" w:eastAsia="Arial"/>
-                <w:b w:val="0"/>
-                <w:i w:val="0"/>
-                <w:color w:val="000000"/>
-                <w:sz w:val="20"/>
-              </w:rPr>
-              <w:t>וכללית</w:t>
-            </w:r>
-          </w:p>
-        </w:tc>
-        <w:tc>
-          <w:tcPr>
-            <w:tcW w:type="dxa" w:w="1240"/>
-            <w:gridSpan w:val="2"/>
-            <w:tcBorders/>
-            <w:tcMar>
-              <w:start w:w="0" w:type="dxa"/>
-              <w:end w:w="0" w:type="dxa"/>
-            </w:tcMar>
-            <w:tcMar>
-              <w:start w:w="0" w:type="dxa"/>
-              <w:end w:w="0" w:type="dxa"/>
-            </w:tcMar>
-          </w:tcPr>
-          <w:p>
-            <w:pPr>
-              <w:autoSpaceDN w:val="0"/>
-              <w:autoSpaceDE w:val="0"/>
-              <w:widowControl/>
-              <w:spacing w:line="196" w:lineRule="exact" w:before="82" w:after="0"/>
-              <w:ind w:left="0" w:right="0" w:firstLine="0"/>
-              <w:jc w:val="center"/>
-            </w:pPr>
-            <w:r>
-              <w:rPr>
-                <w:w w:val="97.5"/>
-                <w:rFonts w:ascii="Arial" w:hAnsi="Arial" w:eastAsia="Arial"/>
-                <w:b w:val="0"/>
-                <w:i w:val="0"/>
-                <w:color w:val="000000"/>
-                <w:sz w:val="20"/>
-              </w:rPr>
-              <w:t>משפחה</w:t>
-            </w:r>
-            <w:r>
-              <w:rPr>
-                <w:w w:val="97.5"/>
-                <w:rFonts w:ascii="Arial Narrow" w:hAnsi="Arial Narrow" w:eastAsia="Arial Narrow"/>
-                <w:b w:val="0"/>
-                <w:i w:val="0"/>
-                <w:color w:val="000000"/>
-                <w:sz w:val="20"/>
-              </w:rPr>
-              <w:t xml:space="preserve"> ,</w:t>
-            </w:r>
-            <w:r>
-              <w:rPr>
-                <w:w w:val="97.5"/>
-                <w:rFonts w:ascii="Arial" w:hAnsi="Arial" w:eastAsia="Arial"/>
-                <w:b w:val="0"/>
-                <w:i w:val="0"/>
-                <w:color w:val="000000"/>
-                <w:sz w:val="20"/>
-              </w:rPr>
-              <w:t>פנימית</w:t>
+              <w:t>024125</w:t>
             </w:r>
           </w:p>
         </w:tc>
@@ -728,546 +159,127 @@
     </w:tbl>
     <w:p>
       <w:pPr>
-        <w:autoSpaceDN w:val="0"/>
-        <w:autoSpaceDE w:val="0"/>
-        <w:widowControl/>
-        <w:spacing w:line="224" w:lineRule="exact" w:before="32" w:after="52"/>
-        <w:ind w:left="1852" w:right="0" w:firstLine="0"/>
-        <w:jc w:val="left"/>
+        <w:bidi w:val="1"/>
+        <w:spacing w:after="80" w:before="0"/>
+        <w:jc w:val="right"/>
+      </w:pPr>
+    </w:p>
+    <w:p>
+      <w:pPr>
+        <w:bidi w:val="1"/>
+        <w:spacing w:after="40" w:before="0"/>
+        <w:jc w:val="center"/>
       </w:pPr>
       <w:r>
         <w:rPr>
-          <w:w w:val="102.27272727272727"/>
-          <w:rFonts w:ascii="Arial Narrow" w:hAnsi="Arial Narrow" w:eastAsia="Arial Narrow"/>
+          <w:rFonts w:ascii="Arial" w:hAnsi="Arial" w:cs="Arial"/>
           <w:b w:val="0"/>
-          <w:i w:val="0"/>
-          <w:color w:val="000000"/>
-          <w:sz w:val="22"/>
+          <w:color w:val="003399"/>
+          <w:sz w:val="20"/>
+          <w:u w:val="none"/>
         </w:rPr>
-        <w:t>024125</w:t>
+        <w:t>טלפון: 08-9257689</w:t>
       </w:r>
+    </w:p>
+    <w:p>
+      <w:pPr>
+        <w:bidi w:val="1"/>
+        <w:spacing w:after="40" w:before="0"/>
+        <w:jc w:val="center"/>
+      </w:pPr>
+      <w:r>
+        <w:rPr>
+          <w:rFonts w:ascii="Arial" w:hAnsi="Arial" w:cs="Arial"/>
+          <w:b w:val="0"/>
+          <w:color w:val="003399"/>
+          <w:sz w:val="20"/>
+          <w:u w:val="none"/>
+        </w:rPr>
+        <w:t>פקס: 08-9257689</w:t>
+      </w:r>
+    </w:p>
+    <w:p>
+      <w:pPr>
+        <w:bidi w:val="1"/>
+        <w:spacing w:after="40" w:before="0"/>
+        <w:jc w:val="center"/>
+      </w:pPr>
+      <w:r>
+        <w:rPr>
+          <w:rFonts w:ascii="Arial" w:hAnsi="Arial" w:cs="Arial"/>
+          <w:b w:val="0"/>
+          <w:color w:val="003399"/>
+          <w:sz w:val="20"/>
+          <w:u w:val="none"/>
+        </w:rPr>
+        <w:t>כתובת: שטרן יאיר 14, רמלה</w:t>
+      </w:r>
+    </w:p>
+    <w:p>
+      <w:pPr>
+        <w:bidi w:val="1"/>
+        <w:spacing w:after="160" w:before="0"/>
+        <w:jc w:val="right"/>
+      </w:pPr>
     </w:p>
     <w:tbl>
       <w:tblPr>
         <w:tblW w:type="auto" w:w="0"/>
-        <w:tblLayout w:type="fixed"/>
+        <w:jc w:val="center"/>
         <w:tblLook w:firstColumn="1" w:firstRow="1" w:lastColumn="0" w:lastRow="0" w:noHBand="0" w:noVBand="1" w:val="04A0"/>
-        <w:tblInd w:w="2092.0" w:type="dxa"/>
       </w:tblPr>
       <w:tblGrid>
-        <w:gridCol w:w="3612"/>
-        <w:gridCol w:w="3612"/>
-        <w:gridCol w:w="3612"/>
+        <w:gridCol w:w="3213"/>
+        <w:gridCol w:w="3213"/>
+        <w:gridCol w:w="3213"/>
       </w:tblGrid>
       <w:tr>
-        <w:trPr>
-          <w:trHeight w:hRule="exact" w:val="316"/>
-        </w:trPr>
         <w:tc>
           <w:tcPr>
-            <w:tcW w:type="dxa" w:w="3700"/>
-            <w:gridSpan w:val="2"/>
+            <w:tcW w:type="dxa" w:w="3213"/>
             <w:tcBorders/>
-            <w:tcMar>
-              <w:start w:w="0" w:type="dxa"/>
-              <w:end w:w="0" w:type="dxa"/>
-            </w:tcMar>
-            <w:tcMar>
-              <w:start w:w="0" w:type="dxa"/>
-              <w:end w:w="0" w:type="dxa"/>
-            </w:tcMar>
           </w:tcPr>
           <w:p>
             <w:pPr>
-              <w:autoSpaceDN w:val="0"/>
-              <w:autoSpaceDE w:val="0"/>
-              <w:widowControl/>
-              <w:spacing w:line="194" w:lineRule="exact" w:before="50" w:after="0"/>
-              <w:ind w:left="0" w:right="114" w:firstLine="0"/>
-              <w:jc w:val="right"/>
+              <w:jc w:val="left"/>
             </w:pPr>
             <w:r>
               <w:rPr>
-                <w:w w:val="97.5"/>
-                <w:rFonts w:ascii="Arial Narrow" w:hAnsi="Arial Narrow" w:eastAsia="Arial Narrow"/>
-                <w:b w:val="0"/>
-                <w:i w:val="0"/>
-                <w:color w:val="000000"/>
+                <w:rFonts w:ascii="Arial" w:hAnsi="Arial" w:cs="Arial"/>
+                <w:b/>
                 <w:sz w:val="20"/>
+                <w:u w:val="none"/>
               </w:rPr>
-              <w:t>08-9257689</w:t>
+              <w:t>0215359910</w:t>
             </w:r>
           </w:p>
         </w:tc>
         <w:tc>
           <w:tcPr>
-            <w:tcW w:type="dxa" w:w="2840"/>
+            <w:tcW w:type="dxa" w:w="3213"/>
             <w:tcBorders/>
-            <w:tcMar>
-              <w:start w:w="0" w:type="dxa"/>
-              <w:end w:w="0" w:type="dxa"/>
-            </w:tcMar>
+          </w:tcPr>
+          <w:p/>
+        </w:tc>
+        <w:tc>
+          <w:tcPr>
+            <w:tcW w:type="dxa" w:w="3213"/>
+            <w:tcBorders/>
           </w:tcPr>
           <w:p>
             <w:pPr>
-              <w:autoSpaceDN w:val="0"/>
-              <w:autoSpaceDE w:val="0"/>
-              <w:widowControl/>
-              <w:spacing w:line="194" w:lineRule="exact" w:before="50" w:after="0"/>
-              <w:ind w:left="142" w:right="0" w:firstLine="0"/>
-              <w:jc w:val="left"/>
-            </w:pPr>
-            <w:r>
-              <w:rPr>
-                <w:w w:val="97.5"/>
-                <w:rFonts w:ascii="Arial" w:hAnsi="Arial" w:eastAsia="Arial"/>
-                <w:b/>
-                <w:i w:val="0"/>
-                <w:color w:val="00008B"/>
-                <w:sz w:val="20"/>
-              </w:rPr>
-              <w:t>טלפון</w:t>
-            </w:r>
-            <w:r>
-              <w:rPr>
-                <w:w w:val="97.5"/>
-                <w:rFonts w:ascii="Arial" w:hAnsi="Arial" w:eastAsia="Arial"/>
-                <w:b/>
-                <w:i w:val="0"/>
-                <w:color w:val="00008B"/>
-                <w:sz w:val="20"/>
-              </w:rPr>
-              <w:t>:</w:t>
-            </w:r>
-          </w:p>
-        </w:tc>
-      </w:tr>
-      <w:tr>
-        <w:trPr>
-          <w:trHeight w:hRule="exact" w:val="340"/>
-        </w:trPr>
-        <w:tc>
-          <w:tcPr>
-            <w:tcW w:type="dxa" w:w="3700"/>
-            <w:gridSpan w:val="2"/>
-            <w:tcBorders/>
-            <w:tcMar>
-              <w:start w:w="0" w:type="dxa"/>
-              <w:end w:w="0" w:type="dxa"/>
-            </w:tcMar>
-            <w:tcMar>
-              <w:start w:w="0" w:type="dxa"/>
-              <w:end w:w="0" w:type="dxa"/>
-            </w:tcMar>
-          </w:tcPr>
-          <w:p>
-            <w:pPr>
-              <w:autoSpaceDN w:val="0"/>
-              <w:autoSpaceDE w:val="0"/>
-              <w:widowControl/>
-              <w:spacing w:line="194" w:lineRule="exact" w:before="92" w:after="0"/>
-              <w:ind w:left="0" w:right="114" w:firstLine="0"/>
+              <w:bidi w:val="1"/>
               <w:jc w:val="right"/>
             </w:pPr>
             <w:r>
               <w:rPr>
-                <w:w w:val="97.5"/>
-                <w:rFonts w:ascii="Arial Narrow" w:hAnsi="Arial Narrow" w:eastAsia="Arial Narrow"/>
-                <w:b w:val="0"/>
-                <w:i w:val="0"/>
-                <w:color w:val="000000"/>
+                <w:rFonts w:ascii="Arial" w:hAnsi="Arial" w:cs="Arial"/>
+                <w:b/>
+                <w:color w:val="003399"/>
                 <w:sz w:val="20"/>
+                <w:u w:val="none"/>
               </w:rPr>
-              <w:t>08-9257689</w:t>
-            </w:r>
-          </w:p>
-        </w:tc>
-        <w:tc>
-          <w:tcPr>
-            <w:tcW w:type="dxa" w:w="2840"/>
-            <w:tcBorders/>
-            <w:tcMar>
-              <w:start w:w="0" w:type="dxa"/>
-              <w:end w:w="0" w:type="dxa"/>
-            </w:tcMar>
-          </w:tcPr>
-          <w:p>
-            <w:pPr>
-              <w:autoSpaceDN w:val="0"/>
-              <w:autoSpaceDE w:val="0"/>
-              <w:widowControl/>
-              <w:spacing w:line="194" w:lineRule="exact" w:before="92" w:after="0"/>
-              <w:ind w:left="236" w:right="0" w:firstLine="0"/>
-              <w:jc w:val="left"/>
-            </w:pPr>
-            <w:r>
-              <w:rPr>
-                <w:w w:val="97.5"/>
-                <w:rFonts w:ascii="Arial" w:hAnsi="Arial" w:eastAsia="Arial"/>
-                <w:b/>
-                <w:i w:val="0"/>
-                <w:color w:val="00008B"/>
-                <w:sz w:val="20"/>
-              </w:rPr>
-              <w:t>פקס</w:t>
-            </w:r>
-            <w:r>
-              <w:rPr>
-                <w:w w:val="97.5"/>
-                <w:rFonts w:ascii="Arial" w:hAnsi="Arial" w:eastAsia="Arial"/>
-                <w:b/>
-                <w:i w:val="0"/>
-                <w:color w:val="00008B"/>
-                <w:sz w:val="20"/>
-              </w:rPr>
-              <w:t>:</w:t>
-            </w:r>
-          </w:p>
-        </w:tc>
-      </w:tr>
-      <w:tr>
-        <w:trPr>
-          <w:trHeight w:hRule="exact" w:val="320"/>
-        </w:trPr>
-        <w:tc>
-          <w:tcPr>
-            <w:tcW w:type="dxa" w:w="3160"/>
-            <w:tcBorders/>
-            <w:tcMar>
-              <w:start w:w="0" w:type="dxa"/>
-              <w:end w:w="0" w:type="dxa"/>
-            </w:tcMar>
-          </w:tcPr>
-          <w:p>
-            <w:pPr>
-              <w:autoSpaceDN w:val="0"/>
-              <w:autoSpaceDE w:val="0"/>
-              <w:widowControl/>
-              <w:spacing w:line="194" w:lineRule="exact" w:before="66" w:after="0"/>
-              <w:ind w:left="0" w:right="16" w:firstLine="0"/>
-              <w:jc w:val="right"/>
-            </w:pPr>
-            <w:r>
-              <w:rPr>
-                <w:w w:val="97.5"/>
-                <w:rFonts w:ascii="Arial Narrow" w:hAnsi="Arial Narrow" w:eastAsia="Arial Narrow"/>
-                <w:b w:val="0"/>
-                <w:i w:val="0"/>
-                <w:color w:val="000000"/>
-                <w:sz w:val="20"/>
-              </w:rPr>
-              <w:t xml:space="preserve"> ,</w:t>
-            </w:r>
-            <w:r>
-              <w:rPr>
-                <w:w w:val="97.5"/>
-                <w:rFonts w:ascii="Arial" w:hAnsi="Arial" w:eastAsia="Arial"/>
-                <w:b w:val="0"/>
-                <w:i w:val="0"/>
-                <w:color w:val="000000"/>
-                <w:sz w:val="20"/>
-              </w:rPr>
-              <w:t>רמלה</w:t>
-            </w:r>
-            <w:r>
-              <w:rPr>
-                <w:w w:val="97.5"/>
-                <w:rFonts w:ascii="Arial" w:hAnsi="Arial" w:eastAsia="Arial"/>
-                <w:b w:val="0"/>
-                <w:i w:val="0"/>
-                <w:color w:val="000000"/>
-                <w:sz w:val="20"/>
-              </w:rPr>
-              <w:t>יאיר</w:t>
-            </w:r>
-            <w:r>
-              <w:rPr>
-                <w:w w:val="97.5"/>
-                <w:rFonts w:ascii="Arial Narrow" w:hAnsi="Arial Narrow" w:eastAsia="Arial Narrow"/>
-                <w:b w:val="0"/>
-                <w:i w:val="0"/>
-                <w:color w:val="000000"/>
-                <w:sz w:val="20"/>
-              </w:rPr>
-              <w:t>14</w:t>
-            </w:r>
-          </w:p>
-        </w:tc>
-        <w:tc>
-          <w:tcPr>
-            <w:tcW w:type="dxa" w:w="3380"/>
-            <w:gridSpan w:val="2"/>
-            <w:tcBorders/>
-            <w:tcMar>
-              <w:start w:w="0" w:type="dxa"/>
-              <w:end w:w="0" w:type="dxa"/>
-            </w:tcMar>
-            <w:tcMar>
-              <w:start w:w="0" w:type="dxa"/>
-              <w:end w:w="0" w:type="dxa"/>
-            </w:tcMar>
-          </w:tcPr>
-          <w:p>
-            <w:pPr>
-              <w:autoSpaceDN w:val="0"/>
-              <w:autoSpaceDE w:val="0"/>
-              <w:widowControl/>
-              <w:spacing w:line="194" w:lineRule="exact" w:before="66" w:after="0"/>
-              <w:ind w:left="28" w:right="0" w:firstLine="0"/>
-              <w:jc w:val="left"/>
-            </w:pPr>
-            <w:r>
-              <w:rPr>
-                <w:w w:val="97.5"/>
-                <w:rFonts w:ascii="Arial" w:hAnsi="Arial" w:eastAsia="Arial"/>
-                <w:b/>
-                <w:i w:val="0"/>
-                <w:color w:val="00008B"/>
-                <w:sz w:val="20"/>
-              </w:rPr>
-              <w:t>כתובת</w:t>
-            </w:r>
-            <w:r>
-              <w:rPr>
-                <w:w w:val="97.5"/>
-                <w:rFonts w:ascii="Arial" w:hAnsi="Arial" w:eastAsia="Arial"/>
-                <w:b/>
-                <w:i w:val="0"/>
-                <w:color w:val="00008B"/>
-                <w:sz w:val="20"/>
-              </w:rPr>
-              <w:t>:</w:t>
-            </w:r>
-            <w:r>
-              <w:rPr>
-                <w:w w:val="97.5"/>
-                <w:rFonts w:ascii="Arial" w:hAnsi="Arial" w:eastAsia="Arial"/>
-                <w:b w:val="0"/>
-                <w:i w:val="0"/>
-                <w:color w:val="000000"/>
-                <w:sz w:val="20"/>
-              </w:rPr>
-              <w:t>שטרן</w:t>
-            </w:r>
-          </w:p>
-        </w:tc>
-      </w:tr>
-    </w:tbl>
-    <w:p>
-      <w:pPr>
-        <w:autoSpaceDN w:val="0"/>
-        <w:autoSpaceDE w:val="0"/>
-        <w:widowControl/>
-        <w:spacing w:line="40" w:lineRule="exact" w:before="0" w:after="0"/>
-        <w:ind w:left="0" w:right="0"/>
-      </w:pPr>
-    </w:p>
-    <w:tbl>
-      <w:tblGrid>
-        <w:gridCol w:w="1083"/>
-        <w:gridCol w:w="1083"/>
-        <w:gridCol w:w="1083"/>
-        <w:gridCol w:w="1083"/>
-        <w:gridCol w:w="1083"/>
-        <w:gridCol w:w="1083"/>
-        <w:gridCol w:w="1083"/>
-        <w:gridCol w:w="1083"/>
-        <w:gridCol w:w="1083"/>
-        <w:gridCol w:w="1083"/>
-      </w:tblGrid>
-      <w:tblPr>
-        <w:tblW w:type="auto" w:w="0"/>
-        <w:tblLook w:firstColumn="1" w:firstRow="1" w:lastColumn="0" w:lastRow="0" w:noHBand="0" w:noVBand="1" w:val="04A0"/>
-      </w:tblPr>
-      <w:tr>
-        <w:tc>
-          <w:tcPr>
-            <w:tcW w:type="dxa" w:w="864"/>
-          </w:tcPr>
-          <w:p>
-            <w:pPr>
-              <w:jc w:val="left"/>
-              <w:bidi w:val="1"/>
-            </w:pPr>
-            <w:r>
-              <w:rPr>
-                <w:rFonts w:ascii="Arial Narrow" w:hAnsi="Arial Narrow"/>
-                <w:b w:val="0"/>
-                <w:i w:val="0"/>
-                <w:sz w:val="20"/>
-              </w:rPr>
-            </w:r>
-          </w:p>
-        </w:tc>
-        <w:tc>
-          <w:tcPr>
-            <w:tcW w:type="dxa" w:w="864"/>
-          </w:tcPr>
-          <w:p>
-            <w:pPr>
-              <w:jc w:val="left"/>
-              <w:bidi w:val="1"/>
-            </w:pPr>
-            <w:r>
-              <w:rPr>
-                <w:rFonts w:ascii="Arial" w:hAnsi="Arial"/>
-                <w:b/>
-                <w:i w:val="0"/>
-                <w:sz w:val="20"/>
-              </w:rPr>
-            </w:r>
-          </w:p>
-        </w:tc>
-        <w:tc>
-          <w:tcPr>
-            <w:tcW w:type="dxa" w:w="864"/>
-          </w:tcPr>
-          <w:p>
-            <w:pPr>
-              <w:jc w:val="center"/>
-              <w:bidi w:val="1"/>
-            </w:pPr>
-            <w:r>
-              <w:rPr>
-                <w:rFonts w:ascii="Arial" w:hAnsi="Arial"/>
-                <w:b w:val="0"/>
-                <w:i w:val="0"/>
-                <w:sz w:val="16"/>
-              </w:rPr>
-            </w:r>
-          </w:p>
-        </w:tc>
-        <w:tc>
-          <w:tcPr>
-            <w:tcW w:type="dxa" w:w="864"/>
-          </w:tcPr>
-          <w:p>
-            <w:pPr>
-              <w:jc w:val="center"/>
-              <w:bidi w:val="1"/>
-            </w:pPr>
-            <w:r>
-              <w:rPr>
-                <w:rFonts w:ascii="Arial" w:hAnsi="Arial"/>
-                <w:b w:val="0"/>
-                <w:i w:val="0"/>
-                <w:sz w:val="16"/>
-              </w:rPr>
-            </w:r>
-          </w:p>
-        </w:tc>
-        <w:tc>
-          <w:tcPr>
-            <w:tcW w:type="dxa" w:w="864"/>
-          </w:tcPr>
-          <w:p>
-            <w:pPr>
-              <w:jc w:val="right"/>
-              <w:bidi w:val="1"/>
-            </w:pPr>
-            <w:r>
-              <w:rPr>
-                <w:rFonts w:ascii="Arial" w:hAnsi="Arial"/>
-                <w:b/>
-                <w:i w:val="0"/>
-                <w:sz w:val="24"/>
-              </w:rPr>
-            </w:r>
-          </w:p>
-        </w:tc>
-        <w:tc>
-          <w:tcPr>
-            <w:tcW w:type="dxa" w:w="864"/>
-          </w:tcPr>
-          <w:p>
-            <w:pPr>
-              <w:jc w:val="center"/>
-              <w:bidi w:val="1"/>
-            </w:pPr>
-            <w:r>
-              <w:rPr>
-                <w:rFonts w:ascii="Arial" w:hAnsi="Arial"/>
-                <w:b/>
-                <w:i w:val="0"/>
-                <w:sz w:val="24"/>
-              </w:rPr>
-            </w:r>
-          </w:p>
-        </w:tc>
-        <w:tc>
-          <w:tcPr>
-            <w:tcW w:type="dxa" w:w="864"/>
-          </w:tcPr>
-          <w:p>
-            <w:pPr>
-              <w:jc w:val="left"/>
-              <w:bidi w:val="1"/>
-            </w:pPr>
-            <w:r>
-              <w:rPr>
-                <w:rFonts w:ascii="Arial" w:hAnsi="Arial"/>
-                <w:b/>
-                <w:i w:val="0"/>
-                <w:sz w:val="24"/>
-              </w:rPr>
-            </w:r>
-          </w:p>
-        </w:tc>
-        <w:tc>
-          <w:tcPr>
-            <w:tcW w:type="dxa" w:w="864"/>
-          </w:tcPr>
-          <w:p>
-            <w:pPr>
-              <w:jc w:val="right"/>
-              <w:bidi w:val="1"/>
-            </w:pPr>
-            <w:r>
-              <w:rPr>
-                <w:rFonts w:ascii="Arial" w:hAnsi="Arial"/>
-                <w:b/>
-                <w:i w:val="0"/>
-                <w:sz w:val="20"/>
-              </w:rPr>
-            </w:r>
-          </w:p>
-        </w:tc>
-        <w:tc>
-          <w:tcPr>
-            <w:tcW w:type="dxa" w:w="864"/>
-          </w:tcPr>
-          <w:p>
-            <w:pPr>
-              <w:jc w:val="right"/>
-              <w:bidi w:val="1"/>
-            </w:pPr>
-            <w:r>
-              <w:rPr>
-                <w:rFonts w:ascii="Arial" w:hAnsi="Arial"/>
-                <w:b/>
-                <w:i w:val="0"/>
-                <w:sz w:val="20"/>
-              </w:rPr>
-              <w:t>פרטיהנבדק:</w:t>
-            </w:r>
-          </w:p>
-        </w:tc>
-        <w:tc>
-          <w:tcPr>
-            <w:tcW w:type="dxa" w:w="864"/>
-          </w:tcPr>
-          <w:p>
-            <w:pPr>
-              <w:jc w:val="center"/>
-              <w:bidi w:val="1"/>
-            </w:pPr>
-            <w:r>
-              <w:rPr>
-                <w:rFonts w:ascii="Arial" w:hAnsi="Arial"/>
-                <w:b/>
-                <w:i w:val="0"/>
-                <w:sz w:val="20"/>
-              </w:rPr>
+              <w:t>פרטי הנבדק:</w:t>
             </w:r>
           </w:p>
         </w:tc>
@@ -1275,196 +287,67 @@
       <w:tr>
         <w:tc>
           <w:tcPr>
-            <w:tcW w:type="dxa" w:w="864"/>
+            <w:tcW w:type="dxa" w:w="3213"/>
+            <w:tcBorders/>
           </w:tcPr>
           <w:p>
             <w:pPr>
-              <w:jc w:val="left"/>
               <w:bidi w:val="1"/>
+              <w:jc w:val="right"/>
             </w:pPr>
             <w:r>
               <w:rPr>
-                <w:rFonts w:ascii="Arial Narrow" w:hAnsi="Arial Narrow"/>
+                <w:rFonts w:ascii="Arial" w:hAnsi="Arial" w:cs="Arial"/>
                 <w:b w:val="0"/>
-                <w:i w:val="0"/>
+                <w:color w:val="003399"/>
                 <w:sz w:val="20"/>
+                <w:u w:val="none"/>
               </w:rPr>
+              <w:t>ת.ז.: 215359910</w:t>
             </w:r>
           </w:p>
         </w:tc>
         <w:tc>
           <w:tcPr>
-            <w:tcW w:type="dxa" w:w="864"/>
+            <w:tcW w:type="dxa" w:w="3213"/>
+            <w:tcBorders/>
           </w:tcPr>
           <w:p>
             <w:pPr>
-              <w:jc w:val="left"/>
               <w:bidi w:val="1"/>
+              <w:jc w:val="right"/>
             </w:pPr>
             <w:r>
               <w:rPr>
-                <w:rFonts w:ascii="Arial" w:hAnsi="Arial"/>
-                <w:b/>
-                <w:i w:val="0"/>
+                <w:rFonts w:ascii="Arial" w:hAnsi="Arial" w:cs="Arial"/>
+                <w:b w:val="0"/>
+                <w:color w:val="003399"/>
                 <w:sz w:val="20"/>
+                <w:u w:val="none"/>
               </w:rPr>
-              <w:t>ת.ז:.215359910</w:t>
+              <w:t>שם פרטי: רון</w:t>
             </w:r>
           </w:p>
         </w:tc>
         <w:tc>
           <w:tcPr>
-            <w:tcW w:type="dxa" w:w="864"/>
+            <w:tcW w:type="dxa" w:w="3213"/>
+            <w:tcBorders/>
           </w:tcPr>
           <w:p>
             <w:pPr>
-              <w:jc w:val="center"/>
               <w:bidi w:val="1"/>
+              <w:jc w:val="right"/>
             </w:pPr>
             <w:r>
               <w:rPr>
-                <w:rFonts w:ascii="Arial" w:hAnsi="Arial"/>
+                <w:rFonts w:ascii="Arial" w:hAnsi="Arial" w:cs="Arial"/>
                 <w:b w:val="0"/>
-                <w:i w:val="0"/>
-                <w:sz w:val="16"/>
+                <w:color w:val="003399"/>
+                <w:sz w:val="20"/>
+                <w:u w:val="none"/>
               </w:rPr>
-            </w:r>
-          </w:p>
-        </w:tc>
-        <w:tc>
-          <w:tcPr>
-            <w:tcW w:type="dxa" w:w="864"/>
-          </w:tcPr>
-          <w:p>
-            <w:pPr>
-              <w:jc w:val="center"/>
-              <w:bidi w:val="1"/>
-            </w:pPr>
-            <w:r>
-              <w:rPr>
-                <w:rFonts w:ascii="Arial" w:hAnsi="Arial"/>
-                <w:b w:val="0"/>
-                <w:i w:val="0"/>
-                <w:sz w:val="16"/>
-              </w:rPr>
-              <w:t>פרטי:רון</w:t>
-            </w:r>
-          </w:p>
-        </w:tc>
-        <w:tc>
-          <w:tcPr>
-            <w:tcW w:type="dxa" w:w="864"/>
-          </w:tcPr>
-          <w:p>
-            <w:pPr>
-              <w:jc w:val="right"/>
-              <w:bidi w:val="1"/>
-            </w:pPr>
-            <w:r>
-              <w:rPr>
-                <w:rFonts w:ascii="Arial" w:hAnsi="Arial"/>
-                <w:b/>
-                <w:i w:val="0"/>
-                <w:sz w:val="24"/>
-              </w:rPr>
-              <w:t>שם</w:t>
-            </w:r>
-          </w:p>
-        </w:tc>
-        <w:tc>
-          <w:tcPr>
-            <w:tcW w:type="dxa" w:w="864"/>
-          </w:tcPr>
-          <w:p>
-            <w:pPr>
-              <w:jc w:val="center"/>
-              <w:bidi w:val="1"/>
-            </w:pPr>
-            <w:r>
-              <w:rPr>
-                <w:rFonts w:ascii="Arial" w:hAnsi="Arial"/>
-                <w:b/>
-                <w:i w:val="0"/>
-                <w:sz w:val="24"/>
-              </w:rPr>
-              <w:t>גורפינקל</w:t>
-            </w:r>
-          </w:p>
-        </w:tc>
-        <w:tc>
-          <w:tcPr>
-            <w:tcW w:type="dxa" w:w="864"/>
-          </w:tcPr>
-          <w:p>
-            <w:pPr>
-              <w:jc w:val="left"/>
-              <w:bidi w:val="1"/>
-            </w:pPr>
-            <w:r>
-              <w:rPr>
-                <w:rFonts w:ascii="Arial" w:hAnsi="Arial"/>
-                <w:b/>
-                <w:i w:val="0"/>
-                <w:sz w:val="24"/>
-              </w:rPr>
-              <w:t>החפשמ םש:</w:t>
-            </w:r>
-          </w:p>
-        </w:tc>
-        <w:tc>
-          <w:tcPr>
-            <w:tcW w:type="dxa" w:w="864"/>
-          </w:tcPr>
-          <w:p>
-            <w:pPr>
-              <w:jc w:val="right"/>
-              <w:bidi w:val="1"/>
-            </w:pPr>
-            <w:r>
-              <w:rPr>
-                <w:rFonts w:ascii="Arial" w:hAnsi="Arial"/>
-                <w:b/>
-                <w:i w:val="0"/>
-                <w:sz w:val="20"/>
-              </w:rPr>
-            </w:r>
-          </w:p>
-        </w:tc>
-        <w:tc>
-          <w:tcPr>
-            <w:tcW w:type="dxa" w:w="864"/>
-          </w:tcPr>
-          <w:p>
-            <w:pPr>
-              <w:jc w:val="right"/>
-              <w:bidi w:val="1"/>
-            </w:pPr>
-            <w:r>
-              <w:rPr>
-                <w:rFonts w:ascii="Arial" w:hAnsi="Arial"/>
-                <w:b/>
-                <w:i w:val="0"/>
-                <w:sz w:val="20"/>
-              </w:rPr>
-            </w:r>
-          </w:p>
-        </w:tc>
-        <w:tc>
-          <w:tcPr>
-            <w:tcW w:type="dxa" w:w="864"/>
-          </w:tcPr>
-          <w:p>
-            <w:pPr>
-              <w:jc w:val="center"/>
-              <w:bidi w:val="1"/>
-            </w:pPr>
-            <w:r>
-              <w:rPr>
-                <w:rFonts w:ascii="Arial" w:hAnsi="Arial"/>
-                <w:b/>
-                <w:i w:val="0"/>
-                <w:sz w:val="20"/>
-              </w:rPr>
+              <w:t>שם משפחה: גורפינקל</w:t>
             </w:r>
           </w:p>
         </w:tc>
@@ -1472,198 +355,67 @@
       <w:tr>
         <w:tc>
           <w:tcPr>
-            <w:tcW w:type="dxa" w:w="864"/>
+            <w:tcW w:type="dxa" w:w="3213"/>
+            <w:tcBorders/>
           </w:tcPr>
           <w:p>
             <w:pPr>
-              <w:jc w:val="left"/>
               <w:bidi w:val="1"/>
+              <w:jc w:val="right"/>
             </w:pPr>
             <w:r>
               <w:rPr>
-                <w:rFonts w:ascii="Arial Narrow" w:hAnsi="Arial Narrow"/>
+                <w:rFonts w:ascii="Arial" w:hAnsi="Arial" w:cs="Arial"/>
                 <w:b w:val="0"/>
-                <w:i w:val="0"/>
+                <w:color w:val="003399"/>
                 <w:sz w:val="20"/>
+                <w:u w:val="none"/>
               </w:rPr>
+              <w:t>טל. עבודה/נייד: 0522460193</w:t>
             </w:r>
           </w:p>
         </w:tc>
         <w:tc>
           <w:tcPr>
-            <w:tcW w:type="dxa" w:w="864"/>
+            <w:tcW w:type="dxa" w:w="3213"/>
+            <w:tcBorders/>
           </w:tcPr>
           <w:p>
             <w:pPr>
-              <w:jc w:val="left"/>
               <w:bidi w:val="1"/>
+              <w:jc w:val="right"/>
             </w:pPr>
             <w:r>
               <w:rPr>
-                <w:rFonts w:ascii="Arial" w:hAnsi="Arial"/>
-                <w:b/>
-                <w:i w:val="0"/>
+                <w:rFonts w:ascii="Arial" w:hAnsi="Arial" w:cs="Arial"/>
+                <w:b w:val="0"/>
+                <w:color w:val="003399"/>
                 <w:sz w:val="20"/>
+                <w:u w:val="none"/>
               </w:rPr>
-              <w:t>נייד:0522460193</w:t>
+              <w:t>מין: ז</w:t>
             </w:r>
           </w:p>
         </w:tc>
         <w:tc>
           <w:tcPr>
-            <w:tcW w:type="dxa" w:w="864"/>
+            <w:tcW w:type="dxa" w:w="3213"/>
+            <w:tcBorders/>
           </w:tcPr>
           <w:p>
             <w:pPr>
-              <w:jc w:val="center"/>
               <w:bidi w:val="1"/>
+              <w:jc w:val="right"/>
             </w:pPr>
             <w:r>
               <w:rPr>
-                <w:rFonts w:ascii="Arial" w:hAnsi="Arial"/>
+                <w:rFonts w:ascii="Arial" w:hAnsi="Arial" w:cs="Arial"/>
                 <w:b w:val="0"/>
-                <w:i w:val="0"/>
-                <w:sz w:val="16"/>
+                <w:color w:val="003399"/>
+                <w:sz w:val="20"/>
+                <w:u w:val="none"/>
               </w:rPr>
-              <w:t>טל.עבודה/</w:t>
-            </w:r>
-          </w:p>
-        </w:tc>
-        <w:tc>
-          <w:tcPr>
-            <w:tcW w:type="dxa" w:w="864"/>
-          </w:tcPr>
-          <w:p>
-            <w:pPr>
-              <w:jc w:val="center"/>
-              <w:bidi w:val="1"/>
-            </w:pPr>
-            <w:r>
-              <w:rPr>
-                <w:rFonts w:ascii="Arial" w:hAnsi="Arial"/>
-                <w:b w:val="0"/>
-                <w:i w:val="0"/>
-                <w:sz w:val="16"/>
-              </w:rPr>
-              <w:t>08-9244787</w:t>
-            </w:r>
-          </w:p>
-        </w:tc>
-        <w:tc>
-          <w:tcPr>
-            <w:tcW w:type="dxa" w:w="864"/>
-          </w:tcPr>
-          <w:p>
-            <w:pPr>
-              <w:jc w:val="right"/>
-              <w:bidi w:val="1"/>
-            </w:pPr>
-            <w:r>
-              <w:rPr>
-                <w:rFonts w:ascii="Arial" w:hAnsi="Arial"/>
-                <w:b/>
-                <w:i w:val="0"/>
-                <w:sz w:val="24"/>
-              </w:rPr>
-              <w:t>טלפון:</w:t>
-            </w:r>
-          </w:p>
-        </w:tc>
-        <w:tc>
-          <w:tcPr>
-            <w:tcW w:type="dxa" w:w="864"/>
-          </w:tcPr>
-          <w:p>
-            <w:pPr>
-              <w:jc w:val="center"/>
-              <w:bidi w:val="1"/>
-            </w:pPr>
-            <w:r>
-              <w:rPr>
-                <w:rFonts w:ascii="Arial" w:hAnsi="Arial"/>
-                <w:b/>
-                <w:i w:val="0"/>
-                <w:sz w:val="24"/>
-              </w:rPr>
-              <w:t>30/05/2005מין:ז</w:t>
-            </w:r>
-          </w:p>
-        </w:tc>
-        <w:tc>
-          <w:tcPr>
-            <w:tcW w:type="dxa" w:w="864"/>
-          </w:tcPr>
-          <w:p>
-            <w:pPr>
-              <w:jc w:val="left"/>
-              <w:bidi w:val="1"/>
-            </w:pPr>
-            <w:r>
-              <w:rPr>
-                <w:rFonts w:ascii="Arial" w:hAnsi="Arial"/>
-                <w:b/>
-                <w:i w:val="0"/>
-                <w:sz w:val="24"/>
-              </w:rPr>
-              <w:t>:</w:t>
-            </w:r>
-          </w:p>
-        </w:tc>
-        <w:tc>
-          <w:tcPr>
-            <w:tcW w:type="dxa" w:w="864"/>
-          </w:tcPr>
-          <w:p>
-            <w:pPr>
-              <w:jc w:val="right"/>
-              <w:bidi w:val="1"/>
-            </w:pPr>
-            <w:r>
-              <w:rPr>
-                <w:rFonts w:ascii="Arial" w:hAnsi="Arial"/>
-                <w:b/>
-                <w:i w:val="0"/>
-                <w:sz w:val="20"/>
-              </w:rPr>
-              <w:t>ת.לידה</w:t>
-            </w:r>
-          </w:p>
-        </w:tc>
-        <w:tc>
-          <w:tcPr>
-            <w:tcW w:type="dxa" w:w="864"/>
-          </w:tcPr>
-          <w:p>
-            <w:pPr>
-              <w:jc w:val="right"/>
-              <w:bidi w:val="1"/>
-            </w:pPr>
-            <w:r>
-              <w:rPr>
-                <w:rFonts w:ascii="Arial" w:hAnsi="Arial"/>
-                <w:b/>
-                <w:i w:val="0"/>
-                <w:sz w:val="20"/>
-              </w:rPr>
-            </w:r>
-          </w:p>
-        </w:tc>
-        <w:tc>
-          <w:tcPr>
-            <w:tcW w:type="dxa" w:w="864"/>
-          </w:tcPr>
-          <w:p>
-            <w:pPr>
-              <w:jc w:val="center"/>
-              <w:bidi w:val="1"/>
-            </w:pPr>
-            <w:r>
-              <w:rPr>
-                <w:rFonts w:ascii="Arial" w:hAnsi="Arial"/>
-                <w:b/>
-                <w:i w:val="0"/>
-                <w:sz w:val="20"/>
-              </w:rPr>
+              <w:t>ת.לידה: 30/05/2005</w:t>
             </w:r>
           </w:p>
         </w:tc>
@@ -1671,195 +423,67 @@
       <w:tr>
         <w:tc>
           <w:tcPr>
-            <w:tcW w:type="dxa" w:w="864"/>
+            <w:tcW w:type="dxa" w:w="3213"/>
+            <w:tcBorders/>
           </w:tcPr>
           <w:p>
             <w:pPr>
-              <w:jc w:val="left"/>
               <w:bidi w:val="1"/>
+              <w:jc w:val="right"/>
             </w:pPr>
             <w:r>
               <w:rPr>
-                <w:rFonts w:ascii="Arial Narrow" w:hAnsi="Arial Narrow"/>
+                <w:rFonts w:ascii="Arial" w:hAnsi="Arial" w:cs="Arial"/>
                 <w:b w:val="0"/>
-                <w:i w:val="0"/>
+                <w:color w:val="003399"/>
                 <w:sz w:val="20"/>
+                <w:u w:val="none"/>
               </w:rPr>
+              <w:t>טלפון: 08-9244787</w:t>
             </w:r>
           </w:p>
         </w:tc>
         <w:tc>
           <w:tcPr>
-            <w:tcW w:type="dxa" w:w="864"/>
+            <w:tcW w:type="dxa" w:w="3213"/>
+            <w:tcBorders/>
           </w:tcPr>
           <w:p>
             <w:pPr>
-              <w:jc w:val="left"/>
               <w:bidi w:val="1"/>
+              <w:jc w:val="right"/>
             </w:pPr>
             <w:r>
               <w:rPr>
-                <w:rFonts w:ascii="Arial" w:hAnsi="Arial"/>
-                <w:b/>
-                <w:i w:val="0"/>
+                <w:rFonts w:ascii="Arial" w:hAnsi="Arial" w:cs="Arial"/>
+                <w:b w:val="0"/>
+                <w:color w:val="003399"/>
                 <w:sz w:val="20"/>
+                <w:u w:val="none"/>
               </w:rPr>
-              <w:t>מיקוד7228212</w:t>
+              <w:t>מיקוד: 7228212</w:t>
             </w:r>
           </w:p>
         </w:tc>
         <w:tc>
           <w:tcPr>
-            <w:tcW w:type="dxa" w:w="864"/>
+            <w:tcW w:type="dxa" w:w="3213"/>
+            <w:tcBorders/>
           </w:tcPr>
           <w:p>
             <w:pPr>
-              <w:jc w:val="center"/>
               <w:bidi w:val="1"/>
+              <w:jc w:val="right"/>
             </w:pPr>
             <w:r>
               <w:rPr>
-                <w:rFonts w:ascii="Arial" w:hAnsi="Arial"/>
+                <w:rFonts w:ascii="Arial" w:hAnsi="Arial" w:cs="Arial"/>
                 <w:b w:val="0"/>
-                <w:i w:val="0"/>
-                <w:sz w:val="16"/>
+                <w:color w:val="003399"/>
+                <w:sz w:val="20"/>
+                <w:u w:val="none"/>
               </w:rPr>
-            </w:r>
-          </w:p>
-        </w:tc>
-        <w:tc>
-          <w:tcPr>
-            <w:tcW w:type="dxa" w:w="864"/>
-          </w:tcPr>
-          <w:p>
-            <w:pPr>
-              <w:jc w:val="center"/>
-              <w:bidi w:val="1"/>
-            </w:pPr>
-            <w:r>
-              <w:rPr>
-                <w:rFonts w:ascii="Arial" w:hAnsi="Arial"/>
-                <w:b w:val="0"/>
-                <w:i w:val="0"/>
-                <w:sz w:val="16"/>
-              </w:rPr>
-            </w:r>
-          </w:p>
-        </w:tc>
-        <w:tc>
-          <w:tcPr>
-            <w:tcW w:type="dxa" w:w="864"/>
-          </w:tcPr>
-          <w:p>
-            <w:pPr>
-              <w:jc w:val="right"/>
-              <w:bidi w:val="1"/>
-            </w:pPr>
-            <w:r>
-              <w:rPr>
-                <w:rFonts w:ascii="Arial" w:hAnsi="Arial"/>
-                <w:b/>
-                <w:i w:val="0"/>
-                <w:sz w:val="24"/>
-              </w:rPr>
-            </w:r>
-          </w:p>
-        </w:tc>
-        <w:tc>
-          <w:tcPr>
-            <w:tcW w:type="dxa" w:w="864"/>
-          </w:tcPr>
-          <w:p>
-            <w:pPr>
-              <w:jc w:val="center"/>
-              <w:bidi w:val="1"/>
-            </w:pPr>
-            <w:r>
-              <w:rPr>
-                <w:rFonts w:ascii="Arial" w:hAnsi="Arial"/>
-                <w:b/>
-                <w:i w:val="0"/>
-                <w:sz w:val="24"/>
-              </w:rPr>
-              <w:t>אפריאט6 ,רמלה</w:t>
-            </w:r>
-          </w:p>
-        </w:tc>
-        <w:tc>
-          <w:tcPr>
-            <w:tcW w:type="dxa" w:w="864"/>
-          </w:tcPr>
-          <w:p>
-            <w:pPr>
-              <w:jc w:val="left"/>
-              <w:bidi w:val="1"/>
-            </w:pPr>
-            <w:r>
-              <w:rPr>
-                <w:rFonts w:ascii="Arial" w:hAnsi="Arial"/>
-                <w:b/>
-                <w:i w:val="0"/>
-                <w:sz w:val="24"/>
-              </w:rPr>
-              <w:t>הרב</w:t>
-            </w:r>
-          </w:p>
-        </w:tc>
-        <w:tc>
-          <w:tcPr>
-            <w:tcW w:type="dxa" w:w="864"/>
-          </w:tcPr>
-          <w:p>
-            <w:pPr>
-              <w:jc w:val="right"/>
-              <w:bidi w:val="1"/>
-            </w:pPr>
-            <w:r>
-              <w:rPr>
-                <w:rFonts w:ascii="Arial" w:hAnsi="Arial"/>
-                <w:b/>
-                <w:i w:val="0"/>
-                <w:sz w:val="20"/>
-              </w:rPr>
-              <w:t>כתובת:</w:t>
-            </w:r>
-          </w:p>
-        </w:tc>
-        <w:tc>
-          <w:tcPr>
-            <w:tcW w:type="dxa" w:w="864"/>
-          </w:tcPr>
-          <w:p>
-            <w:pPr>
-              <w:jc w:val="right"/>
-              <w:bidi w:val="1"/>
-            </w:pPr>
-            <w:r>
-              <w:rPr>
-                <w:rFonts w:ascii="Arial" w:hAnsi="Arial"/>
-                <w:b/>
-                <w:i w:val="0"/>
-                <w:sz w:val="20"/>
-              </w:rPr>
-            </w:r>
-          </w:p>
-        </w:tc>
-        <w:tc>
-          <w:tcPr>
-            <w:tcW w:type="dxa" w:w="864"/>
-          </w:tcPr>
-          <w:p>
-            <w:pPr>
-              <w:jc w:val="center"/>
-              <w:bidi w:val="1"/>
-            </w:pPr>
-            <w:r>
-              <w:rPr>
-                <w:rFonts w:ascii="Arial" w:hAnsi="Arial"/>
-                <w:b/>
-                <w:i w:val="0"/>
-                <w:sz w:val="20"/>
-              </w:rPr>
+              <w:t>כתובת: הרב אפריאט 6, רמלה</w:t>
             </w:r>
           </w:p>
         </w:tc>
@@ -1867,351 +491,143 @@
       <w:tr>
         <w:tc>
           <w:tcPr>
-            <w:tcW w:type="dxa" w:w="864"/>
+            <w:tcW w:type="dxa" w:w="3213"/>
+            <w:tcBorders/>
           </w:tcPr>
-          <w:p>
-            <w:pPr>
-              <w:jc w:val="left"/>
-              <w:bidi w:val="1"/>
-            </w:pPr>
-            <w:r>
-              <w:rPr>
-                <w:rFonts w:ascii="Arial Narrow" w:hAnsi="Arial Narrow"/>
-                <w:b w:val="0"/>
-                <w:i w:val="0"/>
-                <w:sz w:val="20"/>
-              </w:rPr>
-            </w:r>
-          </w:p>
+          <w:p/>
         </w:tc>
         <w:tc>
           <w:tcPr>
-            <w:tcW w:type="dxa" w:w="864"/>
+            <w:tcW w:type="dxa" w:w="3213"/>
+            <w:tcBorders/>
           </w:tcPr>
-          <w:p>
-            <w:pPr>
-              <w:jc w:val="left"/>
-              <w:bidi w:val="1"/>
-            </w:pPr>
-            <w:r>
-              <w:rPr>
-                <w:rFonts w:ascii="Arial" w:hAnsi="Arial"/>
-                <w:b/>
-                <w:i w:val="0"/>
-                <w:sz w:val="20"/>
-              </w:rPr>
-            </w:r>
-          </w:p>
+          <w:p/>
         </w:tc>
         <w:tc>
           <w:tcPr>
-            <w:tcW w:type="dxa" w:w="864"/>
+            <w:tcW w:type="dxa" w:w="3213"/>
+            <w:tcBorders/>
           </w:tcPr>
-          <w:p>
-            <w:pPr>
-              <w:jc w:val="center"/>
-              <w:bidi w:val="1"/>
-            </w:pPr>
-            <w:r>
-              <w:rPr>
-                <w:rFonts w:ascii="Arial" w:hAnsi="Arial"/>
-                <w:b w:val="0"/>
-                <w:i w:val="0"/>
-                <w:sz w:val="16"/>
-              </w:rPr>
-            </w:r>
-          </w:p>
-        </w:tc>
-        <w:tc>
-          <w:tcPr>
-            <w:tcW w:type="dxa" w:w="864"/>
-          </w:tcPr>
-          <w:p>
-            <w:pPr>
-              <w:jc w:val="center"/>
-              <w:bidi w:val="1"/>
-            </w:pPr>
-            <w:r>
-              <w:rPr>
-                <w:rFonts w:ascii="Arial" w:hAnsi="Arial"/>
-                <w:b w:val="0"/>
-                <w:i w:val="0"/>
-                <w:sz w:val="16"/>
-              </w:rPr>
-            </w:r>
-          </w:p>
-        </w:tc>
-        <w:tc>
-          <w:tcPr>
-            <w:tcW w:type="dxa" w:w="864"/>
-          </w:tcPr>
-          <w:p>
-            <w:pPr>
-              <w:jc w:val="right"/>
-              <w:bidi w:val="1"/>
-            </w:pPr>
-            <w:r>
-              <w:rPr>
-                <w:rFonts w:ascii="Arial" w:hAnsi="Arial"/>
-                <w:b/>
-                <w:i w:val="0"/>
-                <w:sz w:val="24"/>
-              </w:rPr>
-            </w:r>
-          </w:p>
-        </w:tc>
-        <w:tc>
-          <w:tcPr>
-            <w:tcW w:type="dxa" w:w="864"/>
-          </w:tcPr>
-          <w:p>
-            <w:pPr>
-              <w:jc w:val="center"/>
-              <w:bidi w:val="1"/>
-            </w:pPr>
-            <w:r>
-              <w:rPr>
-                <w:rFonts w:ascii="Arial" w:hAnsi="Arial"/>
-                <w:b/>
-                <w:i w:val="0"/>
-                <w:sz w:val="24"/>
-              </w:rPr>
-            </w:r>
-          </w:p>
-        </w:tc>
-        <w:tc>
-          <w:tcPr>
-            <w:tcW w:type="dxa" w:w="864"/>
-          </w:tcPr>
-          <w:p>
-            <w:pPr>
-              <w:jc w:val="left"/>
-              <w:bidi w:val="1"/>
-            </w:pPr>
-            <w:r>
-              <w:rPr>
-                <w:rFonts w:ascii="Arial" w:hAnsi="Arial"/>
-                <w:b/>
-                <w:i w:val="0"/>
-                <w:sz w:val="24"/>
-              </w:rPr>
-            </w:r>
-          </w:p>
-        </w:tc>
-        <w:tc>
-          <w:tcPr>
-            <w:tcW w:type="dxa" w:w="864"/>
-          </w:tcPr>
-          <w:p>
-            <w:pPr>
-              <w:jc w:val="right"/>
-              <w:bidi w:val="1"/>
-            </w:pPr>
-            <w:r>
-              <w:rPr>
-                <w:rFonts w:ascii="Arial" w:hAnsi="Arial"/>
-                <w:b/>
-                <w:i w:val="0"/>
-                <w:sz w:val="20"/>
-              </w:rPr>
-              <w:t>0215359910</w:t>
-            </w:r>
-          </w:p>
-        </w:tc>
-        <w:tc>
-          <w:tcPr>
-            <w:tcW w:type="dxa" w:w="864"/>
-          </w:tcPr>
-          <w:p>
-            <w:pPr>
-              <w:jc w:val="right"/>
-              <w:bidi w:val="1"/>
-            </w:pPr>
-            <w:r>
-              <w:rPr>
-                <w:rFonts w:ascii="Arial" w:hAnsi="Arial"/>
-                <w:b/>
-                <w:i w:val="0"/>
-                <w:sz w:val="20"/>
-              </w:rPr>
-            </w:r>
-          </w:p>
-        </w:tc>
-        <w:tc>
-          <w:tcPr>
-            <w:tcW w:type="dxa" w:w="864"/>
-          </w:tcPr>
-          <w:p>
-            <w:pPr>
-              <w:jc w:val="center"/>
-              <w:bidi w:val="1"/>
-            </w:pPr>
-            <w:r>
-              <w:rPr>
-                <w:rFonts w:ascii="Arial" w:hAnsi="Arial"/>
-                <w:b/>
-                <w:i w:val="0"/>
-                <w:sz w:val="20"/>
-              </w:rPr>
-            </w:r>
-          </w:p>
+          <w:p/>
         </w:tc>
       </w:tr>
     </w:tbl>
     <w:p>
       <w:pPr>
-        <w:autoSpaceDN w:val="0"/>
-        <w:autoSpaceDE w:val="0"/>
-        <w:widowControl/>
-        <w:spacing w:line="20" w:lineRule="exact" w:before="0" w:after="0"/>
-        <w:ind w:left="0" w:right="0"/>
+        <w:bidi w:val="1"/>
+        <w:spacing w:after="200" w:before="0"/>
+        <w:jc w:val="right"/>
       </w:pPr>
+    </w:p>
+    <w:p>
+      <w:pPr>
+        <w:bidi w:val="1"/>
+        <w:spacing w:after="160" w:before="0"/>
+        <w:jc w:val="center"/>
+      </w:pPr>
+      <w:r>
+        <w:rPr>
+          <w:rFonts w:ascii="Arial" w:hAnsi="Arial" w:cs="Arial"/>
+          <w:b/>
+          <w:color w:val="003399"/>
+          <w:sz w:val="28"/>
+          <w:u w:val="single"/>
+        </w:rPr>
+        <w:t>אישור מחלה</w:t>
+      </w:r>
+    </w:p>
+    <w:p>
+      <w:pPr>
+        <w:bidi w:val="1"/>
+        <w:spacing w:after="160" w:before="0"/>
+        <w:jc w:val="left"/>
+      </w:pPr>
+      <w:r>
+        <w:rPr>
+          <w:rFonts w:ascii="Arial" w:hAnsi="Arial" w:cs="Arial"/>
+          <w:b w:val="0"/>
+          <w:sz w:val="18"/>
+          <w:u w:val="none"/>
+        </w:rPr>
+        <w:t>ET4D-CV5-ZKC-6R82-449XH</w:t>
+      </w:r>
+    </w:p>
+    <w:p>
+      <w:pPr>
+        <w:bidi w:val="1"/>
+        <w:spacing w:after="160" w:before="0"/>
+        <w:jc w:val="right"/>
+      </w:pPr>
+      <w:r>
+        <w:rPr>
+          <w:rFonts w:ascii="Arial" w:hAnsi="Arial" w:cs="Arial"/>
+          <w:b w:val="0"/>
+          <w:sz w:val="20"/>
+          <w:u w:val="none"/>
+        </w:rPr>
+        <w:t>הנני לאשר כי הנ"ל חלה/תה, האבחנה מפורטת ברשומה הרפואית.</w:t>
+      </w:r>
+    </w:p>
+    <w:p>
+      <w:pPr>
+        <w:bidi w:val="1"/>
+        <w:spacing w:after="400" w:before="0"/>
+        <w:jc w:val="right"/>
+      </w:pPr>
+      <w:r>
+        <w:rPr>
+          <w:rFonts w:ascii="Arial" w:hAnsi="Arial" w:cs="Arial"/>
+          <w:b w:val="0"/>
+          <w:sz w:val="20"/>
+          <w:u w:val="none"/>
+        </w:rPr>
+        <w:t>אינו/ה מסוגל/ת לעבוד מיום: 24/08/2026  עד יום: 27/08/2026  סה"כ: 4 ימים.</w:t>
+      </w:r>
     </w:p>
     <w:tbl>
       <w:tblPr>
         <w:tblW w:type="auto" w:w="0"/>
-        <w:tblLayout w:type="fixed"/>
         <w:tblLook w:firstColumn="1" w:firstRow="1" w:lastColumn="0" w:lastRow="0" w:noHBand="0" w:noVBand="1" w:val="04A0"/>
-        <w:tblInd w:w="2672.0" w:type="dxa"/>
       </w:tblPr>
       <w:tblGrid>
-        <w:gridCol w:w="5417"/>
-        <w:gridCol w:w="5417"/>
+        <w:gridCol w:w="4819"/>
+        <w:gridCol w:w="4819"/>
       </w:tblGrid>
       <w:tr>
-        <w:trPr>
-          <w:trHeight w:hRule="exact" w:val="326"/>
-        </w:trPr>
         <w:tc>
           <w:tcPr>
-            <w:tcW w:type="dxa" w:w="3260"/>
-            <w:tcBorders/>
-            <w:tcMar>
-              <w:start w:w="0" w:type="dxa"/>
-              <w:end w:w="0" w:type="dxa"/>
-            </w:tcMar>
+            <w:tcW w:type="dxa" w:w="4819"/>
+            <w:tcBorders>
+              <w:top w:val="nil" w:sz="8" w:space="0" w:color="003399"/>
+              <w:bottom w:val="nil" w:sz="8" w:space="0" w:color="003399"/>
+              <w:left w:val="nil" w:sz="8" w:space="0" w:color="003399"/>
+              <w:right w:val="nil" w:sz="8" w:space="0" w:color="003399"/>
+            </w:tcBorders>
+          </w:tcPr>
+          <w:p/>
+        </w:tc>
+        <w:tc>
+          <w:tcPr>
+            <w:tcW w:type="dxa" w:w="4819"/>
+            <w:tcBorders>
+              <w:top w:val="nil" w:sz="8" w:space="0" w:color="003399"/>
+              <w:bottom w:val="nil" w:sz="8" w:space="0" w:color="003399"/>
+              <w:left w:val="nil" w:sz="8" w:space="0" w:color="003399"/>
+              <w:right w:val="nil" w:sz="8" w:space="0" w:color="003399"/>
+            </w:tcBorders>
           </w:tcPr>
           <w:p>
             <w:pPr>
-              <w:autoSpaceDN w:val="0"/>
-              <w:autoSpaceDE w:val="0"/>
-              <w:widowControl/>
-              <w:spacing w:line="240" w:lineRule="exact" w:before="60" w:after="0"/>
-              <w:ind w:left="0" w:right="12" w:firstLine="0"/>
+              <w:bidi w:val="1"/>
               <w:jc w:val="right"/>
             </w:pPr>
             <w:r>
               <w:rPr>
-                <w:rFonts w:ascii="Arial" w:hAnsi="Arial" w:eastAsia="Arial"/>
-                <w:b/>
-                <w:i w:val="0"/>
-                <w:color w:val="000000"/>
-                <w:sz w:val="24"/>
-              </w:rPr>
-              <w:t>מחלה</w:t>
-            </w:r>
-          </w:p>
-        </w:tc>
-        <w:tc>
-          <w:tcPr>
-            <w:tcW w:type="dxa" w:w="2740"/>
-            <w:tcBorders/>
-            <w:tcMar>
-              <w:start w:w="0" w:type="dxa"/>
-              <w:end w:w="0" w:type="dxa"/>
-            </w:tcMar>
-          </w:tcPr>
-          <w:p>
-            <w:pPr>
-              <w:autoSpaceDN w:val="0"/>
-              <w:autoSpaceDE w:val="0"/>
-              <w:widowControl/>
-              <w:spacing w:line="240" w:lineRule="exact" w:before="60" w:after="0"/>
-              <w:ind w:left="42" w:right="0" w:firstLine="0"/>
-              <w:jc w:val="left"/>
-            </w:pPr>
-            <w:r>
-              <w:rPr>
-                <w:rFonts w:ascii="Arial" w:hAnsi="Arial" w:eastAsia="Arial"/>
-                <w:b/>
-                <w:i w:val="0"/>
-                <w:color w:val="000000"/>
-                <w:sz w:val="24"/>
-              </w:rPr>
-              <w:t>אישור</w:t>
-            </w:r>
-          </w:p>
-        </w:tc>
-      </w:tr>
-    </w:tbl>
-    <w:p>
-      <w:pPr>
-        <w:autoSpaceDN w:val="0"/>
-        <w:autoSpaceDE w:val="0"/>
-        <w:widowControl/>
-        <w:spacing w:line="20" w:lineRule="exact" w:before="0" w:after="0"/>
-        <w:ind w:left="0" w:right="0"/>
-      </w:pPr>
-    </w:p>
-    <w:tbl>
-      <w:tblPr>
-        <w:tblW w:type="auto" w:w="0"/>
-        <w:tblLayout w:type="fixed"/>
-        <w:tblLook w:firstColumn="1" w:firstRow="1" w:lastColumn="0" w:lastRow="0" w:noHBand="0" w:noVBand="1" w:val="04A0"/>
-        <w:tblInd w:w="720.0" w:type="dxa"/>
-      </w:tblPr>
-      <w:tblGrid>
-        <w:gridCol w:w="2709"/>
-        <w:gridCol w:w="2709"/>
-        <w:gridCol w:w="2709"/>
-        <w:gridCol w:w="2709"/>
-      </w:tblGrid>
-      <w:tr>
-        <w:trPr>
-          <w:trHeight w:hRule="exact" w:val="2864"/>
-        </w:trPr>
-        <w:tc>
-          <w:tcPr>
-            <w:tcW w:type="dxa" w:w="10006"/>
-            <w:gridSpan w:val="4"/>
-            <w:tcBorders>
-              <w:top w:sz="6.400000000000091" w:val="single" w:color="#000000"/>
-              <w:bottom w:sz="6.0" w:val="single" w:color="#00008A"/>
-            </w:tcBorders>
-            <w:tcMar>
-              <w:start w:w="0" w:type="dxa"/>
-              <w:end w:w="0" w:type="dxa"/>
-            </w:tcMar>
-            <w:tcMar>
-              <w:start w:w="0" w:type="dxa"/>
-              <w:end w:w="0" w:type="dxa"/>
-            </w:tcMar>
-            <w:tcMar>
-              <w:start w:w="0" w:type="dxa"/>
-              <w:end w:w="0" w:type="dxa"/>
-            </w:tcMar>
-            <w:tcMar>
-              <w:start w:w="0" w:type="dxa"/>
-              <w:end w:w="0" w:type="dxa"/>
-            </w:tcMar>
-          </w:tcPr>
-          <w:p>
-            <w:pPr>
-              <w:autoSpaceDN w:val="0"/>
-              <w:autoSpaceDE w:val="0"/>
-              <w:widowControl/>
-              <w:spacing w:line="196" w:lineRule="exact" w:before="2478" w:after="0"/>
-              <w:ind w:left="0" w:right="424" w:firstLine="0"/>
-              <w:jc w:val="right"/>
-            </w:pPr>
-            <w:r>
-              <w:rPr>
-                <w:w w:val="97.5"/>
-                <w:rFonts w:ascii="Arial Narrow" w:hAnsi="Arial Narrow" w:eastAsia="Arial Narrow"/>
+                <w:rFonts w:ascii="Arial" w:hAnsi="Arial" w:cs="Arial"/>
                 <w:b w:val="0"/>
-                <w:i w:val="0"/>
-                <w:color w:val="000000"/>
+                <w:color w:val="003399"/>
                 <w:sz w:val="20"/>
+                <w:u w:val="none"/>
               </w:rPr>
               <w:t>31/08/2026</w:t>
             </w:r>
@@ -2219,136 +635,55 @@
         </w:tc>
       </w:tr>
       <w:tr>
-        <w:trPr>
-          <w:trHeight w:hRule="exact" w:val="372"/>
-        </w:trPr>
         <w:tc>
           <w:tcPr>
-            <w:tcW w:type="dxa" w:w="932"/>
+            <w:tcW w:type="dxa" w:w="4819"/>
             <w:tcBorders>
-              <w:top w:sz="6.0" w:val="single" w:color="#00008A"/>
+              <w:top w:val="nil" w:sz="8" w:space="0" w:color="003399"/>
+              <w:bottom w:val="nil" w:sz="8" w:space="0" w:color="003399"/>
+              <w:left w:val="nil" w:sz="8" w:space="0" w:color="003399"/>
+              <w:right w:val="nil" w:sz="8" w:space="0" w:color="003399"/>
             </w:tcBorders>
-            <w:tcMar>
-              <w:start w:w="0" w:type="dxa"/>
-              <w:end w:w="0" w:type="dxa"/>
-            </w:tcMar>
           </w:tcPr>
           <w:p>
             <w:pPr>
-              <w:autoSpaceDN w:val="0"/>
-              <w:autoSpaceDE w:val="0"/>
-              <w:widowControl/>
-              <w:spacing w:line="196" w:lineRule="exact" w:before="168" w:after="0"/>
-              <w:ind w:left="0" w:right="12" w:firstLine="0"/>
+              <w:bidi w:val="1"/>
               <w:jc w:val="right"/>
             </w:pPr>
             <w:r>
               <w:rPr>
-                <w:w w:val="97.5"/>
-                <w:rFonts w:ascii="Arial" w:hAnsi="Arial" w:eastAsia="Arial"/>
-                <w:b/>
-                <w:i w:val="0"/>
-                <w:color w:val="00008B"/>
+                <w:rFonts w:ascii="Arial" w:hAnsi="Arial" w:cs="Arial"/>
+                <w:b w:val="0"/>
+                <w:color w:val="003399"/>
                 <w:sz w:val="20"/>
+                <w:u w:val="none"/>
               </w:rPr>
-              <w:t>הרופא</w:t>
+              <w:t>חתימה וחותמת הרופא</w:t>
             </w:r>
           </w:p>
         </w:tc>
         <w:tc>
           <w:tcPr>
-            <w:tcW w:type="dxa" w:w="660"/>
+            <w:tcW w:type="dxa" w:w="4819"/>
             <w:tcBorders>
-              <w:top w:sz="6.0" w:val="single" w:color="#00008A"/>
+              <w:top w:val="nil" w:sz="8" w:space="0" w:color="003399"/>
+              <w:bottom w:val="nil" w:sz="8" w:space="0" w:color="003399"/>
+              <w:left w:val="nil" w:sz="8" w:space="0" w:color="003399"/>
+              <w:right w:val="nil" w:sz="8" w:space="0" w:color="003399"/>
             </w:tcBorders>
-            <w:tcMar>
-              <w:start w:w="0" w:type="dxa"/>
-              <w:end w:w="0" w:type="dxa"/>
-            </w:tcMar>
           </w:tcPr>
           <w:p>
             <w:pPr>
-              <w:autoSpaceDN w:val="0"/>
-              <w:autoSpaceDE w:val="0"/>
-              <w:widowControl/>
-              <w:spacing w:line="196" w:lineRule="exact" w:before="168" w:after="0"/>
-              <w:ind w:left="0" w:right="0" w:firstLine="0"/>
-              <w:jc w:val="center"/>
-            </w:pPr>
-            <w:r>
-              <w:rPr>
-                <w:w w:val="97.5"/>
-                <w:rFonts w:ascii="Arial" w:hAnsi="Arial" w:eastAsia="Arial"/>
-                <w:b/>
-                <w:i w:val="0"/>
-                <w:color w:val="00008B"/>
-                <w:sz w:val="20"/>
-              </w:rPr>
-              <w:t>וחותמת</w:t>
-            </w:r>
-          </w:p>
-        </w:tc>
-        <w:tc>
-          <w:tcPr>
-            <w:tcW w:type="dxa" w:w="4230"/>
-            <w:tcBorders>
-              <w:top w:sz="6.0" w:val="single" w:color="#00008A"/>
-            </w:tcBorders>
-            <w:tcMar>
-              <w:start w:w="0" w:type="dxa"/>
-              <w:end w:w="0" w:type="dxa"/>
-            </w:tcMar>
-          </w:tcPr>
-          <w:p>
-            <w:pPr>
-              <w:autoSpaceDN w:val="0"/>
-              <w:autoSpaceDE w:val="0"/>
-              <w:widowControl/>
-              <w:spacing w:line="196" w:lineRule="exact" w:before="168" w:after="0"/>
-              <w:ind w:left="28" w:right="0" w:firstLine="0"/>
-              <w:jc w:val="left"/>
-            </w:pPr>
-            <w:r>
-              <w:rPr>
-                <w:w w:val="97.5"/>
-                <w:rFonts w:ascii="Arial" w:hAnsi="Arial" w:eastAsia="Arial"/>
-                <w:b/>
-                <w:i w:val="0"/>
-                <w:color w:val="00008B"/>
-                <w:sz w:val="20"/>
-              </w:rPr>
-              <w:t>חתימה</w:t>
-            </w:r>
-          </w:p>
-        </w:tc>
-        <w:tc>
-          <w:tcPr>
-            <w:tcW w:type="dxa" w:w="4184"/>
-            <w:tcBorders>
-              <w:top w:sz="6.0" w:val="single" w:color="#00008A"/>
-            </w:tcBorders>
-            <w:tcMar>
-              <w:start w:w="0" w:type="dxa"/>
-              <w:end w:w="0" w:type="dxa"/>
-            </w:tcMar>
-          </w:tcPr>
-          <w:p>
-            <w:pPr>
-              <w:autoSpaceDN w:val="0"/>
-              <w:autoSpaceDE w:val="0"/>
-              <w:widowControl/>
-              <w:spacing w:line="196" w:lineRule="exact" w:before="168" w:after="0"/>
-              <w:ind w:left="0" w:right="384" w:firstLine="0"/>
+              <w:bidi w:val="1"/>
               <w:jc w:val="right"/>
             </w:pPr>
             <w:r>
               <w:rPr>
-                <w:w w:val="97.5"/>
-                <w:rFonts w:ascii="Arial" w:hAnsi="Arial" w:eastAsia="Arial"/>
-                <w:b/>
-                <w:i w:val="0"/>
-                <w:color w:val="00008B"/>
+                <w:rFonts w:ascii="Arial" w:hAnsi="Arial" w:cs="Arial"/>
+                <w:b w:val="0"/>
+                <w:color w:val="003399"/>
                 <w:sz w:val="20"/>
+                <w:u w:val="none"/>
               </w:rPr>
               <w:t>תאריך</w:t>
             </w:r>
@@ -2356,797 +691,10 @@
         </w:tc>
       </w:tr>
     </w:tbl>
-    <w:p>
-      <w:pPr>
-        <w:autoSpaceDN w:val="0"/>
-        <w:autoSpaceDE w:val="0"/>
-        <w:widowControl/>
-        <w:spacing w:line="16" w:lineRule="exact" w:before="0" w:after="42"/>
-        <w:ind w:left="196" w:right="0" w:firstLine="0"/>
-        <w:jc w:val="left"/>
-      </w:pPr>
-      <w:r>
-        <w:rPr>
-          <w:w w:val="75.0"/>
-          <w:rFonts w:ascii="Segoe UI" w:hAnsi="Segoe UI" w:eastAsia="Segoe UI"/>
-          <w:b w:val="0"/>
-          <w:i w:val="0"/>
-          <w:color w:val="FFFFFF"/>
-          <w:sz w:val="2"/>
-        </w:rPr>
-        <w:t xml:space="preserve">ET4D-CV5-ZKC-6R82-449XH </w:t>
-      </w:r>
-    </w:p>
-    <w:tbl>
-      <w:tblPr>
-        <w:tblW w:type="auto" w:w="0"/>
-        <w:tblLayout w:type="fixed"/>
-        <w:tblLook w:firstColumn="1" w:firstRow="1" w:lastColumn="0" w:lastRow="0" w:noHBand="0" w:noVBand="1" w:val="04A0"/>
-        <w:tblInd w:w="1772.0" w:type="dxa"/>
-      </w:tblPr>
-      <w:tblGrid>
-        <w:gridCol w:w="985"/>
-        <w:gridCol w:w="985"/>
-        <w:gridCol w:w="985"/>
-        <w:gridCol w:w="985"/>
-        <w:gridCol w:w="985"/>
-        <w:gridCol w:w="985"/>
-        <w:gridCol w:w="985"/>
-        <w:gridCol w:w="985"/>
-        <w:gridCol w:w="985"/>
-        <w:gridCol w:w="985"/>
-        <w:gridCol w:w="985"/>
-      </w:tblGrid>
-      <w:tr>
-        <w:trPr>
-          <w:trHeight w:hRule="exact" w:val="616"/>
-        </w:trPr>
-        <w:tc>
-          <w:tcPr>
-            <w:tcW w:type="dxa" w:w="2600"/>
-            <w:vMerge w:val="restart"/>
-            <w:tcBorders/>
-            <w:tcMar>
-              <w:start w:w="0" w:type="dxa"/>
-              <w:end w:w="0" w:type="dxa"/>
-            </w:tcMar>
-            <w:tcMar>
-              <w:start w:w="0" w:type="dxa"/>
-              <w:end w:w="0" w:type="dxa"/>
-            </w:tcMar>
-          </w:tcPr>
-          <w:p>
-            <w:pPr>
-              <w:autoSpaceDN w:val="0"/>
-              <w:autoSpaceDE w:val="0"/>
-              <w:widowControl/>
-              <w:spacing w:line="196" w:lineRule="exact" w:before="1000" w:after="0"/>
-              <w:ind w:left="0" w:right="30" w:firstLine="0"/>
-              <w:jc w:val="right"/>
-            </w:pPr>
-            <w:r>
-              <w:rPr>
-                <w:w w:val="97.5"/>
-                <w:rFonts w:ascii="Arial Narrow" w:hAnsi="Arial Narrow" w:eastAsia="Arial Narrow"/>
-                <w:b w:val="0"/>
-                <w:i w:val="0"/>
-                <w:color w:val="000000"/>
-                <w:sz w:val="20"/>
-              </w:rPr>
-              <w:t>4</w:t>
-            </w:r>
-            <w:r>
-              <w:rPr>
-                <w:w w:val="97.5"/>
-                <w:rFonts w:ascii="Arial" w:hAnsi="Arial" w:eastAsia="Arial"/>
-                <w:b/>
-                <w:i w:val="0"/>
-                <w:color w:val="00008B"/>
-                <w:sz w:val="20"/>
-              </w:rPr>
-              <w:t>ימים</w:t>
-            </w:r>
-            <w:r>
-              <w:rPr>
-                <w:w w:val="97.5"/>
-                <w:rFonts w:ascii="Arial" w:hAnsi="Arial" w:eastAsia="Arial"/>
-                <w:b/>
-                <w:i w:val="0"/>
-                <w:color w:val="00008B"/>
-                <w:sz w:val="20"/>
-              </w:rPr>
-              <w:t>.</w:t>
-            </w:r>
-          </w:p>
-        </w:tc>
-        <w:tc>
-          <w:tcPr>
-            <w:tcW w:type="dxa" w:w="1900"/>
-            <w:tcBorders/>
-            <w:tcMar>
-              <w:start w:w="0" w:type="dxa"/>
-              <w:end w:w="0" w:type="dxa"/>
-            </w:tcMar>
-          </w:tcPr>
-          <w:p>
-            <w:pPr>
-              <w:autoSpaceDN w:val="0"/>
-              <w:autoSpaceDE w:val="0"/>
-              <w:widowControl/>
-              <w:spacing w:line="194" w:lineRule="exact" w:before="42" w:after="0"/>
-              <w:ind w:left="0" w:right="6" w:firstLine="0"/>
-              <w:jc w:val="right"/>
-            </w:pPr>
-            <w:r>
-              <w:rPr>
-                <w:w w:val="97.5"/>
-                <w:rFonts w:ascii="Arial" w:hAnsi="Arial" w:eastAsia="Arial"/>
-                <w:b/>
-                <w:i w:val="0"/>
-                <w:color w:val="00008B"/>
-                <w:sz w:val="20"/>
-              </w:rPr>
-              <w:t>הרפואית</w:t>
-            </w:r>
-            <w:r>
-              <w:rPr>
-                <w:w w:val="97.5"/>
-                <w:rFonts w:ascii="Arial" w:hAnsi="Arial" w:eastAsia="Arial"/>
-                <w:b/>
-                <w:i w:val="0"/>
-                <w:color w:val="00008B"/>
-                <w:sz w:val="20"/>
-              </w:rPr>
-              <w:t>.</w:t>
-            </w:r>
-          </w:p>
-        </w:tc>
-        <w:tc>
-          <w:tcPr>
-            <w:tcW w:type="dxa" w:w="700"/>
-            <w:gridSpan w:val="2"/>
-            <w:tcBorders/>
-            <w:tcMar>
-              <w:start w:w="0" w:type="dxa"/>
-              <w:end w:w="0" w:type="dxa"/>
-            </w:tcMar>
-            <w:tcMar>
-              <w:start w:w="0" w:type="dxa"/>
-              <w:end w:w="0" w:type="dxa"/>
-            </w:tcMar>
-          </w:tcPr>
-          <w:p>
-            <w:pPr>
-              <w:autoSpaceDN w:val="0"/>
-              <w:autoSpaceDE w:val="0"/>
-              <w:widowControl/>
-              <w:spacing w:line="194" w:lineRule="exact" w:before="42" w:after="0"/>
-              <w:ind w:left="0" w:right="0" w:firstLine="0"/>
-              <w:jc w:val="center"/>
-            </w:pPr>
-            <w:r>
-              <w:rPr>
-                <w:w w:val="97.5"/>
-                <w:rFonts w:ascii="Arial" w:hAnsi="Arial" w:eastAsia="Arial"/>
-                <w:b/>
-                <w:i w:val="0"/>
-                <w:color w:val="00008B"/>
-                <w:sz w:val="20"/>
-              </w:rPr>
-              <w:t>ברשומה</w:t>
-            </w:r>
-          </w:p>
-        </w:tc>
-        <w:tc>
-          <w:tcPr>
-            <w:tcW w:type="dxa" w:w="700"/>
-            <w:tcBorders/>
-            <w:tcMar>
-              <w:start w:w="0" w:type="dxa"/>
-              <w:end w:w="0" w:type="dxa"/>
-            </w:tcMar>
-          </w:tcPr>
-          <w:p>
-            <w:pPr>
-              <w:autoSpaceDN w:val="0"/>
-              <w:autoSpaceDE w:val="0"/>
-              <w:widowControl/>
-              <w:spacing w:line="194" w:lineRule="exact" w:before="42" w:after="0"/>
-              <w:ind w:left="0" w:right="0" w:firstLine="0"/>
-              <w:jc w:val="center"/>
-            </w:pPr>
-            <w:r>
-              <w:rPr>
-                <w:w w:val="97.5"/>
-                <w:rFonts w:ascii="Arial" w:hAnsi="Arial" w:eastAsia="Arial"/>
-                <w:b/>
-                <w:i w:val="0"/>
-                <w:color w:val="00008B"/>
-                <w:sz w:val="20"/>
-              </w:rPr>
-              <w:t>מפורטת</w:t>
-            </w:r>
-          </w:p>
-        </w:tc>
-        <w:tc>
-          <w:tcPr>
-            <w:tcW w:type="dxa" w:w="1470"/>
-            <w:gridSpan w:val="3"/>
-            <w:tcBorders/>
-            <w:tcMar>
-              <w:start w:w="0" w:type="dxa"/>
-              <w:end w:w="0" w:type="dxa"/>
-            </w:tcMar>
-            <w:tcMar>
-              <w:start w:w="0" w:type="dxa"/>
-              <w:end w:w="0" w:type="dxa"/>
-            </w:tcMar>
-            <w:tcMar>
-              <w:start w:w="0" w:type="dxa"/>
-              <w:end w:w="0" w:type="dxa"/>
-            </w:tcMar>
-          </w:tcPr>
-          <w:p>
-            <w:pPr>
-              <w:autoSpaceDN w:val="0"/>
-              <w:autoSpaceDE w:val="0"/>
-              <w:widowControl/>
-              <w:spacing w:line="194" w:lineRule="exact" w:before="42" w:after="0"/>
-              <w:ind w:left="0" w:right="0" w:firstLine="0"/>
-              <w:jc w:val="center"/>
-            </w:pPr>
-            <w:r>
-              <w:rPr>
-                <w:w w:val="97.5"/>
-                <w:rFonts w:ascii="Arial" w:hAnsi="Arial" w:eastAsia="Arial"/>
-                <w:b/>
-                <w:i w:val="0"/>
-                <w:color w:val="00008B"/>
-                <w:sz w:val="20"/>
-              </w:rPr>
-              <w:t>חלה</w:t>
-            </w:r>
-            <w:r>
-              <w:rPr>
-                <w:w w:val="97.5"/>
-                <w:rFonts w:ascii="Arial" w:hAnsi="Arial" w:eastAsia="Arial"/>
-                <w:b/>
-                <w:i w:val="0"/>
-                <w:color w:val="00008B"/>
-                <w:sz w:val="20"/>
-              </w:rPr>
-              <w:t>/</w:t>
-            </w:r>
-            <w:r>
-              <w:rPr>
-                <w:w w:val="97.5"/>
-                <w:rFonts w:ascii="Arial" w:hAnsi="Arial" w:eastAsia="Arial"/>
-                <w:b/>
-                <w:i w:val="0"/>
-                <w:color w:val="00008B"/>
-                <w:sz w:val="20"/>
-              </w:rPr>
-              <w:t>תה</w:t>
-            </w:r>
-            <w:r>
-              <w:rPr>
-                <w:w w:val="97.5"/>
-                <w:rFonts w:ascii="Arial" w:hAnsi="Arial" w:eastAsia="Arial"/>
-                <w:b/>
-                <w:i w:val="0"/>
-                <w:color w:val="00008B"/>
-                <w:sz w:val="20"/>
-              </w:rPr>
-              <w:t xml:space="preserve"> ,</w:t>
-            </w:r>
-            <w:r>
-              <w:rPr>
-                <w:w w:val="97.5"/>
-                <w:rFonts w:ascii="Arial" w:hAnsi="Arial" w:eastAsia="Arial"/>
-                <w:b/>
-                <w:i w:val="0"/>
-                <w:color w:val="00008B"/>
-                <w:sz w:val="20"/>
-              </w:rPr>
-              <w:t>האבחנה</w:t>
-            </w:r>
-          </w:p>
-        </w:tc>
-        <w:tc>
-          <w:tcPr>
-            <w:tcW w:type="dxa" w:w="410"/>
-            <w:tcBorders/>
-            <w:tcMar>
-              <w:start w:w="0" w:type="dxa"/>
-              <w:end w:w="0" w:type="dxa"/>
-            </w:tcMar>
-          </w:tcPr>
-          <w:p>
-            <w:pPr>
-              <w:autoSpaceDN w:val="0"/>
-              <w:autoSpaceDE w:val="0"/>
-              <w:widowControl/>
-              <w:spacing w:line="194" w:lineRule="exact" w:before="42" w:after="0"/>
-              <w:ind w:left="0" w:right="0" w:firstLine="0"/>
-              <w:jc w:val="center"/>
-            </w:pPr>
-            <w:r>
-              <w:rPr>
-                <w:w w:val="97.5"/>
-                <w:rFonts w:ascii="Arial" w:hAnsi="Arial" w:eastAsia="Arial"/>
-                <w:b/>
-                <w:i w:val="0"/>
-                <w:color w:val="00008B"/>
-                <w:sz w:val="20"/>
-              </w:rPr>
-              <w:t>הנ</w:t>
-            </w:r>
-            <w:r>
-              <w:rPr>
-                <w:w w:val="97.5"/>
-                <w:rFonts w:ascii="Arial" w:hAnsi="Arial" w:eastAsia="Arial"/>
-                <w:b/>
-                <w:i w:val="0"/>
-                <w:color w:val="00008B"/>
-                <w:sz w:val="20"/>
-              </w:rPr>
-              <w:t>"</w:t>
-            </w:r>
-            <w:r>
-              <w:rPr>
-                <w:w w:val="97.5"/>
-                <w:rFonts w:ascii="Arial" w:hAnsi="Arial" w:eastAsia="Arial"/>
-                <w:b/>
-                <w:i w:val="0"/>
-                <w:color w:val="00008B"/>
-                <w:sz w:val="20"/>
-              </w:rPr>
-              <w:t>ל</w:t>
-            </w:r>
-          </w:p>
-        </w:tc>
-        <w:tc>
-          <w:tcPr>
-            <w:tcW w:type="dxa" w:w="700"/>
-            <w:tcBorders/>
-            <w:tcMar>
-              <w:start w:w="0" w:type="dxa"/>
-              <w:end w:w="0" w:type="dxa"/>
-            </w:tcMar>
-          </w:tcPr>
-          <w:p>
-            <w:pPr>
-              <w:autoSpaceDN w:val="0"/>
-              <w:autoSpaceDE w:val="0"/>
-              <w:widowControl/>
-              <w:spacing w:line="194" w:lineRule="exact" w:before="42" w:after="0"/>
-              <w:ind w:left="0" w:right="0" w:firstLine="0"/>
-              <w:jc w:val="center"/>
-            </w:pPr>
-            <w:r>
-              <w:rPr>
-                <w:w w:val="97.5"/>
-                <w:rFonts w:ascii="Arial" w:hAnsi="Arial" w:eastAsia="Arial"/>
-                <w:b/>
-                <w:i w:val="0"/>
-                <w:color w:val="00008B"/>
-                <w:sz w:val="20"/>
-              </w:rPr>
-              <w:t>כי רשאל</w:t>
-            </w:r>
-          </w:p>
-        </w:tc>
-        <w:tc>
-          <w:tcPr>
-            <w:tcW w:type="dxa" w:w="540"/>
-            <w:tcBorders/>
-            <w:tcMar>
-              <w:start w:w="0" w:type="dxa"/>
-              <w:end w:w="0" w:type="dxa"/>
-            </w:tcMar>
-          </w:tcPr>
-          <w:p>
-            <w:pPr>
-              <w:autoSpaceDN w:val="0"/>
-              <w:autoSpaceDE w:val="0"/>
-              <w:widowControl/>
-              <w:spacing w:line="194" w:lineRule="exact" w:before="42" w:after="0"/>
-              <w:ind w:left="16" w:right="0" w:firstLine="0"/>
-              <w:jc w:val="left"/>
-            </w:pPr>
-            <w:r>
-              <w:rPr>
-                <w:w w:val="97.5"/>
-                <w:rFonts w:ascii="Arial" w:hAnsi="Arial" w:eastAsia="Arial"/>
-                <w:b/>
-                <w:i w:val="0"/>
-                <w:color w:val="00008B"/>
-                <w:sz w:val="20"/>
-              </w:rPr>
-              <w:t>הנני</w:t>
-            </w:r>
-          </w:p>
-        </w:tc>
-      </w:tr>
-      <w:tr>
-        <w:trPr>
-          <w:trHeight w:hRule="exact" w:val="620"/>
-        </w:trPr>
-        <w:tc>
-          <w:tcPr>
-            <w:tcW w:type="dxa" w:w="985"/>
-            <w:vMerge/>
-            <w:tcBorders/>
-          </w:tcPr>
-          <w:p/>
-        </w:tc>
-        <w:tc>
-          <w:tcPr>
-            <w:tcW w:type="dxa" w:w="1900"/>
-            <w:tcBorders/>
-            <w:tcMar>
-              <w:start w:w="0" w:type="dxa"/>
-              <w:end w:w="0" w:type="dxa"/>
-            </w:tcMar>
-          </w:tcPr>
-          <w:p>
-            <w:pPr>
-              <w:autoSpaceDN w:val="0"/>
-              <w:autoSpaceDE w:val="0"/>
-              <w:widowControl/>
-              <w:spacing w:line="196" w:lineRule="exact" w:before="384" w:after="0"/>
-              <w:ind w:left="62" w:right="0" w:firstLine="0"/>
-              <w:jc w:val="left"/>
-            </w:pPr>
-            <w:r>
-              <w:rPr>
-                <w:w w:val="97.5"/>
-                <w:rFonts w:ascii="Arial Narrow" w:hAnsi="Arial Narrow" w:eastAsia="Arial Narrow"/>
-                <w:b w:val="0"/>
-                <w:i w:val="0"/>
-                <w:color w:val="000000"/>
-                <w:sz w:val="20"/>
-              </w:rPr>
-              <w:t>27/08/2026</w:t>
-            </w:r>
-            <w:r>
-              <w:rPr>
-                <w:w w:val="97.5"/>
-                <w:rFonts w:ascii="Arial" w:hAnsi="Arial" w:eastAsia="Arial"/>
-                <w:b/>
-                <w:i w:val="0"/>
-                <w:color w:val="00008B"/>
-                <w:sz w:val="20"/>
-              </w:rPr>
-              <w:t>סה</w:t>
-            </w:r>
-            <w:r>
-              <w:rPr>
-                <w:w w:val="97.5"/>
-                <w:rFonts w:ascii="Arial" w:hAnsi="Arial" w:eastAsia="Arial"/>
-                <w:b/>
-                <w:i w:val="0"/>
-                <w:color w:val="00008B"/>
-                <w:sz w:val="20"/>
-              </w:rPr>
-              <w:t>"</w:t>
-            </w:r>
-            <w:r>
-              <w:rPr>
-                <w:w w:val="97.5"/>
-                <w:rFonts w:ascii="Arial" w:hAnsi="Arial" w:eastAsia="Arial"/>
-                <w:b/>
-                <w:i w:val="0"/>
-                <w:color w:val="00008B"/>
-                <w:sz w:val="20"/>
-              </w:rPr>
-              <w:t>כ</w:t>
-            </w:r>
-            <w:r>
-              <w:rPr>
-                <w:w w:val="97.5"/>
-                <w:rFonts w:ascii="Arial" w:hAnsi="Arial" w:eastAsia="Arial"/>
-                <w:b/>
-                <w:i w:val="0"/>
-                <w:color w:val="00008B"/>
-                <w:sz w:val="20"/>
-              </w:rPr>
-              <w:t>:</w:t>
-            </w:r>
-          </w:p>
-        </w:tc>
-        <w:tc>
-          <w:tcPr>
-            <w:tcW w:type="dxa" w:w="460"/>
-            <w:tcBorders/>
-            <w:tcMar>
-              <w:start w:w="0" w:type="dxa"/>
-              <w:end w:w="0" w:type="dxa"/>
-            </w:tcMar>
-          </w:tcPr>
-          <w:p>
-            <w:pPr>
-              <w:autoSpaceDN w:val="0"/>
-              <w:autoSpaceDE w:val="0"/>
-              <w:widowControl/>
-              <w:spacing w:line="196" w:lineRule="exact" w:before="384" w:after="0"/>
-              <w:ind w:left="0" w:right="22" w:firstLine="0"/>
-              <w:jc w:val="right"/>
-            </w:pPr>
-            <w:r>
-              <w:rPr>
-                <w:w w:val="97.5"/>
-                <w:rFonts w:ascii="Arial" w:hAnsi="Arial" w:eastAsia="Arial"/>
-                <w:b/>
-                <w:i w:val="0"/>
-                <w:color w:val="00008B"/>
-                <w:sz w:val="20"/>
-              </w:rPr>
-              <w:t>יום</w:t>
-            </w:r>
-            <w:r>
-              <w:rPr>
-                <w:w w:val="97.5"/>
-                <w:rFonts w:ascii="Arial" w:hAnsi="Arial" w:eastAsia="Arial"/>
-                <w:b/>
-                <w:i w:val="0"/>
-                <w:color w:val="00008B"/>
-                <w:sz w:val="20"/>
-              </w:rPr>
-              <w:t>:</w:t>
-            </w:r>
-          </w:p>
-        </w:tc>
-        <w:tc>
-          <w:tcPr>
-            <w:tcW w:type="dxa" w:w="1700"/>
-            <w:gridSpan w:val="3"/>
-            <w:tcBorders/>
-            <w:tcMar>
-              <w:start w:w="0" w:type="dxa"/>
-              <w:end w:w="0" w:type="dxa"/>
-            </w:tcMar>
-            <w:tcMar>
-              <w:start w:w="0" w:type="dxa"/>
-              <w:end w:w="0" w:type="dxa"/>
-            </w:tcMar>
-            <w:tcMar>
-              <w:start w:w="0" w:type="dxa"/>
-              <w:end w:w="0" w:type="dxa"/>
-            </w:tcMar>
-          </w:tcPr>
-          <w:p>
-            <w:pPr>
-              <w:autoSpaceDN w:val="0"/>
-              <w:autoSpaceDE w:val="0"/>
-              <w:widowControl/>
-              <w:spacing w:line="196" w:lineRule="exact" w:before="384" w:after="0"/>
-              <w:ind w:left="22" w:right="0" w:firstLine="0"/>
-              <w:jc w:val="left"/>
-            </w:pPr>
-            <w:r>
-              <w:rPr>
-                <w:w w:val="97.5"/>
-                <w:rFonts w:ascii="Arial Narrow" w:hAnsi="Arial Narrow" w:eastAsia="Arial Narrow"/>
-                <w:b w:val="0"/>
-                <w:i w:val="0"/>
-                <w:color w:val="000000"/>
-                <w:sz w:val="20"/>
-              </w:rPr>
-              <w:t>24/08/2026</w:t>
-            </w:r>
-            <w:r>
-              <w:rPr>
-                <w:w w:val="97.5"/>
-                <w:rFonts w:ascii="Arial" w:hAnsi="Arial" w:eastAsia="Arial"/>
-                <w:b/>
-                <w:i w:val="0"/>
-                <w:color w:val="00008B"/>
-                <w:sz w:val="20"/>
-              </w:rPr>
-              <w:t>עד</w:t>
-            </w:r>
-          </w:p>
-        </w:tc>
-        <w:tc>
-          <w:tcPr>
-            <w:tcW w:type="dxa" w:w="660"/>
-            <w:tcBorders/>
-            <w:tcMar>
-              <w:start w:w="0" w:type="dxa"/>
-              <w:end w:w="0" w:type="dxa"/>
-            </w:tcMar>
-          </w:tcPr>
-          <w:p>
-            <w:pPr>
-              <w:autoSpaceDN w:val="0"/>
-              <w:autoSpaceDE w:val="0"/>
-              <w:widowControl/>
-              <w:spacing w:line="196" w:lineRule="exact" w:before="384" w:after="0"/>
-              <w:ind w:left="0" w:right="56" w:firstLine="0"/>
-              <w:jc w:val="right"/>
-            </w:pPr>
-            <w:r>
-              <w:rPr>
-                <w:w w:val="97.5"/>
-                <w:rFonts w:ascii="Arial" w:hAnsi="Arial" w:eastAsia="Arial"/>
-                <w:b/>
-                <w:i w:val="0"/>
-                <w:color w:val="00008B"/>
-                <w:sz w:val="20"/>
-              </w:rPr>
-              <w:t>מיום</w:t>
-            </w:r>
-            <w:r>
-              <w:rPr>
-                <w:w w:val="97.5"/>
-                <w:rFonts w:ascii="Arial" w:hAnsi="Arial" w:eastAsia="Arial"/>
-                <w:b/>
-                <w:i w:val="0"/>
-                <w:color w:val="00008B"/>
-                <w:sz w:val="20"/>
-              </w:rPr>
-              <w:t>:</w:t>
-            </w:r>
-          </w:p>
-        </w:tc>
-        <w:tc>
-          <w:tcPr>
-            <w:tcW w:type="dxa" w:w="460"/>
-            <w:gridSpan w:val="2"/>
-            <w:tcBorders/>
-            <w:tcMar>
-              <w:start w:w="0" w:type="dxa"/>
-              <w:end w:w="0" w:type="dxa"/>
-            </w:tcMar>
-            <w:tcMar>
-              <w:start w:w="0" w:type="dxa"/>
-              <w:end w:w="0" w:type="dxa"/>
-            </w:tcMar>
-          </w:tcPr>
-          <w:p>
-            <w:pPr>
-              <w:autoSpaceDN w:val="0"/>
-              <w:autoSpaceDE w:val="0"/>
-              <w:widowControl/>
-              <w:spacing w:line="196" w:lineRule="exact" w:before="384" w:after="0"/>
-              <w:ind w:left="0" w:right="0" w:firstLine="0"/>
-              <w:jc w:val="center"/>
-            </w:pPr>
-            <w:r>
-              <w:rPr>
-                <w:w w:val="97.5"/>
-                <w:rFonts w:ascii="Arial" w:hAnsi="Arial" w:eastAsia="Arial"/>
-                <w:b/>
-                <w:i w:val="0"/>
-                <w:color w:val="00008B"/>
-                <w:sz w:val="20"/>
-              </w:rPr>
-              <w:t>לעבוד</w:t>
-            </w:r>
-          </w:p>
-        </w:tc>
-        <w:tc>
-          <w:tcPr>
-            <w:tcW w:type="dxa" w:w="700"/>
-            <w:tcBorders/>
-            <w:tcMar>
-              <w:start w:w="0" w:type="dxa"/>
-              <w:end w:w="0" w:type="dxa"/>
-            </w:tcMar>
-          </w:tcPr>
-          <w:p>
-            <w:pPr>
-              <w:autoSpaceDN w:val="0"/>
-              <w:autoSpaceDE w:val="0"/>
-              <w:widowControl/>
-              <w:spacing w:line="196" w:lineRule="exact" w:before="384" w:after="0"/>
-              <w:ind w:left="0" w:right="0" w:firstLine="0"/>
-              <w:jc w:val="center"/>
-            </w:pPr>
-            <w:r>
-              <w:rPr>
-                <w:w w:val="97.5"/>
-                <w:rFonts w:ascii="Arial" w:hAnsi="Arial" w:eastAsia="Arial"/>
-                <w:b/>
-                <w:i w:val="0"/>
-                <w:color w:val="00008B"/>
-                <w:sz w:val="20"/>
-              </w:rPr>
-              <w:t>מסוגל</w:t>
-            </w:r>
-            <w:r>
-              <w:rPr>
-                <w:w w:val="97.5"/>
-                <w:rFonts w:ascii="Arial" w:hAnsi="Arial" w:eastAsia="Arial"/>
-                <w:b/>
-                <w:i w:val="0"/>
-                <w:color w:val="00008B"/>
-                <w:sz w:val="20"/>
-              </w:rPr>
-              <w:t>/</w:t>
-            </w:r>
-            <w:r>
-              <w:rPr>
-                <w:w w:val="97.5"/>
-                <w:rFonts w:ascii="Arial" w:hAnsi="Arial" w:eastAsia="Arial"/>
-                <w:b/>
-                <w:i w:val="0"/>
-                <w:color w:val="00008B"/>
-                <w:sz w:val="20"/>
-              </w:rPr>
-              <w:t>ת</w:t>
-            </w:r>
-          </w:p>
-        </w:tc>
-        <w:tc>
-          <w:tcPr>
-            <w:tcW w:type="dxa" w:w="540"/>
-            <w:tcBorders/>
-            <w:tcMar>
-              <w:start w:w="0" w:type="dxa"/>
-              <w:end w:w="0" w:type="dxa"/>
-            </w:tcMar>
-          </w:tcPr>
-          <w:p>
-            <w:pPr>
-              <w:autoSpaceDN w:val="0"/>
-              <w:autoSpaceDE w:val="0"/>
-              <w:widowControl/>
-              <w:spacing w:line="196" w:lineRule="exact" w:before="384" w:after="0"/>
-              <w:ind w:left="0" w:right="0" w:firstLine="0"/>
-              <w:jc w:val="center"/>
-            </w:pPr>
-            <w:r>
-              <w:rPr>
-                <w:w w:val="97.5"/>
-                <w:rFonts w:ascii="Arial" w:hAnsi="Arial" w:eastAsia="Arial"/>
-                <w:b/>
-                <w:i w:val="0"/>
-                <w:color w:val="00008B"/>
-                <w:sz w:val="20"/>
-              </w:rPr>
-              <w:t>אינו</w:t>
-            </w:r>
-            <w:r>
-              <w:rPr>
-                <w:w w:val="97.5"/>
-                <w:rFonts w:ascii="Arial" w:hAnsi="Arial" w:eastAsia="Arial"/>
-                <w:b/>
-                <w:i w:val="0"/>
-                <w:color w:val="00008B"/>
-                <w:sz w:val="20"/>
-              </w:rPr>
-              <w:t>/</w:t>
-            </w:r>
-            <w:r>
-              <w:rPr>
-                <w:w w:val="97.5"/>
-                <w:rFonts w:ascii="Arial" w:hAnsi="Arial" w:eastAsia="Arial"/>
-                <w:b/>
-                <w:i w:val="0"/>
-                <w:color w:val="00008B"/>
-                <w:sz w:val="20"/>
-              </w:rPr>
-              <w:t>ה</w:t>
-            </w:r>
-          </w:p>
-        </w:tc>
-      </w:tr>
-    </w:tbl>
-    <w:p>
-      <w:pPr>
-        <w:autoSpaceDN w:val="0"/>
-        <w:autoSpaceDE w:val="0"/>
-        <w:widowControl/>
-        <w:spacing w:line="14" w:lineRule="exact" w:before="0" w:after="0"/>
-        <w:ind w:left="0" w:right="0"/>
-      </w:pPr>
-    </w:p>
     <w:sectPr>
-      <w:pgSz w:w="11905" w:h="16838"/>
-      <w:pgMar w:top="188" w:right="662" w:bottom="1440" w:left="408" w:header="720" w:footer="720" w:gutter="0"/>
-      <w:cols/>
+      <w:pgSz w:w="11906" w:h="16838"/>
+      <w:pgMar w:top="850" w:right="1134" w:bottom="850" w:left="1134" w:header="720" w:footer="720" w:gutter="0"/>
+      <w:cols w:space="720"/>
       <w:docGrid w:linePitch="360"/>
     </w:sectPr>
   </w:body>

</xml_diff>

<commit_message>
Organize Word-converted Google Doc to match PDF layout
Co-authored-by: Ron Gurfinkel <RonBabaj@users.noreply.github.com>
</commit_message>
<xml_diff>
--- a/exports/medical_certificate.docx
+++ b/exports/medical_certificate.docx
@@ -9,29 +9,31 @@
         <w:tblLook w:firstColumn="1" w:firstRow="1" w:lastColumn="0" w:lastRow="0" w:noHBand="0" w:noVBand="1" w:val="04A0"/>
       </w:tblPr>
       <w:tblGrid>
-        <w:gridCol w:w="3213"/>
-        <w:gridCol w:w="3213"/>
-        <w:gridCol w:w="3213"/>
+        <w:gridCol w:w="3402"/>
+        <w:gridCol w:w="3402"/>
+        <w:gridCol w:w="3402"/>
       </w:tblGrid>
       <w:tr>
         <w:tc>
           <w:tcPr>
-            <w:tcW w:type="dxa" w:w="3213"/>
+            <w:tcW w:type="dxa" w:w="3402"/>
             <w:tcBorders>
-              <w:top w:val="nil" w:sz="8" w:space="0" w:color="003399"/>
-              <w:bottom w:val="nil" w:sz="8" w:space="0" w:color="003399"/>
-              <w:left w:val="nil" w:sz="8" w:space="0" w:color="003399"/>
-              <w:right w:val="nil" w:sz="8" w:space="0" w:color="003399"/>
+              <w:top w:val="nil"/>
+              <w:left w:val="nil"/>
+              <w:bottom w:val="nil"/>
+              <w:right w:val="nil"/>
+              <w:insideH w:val="nil"/>
+              <w:insideV w:val="nil"/>
             </w:tcBorders>
           </w:tcPr>
           <w:p>
             <w:pPr>
+              <w:jc w:val="right"/>
               <w:bidi w:val="1"/>
-              <w:jc w:val="right"/>
             </w:pPr>
             <w:r>
               <w:rPr>
-                <w:rFonts w:ascii="Arial" w:hAnsi="Arial" w:cs="Arial"/>
+                <w:rFonts w:ascii="Arial" w:hAnsi="Arial"/>
                 <w:b w:val="0"/>
                 <w:color w:val="003399"/>
                 <w:sz w:val="20"/>
@@ -42,14 +44,14 @@
           </w:p>
           <w:p>
             <w:pPr>
+              <w:jc w:val="right"/>
               <w:bidi w:val="1"/>
-              <w:jc w:val="right"/>
             </w:pPr>
             <w:r>
               <w:rPr>
-                <w:rFonts w:ascii="Arial" w:hAnsi="Arial" w:cs="Arial"/>
+                <w:rFonts w:ascii="Arial" w:hAnsi="Arial"/>
                 <w:b w:val="0"/>
-                <w:color w:val="003399"/>
+                <w:color w:val="000000"/>
                 <w:sz w:val="20"/>
                 <w:u w:val="none"/>
               </w:rPr>
@@ -59,23 +61,26 @@
         </w:tc>
         <w:tc>
           <w:tcPr>
-            <w:tcW w:type="dxa" w:w="3213"/>
+            <w:tcW w:type="dxa" w:w="3402"/>
             <w:tcBorders>
-              <w:top w:val="nil" w:sz="8" w:space="0" w:color="003399"/>
-              <w:bottom w:val="nil" w:sz="8" w:space="0" w:color="003399"/>
-              <w:left w:val="nil" w:sz="8" w:space="0" w:color="003399"/>
-              <w:right w:val="nil" w:sz="8" w:space="0" w:color="003399"/>
+              <w:top w:val="nil"/>
+              <w:left w:val="nil"/>
+              <w:bottom w:val="nil"/>
+              <w:right w:val="nil"/>
+              <w:insideH w:val="nil"/>
+              <w:insideV w:val="nil"/>
             </w:tcBorders>
           </w:tcPr>
           <w:p>
             <w:pPr>
               <w:jc w:val="center"/>
+              <w:bidi w:val="1"/>
             </w:pPr>
             <w:r>
               <w:rPr>
-                <w:rFonts w:ascii="Arial" w:hAnsi="Arial" w:cs="Arial"/>
+                <w:rFonts w:ascii="Arial" w:hAnsi="Arial"/>
                 <w:b/>
-                <w:color w:val="003399"/>
+                <w:color w:val="000000"/>
                 <w:sz w:val="28"/>
                 <w:u w:val="none"/>
               </w:rPr>
@@ -85,12 +90,13 @@
           <w:p>
             <w:pPr>
               <w:jc w:val="center"/>
+              <w:bidi w:val="1"/>
             </w:pPr>
             <w:r>
               <w:rPr>
-                <w:rFonts w:ascii="Arial" w:hAnsi="Arial" w:cs="Arial"/>
+                <w:rFonts w:ascii="Arial" w:hAnsi="Arial"/>
                 <w:b/>
-                <w:color w:val="003399"/>
+                <w:color w:val="000000"/>
                 <w:sz w:val="28"/>
                 <w:u w:val="none"/>
               </w:rPr>
@@ -100,22 +106,24 @@
         </w:tc>
         <w:tc>
           <w:tcPr>
-            <w:tcW w:type="dxa" w:w="3213"/>
+            <w:tcW w:type="dxa" w:w="3402"/>
             <w:tcBorders>
-              <w:top w:val="nil" w:sz="8" w:space="0" w:color="003399"/>
-              <w:bottom w:val="nil" w:sz="8" w:space="0" w:color="003399"/>
-              <w:left w:val="nil" w:sz="8" w:space="0" w:color="003399"/>
-              <w:right w:val="nil" w:sz="8" w:space="0" w:color="003399"/>
+              <w:top w:val="nil"/>
+              <w:left w:val="nil"/>
+              <w:bottom w:val="nil"/>
+              <w:right w:val="nil"/>
+              <w:insideH w:val="nil"/>
+              <w:insideV w:val="nil"/>
             </w:tcBorders>
           </w:tcPr>
           <w:p>
             <w:pPr>
+              <w:jc w:val="left"/>
               <w:bidi w:val="1"/>
-              <w:jc w:val="left"/>
             </w:pPr>
             <w:r>
               <w:rPr>
-                <w:rFonts w:ascii="Arial" w:hAnsi="Arial" w:cs="Arial"/>
+                <w:rFonts w:ascii="Arial" w:hAnsi="Arial"/>
                 <w:b w:val="0"/>
                 <w:color w:val="003399"/>
                 <w:sz w:val="20"/>
@@ -126,15 +134,15 @@
           </w:p>
           <w:p>
             <w:pPr>
+              <w:jc w:val="left"/>
               <w:bidi w:val="1"/>
-              <w:jc w:val="left"/>
             </w:pPr>
             <w:r>
               <w:rPr>
-                <w:rFonts w:ascii="Arial" w:hAnsi="Arial" w:cs="Arial"/>
+                <w:rFonts w:ascii="Arial" w:hAnsi="Arial"/>
                 <w:b w:val="0"/>
                 <w:color w:val="003399"/>
-                <w:sz w:val="20"/>
+                <w:sz w:val="18"/>
                 <w:u w:val="none"/>
               </w:rPr>
               <w:t>מ.ר גורם מפנה:</w:t>
@@ -143,11 +151,13 @@
           <w:p>
             <w:pPr>
               <w:jc w:val="left"/>
+              <w:bidi w:val="1"/>
             </w:pPr>
             <w:r>
               <w:rPr>
-                <w:rFonts w:ascii="Arial" w:hAnsi="Arial" w:cs="Arial"/>
+                <w:rFonts w:ascii="Arial" w:hAnsi="Arial"/>
                 <w:b/>
+                <w:color w:val="000000"/>
                 <w:sz w:val="22"/>
                 <w:u w:val="none"/>
               </w:rPr>
@@ -157,22 +167,112 @@
         </w:tc>
       </w:tr>
     </w:tbl>
+    <w:tbl>
+      <w:tblPr>
+        <w:tblW w:type="auto" w:w="0"/>
+        <w:tblLook w:firstColumn="1" w:firstRow="1" w:lastColumn="0" w:lastRow="0" w:noHBand="0" w:noVBand="1" w:val="04A0"/>
+      </w:tblPr>
+      <w:tblGrid>
+        <w:gridCol w:w="3402"/>
+        <w:gridCol w:w="3402"/>
+        <w:gridCol w:w="3402"/>
+      </w:tblGrid>
+      <w:tr>
+        <w:tc>
+          <w:tcPr>
+            <w:tcW w:type="dxa" w:w="3402"/>
+            <w:tcBorders>
+              <w:top w:val="nil"/>
+              <w:left w:val="nil"/>
+              <w:bottom w:val="nil"/>
+              <w:right w:val="nil"/>
+              <w:insideH w:val="nil"/>
+              <w:insideV w:val="nil"/>
+            </w:tcBorders>
+          </w:tcPr>
+          <w:p/>
+        </w:tc>
+        <w:tc>
+          <w:tcPr>
+            <w:tcW w:type="dxa" w:w="3402"/>
+            <w:tcBorders>
+              <w:top w:val="nil"/>
+              <w:left w:val="nil"/>
+              <w:bottom w:val="nil"/>
+              <w:right w:val="nil"/>
+              <w:insideH w:val="nil"/>
+              <w:insideV w:val="nil"/>
+            </w:tcBorders>
+          </w:tcPr>
+          <w:p>
+            <w:pPr>
+              <w:jc w:val="center"/>
+            </w:pPr>
+            <w:r>
+              <w:drawing>
+                <wp:inline xmlns:a="http://schemas.openxmlformats.org/drawingml/2006/main" xmlns:pic="http://schemas.openxmlformats.org/drawingml/2006/picture">
+                  <wp:extent cx="1152000" cy="834207"/>
+                  <wp:docPr id="1" name="Picture 1"/>
+                  <wp:cNvGraphicFramePr>
+                    <a:graphicFrameLocks noChangeAspect="1"/>
+                  </wp:cNvGraphicFramePr>
+                  <a:graphic>
+                    <a:graphicData uri="http://schemas.openxmlformats.org/drawingml/2006/picture">
+                      <pic:pic>
+                        <pic:nvPicPr>
+                          <pic:cNvPr id="0" name="image0.png"/>
+                          <pic:cNvPicPr/>
+                        </pic:nvPicPr>
+                        <pic:blipFill>
+                          <a:blip r:embed="rId9"/>
+                          <a:stretch>
+                            <a:fillRect/>
+                          </a:stretch>
+                        </pic:blipFill>
+                        <pic:spPr>
+                          <a:xfrm>
+                            <a:off x="0" y="0"/>
+                            <a:ext cx="1152000" cy="834207"/>
+                          </a:xfrm>
+                          <a:prstGeom prst="rect"/>
+                        </pic:spPr>
+                      </pic:pic>
+                    </a:graphicData>
+                  </a:graphic>
+                </wp:inline>
+              </w:drawing>
+            </w:r>
+          </w:p>
+        </w:tc>
+        <w:tc>
+          <w:tcPr>
+            <w:tcW w:type="dxa" w:w="3402"/>
+            <w:tcBorders>
+              <w:top w:val="nil"/>
+              <w:left w:val="nil"/>
+              <w:bottom w:val="nil"/>
+              <w:right w:val="nil"/>
+              <w:insideH w:val="nil"/>
+              <w:insideV w:val="nil"/>
+            </w:tcBorders>
+          </w:tcPr>
+          <w:p/>
+        </w:tc>
+      </w:tr>
+    </w:tbl>
     <w:p>
       <w:pPr>
-        <w:bidi w:val="1"/>
-        <w:spacing w:after="80" w:before="0"/>
-        <w:jc w:val="right"/>
+        <w:spacing w:after="40"/>
       </w:pPr>
     </w:p>
     <w:p>
       <w:pPr>
+        <w:jc w:val="center"/>
         <w:bidi w:val="1"/>
-        <w:spacing w:after="40" w:before="0"/>
-        <w:jc w:val="center"/>
       </w:pPr>
       <w:r>
         <w:rPr>
-          <w:rFonts w:ascii="Arial" w:hAnsi="Arial" w:cs="Arial"/>
+          <w:rFonts w:ascii="Arial" w:hAnsi="Arial"/>
           <w:b w:val="0"/>
           <w:color w:val="003399"/>
           <w:sz w:val="20"/>
@@ -183,13 +283,12 @@
     </w:p>
     <w:p>
       <w:pPr>
+        <w:jc w:val="center"/>
         <w:bidi w:val="1"/>
-        <w:spacing w:after="40" w:before="0"/>
-        <w:jc w:val="center"/>
       </w:pPr>
       <w:r>
         <w:rPr>
-          <w:rFonts w:ascii="Arial" w:hAnsi="Arial" w:cs="Arial"/>
+          <w:rFonts w:ascii="Arial" w:hAnsi="Arial"/>
           <w:b w:val="0"/>
           <w:color w:val="003399"/>
           <w:sz w:val="20"/>
@@ -200,13 +299,12 @@
     </w:p>
     <w:p>
       <w:pPr>
+        <w:jc w:val="center"/>
         <w:bidi w:val="1"/>
-        <w:spacing w:after="40" w:before="0"/>
-        <w:jc w:val="center"/>
       </w:pPr>
       <w:r>
         <w:rPr>
-          <w:rFonts w:ascii="Arial" w:hAnsi="Arial" w:cs="Arial"/>
+          <w:rFonts w:ascii="Arial" w:hAnsi="Arial"/>
           <w:b w:val="0"/>
           <w:color w:val="003399"/>
           <w:sz w:val="20"/>
@@ -217,9 +315,7 @@
     </w:p>
     <w:p>
       <w:pPr>
-        <w:bidi w:val="1"/>
-        <w:spacing w:after="160" w:before="0"/>
-        <w:jc w:val="right"/>
+        <w:spacing w:after="160"/>
       </w:pPr>
     </w:p>
     <w:tbl>
@@ -229,24 +325,32 @@
         <w:tblLook w:firstColumn="1" w:firstRow="1" w:lastColumn="0" w:lastRow="0" w:noHBand="0" w:noVBand="1" w:val="04A0"/>
       </w:tblPr>
       <w:tblGrid>
-        <w:gridCol w:w="3213"/>
-        <w:gridCol w:w="3213"/>
-        <w:gridCol w:w="3213"/>
+        <w:gridCol w:w="2551"/>
+        <w:gridCol w:w="2551"/>
+        <w:gridCol w:w="2551"/>
+        <w:gridCol w:w="2551"/>
       </w:tblGrid>
       <w:tr>
         <w:tc>
           <w:tcPr>
-            <w:tcW w:type="dxa" w:w="3213"/>
-            <w:tcBorders/>
+            <w:tcW w:type="dxa" w:w="2551"/>
+            <w:tcBorders>
+              <w:top w:val="single" w:sz="8" w:color="003399"/>
+              <w:left w:val="single" w:sz="8" w:color="003399"/>
+              <w:bottom w:val="single" w:sz="8" w:color="003399"/>
+              <w:right w:val="single" w:sz="8" w:color="003399"/>
+            </w:tcBorders>
           </w:tcPr>
           <w:p>
             <w:pPr>
               <w:jc w:val="left"/>
+              <w:bidi w:val="1"/>
             </w:pPr>
             <w:r>
               <w:rPr>
-                <w:rFonts w:ascii="Arial" w:hAnsi="Arial" w:cs="Arial"/>
+                <w:rFonts w:ascii="Arial" w:hAnsi="Arial"/>
                 <w:b/>
+                <w:color w:val="000000"/>
                 <w:sz w:val="20"/>
                 <w:u w:val="none"/>
               </w:rPr>
@@ -256,24 +360,46 @@
         </w:tc>
         <w:tc>
           <w:tcPr>
-            <w:tcW w:type="dxa" w:w="3213"/>
-            <w:tcBorders/>
+            <w:tcW w:type="dxa" w:w="2551"/>
+            <w:tcBorders>
+              <w:top w:val="single" w:sz="8" w:color="003399"/>
+              <w:left w:val="single" w:sz="8" w:color="003399"/>
+              <w:bottom w:val="single" w:sz="8" w:color="003399"/>
+              <w:right w:val="single" w:sz="8" w:color="003399"/>
+            </w:tcBorders>
           </w:tcPr>
           <w:p/>
         </w:tc>
         <w:tc>
           <w:tcPr>
-            <w:tcW w:type="dxa" w:w="3213"/>
-            <w:tcBorders/>
+            <w:tcW w:type="dxa" w:w="2551"/>
+            <w:tcBorders>
+              <w:top w:val="single" w:sz="8" w:color="003399"/>
+              <w:left w:val="single" w:sz="8" w:color="003399"/>
+              <w:bottom w:val="single" w:sz="8" w:color="003399"/>
+              <w:right w:val="single" w:sz="8" w:color="003399"/>
+            </w:tcBorders>
+          </w:tcPr>
+          <w:p/>
+        </w:tc>
+        <w:tc>
+          <w:tcPr>
+            <w:tcW w:type="dxa" w:w="2551"/>
+            <w:tcBorders>
+              <w:top w:val="single" w:sz="8" w:color="003399"/>
+              <w:left w:val="single" w:sz="8" w:color="003399"/>
+              <w:bottom w:val="single" w:sz="8" w:color="003399"/>
+              <w:right w:val="single" w:sz="8" w:color="003399"/>
+            </w:tcBorders>
           </w:tcPr>
           <w:p>
             <w:pPr>
+              <w:jc w:val="right"/>
               <w:bidi w:val="1"/>
-              <w:jc w:val="right"/>
             </w:pPr>
             <w:r>
               <w:rPr>
-                <w:rFonts w:ascii="Arial" w:hAnsi="Arial" w:cs="Arial"/>
+                <w:rFonts w:ascii="Arial" w:hAnsi="Arial"/>
                 <w:b/>
                 <w:color w:val="003399"/>
                 <w:sz w:val="20"/>
@@ -287,17 +413,22 @@
       <w:tr>
         <w:tc>
           <w:tcPr>
-            <w:tcW w:type="dxa" w:w="3213"/>
-            <w:tcBorders/>
+            <w:tcW w:type="dxa" w:w="2551"/>
+            <w:tcBorders>
+              <w:top w:val="single" w:sz="8" w:color="003399"/>
+              <w:left w:val="single" w:sz="8" w:color="003399"/>
+              <w:bottom w:val="single" w:sz="8" w:color="003399"/>
+              <w:right w:val="single" w:sz="8" w:color="003399"/>
+            </w:tcBorders>
           </w:tcPr>
           <w:p>
             <w:pPr>
+              <w:jc w:val="right"/>
               <w:bidi w:val="1"/>
-              <w:jc w:val="right"/>
             </w:pPr>
             <w:r>
               <w:rPr>
-                <w:rFonts w:ascii="Arial" w:hAnsi="Arial" w:cs="Arial"/>
+                <w:rFonts w:ascii="Arial" w:hAnsi="Arial"/>
                 <w:b w:val="0"/>
                 <w:color w:val="003399"/>
                 <w:sz w:val="20"/>
@@ -309,17 +440,22 @@
         </w:tc>
         <w:tc>
           <w:tcPr>
-            <w:tcW w:type="dxa" w:w="3213"/>
-            <w:tcBorders/>
+            <w:tcW w:type="dxa" w:w="2551"/>
+            <w:tcBorders>
+              <w:top w:val="single" w:sz="8" w:color="003399"/>
+              <w:left w:val="single" w:sz="8" w:color="003399"/>
+              <w:bottom w:val="single" w:sz="8" w:color="003399"/>
+              <w:right w:val="single" w:sz="8" w:color="003399"/>
+            </w:tcBorders>
           </w:tcPr>
           <w:p>
             <w:pPr>
+              <w:jc w:val="right"/>
               <w:bidi w:val="1"/>
-              <w:jc w:val="right"/>
             </w:pPr>
             <w:r>
               <w:rPr>
-                <w:rFonts w:ascii="Arial" w:hAnsi="Arial" w:cs="Arial"/>
+                <w:rFonts w:ascii="Arial" w:hAnsi="Arial"/>
                 <w:b w:val="0"/>
                 <w:color w:val="003399"/>
                 <w:sz w:val="20"/>
@@ -331,17 +467,22 @@
         </w:tc>
         <w:tc>
           <w:tcPr>
-            <w:tcW w:type="dxa" w:w="3213"/>
-            <w:tcBorders/>
+            <w:tcW w:type="dxa" w:w="2551"/>
+            <w:tcBorders>
+              <w:top w:val="single" w:sz="8" w:color="003399"/>
+              <w:left w:val="single" w:sz="8" w:color="003399"/>
+              <w:bottom w:val="single" w:sz="8" w:color="003399"/>
+              <w:right w:val="single" w:sz="8" w:color="003399"/>
+            </w:tcBorders>
           </w:tcPr>
           <w:p>
             <w:pPr>
+              <w:jc w:val="right"/>
               <w:bidi w:val="1"/>
-              <w:jc w:val="right"/>
             </w:pPr>
             <w:r>
               <w:rPr>
-                <w:rFonts w:ascii="Arial" w:hAnsi="Arial" w:cs="Arial"/>
+                <w:rFonts w:ascii="Arial" w:hAnsi="Arial"/>
                 <w:b w:val="0"/>
                 <w:color w:val="003399"/>
                 <w:sz w:val="20"/>
@@ -351,21 +492,38 @@
             </w:r>
           </w:p>
         </w:tc>
+        <w:tc>
+          <w:tcPr>
+            <w:tcW w:type="dxa" w:w="2551"/>
+            <w:tcBorders>
+              <w:top w:val="single" w:sz="8" w:color="003399"/>
+              <w:left w:val="single" w:sz="8" w:color="003399"/>
+              <w:bottom w:val="single" w:sz="8" w:color="003399"/>
+              <w:right w:val="single" w:sz="8" w:color="003399"/>
+            </w:tcBorders>
+          </w:tcPr>
+          <w:p/>
+        </w:tc>
       </w:tr>
       <w:tr>
         <w:tc>
           <w:tcPr>
-            <w:tcW w:type="dxa" w:w="3213"/>
-            <w:tcBorders/>
+            <w:tcW w:type="dxa" w:w="2551"/>
+            <w:tcBorders>
+              <w:top w:val="single" w:sz="8" w:color="003399"/>
+              <w:left w:val="single" w:sz="8" w:color="003399"/>
+              <w:bottom w:val="single" w:sz="8" w:color="003399"/>
+              <w:right w:val="single" w:sz="8" w:color="003399"/>
+            </w:tcBorders>
           </w:tcPr>
           <w:p>
             <w:pPr>
+              <w:jc w:val="right"/>
               <w:bidi w:val="1"/>
-              <w:jc w:val="right"/>
             </w:pPr>
             <w:r>
               <w:rPr>
-                <w:rFonts w:ascii="Arial" w:hAnsi="Arial" w:cs="Arial"/>
+                <w:rFonts w:ascii="Arial" w:hAnsi="Arial"/>
                 <w:b w:val="0"/>
                 <w:color w:val="003399"/>
                 <w:sz w:val="20"/>
@@ -377,63 +535,22 @@
         </w:tc>
         <w:tc>
           <w:tcPr>
-            <w:tcW w:type="dxa" w:w="3213"/>
-            <w:tcBorders/>
+            <w:tcW w:type="dxa" w:w="2551"/>
+            <w:tcBorders>
+              <w:top w:val="single" w:sz="8" w:color="003399"/>
+              <w:left w:val="single" w:sz="8" w:color="003399"/>
+              <w:bottom w:val="single" w:sz="8" w:color="003399"/>
+              <w:right w:val="single" w:sz="8" w:color="003399"/>
+            </w:tcBorders>
           </w:tcPr>
           <w:p>
             <w:pPr>
+              <w:jc w:val="right"/>
               <w:bidi w:val="1"/>
-              <w:jc w:val="right"/>
             </w:pPr>
             <w:r>
               <w:rPr>
-                <w:rFonts w:ascii="Arial" w:hAnsi="Arial" w:cs="Arial"/>
-                <w:b w:val="0"/>
-                <w:color w:val="003399"/>
-                <w:sz w:val="20"/>
-                <w:u w:val="none"/>
-              </w:rPr>
-              <w:t>מין: ז</w:t>
-            </w:r>
-          </w:p>
-        </w:tc>
-        <w:tc>
-          <w:tcPr>
-            <w:tcW w:type="dxa" w:w="3213"/>
-            <w:tcBorders/>
-          </w:tcPr>
-          <w:p>
-            <w:pPr>
-              <w:bidi w:val="1"/>
-              <w:jc w:val="right"/>
-            </w:pPr>
-            <w:r>
-              <w:rPr>
-                <w:rFonts w:ascii="Arial" w:hAnsi="Arial" w:cs="Arial"/>
-                <w:b w:val="0"/>
-                <w:color w:val="003399"/>
-                <w:sz w:val="20"/>
-                <w:u w:val="none"/>
-              </w:rPr>
-              <w:t>ת.לידה: 30/05/2005</w:t>
-            </w:r>
-          </w:p>
-        </w:tc>
-      </w:tr>
-      <w:tr>
-        <w:tc>
-          <w:tcPr>
-            <w:tcW w:type="dxa" w:w="3213"/>
-            <w:tcBorders/>
-          </w:tcPr>
-          <w:p>
-            <w:pPr>
-              <w:bidi w:val="1"/>
-              <w:jc w:val="right"/>
-            </w:pPr>
-            <w:r>
-              <w:rPr>
-                <w:rFonts w:ascii="Arial" w:hAnsi="Arial" w:cs="Arial"/>
+                <w:rFonts w:ascii="Arial" w:hAnsi="Arial"/>
                 <w:b w:val="0"/>
                 <w:color w:val="003399"/>
                 <w:sz w:val="20"/>
@@ -445,39 +562,117 @@
         </w:tc>
         <w:tc>
           <w:tcPr>
-            <w:tcW w:type="dxa" w:w="3213"/>
-            <w:tcBorders/>
+            <w:tcW w:type="dxa" w:w="2551"/>
+            <w:tcBorders>
+              <w:top w:val="single" w:sz="8" w:color="003399"/>
+              <w:left w:val="single" w:sz="8" w:color="003399"/>
+              <w:bottom w:val="single" w:sz="8" w:color="003399"/>
+              <w:right w:val="single" w:sz="8" w:color="003399"/>
+            </w:tcBorders>
           </w:tcPr>
           <w:p>
             <w:pPr>
+              <w:jc w:val="right"/>
               <w:bidi w:val="1"/>
-              <w:jc w:val="right"/>
             </w:pPr>
             <w:r>
               <w:rPr>
-                <w:rFonts w:ascii="Arial" w:hAnsi="Arial" w:cs="Arial"/>
+                <w:rFonts w:ascii="Arial" w:hAnsi="Arial"/>
                 <w:b w:val="0"/>
                 <w:color w:val="003399"/>
                 <w:sz w:val="20"/>
                 <w:u w:val="none"/>
               </w:rPr>
-              <w:t>מיקוד: 7228212</w:t>
+              <w:t>ת.לידה: 30/05/2005</w:t>
             </w:r>
           </w:p>
         </w:tc>
         <w:tc>
           <w:tcPr>
-            <w:tcW w:type="dxa" w:w="3213"/>
-            <w:tcBorders/>
+            <w:tcW w:type="dxa" w:w="2551"/>
+            <w:tcBorders>
+              <w:top w:val="single" w:sz="8" w:color="003399"/>
+              <w:left w:val="single" w:sz="8" w:color="003399"/>
+              <w:bottom w:val="single" w:sz="8" w:color="003399"/>
+              <w:right w:val="single" w:sz="8" w:color="003399"/>
+            </w:tcBorders>
           </w:tcPr>
           <w:p>
             <w:pPr>
+              <w:jc w:val="right"/>
               <w:bidi w:val="1"/>
-              <w:jc w:val="right"/>
             </w:pPr>
             <w:r>
               <w:rPr>
-                <w:rFonts w:ascii="Arial" w:hAnsi="Arial" w:cs="Arial"/>
+                <w:rFonts w:ascii="Arial" w:hAnsi="Arial"/>
+                <w:b w:val="0"/>
+                <w:color w:val="003399"/>
+                <w:sz w:val="20"/>
+                <w:u w:val="none"/>
+              </w:rPr>
+              <w:t>מין: ז</w:t>
+            </w:r>
+          </w:p>
+        </w:tc>
+      </w:tr>
+      <w:tr>
+        <w:tc>
+          <w:tcPr>
+            <w:tcW w:type="dxa" w:w="2551"/>
+            <w:tcBorders>
+              <w:top w:val="single" w:sz="8" w:color="003399"/>
+              <w:left w:val="single" w:sz="8" w:color="003399"/>
+              <w:bottom w:val="single" w:sz="8" w:color="003399"/>
+              <w:right w:val="single" w:sz="8" w:color="003399"/>
+            </w:tcBorders>
+          </w:tcPr>
+          <w:p/>
+        </w:tc>
+        <w:tc>
+          <w:tcPr>
+            <w:tcW w:type="dxa" w:w="2551"/>
+            <w:tcBorders>
+              <w:top w:val="single" w:sz="8" w:color="003399"/>
+              <w:left w:val="single" w:sz="8" w:color="003399"/>
+              <w:bottom w:val="single" w:sz="8" w:color="003399"/>
+              <w:right w:val="single" w:sz="8" w:color="003399"/>
+            </w:tcBorders>
+          </w:tcPr>
+          <w:p>
+            <w:pPr>
+              <w:jc w:val="right"/>
+              <w:bidi w:val="1"/>
+            </w:pPr>
+            <w:r>
+              <w:rPr>
+                <w:rFonts w:ascii="Arial" w:hAnsi="Arial"/>
+                <w:b w:val="0"/>
+                <w:color w:val="000000"/>
+                <w:sz w:val="20"/>
+                <w:u w:val="none"/>
+              </w:rPr>
+              <w:t>מיקוד 7228212</w:t>
+            </w:r>
+          </w:p>
+        </w:tc>
+        <w:tc>
+          <w:tcPr>
+            <w:tcW w:type="dxa" w:w="2551"/>
+            <w:tcBorders>
+              <w:top w:val="single" w:sz="8" w:color="003399"/>
+              <w:left w:val="single" w:sz="8" w:color="003399"/>
+              <w:bottom w:val="single" w:sz="8" w:color="003399"/>
+              <w:right w:val="single" w:sz="8" w:color="003399"/>
+            </w:tcBorders>
+          </w:tcPr>
+          <w:p>
+            <w:pPr>
+              <w:jc w:val="right"/>
+              <w:bidi w:val="1"/>
+            </w:pPr>
+            <w:r>
+              <w:rPr>
+                <w:rFonts w:ascii="Arial" w:hAnsi="Arial"/>
                 <w:b w:val="0"/>
                 <w:color w:val="003399"/>
                 <w:sz w:val="20"/>
@@ -487,26 +682,65 @@
             </w:r>
           </w:p>
         </w:tc>
+        <w:tc>
+          <w:tcPr>
+            <w:tcW w:type="dxa" w:w="2551"/>
+            <w:tcBorders>
+              <w:top w:val="single" w:sz="8" w:color="003399"/>
+              <w:left w:val="single" w:sz="8" w:color="003399"/>
+              <w:bottom w:val="single" w:sz="8" w:color="003399"/>
+              <w:right w:val="single" w:sz="8" w:color="003399"/>
+            </w:tcBorders>
+          </w:tcPr>
+          <w:p/>
+        </w:tc>
       </w:tr>
       <w:tr>
         <w:tc>
           <w:tcPr>
-            <w:tcW w:type="dxa" w:w="3213"/>
-            <w:tcBorders/>
+            <w:tcW w:type="dxa" w:w="2551"/>
+            <w:tcBorders>
+              <w:top w:val="single" w:sz="8" w:color="003399"/>
+              <w:left w:val="single" w:sz="8" w:color="003399"/>
+              <w:bottom w:val="single" w:sz="8" w:color="003399"/>
+              <w:right w:val="single" w:sz="8" w:color="003399"/>
+            </w:tcBorders>
           </w:tcPr>
           <w:p/>
         </w:tc>
         <w:tc>
           <w:tcPr>
-            <w:tcW w:type="dxa" w:w="3213"/>
-            <w:tcBorders/>
+            <w:tcW w:type="dxa" w:w="2551"/>
+            <w:tcBorders>
+              <w:top w:val="single" w:sz="8" w:color="003399"/>
+              <w:left w:val="single" w:sz="8" w:color="003399"/>
+              <w:bottom w:val="single" w:sz="8" w:color="003399"/>
+              <w:right w:val="single" w:sz="8" w:color="003399"/>
+            </w:tcBorders>
           </w:tcPr>
           <w:p/>
         </w:tc>
         <w:tc>
           <w:tcPr>
-            <w:tcW w:type="dxa" w:w="3213"/>
-            <w:tcBorders/>
+            <w:tcW w:type="dxa" w:w="2551"/>
+            <w:tcBorders>
+              <w:top w:val="single" w:sz="8" w:color="003399"/>
+              <w:left w:val="single" w:sz="8" w:color="003399"/>
+              <w:bottom w:val="single" w:sz="8" w:color="003399"/>
+              <w:right w:val="single" w:sz="8" w:color="003399"/>
+            </w:tcBorders>
+          </w:tcPr>
+          <w:p/>
+        </w:tc>
+        <w:tc>
+          <w:tcPr>
+            <w:tcW w:type="dxa" w:w="2551"/>
+            <w:tcBorders>
+              <w:top w:val="single" w:sz="8" w:color="003399"/>
+              <w:left w:val="single" w:sz="8" w:color="003399"/>
+              <w:bottom w:val="single" w:sz="8" w:color="003399"/>
+              <w:right w:val="single" w:sz="8" w:color="003399"/>
+            </w:tcBorders>
           </w:tcPr>
           <w:p/>
         </w:tc>
@@ -514,20 +748,17 @@
     </w:tbl>
     <w:p>
       <w:pPr>
-        <w:bidi w:val="1"/>
-        <w:spacing w:after="200" w:before="0"/>
-        <w:jc w:val="right"/>
+        <w:spacing w:after="200"/>
       </w:pPr>
     </w:p>
     <w:p>
       <w:pPr>
+        <w:jc w:val="center"/>
         <w:bidi w:val="1"/>
-        <w:spacing w:after="160" w:before="0"/>
-        <w:jc w:val="center"/>
       </w:pPr>
       <w:r>
         <w:rPr>
-          <w:rFonts w:ascii="Arial" w:hAnsi="Arial" w:cs="Arial"/>
+          <w:rFonts w:ascii="Arial" w:hAnsi="Arial"/>
           <w:b/>
           <w:color w:val="003399"/>
           <w:sz w:val="28"/>
@@ -536,96 +767,106 @@
         <w:t>אישור מחלה</w:t>
       </w:r>
     </w:p>
+    <w:p/>
     <w:p>
       <w:pPr>
+        <w:jc w:val="left"/>
         <w:bidi w:val="1"/>
-        <w:spacing w:after="160" w:before="0"/>
-        <w:jc w:val="left"/>
       </w:pPr>
       <w:r>
         <w:rPr>
-          <w:rFonts w:ascii="Arial" w:hAnsi="Arial" w:cs="Arial"/>
+          <w:rFonts w:ascii="Arial" w:hAnsi="Arial"/>
           <w:b w:val="0"/>
+          <w:color w:val="000000"/>
           <w:sz w:val="18"/>
           <w:u w:val="none"/>
         </w:rPr>
         <w:t>ET4D-CV5-ZKC-6R82-449XH</w:t>
       </w:r>
     </w:p>
+    <w:p/>
     <w:p>
       <w:pPr>
+        <w:jc w:val="right"/>
         <w:bidi w:val="1"/>
-        <w:spacing w:after="160" w:before="0"/>
-        <w:jc w:val="right"/>
       </w:pPr>
       <w:r>
         <w:rPr>
-          <w:rFonts w:ascii="Arial" w:hAnsi="Arial" w:cs="Arial"/>
+          <w:rFonts w:ascii="Arial" w:hAnsi="Arial"/>
           <w:b w:val="0"/>
+          <w:color w:val="000000"/>
           <w:sz w:val="20"/>
           <w:u w:val="none"/>
         </w:rPr>
         <w:t>הנני לאשר כי הנ"ל חלה/תה, האבחנה מפורטת ברשומה הרפואית.</w:t>
       </w:r>
     </w:p>
+    <w:p/>
     <w:p>
       <w:pPr>
+        <w:jc w:val="right"/>
         <w:bidi w:val="1"/>
-        <w:spacing w:after="400" w:before="0"/>
-        <w:jc w:val="right"/>
       </w:pPr>
       <w:r>
         <w:rPr>
-          <w:rFonts w:ascii="Arial" w:hAnsi="Arial" w:cs="Arial"/>
+          <w:rFonts w:ascii="Arial" w:hAnsi="Arial"/>
           <w:b w:val="0"/>
+          <w:color w:val="000000"/>
           <w:sz w:val="20"/>
           <w:u w:val="none"/>
         </w:rPr>
         <w:t>אינו/ה מסוגל/ת לעבוד מיום: 24/08/2026  עד יום: 27/08/2026  סה"כ: 4 ימים.</w:t>
       </w:r>
     </w:p>
+    <w:p/>
+    <w:p/>
+    <w:p/>
     <w:tbl>
       <w:tblPr>
         <w:tblW w:type="auto" w:w="0"/>
         <w:tblLook w:firstColumn="1" w:firstRow="1" w:lastColumn="0" w:lastRow="0" w:noHBand="0" w:noVBand="1" w:val="04A0"/>
       </w:tblPr>
       <w:tblGrid>
-        <w:gridCol w:w="4819"/>
-        <w:gridCol w:w="4819"/>
+        <w:gridCol w:w="5103"/>
+        <w:gridCol w:w="5103"/>
       </w:tblGrid>
       <w:tr>
         <w:tc>
           <w:tcPr>
-            <w:tcW w:type="dxa" w:w="4819"/>
+            <w:tcW w:type="dxa" w:w="5103"/>
             <w:tcBorders>
-              <w:top w:val="nil" w:sz="8" w:space="0" w:color="003399"/>
-              <w:bottom w:val="nil" w:sz="8" w:space="0" w:color="003399"/>
-              <w:left w:val="nil" w:sz="8" w:space="0" w:color="003399"/>
-              <w:right w:val="nil" w:sz="8" w:space="0" w:color="003399"/>
+              <w:top w:val="nil"/>
+              <w:left w:val="nil"/>
+              <w:bottom w:val="nil"/>
+              <w:right w:val="nil"/>
+              <w:insideH w:val="nil"/>
+              <w:insideV w:val="nil"/>
             </w:tcBorders>
           </w:tcPr>
           <w:p/>
         </w:tc>
         <w:tc>
           <w:tcPr>
-            <w:tcW w:type="dxa" w:w="4819"/>
+            <w:tcW w:type="dxa" w:w="5103"/>
             <w:tcBorders>
-              <w:top w:val="nil" w:sz="8" w:space="0" w:color="003399"/>
-              <w:bottom w:val="nil" w:sz="8" w:space="0" w:color="003399"/>
-              <w:left w:val="nil" w:sz="8" w:space="0" w:color="003399"/>
-              <w:right w:val="nil" w:sz="8" w:space="0" w:color="003399"/>
+              <w:top w:val="nil"/>
+              <w:left w:val="nil"/>
+              <w:bottom w:val="nil"/>
+              <w:right w:val="nil"/>
+              <w:insideH w:val="nil"/>
+              <w:insideV w:val="nil"/>
             </w:tcBorders>
           </w:tcPr>
           <w:p>
             <w:pPr>
+              <w:jc w:val="right"/>
               <w:bidi w:val="1"/>
-              <w:jc w:val="right"/>
             </w:pPr>
             <w:r>
               <w:rPr>
-                <w:rFonts w:ascii="Arial" w:hAnsi="Arial" w:cs="Arial"/>
+                <w:rFonts w:ascii="Arial" w:hAnsi="Arial"/>
                 <w:b w:val="0"/>
-                <w:color w:val="003399"/>
+                <w:color w:val="000000"/>
                 <w:sz w:val="20"/>
                 <w:u w:val="none"/>
               </w:rPr>
@@ -637,22 +878,24 @@
       <w:tr>
         <w:tc>
           <w:tcPr>
-            <w:tcW w:type="dxa" w:w="4819"/>
+            <w:tcW w:type="dxa" w:w="5103"/>
             <w:tcBorders>
-              <w:top w:val="nil" w:sz="8" w:space="0" w:color="003399"/>
-              <w:bottom w:val="nil" w:sz="8" w:space="0" w:color="003399"/>
-              <w:left w:val="nil" w:sz="8" w:space="0" w:color="003399"/>
-              <w:right w:val="nil" w:sz="8" w:space="0" w:color="003399"/>
+              <w:top w:val="nil"/>
+              <w:left w:val="nil"/>
+              <w:bottom w:val="nil"/>
+              <w:right w:val="nil"/>
+              <w:insideH w:val="nil"/>
+              <w:insideV w:val="nil"/>
             </w:tcBorders>
           </w:tcPr>
           <w:p>
             <w:pPr>
+              <w:jc w:val="right"/>
               <w:bidi w:val="1"/>
-              <w:jc w:val="right"/>
             </w:pPr>
             <w:r>
               <w:rPr>
-                <w:rFonts w:ascii="Arial" w:hAnsi="Arial" w:cs="Arial"/>
+                <w:rFonts w:ascii="Arial" w:hAnsi="Arial"/>
                 <w:b w:val="0"/>
                 <w:color w:val="003399"/>
                 <w:sz w:val="20"/>
@@ -664,22 +907,24 @@
         </w:tc>
         <w:tc>
           <w:tcPr>
-            <w:tcW w:type="dxa" w:w="4819"/>
+            <w:tcW w:type="dxa" w:w="5103"/>
             <w:tcBorders>
-              <w:top w:val="nil" w:sz="8" w:space="0" w:color="003399"/>
-              <w:bottom w:val="nil" w:sz="8" w:space="0" w:color="003399"/>
-              <w:left w:val="nil" w:sz="8" w:space="0" w:color="003399"/>
-              <w:right w:val="nil" w:sz="8" w:space="0" w:color="003399"/>
+              <w:top w:val="nil"/>
+              <w:left w:val="nil"/>
+              <w:bottom w:val="nil"/>
+              <w:right w:val="nil"/>
+              <w:insideH w:val="nil"/>
+              <w:insideV w:val="nil"/>
             </w:tcBorders>
           </w:tcPr>
           <w:p>
             <w:pPr>
+              <w:jc w:val="right"/>
               <w:bidi w:val="1"/>
-              <w:jc w:val="right"/>
             </w:pPr>
             <w:r>
               <w:rPr>
-                <w:rFonts w:ascii="Arial" w:hAnsi="Arial" w:cs="Arial"/>
+                <w:rFonts w:ascii="Arial" w:hAnsi="Arial"/>
                 <w:b w:val="0"/>
                 <w:color w:val="003399"/>
                 <w:sz w:val="20"/>
@@ -693,7 +938,7 @@
     </w:tbl>
     <w:sectPr>
       <w:pgSz w:w="11906" w:h="16838"/>
-      <w:pgMar w:top="850" w:right="1134" w:bottom="850" w:left="1134" w:header="720" w:footer="720" w:gutter="0"/>
+      <w:pgMar w:top="720" w:right="850" w:bottom="720" w:left="850" w:header="720" w:footer="720" w:gutter="0"/>
       <w:cols w:space="720"/>
       <w:docGrid w:linePitch="360"/>
     </w:sectPr>

</xml_diff>

<commit_message>
Match PDF colors and fix patient fields; preserve Word barcodes
Co-authored-by: Ron Gurfinkel <RonBabaj@users.noreply.github.com>
</commit_message>
<xml_diff>
--- a/exports/medical_certificate.docx
+++ b/exports/medical_certificate.docx
@@ -1949,32 +1949,19 @@
             </w:pPr>
             <w:r>
               <w:rPr>
-                <w:rFonts w:ascii="Arial" w:eastAsia="Arial" w:hAnsi="Arial" w:cs="Arial"/>
-                <w:b/>
-                <w:bCs/>
+                <w:rFonts w:ascii="Arial" w:hAnsi="Arial"/>
+                <w:b w:val="0"/>
                 <w:color w:val="00008B"/>
-                <w:sz w:val="20"/>
-                <w:szCs w:val="20"/>
-                <w:rtl/>
               </w:rPr>
               <w:t>ת.ז.:</w:t>
             </w:r>
             <w:r>
               <w:rPr>
-                <w:rFonts w:ascii="Arial" w:eastAsia="Arial" w:hAnsi="Arial" w:cs="Arial"/>
-                <w:sz w:val="20"/>
-                <w:szCs w:val="20"/>
-                <w:rtl/>
+                <w:rFonts w:ascii="Arial" w:hAnsi="Arial"/>
+                <w:b w:val="0"/>
+                <w:color w:val="000000"/>
               </w:rPr>
-              <w:t xml:space="preserve"> </w:t>
-            </w:r>
-            <w:r>
-              <w:rPr>
-                <w:rFonts w:ascii="Arial" w:eastAsia="Arial" w:hAnsi="Arial" w:cs="Arial"/>
-                <w:sz w:val="20"/>
-                <w:szCs w:val="20"/>
-              </w:rPr>
-              <w:t>215359910</w:t>
+              <w:t xml:space="preserve"> 215359910</w:t>
             </w:r>
           </w:p>
         </w:tc>
@@ -1996,23 +1983,17 @@
             </w:pPr>
             <w:r>
               <w:rPr>
-                <w:rFonts w:ascii="Arial" w:eastAsia="Arial" w:hAnsi="Arial" w:cs="Arial"/>
-                <w:b/>
-                <w:bCs/>
+                <w:rFonts w:ascii="Arial" w:hAnsi="Arial"/>
+                <w:b w:val="0"/>
                 <w:color w:val="00008B"/>
-                <w:sz w:val="20"/>
-                <w:szCs w:val="20"/>
-                <w:rtl/>
               </w:rPr>
               <w:t>שם פרטי:</w:t>
             </w:r>
             <w:r>
               <w:rPr>
-                <w:rFonts w:ascii="Arial" w:eastAsia="Arial" w:hAnsi="Arial" w:cs="Arial"/>
-                <w:b/>
-                <w:bCs/>
-                <w:sz w:val="24"/>
-                <w:rtl/>
+                <w:rFonts w:ascii="Arial" w:hAnsi="Arial"/>
+                <w:b w:val="0"/>
+                <w:color w:val="000000"/>
               </w:rPr>
               <w:t xml:space="preserve"> רון</w:t>
             </w:r>
@@ -2036,23 +2017,17 @@
             </w:pPr>
             <w:r>
               <w:rPr>
-                <w:rFonts w:ascii="Arial" w:eastAsia="Arial" w:hAnsi="Arial" w:cs="Arial"/>
-                <w:b/>
-                <w:bCs/>
+                <w:rFonts w:ascii="Arial" w:hAnsi="Arial"/>
+                <w:b w:val="0"/>
                 <w:color w:val="00008B"/>
-                <w:sz w:val="20"/>
-                <w:szCs w:val="20"/>
-                <w:rtl/>
               </w:rPr>
               <w:t>שם משפחה:</w:t>
             </w:r>
             <w:r>
               <w:rPr>
-                <w:rFonts w:ascii="Arial" w:eastAsia="Arial" w:hAnsi="Arial" w:cs="Arial"/>
-                <w:b/>
-                <w:bCs/>
-                <w:sz w:val="24"/>
-                <w:rtl/>
+                <w:rFonts w:ascii="Arial" w:hAnsi="Arial"/>
+                <w:b w:val="0"/>
+                <w:color w:val="000000"/>
               </w:rPr>
               <w:t xml:space="preserve"> גורפינקל</w:t>
             </w:r>
@@ -2075,13 +2050,9 @@
             </w:pPr>
             <w:r>
               <w:rPr>
-                <w:rFonts w:ascii="Arial" w:eastAsia="Arial" w:hAnsi="Arial" w:cs="Arial"/>
-                <w:b/>
-                <w:bCs/>
+                <w:rFonts w:ascii="Arial" w:hAnsi="Arial"/>
+                <w:b w:val="0"/>
                 <w:color w:val="00008B"/>
-                <w:sz w:val="17"/>
-                <w:szCs w:val="17"/>
-                <w:rtl/>
               </w:rPr>
               <w:t>פרטי הנבדק:</w:t>
             </w:r>
@@ -2109,7 +2080,44 @@
               <w:jc w:val="both"/>
             </w:pPr>
             <w:r>
-              <w:t>טל.עבודה/נייד: 0522460193</w:t>
+              <w:rPr>
+                <w:rFonts w:ascii="Arial" w:hAnsi="Arial"/>
+                <w:b w:val="0"/>
+                <w:color w:val="00008B"/>
+              </w:rPr>
+              <w:t>טל.עבודה/נייד:</w:t>
+            </w:r>
+            <w:r>
+              <w:rPr>
+                <w:rFonts w:ascii="Arial" w:hAnsi="Arial"/>
+                <w:b w:val="0"/>
+                <w:color w:val="000000"/>
+              </w:rPr>
+              <w:t xml:space="preserve"> 0522460193</w:t>
+            </w:r>
+            <w:r>
+              <w:rPr>
+                <w:rFonts w:ascii="Arial" w:hAnsi="Arial"/>
+                <w:b w:val="0"/>
+                <w:color w:val="000000"/>
+              </w:rPr>
+              <w:br/>
+            </w:r>
+            <w:r>
+              <w:rPr>
+                <w:rFonts w:ascii="Arial" w:hAnsi="Arial"/>
+                <w:b w:val="0"/>
+                <w:color w:val="00008B"/>
+              </w:rPr>
+              <w:t xml:space="preserve">מיקוד </w:t>
+            </w:r>
+            <w:r>
+              <w:rPr>
+                <w:rFonts w:ascii="Arial" w:hAnsi="Arial"/>
+                <w:b w:val="0"/>
+                <w:color w:val="000000"/>
+              </w:rPr>
+              <w:t>7228212</w:t>
             </w:r>
           </w:p>
         </w:tc>
@@ -2133,7 +2141,20 @@
               <w:jc w:val="left"/>
             </w:pPr>
             <w:r>
-              <w:t>טלפון: 08-9244787</w:t>
+              <w:rPr>
+                <w:rFonts w:ascii="Arial" w:hAnsi="Arial"/>
+                <w:b w:val="0"/>
+                <w:color w:val="00008B"/>
+              </w:rPr>
+              <w:t>טלפון:</w:t>
+            </w:r>
+            <w:r>
+              <w:rPr>
+                <w:rFonts w:ascii="Arial" w:hAnsi="Arial"/>
+                <w:b w:val="0"/>
+                <w:color w:val="000000"/>
+              </w:rPr>
+              <w:t xml:space="preserve"> 08-9244787</w:t>
             </w:r>
           </w:p>
         </w:tc>
@@ -2153,13 +2174,69 @@
               <w:ind w:right="383"/>
             </w:pPr>
             <w:r>
-              <w:t>ת.לידה: 30/05/2005</w:t>
+              <w:rPr>
+                <w:rFonts w:ascii="Arial" w:hAnsi="Arial"/>
+                <w:b w:val="0"/>
+                <w:color w:val="00008B"/>
+              </w:rPr>
+              <w:t>ת.לידה:</w:t>
+            </w:r>
+            <w:r>
+              <w:rPr>
+                <w:rFonts w:ascii="Arial" w:hAnsi="Arial"/>
+                <w:b w:val="0"/>
+                <w:color w:val="000000"/>
+              </w:rPr>
+              <w:t xml:space="preserve"> 30/05/2005</w:t>
               <w:tab/>
-              <w:t>מין: ז</w:t>
+            </w:r>
+            <w:r>
+              <w:rPr>
+                <w:rFonts w:ascii="Arial" w:hAnsi="Arial"/>
+                <w:b w:val="0"/>
+                <w:color w:val="000000"/>
+              </w:rPr>
               <w:br/>
-              <w:t>כתובת: הרב אפריאט 6, רמלה</w:t>
+            </w:r>
+            <w:r>
+              <w:rPr>
+                <w:rFonts w:ascii="Arial" w:hAnsi="Arial"/>
+                <w:b w:val="0"/>
+                <w:color w:val="00008B"/>
+              </w:rPr>
+              <w:t>מין:</w:t>
+            </w:r>
+            <w:r>
+              <w:rPr>
+                <w:rFonts w:ascii="Arial" w:hAnsi="Arial"/>
+                <w:b w:val="0"/>
+                <w:color w:val="000000"/>
+              </w:rPr>
+              <w:t xml:space="preserve"> ז</w:t>
+            </w:r>
+            <w:r>
+              <w:rPr>
+                <w:rFonts w:ascii="Arial" w:hAnsi="Arial"/>
+                <w:b w:val="0"/>
+                <w:color w:val="000000"/>
+              </w:rPr>
               <w:br/>
-              <w:t>מיקוד 7228212</w:t>
+            </w:r>
+            <w:r>
+              <w:rPr>
+                <w:rFonts w:ascii="Arial" w:hAnsi="Arial"/>
+                <w:b w:val="0"/>
+                <w:color w:val="00008B"/>
+              </w:rPr>
+              <w:t>כתובת:</w:t>
+            </w:r>
+            <w:r>
+              <w:rPr>
+                <w:rFonts w:ascii="Arial" w:hAnsi="Arial"/>
+                <w:b w:val="0"/>
+                <w:color w:val="000000"/>
+              </w:rPr>
+              <w:t xml:space="preserve"> הרב אפריאט 6, רמלה</w:t>
             </w:r>
           </w:p>
         </w:tc>
@@ -2182,6 +2259,2369 @@
               <w:jc w:val="left"/>
             </w:pPr>
             <w:r>
+              <w:rPr>
+                <w:noProof/>
+              </w:rPr>
+              <mc:AlternateContent>
+                <mc:Choice Requires="wpg">
+                  <w:drawing>
+                    <wp:inline distT="0" distB="0" distL="0" distR="0" wp14:anchorId="7D1BAFA2" wp14:editId="2A2DD1F7">
+                      <wp:extent cx="742950" cy="285750"/>
+                      <wp:effectExtent l="0" t="0" r="0" b="0"/>
+                      <wp:docPr id="2506" name="Group 2506"/>
+                      <wp:cNvGraphicFramePr/>
+                      <a:graphic xmlns:a="http://schemas.openxmlformats.org/drawingml/2006/main">
+                        <a:graphicData uri="http://schemas.microsoft.com/office/word/2010/wordprocessingGroup">
+                          <wpg:wgp>
+                            <wpg:cNvGrpSpPr/>
+                            <wpg:grpSpPr>
+                              <a:xfrm>
+                                <a:off x="0" y="0"/>
+                                <a:ext cx="742950" cy="285750"/>
+                                <a:chOff x="0" y="0"/>
+                                <a:chExt cx="742950" cy="285750"/>
+                              </a:xfrm>
+                            </wpg:grpSpPr>
+                            <wps:wsp>
+                              <wps:cNvPr id="4962" name="Shape 4962"/>
+                              <wps:cNvSpPr/>
+                              <wps:spPr>
+                                <a:xfrm>
+                                  <a:off x="0" y="0"/>
+                                  <a:ext cx="9525" cy="285750"/>
+                                </a:xfrm>
+                                <a:custGeom>
+                                  <a:avLst/>
+                                  <a:gdLst/>
+                                  <a:ahLst/>
+                                  <a:cxnLst/>
+                                  <a:rect l="0" t="0" r="0" b="0"/>
+                                  <a:pathLst>
+                                    <a:path w="9525" h="285750">
+                                      <a:moveTo>
+                                        <a:pt x="0" y="0"/>
+                                      </a:moveTo>
+                                      <a:lnTo>
+                                        <a:pt x="9525" y="0"/>
+                                      </a:lnTo>
+                                      <a:lnTo>
+                                        <a:pt x="9525" y="285750"/>
+                                      </a:lnTo>
+                                      <a:lnTo>
+                                        <a:pt x="0" y="285750"/>
+                                      </a:lnTo>
+                                      <a:lnTo>
+                                        <a:pt x="0" y="0"/>
+                                      </a:lnTo>
+                                    </a:path>
+                                  </a:pathLst>
+                                </a:custGeom>
+                                <a:ln w="0" cap="flat">
+                                  <a:miter lim="127000"/>
+                                </a:ln>
+                              </wps:spPr>
+                              <wps:style>
+                                <a:lnRef idx="0">
+                                  <a:srgbClr val="000000">
+                                    <a:alpha val="0"/>
+                                  </a:srgbClr>
+                                </a:lnRef>
+                                <a:fillRef idx="1">
+                                  <a:srgbClr val="000000"/>
+                                </a:fillRef>
+                                <a:effectRef idx="0">
+                                  <a:scrgbClr r="0" g="0" b="0"/>
+                                </a:effectRef>
+                                <a:fontRef idx="none"/>
+                              </wps:style>
+                              <wps:bodyPr/>
+                            </wps:wsp>
+                            <wps:wsp>
+                              <wps:cNvPr id="4963" name="Shape 4963"/>
+                              <wps:cNvSpPr/>
+                              <wps:spPr>
+                                <a:xfrm>
+                                  <a:off x="19050" y="0"/>
+                                  <a:ext cx="9525" cy="285750"/>
+                                </a:xfrm>
+                                <a:custGeom>
+                                  <a:avLst/>
+                                  <a:gdLst/>
+                                  <a:ahLst/>
+                                  <a:cxnLst/>
+                                  <a:rect l="0" t="0" r="0" b="0"/>
+                                  <a:pathLst>
+                                    <a:path w="9525" h="285750">
+                                      <a:moveTo>
+                                        <a:pt x="0" y="0"/>
+                                      </a:moveTo>
+                                      <a:lnTo>
+                                        <a:pt x="9525" y="0"/>
+                                      </a:lnTo>
+                                      <a:lnTo>
+                                        <a:pt x="9525" y="285750"/>
+                                      </a:lnTo>
+                                      <a:lnTo>
+                                        <a:pt x="0" y="285750"/>
+                                      </a:lnTo>
+                                      <a:lnTo>
+                                        <a:pt x="0" y="0"/>
+                                      </a:lnTo>
+                                    </a:path>
+                                  </a:pathLst>
+                                </a:custGeom>
+                                <a:ln w="0" cap="flat">
+                                  <a:miter lim="127000"/>
+                                </a:ln>
+                              </wps:spPr>
+                              <wps:style>
+                                <a:lnRef idx="0">
+                                  <a:srgbClr val="000000">
+                                    <a:alpha val="0"/>
+                                  </a:srgbClr>
+                                </a:lnRef>
+                                <a:fillRef idx="1">
+                                  <a:srgbClr val="000000"/>
+                                </a:fillRef>
+                                <a:effectRef idx="0">
+                                  <a:scrgbClr r="0" g="0" b="0"/>
+                                </a:effectRef>
+                                <a:fontRef idx="none"/>
+                              </wps:style>
+                              <wps:bodyPr/>
+                            </wps:wsp>
+                            <wps:wsp>
+                              <wps:cNvPr id="4964" name="Shape 4964"/>
+                              <wps:cNvSpPr/>
+                              <wps:spPr>
+                                <a:xfrm>
+                                  <a:off x="38100" y="0"/>
+                                  <a:ext cx="9525" cy="285750"/>
+                                </a:xfrm>
+                                <a:custGeom>
+                                  <a:avLst/>
+                                  <a:gdLst/>
+                                  <a:ahLst/>
+                                  <a:cxnLst/>
+                                  <a:rect l="0" t="0" r="0" b="0"/>
+                                  <a:pathLst>
+                                    <a:path w="9525" h="285750">
+                                      <a:moveTo>
+                                        <a:pt x="0" y="0"/>
+                                      </a:moveTo>
+                                      <a:lnTo>
+                                        <a:pt x="9525" y="0"/>
+                                      </a:lnTo>
+                                      <a:lnTo>
+                                        <a:pt x="9525" y="285750"/>
+                                      </a:lnTo>
+                                      <a:lnTo>
+                                        <a:pt x="0" y="285750"/>
+                                      </a:lnTo>
+                                      <a:lnTo>
+                                        <a:pt x="0" y="0"/>
+                                      </a:lnTo>
+                                    </a:path>
+                                  </a:pathLst>
+                                </a:custGeom>
+                                <a:ln w="0" cap="flat">
+                                  <a:miter lim="127000"/>
+                                </a:ln>
+                              </wps:spPr>
+                              <wps:style>
+                                <a:lnRef idx="0">
+                                  <a:srgbClr val="000000">
+                                    <a:alpha val="0"/>
+                                  </a:srgbClr>
+                                </a:lnRef>
+                                <a:fillRef idx="1">
+                                  <a:srgbClr val="000000"/>
+                                </a:fillRef>
+                                <a:effectRef idx="0">
+                                  <a:scrgbClr r="0" g="0" b="0"/>
+                                </a:effectRef>
+                                <a:fontRef idx="none"/>
+                              </wps:style>
+                              <wps:bodyPr/>
+                            </wps:wsp>
+                            <wps:wsp>
+                              <wps:cNvPr id="4965" name="Shape 4965"/>
+                              <wps:cNvSpPr/>
+                              <wps:spPr>
+                                <a:xfrm>
+                                  <a:off x="57150" y="0"/>
+                                  <a:ext cx="9525" cy="285750"/>
+                                </a:xfrm>
+                                <a:custGeom>
+                                  <a:avLst/>
+                                  <a:gdLst/>
+                                  <a:ahLst/>
+                                  <a:cxnLst/>
+                                  <a:rect l="0" t="0" r="0" b="0"/>
+                                  <a:pathLst>
+                                    <a:path w="9525" h="285750">
+                                      <a:moveTo>
+                                        <a:pt x="0" y="0"/>
+                                      </a:moveTo>
+                                      <a:lnTo>
+                                        <a:pt x="9525" y="0"/>
+                                      </a:lnTo>
+                                      <a:lnTo>
+                                        <a:pt x="9525" y="285750"/>
+                                      </a:lnTo>
+                                      <a:lnTo>
+                                        <a:pt x="0" y="285750"/>
+                                      </a:lnTo>
+                                      <a:lnTo>
+                                        <a:pt x="0" y="0"/>
+                                      </a:lnTo>
+                                    </a:path>
+                                  </a:pathLst>
+                                </a:custGeom>
+                                <a:ln w="0" cap="flat">
+                                  <a:miter lim="127000"/>
+                                </a:ln>
+                              </wps:spPr>
+                              <wps:style>
+                                <a:lnRef idx="0">
+                                  <a:srgbClr val="000000">
+                                    <a:alpha val="0"/>
+                                  </a:srgbClr>
+                                </a:lnRef>
+                                <a:fillRef idx="1">
+                                  <a:srgbClr val="000000"/>
+                                </a:fillRef>
+                                <a:effectRef idx="0">
+                                  <a:scrgbClr r="0" g="0" b="0"/>
+                                </a:effectRef>
+                                <a:fontRef idx="none"/>
+                              </wps:style>
+                              <wps:bodyPr/>
+                            </wps:wsp>
+                            <wps:wsp>
+                              <wps:cNvPr id="4966" name="Shape 4966"/>
+                              <wps:cNvSpPr/>
+                              <wps:spPr>
+                                <a:xfrm>
+                                  <a:off x="85725" y="0"/>
+                                  <a:ext cx="9525" cy="285750"/>
+                                </a:xfrm>
+                                <a:custGeom>
+                                  <a:avLst/>
+                                  <a:gdLst/>
+                                  <a:ahLst/>
+                                  <a:cxnLst/>
+                                  <a:rect l="0" t="0" r="0" b="0"/>
+                                  <a:pathLst>
+                                    <a:path w="9525" h="285750">
+                                      <a:moveTo>
+                                        <a:pt x="0" y="0"/>
+                                      </a:moveTo>
+                                      <a:lnTo>
+                                        <a:pt x="9525" y="0"/>
+                                      </a:lnTo>
+                                      <a:lnTo>
+                                        <a:pt x="9525" y="285750"/>
+                                      </a:lnTo>
+                                      <a:lnTo>
+                                        <a:pt x="0" y="285750"/>
+                                      </a:lnTo>
+                                      <a:lnTo>
+                                        <a:pt x="0" y="0"/>
+                                      </a:lnTo>
+                                    </a:path>
+                                  </a:pathLst>
+                                </a:custGeom>
+                                <a:ln w="0" cap="flat">
+                                  <a:miter lim="127000"/>
+                                </a:ln>
+                              </wps:spPr>
+                              <wps:style>
+                                <a:lnRef idx="0">
+                                  <a:srgbClr val="000000">
+                                    <a:alpha val="0"/>
+                                  </a:srgbClr>
+                                </a:lnRef>
+                                <a:fillRef idx="1">
+                                  <a:srgbClr val="000000"/>
+                                </a:fillRef>
+                                <a:effectRef idx="0">
+                                  <a:scrgbClr r="0" g="0" b="0"/>
+                                </a:effectRef>
+                                <a:fontRef idx="none"/>
+                              </wps:style>
+                              <wps:bodyPr/>
+                            </wps:wsp>
+                            <wps:wsp>
+                              <wps:cNvPr id="4967" name="Shape 4967"/>
+                              <wps:cNvSpPr/>
+                              <wps:spPr>
+                                <a:xfrm>
+                                  <a:off x="95250" y="0"/>
+                                  <a:ext cx="9525" cy="285750"/>
+                                </a:xfrm>
+                                <a:custGeom>
+                                  <a:avLst/>
+                                  <a:gdLst/>
+                                  <a:ahLst/>
+                                  <a:cxnLst/>
+                                  <a:rect l="0" t="0" r="0" b="0"/>
+                                  <a:pathLst>
+                                    <a:path w="9525" h="285750">
+                                      <a:moveTo>
+                                        <a:pt x="0" y="0"/>
+                                      </a:moveTo>
+                                      <a:lnTo>
+                                        <a:pt x="9525" y="0"/>
+                                      </a:lnTo>
+                                      <a:lnTo>
+                                        <a:pt x="9525" y="285750"/>
+                                      </a:lnTo>
+                                      <a:lnTo>
+                                        <a:pt x="0" y="285750"/>
+                                      </a:lnTo>
+                                      <a:lnTo>
+                                        <a:pt x="0" y="0"/>
+                                      </a:lnTo>
+                                    </a:path>
+                                  </a:pathLst>
+                                </a:custGeom>
+                                <a:ln w="0" cap="flat">
+                                  <a:miter lim="127000"/>
+                                </a:ln>
+                              </wps:spPr>
+                              <wps:style>
+                                <a:lnRef idx="0">
+                                  <a:srgbClr val="000000">
+                                    <a:alpha val="0"/>
+                                  </a:srgbClr>
+                                </a:lnRef>
+                                <a:fillRef idx="1">
+                                  <a:srgbClr val="000000"/>
+                                </a:fillRef>
+                                <a:effectRef idx="0">
+                                  <a:scrgbClr r="0" g="0" b="0"/>
+                                </a:effectRef>
+                                <a:fontRef idx="none"/>
+                              </wps:style>
+                              <wps:bodyPr/>
+                            </wps:wsp>
+                            <wps:wsp>
+                              <wps:cNvPr id="4968" name="Shape 4968"/>
+                              <wps:cNvSpPr/>
+                              <wps:spPr>
+                                <a:xfrm>
+                                  <a:off x="114300" y="0"/>
+                                  <a:ext cx="9525" cy="285750"/>
+                                </a:xfrm>
+                                <a:custGeom>
+                                  <a:avLst/>
+                                  <a:gdLst/>
+                                  <a:ahLst/>
+                                  <a:cxnLst/>
+                                  <a:rect l="0" t="0" r="0" b="0"/>
+                                  <a:pathLst>
+                                    <a:path w="9525" h="285750">
+                                      <a:moveTo>
+                                        <a:pt x="0" y="0"/>
+                                      </a:moveTo>
+                                      <a:lnTo>
+                                        <a:pt x="9525" y="0"/>
+                                      </a:lnTo>
+                                      <a:lnTo>
+                                        <a:pt x="9525" y="285750"/>
+                                      </a:lnTo>
+                                      <a:lnTo>
+                                        <a:pt x="0" y="285750"/>
+                                      </a:lnTo>
+                                      <a:lnTo>
+                                        <a:pt x="0" y="0"/>
+                                      </a:lnTo>
+                                    </a:path>
+                                  </a:pathLst>
+                                </a:custGeom>
+                                <a:ln w="0" cap="flat">
+                                  <a:miter lim="127000"/>
+                                </a:ln>
+                              </wps:spPr>
+                              <wps:style>
+                                <a:lnRef idx="0">
+                                  <a:srgbClr val="000000">
+                                    <a:alpha val="0"/>
+                                  </a:srgbClr>
+                                </a:lnRef>
+                                <a:fillRef idx="1">
+                                  <a:srgbClr val="000000"/>
+                                </a:fillRef>
+                                <a:effectRef idx="0">
+                                  <a:scrgbClr r="0" g="0" b="0"/>
+                                </a:effectRef>
+                                <a:fontRef idx="none"/>
+                              </wps:style>
+                              <wps:bodyPr/>
+                            </wps:wsp>
+                            <wps:wsp>
+                              <wps:cNvPr id="4969" name="Shape 4969"/>
+                              <wps:cNvSpPr/>
+                              <wps:spPr>
+                                <a:xfrm>
+                                  <a:off x="123825" y="0"/>
+                                  <a:ext cx="9525" cy="285750"/>
+                                </a:xfrm>
+                                <a:custGeom>
+                                  <a:avLst/>
+                                  <a:gdLst/>
+                                  <a:ahLst/>
+                                  <a:cxnLst/>
+                                  <a:rect l="0" t="0" r="0" b="0"/>
+                                  <a:pathLst>
+                                    <a:path w="9525" h="285750">
+                                      <a:moveTo>
+                                        <a:pt x="0" y="0"/>
+                                      </a:moveTo>
+                                      <a:lnTo>
+                                        <a:pt x="9525" y="0"/>
+                                      </a:lnTo>
+                                      <a:lnTo>
+                                        <a:pt x="9525" y="285750"/>
+                                      </a:lnTo>
+                                      <a:lnTo>
+                                        <a:pt x="0" y="285750"/>
+                                      </a:lnTo>
+                                      <a:lnTo>
+                                        <a:pt x="0" y="0"/>
+                                      </a:lnTo>
+                                    </a:path>
+                                  </a:pathLst>
+                                </a:custGeom>
+                                <a:ln w="0" cap="flat">
+                                  <a:miter lim="127000"/>
+                                </a:ln>
+                              </wps:spPr>
+                              <wps:style>
+                                <a:lnRef idx="0">
+                                  <a:srgbClr val="000000">
+                                    <a:alpha val="0"/>
+                                  </a:srgbClr>
+                                </a:lnRef>
+                                <a:fillRef idx="1">
+                                  <a:srgbClr val="000000"/>
+                                </a:fillRef>
+                                <a:effectRef idx="0">
+                                  <a:scrgbClr r="0" g="0" b="0"/>
+                                </a:effectRef>
+                                <a:fontRef idx="none"/>
+                              </wps:style>
+                              <wps:bodyPr/>
+                            </wps:wsp>
+                            <wps:wsp>
+                              <wps:cNvPr id="4970" name="Shape 4970"/>
+                              <wps:cNvSpPr/>
+                              <wps:spPr>
+                                <a:xfrm>
+                                  <a:off x="142875" y="0"/>
+                                  <a:ext cx="9525" cy="285750"/>
+                                </a:xfrm>
+                                <a:custGeom>
+                                  <a:avLst/>
+                                  <a:gdLst/>
+                                  <a:ahLst/>
+                                  <a:cxnLst/>
+                                  <a:rect l="0" t="0" r="0" b="0"/>
+                                  <a:pathLst>
+                                    <a:path w="9525" h="285750">
+                                      <a:moveTo>
+                                        <a:pt x="0" y="0"/>
+                                      </a:moveTo>
+                                      <a:lnTo>
+                                        <a:pt x="9525" y="0"/>
+                                      </a:lnTo>
+                                      <a:lnTo>
+                                        <a:pt x="9525" y="285750"/>
+                                      </a:lnTo>
+                                      <a:lnTo>
+                                        <a:pt x="0" y="285750"/>
+                                      </a:lnTo>
+                                      <a:lnTo>
+                                        <a:pt x="0" y="0"/>
+                                      </a:lnTo>
+                                    </a:path>
+                                  </a:pathLst>
+                                </a:custGeom>
+                                <a:ln w="0" cap="flat">
+                                  <a:miter lim="127000"/>
+                                </a:ln>
+                              </wps:spPr>
+                              <wps:style>
+                                <a:lnRef idx="0">
+                                  <a:srgbClr val="000000">
+                                    <a:alpha val="0"/>
+                                  </a:srgbClr>
+                                </a:lnRef>
+                                <a:fillRef idx="1">
+                                  <a:srgbClr val="000000"/>
+                                </a:fillRef>
+                                <a:effectRef idx="0">
+                                  <a:scrgbClr r="0" g="0" b="0"/>
+                                </a:effectRef>
+                                <a:fontRef idx="none"/>
+                              </wps:style>
+                              <wps:bodyPr/>
+                            </wps:wsp>
+                            <wps:wsp>
+                              <wps:cNvPr id="4971" name="Shape 4971"/>
+                              <wps:cNvSpPr/>
+                              <wps:spPr>
+                                <a:xfrm>
+                                  <a:off x="171450" y="0"/>
+                                  <a:ext cx="9525" cy="285750"/>
+                                </a:xfrm>
+                                <a:custGeom>
+                                  <a:avLst/>
+                                  <a:gdLst/>
+                                  <a:ahLst/>
+                                  <a:cxnLst/>
+                                  <a:rect l="0" t="0" r="0" b="0"/>
+                                  <a:pathLst>
+                                    <a:path w="9525" h="285750">
+                                      <a:moveTo>
+                                        <a:pt x="0" y="0"/>
+                                      </a:moveTo>
+                                      <a:lnTo>
+                                        <a:pt x="9525" y="0"/>
+                                      </a:lnTo>
+                                      <a:lnTo>
+                                        <a:pt x="9525" y="285750"/>
+                                      </a:lnTo>
+                                      <a:lnTo>
+                                        <a:pt x="0" y="285750"/>
+                                      </a:lnTo>
+                                      <a:lnTo>
+                                        <a:pt x="0" y="0"/>
+                                      </a:lnTo>
+                                    </a:path>
+                                  </a:pathLst>
+                                </a:custGeom>
+                                <a:ln w="0" cap="flat">
+                                  <a:miter lim="127000"/>
+                                </a:ln>
+                              </wps:spPr>
+                              <wps:style>
+                                <a:lnRef idx="0">
+                                  <a:srgbClr val="000000">
+                                    <a:alpha val="0"/>
+                                  </a:srgbClr>
+                                </a:lnRef>
+                                <a:fillRef idx="1">
+                                  <a:srgbClr val="000000"/>
+                                </a:fillRef>
+                                <a:effectRef idx="0">
+                                  <a:scrgbClr r="0" g="0" b="0"/>
+                                </a:effectRef>
+                                <a:fontRef idx="none"/>
+                              </wps:style>
+                              <wps:bodyPr/>
+                            </wps:wsp>
+                            <wps:wsp>
+                              <wps:cNvPr id="4972" name="Shape 4972"/>
+                              <wps:cNvSpPr/>
+                              <wps:spPr>
+                                <a:xfrm>
+                                  <a:off x="180975" y="0"/>
+                                  <a:ext cx="9525" cy="285750"/>
+                                </a:xfrm>
+                                <a:custGeom>
+                                  <a:avLst/>
+                                  <a:gdLst/>
+                                  <a:ahLst/>
+                                  <a:cxnLst/>
+                                  <a:rect l="0" t="0" r="0" b="0"/>
+                                  <a:pathLst>
+                                    <a:path w="9525" h="285750">
+                                      <a:moveTo>
+                                        <a:pt x="0" y="0"/>
+                                      </a:moveTo>
+                                      <a:lnTo>
+                                        <a:pt x="9525" y="0"/>
+                                      </a:lnTo>
+                                      <a:lnTo>
+                                        <a:pt x="9525" y="285750"/>
+                                      </a:lnTo>
+                                      <a:lnTo>
+                                        <a:pt x="0" y="285750"/>
+                                      </a:lnTo>
+                                      <a:lnTo>
+                                        <a:pt x="0" y="0"/>
+                                      </a:lnTo>
+                                    </a:path>
+                                  </a:pathLst>
+                                </a:custGeom>
+                                <a:ln w="0" cap="flat">
+                                  <a:miter lim="127000"/>
+                                </a:ln>
+                              </wps:spPr>
+                              <wps:style>
+                                <a:lnRef idx="0">
+                                  <a:srgbClr val="000000">
+                                    <a:alpha val="0"/>
+                                  </a:srgbClr>
+                                </a:lnRef>
+                                <a:fillRef idx="1">
+                                  <a:srgbClr val="000000"/>
+                                </a:fillRef>
+                                <a:effectRef idx="0">
+                                  <a:scrgbClr r="0" g="0" b="0"/>
+                                </a:effectRef>
+                                <a:fontRef idx="none"/>
+                              </wps:style>
+                              <wps:bodyPr/>
+                            </wps:wsp>
+                            <wps:wsp>
+                              <wps:cNvPr id="4973" name="Shape 4973"/>
+                              <wps:cNvSpPr/>
+                              <wps:spPr>
+                                <a:xfrm>
+                                  <a:off x="209550" y="0"/>
+                                  <a:ext cx="9525" cy="285750"/>
+                                </a:xfrm>
+                                <a:custGeom>
+                                  <a:avLst/>
+                                  <a:gdLst/>
+                                  <a:ahLst/>
+                                  <a:cxnLst/>
+                                  <a:rect l="0" t="0" r="0" b="0"/>
+                                  <a:pathLst>
+                                    <a:path w="9525" h="285750">
+                                      <a:moveTo>
+                                        <a:pt x="0" y="0"/>
+                                      </a:moveTo>
+                                      <a:lnTo>
+                                        <a:pt x="9525" y="0"/>
+                                      </a:lnTo>
+                                      <a:lnTo>
+                                        <a:pt x="9525" y="285750"/>
+                                      </a:lnTo>
+                                      <a:lnTo>
+                                        <a:pt x="0" y="285750"/>
+                                      </a:lnTo>
+                                      <a:lnTo>
+                                        <a:pt x="0" y="0"/>
+                                      </a:lnTo>
+                                    </a:path>
+                                  </a:pathLst>
+                                </a:custGeom>
+                                <a:ln w="0" cap="flat">
+                                  <a:miter lim="127000"/>
+                                </a:ln>
+                              </wps:spPr>
+                              <wps:style>
+                                <a:lnRef idx="0">
+                                  <a:srgbClr val="000000">
+                                    <a:alpha val="0"/>
+                                  </a:srgbClr>
+                                </a:lnRef>
+                                <a:fillRef idx="1">
+                                  <a:srgbClr val="000000"/>
+                                </a:fillRef>
+                                <a:effectRef idx="0">
+                                  <a:scrgbClr r="0" g="0" b="0"/>
+                                </a:effectRef>
+                                <a:fontRef idx="none"/>
+                              </wps:style>
+                              <wps:bodyPr/>
+                            </wps:wsp>
+                            <wps:wsp>
+                              <wps:cNvPr id="4974" name="Shape 4974"/>
+                              <wps:cNvSpPr/>
+                              <wps:spPr>
+                                <a:xfrm>
+                                  <a:off x="228600" y="0"/>
+                                  <a:ext cx="9525" cy="285750"/>
+                                </a:xfrm>
+                                <a:custGeom>
+                                  <a:avLst/>
+                                  <a:gdLst/>
+                                  <a:ahLst/>
+                                  <a:cxnLst/>
+                                  <a:rect l="0" t="0" r="0" b="0"/>
+                                  <a:pathLst>
+                                    <a:path w="9525" h="285750">
+                                      <a:moveTo>
+                                        <a:pt x="0" y="0"/>
+                                      </a:moveTo>
+                                      <a:lnTo>
+                                        <a:pt x="9525" y="0"/>
+                                      </a:lnTo>
+                                      <a:lnTo>
+                                        <a:pt x="9525" y="285750"/>
+                                      </a:lnTo>
+                                      <a:lnTo>
+                                        <a:pt x="0" y="285750"/>
+                                      </a:lnTo>
+                                      <a:lnTo>
+                                        <a:pt x="0" y="0"/>
+                                      </a:lnTo>
+                                    </a:path>
+                                  </a:pathLst>
+                                </a:custGeom>
+                                <a:ln w="0" cap="flat">
+                                  <a:miter lim="127000"/>
+                                </a:ln>
+                              </wps:spPr>
+                              <wps:style>
+                                <a:lnRef idx="0">
+                                  <a:srgbClr val="000000">
+                                    <a:alpha val="0"/>
+                                  </a:srgbClr>
+                                </a:lnRef>
+                                <a:fillRef idx="1">
+                                  <a:srgbClr val="000000"/>
+                                </a:fillRef>
+                                <a:effectRef idx="0">
+                                  <a:scrgbClr r="0" g="0" b="0"/>
+                                </a:effectRef>
+                                <a:fontRef idx="none"/>
+                              </wps:style>
+                              <wps:bodyPr/>
+                            </wps:wsp>
+                            <wps:wsp>
+                              <wps:cNvPr id="4975" name="Shape 4975"/>
+                              <wps:cNvSpPr/>
+                              <wps:spPr>
+                                <a:xfrm>
+                                  <a:off x="257175" y="0"/>
+                                  <a:ext cx="9525" cy="285750"/>
+                                </a:xfrm>
+                                <a:custGeom>
+                                  <a:avLst/>
+                                  <a:gdLst/>
+                                  <a:ahLst/>
+                                  <a:cxnLst/>
+                                  <a:rect l="0" t="0" r="0" b="0"/>
+                                  <a:pathLst>
+                                    <a:path w="9525" h="285750">
+                                      <a:moveTo>
+                                        <a:pt x="0" y="0"/>
+                                      </a:moveTo>
+                                      <a:lnTo>
+                                        <a:pt x="9525" y="0"/>
+                                      </a:lnTo>
+                                      <a:lnTo>
+                                        <a:pt x="9525" y="285750"/>
+                                      </a:lnTo>
+                                      <a:lnTo>
+                                        <a:pt x="0" y="285750"/>
+                                      </a:lnTo>
+                                      <a:lnTo>
+                                        <a:pt x="0" y="0"/>
+                                      </a:lnTo>
+                                    </a:path>
+                                  </a:pathLst>
+                                </a:custGeom>
+                                <a:ln w="0" cap="flat">
+                                  <a:miter lim="127000"/>
+                                </a:ln>
+                              </wps:spPr>
+                              <wps:style>
+                                <a:lnRef idx="0">
+                                  <a:srgbClr val="000000">
+                                    <a:alpha val="0"/>
+                                  </a:srgbClr>
+                                </a:lnRef>
+                                <a:fillRef idx="1">
+                                  <a:srgbClr val="000000"/>
+                                </a:fillRef>
+                                <a:effectRef idx="0">
+                                  <a:scrgbClr r="0" g="0" b="0"/>
+                                </a:effectRef>
+                                <a:fontRef idx="none"/>
+                              </wps:style>
+                              <wps:bodyPr/>
+                            </wps:wsp>
+                            <wps:wsp>
+                              <wps:cNvPr id="4976" name="Shape 4976"/>
+                              <wps:cNvSpPr/>
+                              <wps:spPr>
+                                <a:xfrm>
+                                  <a:off x="276225" y="0"/>
+                                  <a:ext cx="9525" cy="285750"/>
+                                </a:xfrm>
+                                <a:custGeom>
+                                  <a:avLst/>
+                                  <a:gdLst/>
+                                  <a:ahLst/>
+                                  <a:cxnLst/>
+                                  <a:rect l="0" t="0" r="0" b="0"/>
+                                  <a:pathLst>
+                                    <a:path w="9525" h="285750">
+                                      <a:moveTo>
+                                        <a:pt x="0" y="0"/>
+                                      </a:moveTo>
+                                      <a:lnTo>
+                                        <a:pt x="9525" y="0"/>
+                                      </a:lnTo>
+                                      <a:lnTo>
+                                        <a:pt x="9525" y="285750"/>
+                                      </a:lnTo>
+                                      <a:lnTo>
+                                        <a:pt x="0" y="285750"/>
+                                      </a:lnTo>
+                                      <a:lnTo>
+                                        <a:pt x="0" y="0"/>
+                                      </a:lnTo>
+                                    </a:path>
+                                  </a:pathLst>
+                                </a:custGeom>
+                                <a:ln w="0" cap="flat">
+                                  <a:miter lim="127000"/>
+                                </a:ln>
+                              </wps:spPr>
+                              <wps:style>
+                                <a:lnRef idx="0">
+                                  <a:srgbClr val="000000">
+                                    <a:alpha val="0"/>
+                                  </a:srgbClr>
+                                </a:lnRef>
+                                <a:fillRef idx="1">
+                                  <a:srgbClr val="000000"/>
+                                </a:fillRef>
+                                <a:effectRef idx="0">
+                                  <a:scrgbClr r="0" g="0" b="0"/>
+                                </a:effectRef>
+                                <a:fontRef idx="none"/>
+                              </wps:style>
+                              <wps:bodyPr/>
+                            </wps:wsp>
+                            <wps:wsp>
+                              <wps:cNvPr id="4977" name="Shape 4977"/>
+                              <wps:cNvSpPr/>
+                              <wps:spPr>
+                                <a:xfrm>
+                                  <a:off x="285750" y="0"/>
+                                  <a:ext cx="9525" cy="285750"/>
+                                </a:xfrm>
+                                <a:custGeom>
+                                  <a:avLst/>
+                                  <a:gdLst/>
+                                  <a:ahLst/>
+                                  <a:cxnLst/>
+                                  <a:rect l="0" t="0" r="0" b="0"/>
+                                  <a:pathLst>
+                                    <a:path w="9525" h="285750">
+                                      <a:moveTo>
+                                        <a:pt x="0" y="0"/>
+                                      </a:moveTo>
+                                      <a:lnTo>
+                                        <a:pt x="9525" y="0"/>
+                                      </a:lnTo>
+                                      <a:lnTo>
+                                        <a:pt x="9525" y="285750"/>
+                                      </a:lnTo>
+                                      <a:lnTo>
+                                        <a:pt x="0" y="285750"/>
+                                      </a:lnTo>
+                                      <a:lnTo>
+                                        <a:pt x="0" y="0"/>
+                                      </a:lnTo>
+                                    </a:path>
+                                  </a:pathLst>
+                                </a:custGeom>
+                                <a:ln w="0" cap="flat">
+                                  <a:miter lim="127000"/>
+                                </a:ln>
+                              </wps:spPr>
+                              <wps:style>
+                                <a:lnRef idx="0">
+                                  <a:srgbClr val="000000">
+                                    <a:alpha val="0"/>
+                                  </a:srgbClr>
+                                </a:lnRef>
+                                <a:fillRef idx="1">
+                                  <a:srgbClr val="000000"/>
+                                </a:fillRef>
+                                <a:effectRef idx="0">
+                                  <a:scrgbClr r="0" g="0" b="0"/>
+                                </a:effectRef>
+                                <a:fontRef idx="none"/>
+                              </wps:style>
+                              <wps:bodyPr/>
+                            </wps:wsp>
+                            <wps:wsp>
+                              <wps:cNvPr id="4978" name="Shape 4978"/>
+                              <wps:cNvSpPr/>
+                              <wps:spPr>
+                                <a:xfrm>
+                                  <a:off x="304800" y="0"/>
+                                  <a:ext cx="9525" cy="285750"/>
+                                </a:xfrm>
+                                <a:custGeom>
+                                  <a:avLst/>
+                                  <a:gdLst/>
+                                  <a:ahLst/>
+                                  <a:cxnLst/>
+                                  <a:rect l="0" t="0" r="0" b="0"/>
+                                  <a:pathLst>
+                                    <a:path w="9525" h="285750">
+                                      <a:moveTo>
+                                        <a:pt x="0" y="0"/>
+                                      </a:moveTo>
+                                      <a:lnTo>
+                                        <a:pt x="9525" y="0"/>
+                                      </a:lnTo>
+                                      <a:lnTo>
+                                        <a:pt x="9525" y="285750"/>
+                                      </a:lnTo>
+                                      <a:lnTo>
+                                        <a:pt x="0" y="285750"/>
+                                      </a:lnTo>
+                                      <a:lnTo>
+                                        <a:pt x="0" y="0"/>
+                                      </a:lnTo>
+                                    </a:path>
+                                  </a:pathLst>
+                                </a:custGeom>
+                                <a:ln w="0" cap="flat">
+                                  <a:miter lim="127000"/>
+                                </a:ln>
+                              </wps:spPr>
+                              <wps:style>
+                                <a:lnRef idx="0">
+                                  <a:srgbClr val="000000">
+                                    <a:alpha val="0"/>
+                                  </a:srgbClr>
+                                </a:lnRef>
+                                <a:fillRef idx="1">
+                                  <a:srgbClr val="000000"/>
+                                </a:fillRef>
+                                <a:effectRef idx="0">
+                                  <a:scrgbClr r="0" g="0" b="0"/>
+                                </a:effectRef>
+                                <a:fontRef idx="none"/>
+                              </wps:style>
+                              <wps:bodyPr/>
+                            </wps:wsp>
+                            <wps:wsp>
+                              <wps:cNvPr id="4979" name="Shape 4979"/>
+                              <wps:cNvSpPr/>
+                              <wps:spPr>
+                                <a:xfrm>
+                                  <a:off x="314325" y="0"/>
+                                  <a:ext cx="9525" cy="285750"/>
+                                </a:xfrm>
+                                <a:custGeom>
+                                  <a:avLst/>
+                                  <a:gdLst/>
+                                  <a:ahLst/>
+                                  <a:cxnLst/>
+                                  <a:rect l="0" t="0" r="0" b="0"/>
+                                  <a:pathLst>
+                                    <a:path w="9525" h="285750">
+                                      <a:moveTo>
+                                        <a:pt x="0" y="0"/>
+                                      </a:moveTo>
+                                      <a:lnTo>
+                                        <a:pt x="9525" y="0"/>
+                                      </a:lnTo>
+                                      <a:lnTo>
+                                        <a:pt x="9525" y="285750"/>
+                                      </a:lnTo>
+                                      <a:lnTo>
+                                        <a:pt x="0" y="285750"/>
+                                      </a:lnTo>
+                                      <a:lnTo>
+                                        <a:pt x="0" y="0"/>
+                                      </a:lnTo>
+                                    </a:path>
+                                  </a:pathLst>
+                                </a:custGeom>
+                                <a:ln w="0" cap="flat">
+                                  <a:miter lim="127000"/>
+                                </a:ln>
+                              </wps:spPr>
+                              <wps:style>
+                                <a:lnRef idx="0">
+                                  <a:srgbClr val="000000">
+                                    <a:alpha val="0"/>
+                                  </a:srgbClr>
+                                </a:lnRef>
+                                <a:fillRef idx="1">
+                                  <a:srgbClr val="000000"/>
+                                </a:fillRef>
+                                <a:effectRef idx="0">
+                                  <a:scrgbClr r="0" g="0" b="0"/>
+                                </a:effectRef>
+                                <a:fontRef idx="none"/>
+                              </wps:style>
+                              <wps:bodyPr/>
+                            </wps:wsp>
+                            <wps:wsp>
+                              <wps:cNvPr id="4980" name="Shape 4980"/>
+                              <wps:cNvSpPr/>
+                              <wps:spPr>
+                                <a:xfrm>
+                                  <a:off x="342900" y="0"/>
+                                  <a:ext cx="9525" cy="285750"/>
+                                </a:xfrm>
+                                <a:custGeom>
+                                  <a:avLst/>
+                                  <a:gdLst/>
+                                  <a:ahLst/>
+                                  <a:cxnLst/>
+                                  <a:rect l="0" t="0" r="0" b="0"/>
+                                  <a:pathLst>
+                                    <a:path w="9525" h="285750">
+                                      <a:moveTo>
+                                        <a:pt x="0" y="0"/>
+                                      </a:moveTo>
+                                      <a:lnTo>
+                                        <a:pt x="9525" y="0"/>
+                                      </a:lnTo>
+                                      <a:lnTo>
+                                        <a:pt x="9525" y="285750"/>
+                                      </a:lnTo>
+                                      <a:lnTo>
+                                        <a:pt x="0" y="285750"/>
+                                      </a:lnTo>
+                                      <a:lnTo>
+                                        <a:pt x="0" y="0"/>
+                                      </a:lnTo>
+                                    </a:path>
+                                  </a:pathLst>
+                                </a:custGeom>
+                                <a:ln w="0" cap="flat">
+                                  <a:miter lim="127000"/>
+                                </a:ln>
+                              </wps:spPr>
+                              <wps:style>
+                                <a:lnRef idx="0">
+                                  <a:srgbClr val="000000">
+                                    <a:alpha val="0"/>
+                                  </a:srgbClr>
+                                </a:lnRef>
+                                <a:fillRef idx="1">
+                                  <a:srgbClr val="000000"/>
+                                </a:fillRef>
+                                <a:effectRef idx="0">
+                                  <a:scrgbClr r="0" g="0" b="0"/>
+                                </a:effectRef>
+                                <a:fontRef idx="none"/>
+                              </wps:style>
+                              <wps:bodyPr/>
+                            </wps:wsp>
+                            <wps:wsp>
+                              <wps:cNvPr id="4981" name="Shape 4981"/>
+                              <wps:cNvSpPr/>
+                              <wps:spPr>
+                                <a:xfrm>
+                                  <a:off x="352425" y="0"/>
+                                  <a:ext cx="9525" cy="285750"/>
+                                </a:xfrm>
+                                <a:custGeom>
+                                  <a:avLst/>
+                                  <a:gdLst/>
+                                  <a:ahLst/>
+                                  <a:cxnLst/>
+                                  <a:rect l="0" t="0" r="0" b="0"/>
+                                  <a:pathLst>
+                                    <a:path w="9525" h="285750">
+                                      <a:moveTo>
+                                        <a:pt x="0" y="0"/>
+                                      </a:moveTo>
+                                      <a:lnTo>
+                                        <a:pt x="9525" y="0"/>
+                                      </a:lnTo>
+                                      <a:lnTo>
+                                        <a:pt x="9525" y="285750"/>
+                                      </a:lnTo>
+                                      <a:lnTo>
+                                        <a:pt x="0" y="285750"/>
+                                      </a:lnTo>
+                                      <a:lnTo>
+                                        <a:pt x="0" y="0"/>
+                                      </a:lnTo>
+                                    </a:path>
+                                  </a:pathLst>
+                                </a:custGeom>
+                                <a:ln w="0" cap="flat">
+                                  <a:miter lim="127000"/>
+                                </a:ln>
+                              </wps:spPr>
+                              <wps:style>
+                                <a:lnRef idx="0">
+                                  <a:srgbClr val="000000">
+                                    <a:alpha val="0"/>
+                                  </a:srgbClr>
+                                </a:lnRef>
+                                <a:fillRef idx="1">
+                                  <a:srgbClr val="000000"/>
+                                </a:fillRef>
+                                <a:effectRef idx="0">
+                                  <a:scrgbClr r="0" g="0" b="0"/>
+                                </a:effectRef>
+                                <a:fontRef idx="none"/>
+                              </wps:style>
+                              <wps:bodyPr/>
+                            </wps:wsp>
+                            <wps:wsp>
+                              <wps:cNvPr id="4982" name="Shape 4982"/>
+                              <wps:cNvSpPr/>
+                              <wps:spPr>
+                                <a:xfrm>
+                                  <a:off x="371475" y="0"/>
+                                  <a:ext cx="9525" cy="285750"/>
+                                </a:xfrm>
+                                <a:custGeom>
+                                  <a:avLst/>
+                                  <a:gdLst/>
+                                  <a:ahLst/>
+                                  <a:cxnLst/>
+                                  <a:rect l="0" t="0" r="0" b="0"/>
+                                  <a:pathLst>
+                                    <a:path w="9525" h="285750">
+                                      <a:moveTo>
+                                        <a:pt x="0" y="0"/>
+                                      </a:moveTo>
+                                      <a:lnTo>
+                                        <a:pt x="9525" y="0"/>
+                                      </a:lnTo>
+                                      <a:lnTo>
+                                        <a:pt x="9525" y="285750"/>
+                                      </a:lnTo>
+                                      <a:lnTo>
+                                        <a:pt x="0" y="285750"/>
+                                      </a:lnTo>
+                                      <a:lnTo>
+                                        <a:pt x="0" y="0"/>
+                                      </a:lnTo>
+                                    </a:path>
+                                  </a:pathLst>
+                                </a:custGeom>
+                                <a:ln w="0" cap="flat">
+                                  <a:miter lim="127000"/>
+                                </a:ln>
+                              </wps:spPr>
+                              <wps:style>
+                                <a:lnRef idx="0">
+                                  <a:srgbClr val="000000">
+                                    <a:alpha val="0"/>
+                                  </a:srgbClr>
+                                </a:lnRef>
+                                <a:fillRef idx="1">
+                                  <a:srgbClr val="000000"/>
+                                </a:fillRef>
+                                <a:effectRef idx="0">
+                                  <a:scrgbClr r="0" g="0" b="0"/>
+                                </a:effectRef>
+                                <a:fontRef idx="none"/>
+                              </wps:style>
+                              <wps:bodyPr/>
+                            </wps:wsp>
+                            <wps:wsp>
+                              <wps:cNvPr id="4983" name="Shape 4983"/>
+                              <wps:cNvSpPr/>
+                              <wps:spPr>
+                                <a:xfrm>
+                                  <a:off x="400050" y="0"/>
+                                  <a:ext cx="9525" cy="285750"/>
+                                </a:xfrm>
+                                <a:custGeom>
+                                  <a:avLst/>
+                                  <a:gdLst/>
+                                  <a:ahLst/>
+                                  <a:cxnLst/>
+                                  <a:rect l="0" t="0" r="0" b="0"/>
+                                  <a:pathLst>
+                                    <a:path w="9525" h="285750">
+                                      <a:moveTo>
+                                        <a:pt x="0" y="0"/>
+                                      </a:moveTo>
+                                      <a:lnTo>
+                                        <a:pt x="9525" y="0"/>
+                                      </a:lnTo>
+                                      <a:lnTo>
+                                        <a:pt x="9525" y="285750"/>
+                                      </a:lnTo>
+                                      <a:lnTo>
+                                        <a:pt x="0" y="285750"/>
+                                      </a:lnTo>
+                                      <a:lnTo>
+                                        <a:pt x="0" y="0"/>
+                                      </a:lnTo>
+                                    </a:path>
+                                  </a:pathLst>
+                                </a:custGeom>
+                                <a:ln w="0" cap="flat">
+                                  <a:miter lim="127000"/>
+                                </a:ln>
+                              </wps:spPr>
+                              <wps:style>
+                                <a:lnRef idx="0">
+                                  <a:srgbClr val="000000">
+                                    <a:alpha val="0"/>
+                                  </a:srgbClr>
+                                </a:lnRef>
+                                <a:fillRef idx="1">
+                                  <a:srgbClr val="000000"/>
+                                </a:fillRef>
+                                <a:effectRef idx="0">
+                                  <a:scrgbClr r="0" g="0" b="0"/>
+                                </a:effectRef>
+                                <a:fontRef idx="none"/>
+                              </wps:style>
+                              <wps:bodyPr/>
+                            </wps:wsp>
+                            <wps:wsp>
+                              <wps:cNvPr id="4984" name="Shape 4984"/>
+                              <wps:cNvSpPr/>
+                              <wps:spPr>
+                                <a:xfrm>
+                                  <a:off x="419100" y="0"/>
+                                  <a:ext cx="9525" cy="285750"/>
+                                </a:xfrm>
+                                <a:custGeom>
+                                  <a:avLst/>
+                                  <a:gdLst/>
+                                  <a:ahLst/>
+                                  <a:cxnLst/>
+                                  <a:rect l="0" t="0" r="0" b="0"/>
+                                  <a:pathLst>
+                                    <a:path w="9525" h="285750">
+                                      <a:moveTo>
+                                        <a:pt x="0" y="0"/>
+                                      </a:moveTo>
+                                      <a:lnTo>
+                                        <a:pt x="9525" y="0"/>
+                                      </a:lnTo>
+                                      <a:lnTo>
+                                        <a:pt x="9525" y="285750"/>
+                                      </a:lnTo>
+                                      <a:lnTo>
+                                        <a:pt x="0" y="285750"/>
+                                      </a:lnTo>
+                                      <a:lnTo>
+                                        <a:pt x="0" y="0"/>
+                                      </a:lnTo>
+                                    </a:path>
+                                  </a:pathLst>
+                                </a:custGeom>
+                                <a:ln w="0" cap="flat">
+                                  <a:miter lim="127000"/>
+                                </a:ln>
+                              </wps:spPr>
+                              <wps:style>
+                                <a:lnRef idx="0">
+                                  <a:srgbClr val="000000">
+                                    <a:alpha val="0"/>
+                                  </a:srgbClr>
+                                </a:lnRef>
+                                <a:fillRef idx="1">
+                                  <a:srgbClr val="000000"/>
+                                </a:fillRef>
+                                <a:effectRef idx="0">
+                                  <a:scrgbClr r="0" g="0" b="0"/>
+                                </a:effectRef>
+                                <a:fontRef idx="none"/>
+                              </wps:style>
+                              <wps:bodyPr/>
+                            </wps:wsp>
+                            <wps:wsp>
+                              <wps:cNvPr id="4985" name="Shape 4985"/>
+                              <wps:cNvSpPr/>
+                              <wps:spPr>
+                                <a:xfrm>
+                                  <a:off x="438150" y="0"/>
+                                  <a:ext cx="9525" cy="285750"/>
+                                </a:xfrm>
+                                <a:custGeom>
+                                  <a:avLst/>
+                                  <a:gdLst/>
+                                  <a:ahLst/>
+                                  <a:cxnLst/>
+                                  <a:rect l="0" t="0" r="0" b="0"/>
+                                  <a:pathLst>
+                                    <a:path w="9525" h="285750">
+                                      <a:moveTo>
+                                        <a:pt x="0" y="0"/>
+                                      </a:moveTo>
+                                      <a:lnTo>
+                                        <a:pt x="9525" y="0"/>
+                                      </a:lnTo>
+                                      <a:lnTo>
+                                        <a:pt x="9525" y="285750"/>
+                                      </a:lnTo>
+                                      <a:lnTo>
+                                        <a:pt x="0" y="285750"/>
+                                      </a:lnTo>
+                                      <a:lnTo>
+                                        <a:pt x="0" y="0"/>
+                                      </a:lnTo>
+                                    </a:path>
+                                  </a:pathLst>
+                                </a:custGeom>
+                                <a:ln w="0" cap="flat">
+                                  <a:miter lim="127000"/>
+                                </a:ln>
+                              </wps:spPr>
+                              <wps:style>
+                                <a:lnRef idx="0">
+                                  <a:srgbClr val="000000">
+                                    <a:alpha val="0"/>
+                                  </a:srgbClr>
+                                </a:lnRef>
+                                <a:fillRef idx="1">
+                                  <a:srgbClr val="000000"/>
+                                </a:fillRef>
+                                <a:effectRef idx="0">
+                                  <a:scrgbClr r="0" g="0" b="0"/>
+                                </a:effectRef>
+                                <a:fontRef idx="none"/>
+                              </wps:style>
+                              <wps:bodyPr/>
+                            </wps:wsp>
+                            <wps:wsp>
+                              <wps:cNvPr id="4986" name="Shape 4986"/>
+                              <wps:cNvSpPr/>
+                              <wps:spPr>
+                                <a:xfrm>
+                                  <a:off x="457200" y="0"/>
+                                  <a:ext cx="9525" cy="285750"/>
+                                </a:xfrm>
+                                <a:custGeom>
+                                  <a:avLst/>
+                                  <a:gdLst/>
+                                  <a:ahLst/>
+                                  <a:cxnLst/>
+                                  <a:rect l="0" t="0" r="0" b="0"/>
+                                  <a:pathLst>
+                                    <a:path w="9525" h="285750">
+                                      <a:moveTo>
+                                        <a:pt x="0" y="0"/>
+                                      </a:moveTo>
+                                      <a:lnTo>
+                                        <a:pt x="9525" y="0"/>
+                                      </a:lnTo>
+                                      <a:lnTo>
+                                        <a:pt x="9525" y="285750"/>
+                                      </a:lnTo>
+                                      <a:lnTo>
+                                        <a:pt x="0" y="285750"/>
+                                      </a:lnTo>
+                                      <a:lnTo>
+                                        <a:pt x="0" y="0"/>
+                                      </a:lnTo>
+                                    </a:path>
+                                  </a:pathLst>
+                                </a:custGeom>
+                                <a:ln w="0" cap="flat">
+                                  <a:miter lim="127000"/>
+                                </a:ln>
+                              </wps:spPr>
+                              <wps:style>
+                                <a:lnRef idx="0">
+                                  <a:srgbClr val="000000">
+                                    <a:alpha val="0"/>
+                                  </a:srgbClr>
+                                </a:lnRef>
+                                <a:fillRef idx="1">
+                                  <a:srgbClr val="000000"/>
+                                </a:fillRef>
+                                <a:effectRef idx="0">
+                                  <a:scrgbClr r="0" g="0" b="0"/>
+                                </a:effectRef>
+                                <a:fontRef idx="none"/>
+                              </wps:style>
+                              <wps:bodyPr/>
+                            </wps:wsp>
+                            <wps:wsp>
+                              <wps:cNvPr id="4987" name="Shape 4987"/>
+                              <wps:cNvSpPr/>
+                              <wps:spPr>
+                                <a:xfrm>
+                                  <a:off x="466725" y="0"/>
+                                  <a:ext cx="9525" cy="285750"/>
+                                </a:xfrm>
+                                <a:custGeom>
+                                  <a:avLst/>
+                                  <a:gdLst/>
+                                  <a:ahLst/>
+                                  <a:cxnLst/>
+                                  <a:rect l="0" t="0" r="0" b="0"/>
+                                  <a:pathLst>
+                                    <a:path w="9525" h="285750">
+                                      <a:moveTo>
+                                        <a:pt x="0" y="0"/>
+                                      </a:moveTo>
+                                      <a:lnTo>
+                                        <a:pt x="9525" y="0"/>
+                                      </a:lnTo>
+                                      <a:lnTo>
+                                        <a:pt x="9525" y="285750"/>
+                                      </a:lnTo>
+                                      <a:lnTo>
+                                        <a:pt x="0" y="285750"/>
+                                      </a:lnTo>
+                                      <a:lnTo>
+                                        <a:pt x="0" y="0"/>
+                                      </a:lnTo>
+                                    </a:path>
+                                  </a:pathLst>
+                                </a:custGeom>
+                                <a:ln w="0" cap="flat">
+                                  <a:miter lim="127000"/>
+                                </a:ln>
+                              </wps:spPr>
+                              <wps:style>
+                                <a:lnRef idx="0">
+                                  <a:srgbClr val="000000">
+                                    <a:alpha val="0"/>
+                                  </a:srgbClr>
+                                </a:lnRef>
+                                <a:fillRef idx="1">
+                                  <a:srgbClr val="000000"/>
+                                </a:fillRef>
+                                <a:effectRef idx="0">
+                                  <a:scrgbClr r="0" g="0" b="0"/>
+                                </a:effectRef>
+                                <a:fontRef idx="none"/>
+                              </wps:style>
+                              <wps:bodyPr/>
+                            </wps:wsp>
+                            <wps:wsp>
+                              <wps:cNvPr id="4988" name="Shape 4988"/>
+                              <wps:cNvSpPr/>
+                              <wps:spPr>
+                                <a:xfrm>
+                                  <a:off x="495300" y="0"/>
+                                  <a:ext cx="9525" cy="285750"/>
+                                </a:xfrm>
+                                <a:custGeom>
+                                  <a:avLst/>
+                                  <a:gdLst/>
+                                  <a:ahLst/>
+                                  <a:cxnLst/>
+                                  <a:rect l="0" t="0" r="0" b="0"/>
+                                  <a:pathLst>
+                                    <a:path w="9525" h="285750">
+                                      <a:moveTo>
+                                        <a:pt x="0" y="0"/>
+                                      </a:moveTo>
+                                      <a:lnTo>
+                                        <a:pt x="9525" y="0"/>
+                                      </a:lnTo>
+                                      <a:lnTo>
+                                        <a:pt x="9525" y="285750"/>
+                                      </a:lnTo>
+                                      <a:lnTo>
+                                        <a:pt x="0" y="285750"/>
+                                      </a:lnTo>
+                                      <a:lnTo>
+                                        <a:pt x="0" y="0"/>
+                                      </a:lnTo>
+                                    </a:path>
+                                  </a:pathLst>
+                                </a:custGeom>
+                                <a:ln w="0" cap="flat">
+                                  <a:miter lim="127000"/>
+                                </a:ln>
+                              </wps:spPr>
+                              <wps:style>
+                                <a:lnRef idx="0">
+                                  <a:srgbClr val="000000">
+                                    <a:alpha val="0"/>
+                                  </a:srgbClr>
+                                </a:lnRef>
+                                <a:fillRef idx="1">
+                                  <a:srgbClr val="000000"/>
+                                </a:fillRef>
+                                <a:effectRef idx="0">
+                                  <a:scrgbClr r="0" g="0" b="0"/>
+                                </a:effectRef>
+                                <a:fontRef idx="none"/>
+                              </wps:style>
+                              <wps:bodyPr/>
+                            </wps:wsp>
+                            <wps:wsp>
+                              <wps:cNvPr id="4989" name="Shape 4989"/>
+                              <wps:cNvSpPr/>
+                              <wps:spPr>
+                                <a:xfrm>
+                                  <a:off x="514350" y="0"/>
+                                  <a:ext cx="9525" cy="285750"/>
+                                </a:xfrm>
+                                <a:custGeom>
+                                  <a:avLst/>
+                                  <a:gdLst/>
+                                  <a:ahLst/>
+                                  <a:cxnLst/>
+                                  <a:rect l="0" t="0" r="0" b="0"/>
+                                  <a:pathLst>
+                                    <a:path w="9525" h="285750">
+                                      <a:moveTo>
+                                        <a:pt x="0" y="0"/>
+                                      </a:moveTo>
+                                      <a:lnTo>
+                                        <a:pt x="9525" y="0"/>
+                                      </a:lnTo>
+                                      <a:lnTo>
+                                        <a:pt x="9525" y="285750"/>
+                                      </a:lnTo>
+                                      <a:lnTo>
+                                        <a:pt x="0" y="285750"/>
+                                      </a:lnTo>
+                                      <a:lnTo>
+                                        <a:pt x="0" y="0"/>
+                                      </a:lnTo>
+                                    </a:path>
+                                  </a:pathLst>
+                                </a:custGeom>
+                                <a:ln w="0" cap="flat">
+                                  <a:miter lim="127000"/>
+                                </a:ln>
+                              </wps:spPr>
+                              <wps:style>
+                                <a:lnRef idx="0">
+                                  <a:srgbClr val="000000">
+                                    <a:alpha val="0"/>
+                                  </a:srgbClr>
+                                </a:lnRef>
+                                <a:fillRef idx="1">
+                                  <a:srgbClr val="000000"/>
+                                </a:fillRef>
+                                <a:effectRef idx="0">
+                                  <a:scrgbClr r="0" g="0" b="0"/>
+                                </a:effectRef>
+                                <a:fontRef idx="none"/>
+                              </wps:style>
+                              <wps:bodyPr/>
+                            </wps:wsp>
+                            <wps:wsp>
+                              <wps:cNvPr id="4990" name="Shape 4990"/>
+                              <wps:cNvSpPr/>
+                              <wps:spPr>
+                                <a:xfrm>
+                                  <a:off x="523875" y="0"/>
+                                  <a:ext cx="9525" cy="285750"/>
+                                </a:xfrm>
+                                <a:custGeom>
+                                  <a:avLst/>
+                                  <a:gdLst/>
+                                  <a:ahLst/>
+                                  <a:cxnLst/>
+                                  <a:rect l="0" t="0" r="0" b="0"/>
+                                  <a:pathLst>
+                                    <a:path w="9525" h="285750">
+                                      <a:moveTo>
+                                        <a:pt x="0" y="0"/>
+                                      </a:moveTo>
+                                      <a:lnTo>
+                                        <a:pt x="9525" y="0"/>
+                                      </a:lnTo>
+                                      <a:lnTo>
+                                        <a:pt x="9525" y="285750"/>
+                                      </a:lnTo>
+                                      <a:lnTo>
+                                        <a:pt x="0" y="285750"/>
+                                      </a:lnTo>
+                                      <a:lnTo>
+                                        <a:pt x="0" y="0"/>
+                                      </a:lnTo>
+                                    </a:path>
+                                  </a:pathLst>
+                                </a:custGeom>
+                                <a:ln w="0" cap="flat">
+                                  <a:miter lim="127000"/>
+                                </a:ln>
+                              </wps:spPr>
+                              <wps:style>
+                                <a:lnRef idx="0">
+                                  <a:srgbClr val="000000">
+                                    <a:alpha val="0"/>
+                                  </a:srgbClr>
+                                </a:lnRef>
+                                <a:fillRef idx="1">
+                                  <a:srgbClr val="000000"/>
+                                </a:fillRef>
+                                <a:effectRef idx="0">
+                                  <a:scrgbClr r="0" g="0" b="0"/>
+                                </a:effectRef>
+                                <a:fontRef idx="none"/>
+                              </wps:style>
+                              <wps:bodyPr/>
+                            </wps:wsp>
+                            <wps:wsp>
+                              <wps:cNvPr id="4991" name="Shape 4991"/>
+                              <wps:cNvSpPr/>
+                              <wps:spPr>
+                                <a:xfrm>
+                                  <a:off x="552450" y="0"/>
+                                  <a:ext cx="9525" cy="285750"/>
+                                </a:xfrm>
+                                <a:custGeom>
+                                  <a:avLst/>
+                                  <a:gdLst/>
+                                  <a:ahLst/>
+                                  <a:cxnLst/>
+                                  <a:rect l="0" t="0" r="0" b="0"/>
+                                  <a:pathLst>
+                                    <a:path w="9525" h="285750">
+                                      <a:moveTo>
+                                        <a:pt x="0" y="0"/>
+                                      </a:moveTo>
+                                      <a:lnTo>
+                                        <a:pt x="9525" y="0"/>
+                                      </a:lnTo>
+                                      <a:lnTo>
+                                        <a:pt x="9525" y="285750"/>
+                                      </a:lnTo>
+                                      <a:lnTo>
+                                        <a:pt x="0" y="285750"/>
+                                      </a:lnTo>
+                                      <a:lnTo>
+                                        <a:pt x="0" y="0"/>
+                                      </a:lnTo>
+                                    </a:path>
+                                  </a:pathLst>
+                                </a:custGeom>
+                                <a:ln w="0" cap="flat">
+                                  <a:miter lim="127000"/>
+                                </a:ln>
+                              </wps:spPr>
+                              <wps:style>
+                                <a:lnRef idx="0">
+                                  <a:srgbClr val="000000">
+                                    <a:alpha val="0"/>
+                                  </a:srgbClr>
+                                </a:lnRef>
+                                <a:fillRef idx="1">
+                                  <a:srgbClr val="000000"/>
+                                </a:fillRef>
+                                <a:effectRef idx="0">
+                                  <a:scrgbClr r="0" g="0" b="0"/>
+                                </a:effectRef>
+                                <a:fontRef idx="none"/>
+                              </wps:style>
+                              <wps:bodyPr/>
+                            </wps:wsp>
+                            <wps:wsp>
+                              <wps:cNvPr id="4992" name="Shape 4992"/>
+                              <wps:cNvSpPr/>
+                              <wps:spPr>
+                                <a:xfrm>
+                                  <a:off x="571500" y="0"/>
+                                  <a:ext cx="9525" cy="285750"/>
+                                </a:xfrm>
+                                <a:custGeom>
+                                  <a:avLst/>
+                                  <a:gdLst/>
+                                  <a:ahLst/>
+                                  <a:cxnLst/>
+                                  <a:rect l="0" t="0" r="0" b="0"/>
+                                  <a:pathLst>
+                                    <a:path w="9525" h="285750">
+                                      <a:moveTo>
+                                        <a:pt x="0" y="0"/>
+                                      </a:moveTo>
+                                      <a:lnTo>
+                                        <a:pt x="9525" y="0"/>
+                                      </a:lnTo>
+                                      <a:lnTo>
+                                        <a:pt x="9525" y="285750"/>
+                                      </a:lnTo>
+                                      <a:lnTo>
+                                        <a:pt x="0" y="285750"/>
+                                      </a:lnTo>
+                                      <a:lnTo>
+                                        <a:pt x="0" y="0"/>
+                                      </a:lnTo>
+                                    </a:path>
+                                  </a:pathLst>
+                                </a:custGeom>
+                                <a:ln w="0" cap="flat">
+                                  <a:miter lim="127000"/>
+                                </a:ln>
+                              </wps:spPr>
+                              <wps:style>
+                                <a:lnRef idx="0">
+                                  <a:srgbClr val="000000">
+                                    <a:alpha val="0"/>
+                                  </a:srgbClr>
+                                </a:lnRef>
+                                <a:fillRef idx="1">
+                                  <a:srgbClr val="000000"/>
+                                </a:fillRef>
+                                <a:effectRef idx="0">
+                                  <a:scrgbClr r="0" g="0" b="0"/>
+                                </a:effectRef>
+                                <a:fontRef idx="none"/>
+                              </wps:style>
+                              <wps:bodyPr/>
+                            </wps:wsp>
+                            <wps:wsp>
+                              <wps:cNvPr id="4993" name="Shape 4993"/>
+                              <wps:cNvSpPr/>
+                              <wps:spPr>
+                                <a:xfrm>
+                                  <a:off x="581025" y="0"/>
+                                  <a:ext cx="9525" cy="285750"/>
+                                </a:xfrm>
+                                <a:custGeom>
+                                  <a:avLst/>
+                                  <a:gdLst/>
+                                  <a:ahLst/>
+                                  <a:cxnLst/>
+                                  <a:rect l="0" t="0" r="0" b="0"/>
+                                  <a:pathLst>
+                                    <a:path w="9525" h="285750">
+                                      <a:moveTo>
+                                        <a:pt x="0" y="0"/>
+                                      </a:moveTo>
+                                      <a:lnTo>
+                                        <a:pt x="9525" y="0"/>
+                                      </a:lnTo>
+                                      <a:lnTo>
+                                        <a:pt x="9525" y="285750"/>
+                                      </a:lnTo>
+                                      <a:lnTo>
+                                        <a:pt x="0" y="285750"/>
+                                      </a:lnTo>
+                                      <a:lnTo>
+                                        <a:pt x="0" y="0"/>
+                                      </a:lnTo>
+                                    </a:path>
+                                  </a:pathLst>
+                                </a:custGeom>
+                                <a:ln w="0" cap="flat">
+                                  <a:miter lim="127000"/>
+                                </a:ln>
+                              </wps:spPr>
+                              <wps:style>
+                                <a:lnRef idx="0">
+                                  <a:srgbClr val="000000">
+                                    <a:alpha val="0"/>
+                                  </a:srgbClr>
+                                </a:lnRef>
+                                <a:fillRef idx="1">
+                                  <a:srgbClr val="000000"/>
+                                </a:fillRef>
+                                <a:effectRef idx="0">
+                                  <a:scrgbClr r="0" g="0" b="0"/>
+                                </a:effectRef>
+                                <a:fontRef idx="none"/>
+                              </wps:style>
+                              <wps:bodyPr/>
+                            </wps:wsp>
+                            <wps:wsp>
+                              <wps:cNvPr id="4994" name="Shape 4994"/>
+                              <wps:cNvSpPr/>
+                              <wps:spPr>
+                                <a:xfrm>
+                                  <a:off x="600075" y="0"/>
+                                  <a:ext cx="9525" cy="285750"/>
+                                </a:xfrm>
+                                <a:custGeom>
+                                  <a:avLst/>
+                                  <a:gdLst/>
+                                  <a:ahLst/>
+                                  <a:cxnLst/>
+                                  <a:rect l="0" t="0" r="0" b="0"/>
+                                  <a:pathLst>
+                                    <a:path w="9525" h="285750">
+                                      <a:moveTo>
+                                        <a:pt x="0" y="0"/>
+                                      </a:moveTo>
+                                      <a:lnTo>
+                                        <a:pt x="9525" y="0"/>
+                                      </a:lnTo>
+                                      <a:lnTo>
+                                        <a:pt x="9525" y="285750"/>
+                                      </a:lnTo>
+                                      <a:lnTo>
+                                        <a:pt x="0" y="285750"/>
+                                      </a:lnTo>
+                                      <a:lnTo>
+                                        <a:pt x="0" y="0"/>
+                                      </a:lnTo>
+                                    </a:path>
+                                  </a:pathLst>
+                                </a:custGeom>
+                                <a:ln w="0" cap="flat">
+                                  <a:miter lim="127000"/>
+                                </a:ln>
+                              </wps:spPr>
+                              <wps:style>
+                                <a:lnRef idx="0">
+                                  <a:srgbClr val="000000">
+                                    <a:alpha val="0"/>
+                                  </a:srgbClr>
+                                </a:lnRef>
+                                <a:fillRef idx="1">
+                                  <a:srgbClr val="000000"/>
+                                </a:fillRef>
+                                <a:effectRef idx="0">
+                                  <a:scrgbClr r="0" g="0" b="0"/>
+                                </a:effectRef>
+                                <a:fontRef idx="none"/>
+                              </wps:style>
+                              <wps:bodyPr/>
+                            </wps:wsp>
+                            <wps:wsp>
+                              <wps:cNvPr id="4995" name="Shape 4995"/>
+                              <wps:cNvSpPr/>
+                              <wps:spPr>
+                                <a:xfrm>
+                                  <a:off x="619125" y="0"/>
+                                  <a:ext cx="9525" cy="285750"/>
+                                </a:xfrm>
+                                <a:custGeom>
+                                  <a:avLst/>
+                                  <a:gdLst/>
+                                  <a:ahLst/>
+                                  <a:cxnLst/>
+                                  <a:rect l="0" t="0" r="0" b="0"/>
+                                  <a:pathLst>
+                                    <a:path w="9525" h="285750">
+                                      <a:moveTo>
+                                        <a:pt x="0" y="0"/>
+                                      </a:moveTo>
+                                      <a:lnTo>
+                                        <a:pt x="9525" y="0"/>
+                                      </a:lnTo>
+                                      <a:lnTo>
+                                        <a:pt x="9525" y="285750"/>
+                                      </a:lnTo>
+                                      <a:lnTo>
+                                        <a:pt x="0" y="285750"/>
+                                      </a:lnTo>
+                                      <a:lnTo>
+                                        <a:pt x="0" y="0"/>
+                                      </a:lnTo>
+                                    </a:path>
+                                  </a:pathLst>
+                                </a:custGeom>
+                                <a:ln w="0" cap="flat">
+                                  <a:miter lim="127000"/>
+                                </a:ln>
+                              </wps:spPr>
+                              <wps:style>
+                                <a:lnRef idx="0">
+                                  <a:srgbClr val="000000">
+                                    <a:alpha val="0"/>
+                                  </a:srgbClr>
+                                </a:lnRef>
+                                <a:fillRef idx="1">
+                                  <a:srgbClr val="000000"/>
+                                </a:fillRef>
+                                <a:effectRef idx="0">
+                                  <a:scrgbClr r="0" g="0" b="0"/>
+                                </a:effectRef>
+                                <a:fontRef idx="none"/>
+                              </wps:style>
+                              <wps:bodyPr/>
+                            </wps:wsp>
+                            <wps:wsp>
+                              <wps:cNvPr id="4996" name="Shape 4996"/>
+                              <wps:cNvSpPr/>
+                              <wps:spPr>
+                                <a:xfrm>
+                                  <a:off x="647700" y="0"/>
+                                  <a:ext cx="9525" cy="285750"/>
+                                </a:xfrm>
+                                <a:custGeom>
+                                  <a:avLst/>
+                                  <a:gdLst/>
+                                  <a:ahLst/>
+                                  <a:cxnLst/>
+                                  <a:rect l="0" t="0" r="0" b="0"/>
+                                  <a:pathLst>
+                                    <a:path w="9525" h="285750">
+                                      <a:moveTo>
+                                        <a:pt x="0" y="0"/>
+                                      </a:moveTo>
+                                      <a:lnTo>
+                                        <a:pt x="9525" y="0"/>
+                                      </a:lnTo>
+                                      <a:lnTo>
+                                        <a:pt x="9525" y="285750"/>
+                                      </a:lnTo>
+                                      <a:lnTo>
+                                        <a:pt x="0" y="285750"/>
+                                      </a:lnTo>
+                                      <a:lnTo>
+                                        <a:pt x="0" y="0"/>
+                                      </a:lnTo>
+                                    </a:path>
+                                  </a:pathLst>
+                                </a:custGeom>
+                                <a:ln w="0" cap="flat">
+                                  <a:miter lim="127000"/>
+                                </a:ln>
+                              </wps:spPr>
+                              <wps:style>
+                                <a:lnRef idx="0">
+                                  <a:srgbClr val="000000">
+                                    <a:alpha val="0"/>
+                                  </a:srgbClr>
+                                </a:lnRef>
+                                <a:fillRef idx="1">
+                                  <a:srgbClr val="000000"/>
+                                </a:fillRef>
+                                <a:effectRef idx="0">
+                                  <a:scrgbClr r="0" g="0" b="0"/>
+                                </a:effectRef>
+                                <a:fontRef idx="none"/>
+                              </wps:style>
+                              <wps:bodyPr/>
+                            </wps:wsp>
+                            <wps:wsp>
+                              <wps:cNvPr id="4997" name="Shape 4997"/>
+                              <wps:cNvSpPr/>
+                              <wps:spPr>
+                                <a:xfrm>
+                                  <a:off x="676275" y="0"/>
+                                  <a:ext cx="9525" cy="285750"/>
+                                </a:xfrm>
+                                <a:custGeom>
+                                  <a:avLst/>
+                                  <a:gdLst/>
+                                  <a:ahLst/>
+                                  <a:cxnLst/>
+                                  <a:rect l="0" t="0" r="0" b="0"/>
+                                  <a:pathLst>
+                                    <a:path w="9525" h="285750">
+                                      <a:moveTo>
+                                        <a:pt x="0" y="0"/>
+                                      </a:moveTo>
+                                      <a:lnTo>
+                                        <a:pt x="9525" y="0"/>
+                                      </a:lnTo>
+                                      <a:lnTo>
+                                        <a:pt x="9525" y="285750"/>
+                                      </a:lnTo>
+                                      <a:lnTo>
+                                        <a:pt x="0" y="285750"/>
+                                      </a:lnTo>
+                                      <a:lnTo>
+                                        <a:pt x="0" y="0"/>
+                                      </a:lnTo>
+                                    </a:path>
+                                  </a:pathLst>
+                                </a:custGeom>
+                                <a:ln w="0" cap="flat">
+                                  <a:miter lim="127000"/>
+                                </a:ln>
+                              </wps:spPr>
+                              <wps:style>
+                                <a:lnRef idx="0">
+                                  <a:srgbClr val="000000">
+                                    <a:alpha val="0"/>
+                                  </a:srgbClr>
+                                </a:lnRef>
+                                <a:fillRef idx="1">
+                                  <a:srgbClr val="000000"/>
+                                </a:fillRef>
+                                <a:effectRef idx="0">
+                                  <a:scrgbClr r="0" g="0" b="0"/>
+                                </a:effectRef>
+                                <a:fontRef idx="none"/>
+                              </wps:style>
+                              <wps:bodyPr/>
+                            </wps:wsp>
+                            <wps:wsp>
+                              <wps:cNvPr id="4998" name="Shape 4998"/>
+                              <wps:cNvSpPr/>
+                              <wps:spPr>
+                                <a:xfrm>
+                                  <a:off x="685800" y="0"/>
+                                  <a:ext cx="9525" cy="285750"/>
+                                </a:xfrm>
+                                <a:custGeom>
+                                  <a:avLst/>
+                                  <a:gdLst/>
+                                  <a:ahLst/>
+                                  <a:cxnLst/>
+                                  <a:rect l="0" t="0" r="0" b="0"/>
+                                  <a:pathLst>
+                                    <a:path w="9525" h="285750">
+                                      <a:moveTo>
+                                        <a:pt x="0" y="0"/>
+                                      </a:moveTo>
+                                      <a:lnTo>
+                                        <a:pt x="9525" y="0"/>
+                                      </a:lnTo>
+                                      <a:lnTo>
+                                        <a:pt x="9525" y="285750"/>
+                                      </a:lnTo>
+                                      <a:lnTo>
+                                        <a:pt x="0" y="285750"/>
+                                      </a:lnTo>
+                                      <a:lnTo>
+                                        <a:pt x="0" y="0"/>
+                                      </a:lnTo>
+                                    </a:path>
+                                  </a:pathLst>
+                                </a:custGeom>
+                                <a:ln w="0" cap="flat">
+                                  <a:miter lim="127000"/>
+                                </a:ln>
+                              </wps:spPr>
+                              <wps:style>
+                                <a:lnRef idx="0">
+                                  <a:srgbClr val="000000">
+                                    <a:alpha val="0"/>
+                                  </a:srgbClr>
+                                </a:lnRef>
+                                <a:fillRef idx="1">
+                                  <a:srgbClr val="000000"/>
+                                </a:fillRef>
+                                <a:effectRef idx="0">
+                                  <a:scrgbClr r="0" g="0" b="0"/>
+                                </a:effectRef>
+                                <a:fontRef idx="none"/>
+                              </wps:style>
+                              <wps:bodyPr/>
+                            </wps:wsp>
+                            <wps:wsp>
+                              <wps:cNvPr id="4999" name="Shape 4999"/>
+                              <wps:cNvSpPr/>
+                              <wps:spPr>
+                                <a:xfrm>
+                                  <a:off x="704850" y="0"/>
+                                  <a:ext cx="9525" cy="285750"/>
+                                </a:xfrm>
+                                <a:custGeom>
+                                  <a:avLst/>
+                                  <a:gdLst/>
+                                  <a:ahLst/>
+                                  <a:cxnLst/>
+                                  <a:rect l="0" t="0" r="0" b="0"/>
+                                  <a:pathLst>
+                                    <a:path w="9525" h="285750">
+                                      <a:moveTo>
+                                        <a:pt x="0" y="0"/>
+                                      </a:moveTo>
+                                      <a:lnTo>
+                                        <a:pt x="9525" y="0"/>
+                                      </a:lnTo>
+                                      <a:lnTo>
+                                        <a:pt x="9525" y="285750"/>
+                                      </a:lnTo>
+                                      <a:lnTo>
+                                        <a:pt x="0" y="285750"/>
+                                      </a:lnTo>
+                                      <a:lnTo>
+                                        <a:pt x="0" y="0"/>
+                                      </a:lnTo>
+                                    </a:path>
+                                  </a:pathLst>
+                                </a:custGeom>
+                                <a:ln w="0" cap="flat">
+                                  <a:miter lim="127000"/>
+                                </a:ln>
+                              </wps:spPr>
+                              <wps:style>
+                                <a:lnRef idx="0">
+                                  <a:srgbClr val="000000">
+                                    <a:alpha val="0"/>
+                                  </a:srgbClr>
+                                </a:lnRef>
+                                <a:fillRef idx="1">
+                                  <a:srgbClr val="000000"/>
+                                </a:fillRef>
+                                <a:effectRef idx="0">
+                                  <a:scrgbClr r="0" g="0" b="0"/>
+                                </a:effectRef>
+                                <a:fontRef idx="none"/>
+                              </wps:style>
+                              <wps:bodyPr/>
+                            </wps:wsp>
+                            <wps:wsp>
+                              <wps:cNvPr id="5000" name="Shape 5000"/>
+                              <wps:cNvSpPr/>
+                              <wps:spPr>
+                                <a:xfrm>
+                                  <a:off x="714375" y="0"/>
+                                  <a:ext cx="9525" cy="285750"/>
+                                </a:xfrm>
+                                <a:custGeom>
+                                  <a:avLst/>
+                                  <a:gdLst/>
+                                  <a:ahLst/>
+                                  <a:cxnLst/>
+                                  <a:rect l="0" t="0" r="0" b="0"/>
+                                  <a:pathLst>
+                                    <a:path w="9525" h="285750">
+                                      <a:moveTo>
+                                        <a:pt x="0" y="0"/>
+                                      </a:moveTo>
+                                      <a:lnTo>
+                                        <a:pt x="9525" y="0"/>
+                                      </a:lnTo>
+                                      <a:lnTo>
+                                        <a:pt x="9525" y="285750"/>
+                                      </a:lnTo>
+                                      <a:lnTo>
+                                        <a:pt x="0" y="285750"/>
+                                      </a:lnTo>
+                                      <a:lnTo>
+                                        <a:pt x="0" y="0"/>
+                                      </a:lnTo>
+                                    </a:path>
+                                  </a:pathLst>
+                                </a:custGeom>
+                                <a:ln w="0" cap="flat">
+                                  <a:miter lim="127000"/>
+                                </a:ln>
+                              </wps:spPr>
+                              <wps:style>
+                                <a:lnRef idx="0">
+                                  <a:srgbClr val="000000">
+                                    <a:alpha val="0"/>
+                                  </a:srgbClr>
+                                </a:lnRef>
+                                <a:fillRef idx="1">
+                                  <a:srgbClr val="000000"/>
+                                </a:fillRef>
+                                <a:effectRef idx="0">
+                                  <a:scrgbClr r="0" g="0" b="0"/>
+                                </a:effectRef>
+                                <a:fontRef idx="none"/>
+                              </wps:style>
+                              <wps:bodyPr/>
+                            </wps:wsp>
+                            <wps:wsp>
+                              <wps:cNvPr id="5001" name="Shape 5001"/>
+                              <wps:cNvSpPr/>
+                              <wps:spPr>
+                                <a:xfrm>
+                                  <a:off x="733425" y="0"/>
+                                  <a:ext cx="9525" cy="285750"/>
+                                </a:xfrm>
+                                <a:custGeom>
+                                  <a:avLst/>
+                                  <a:gdLst/>
+                                  <a:ahLst/>
+                                  <a:cxnLst/>
+                                  <a:rect l="0" t="0" r="0" b="0"/>
+                                  <a:pathLst>
+                                    <a:path w="9525" h="285750">
+                                      <a:moveTo>
+                                        <a:pt x="0" y="0"/>
+                                      </a:moveTo>
+                                      <a:lnTo>
+                                        <a:pt x="9525" y="0"/>
+                                      </a:lnTo>
+                                      <a:lnTo>
+                                        <a:pt x="9525" y="285750"/>
+                                      </a:lnTo>
+                                      <a:lnTo>
+                                        <a:pt x="0" y="285750"/>
+                                      </a:lnTo>
+                                      <a:lnTo>
+                                        <a:pt x="0" y="0"/>
+                                      </a:lnTo>
+                                    </a:path>
+                                  </a:pathLst>
+                                </a:custGeom>
+                                <a:ln w="0" cap="flat">
+                                  <a:miter lim="127000"/>
+                                </a:ln>
+                              </wps:spPr>
+                              <wps:style>
+                                <a:lnRef idx="0">
+                                  <a:srgbClr val="000000">
+                                    <a:alpha val="0"/>
+                                  </a:srgbClr>
+                                </a:lnRef>
+                                <a:fillRef idx="1">
+                                  <a:srgbClr val="000000"/>
+                                </a:fillRef>
+                                <a:effectRef idx="0">
+                                  <a:scrgbClr r="0" g="0" b="0"/>
+                                </a:effectRef>
+                                <a:fontRef idx="none"/>
+                              </wps:style>
+                              <wps:bodyPr/>
+                            </wps:wsp>
+                          </wpg:wgp>
+                        </a:graphicData>
+                      </a:graphic>
+                    </wp:inline>
+                  </w:drawing>
+                </mc:Choice>
+                <mc:Fallback xmlns:a="http://schemas.openxmlformats.org/drawingml/2006/main">
+                  <w:pict>
+                    <v:group id="Group 2506" style="width:58.5pt;height:22.5pt;mso-position-horizontal-relative:char;mso-position-vertical-relative:line" coordsize="7429,2857">
+                      <v:shape id="Shape 5002" style="position:absolute;width:95;height:2857;left:0;top:0;" coordsize="9525,285750" path="m0,0l9525,0l9525,285750l0,285750l0,0">
+                        <v:stroke weight="0pt" endcap="flat" joinstyle="miter" miterlimit="10" on="false" color="#000000" opacity="0"/>
+                        <v:fill on="true" color="#000000"/>
+                      </v:shape>
+                      <v:shape id="Shape 5003" style="position:absolute;width:95;height:2857;left:190;top:0;" coordsize="9525,285750" path="m0,0l9525,0l9525,285750l0,285750l0,0">
+                        <v:stroke weight="0pt" endcap="flat" joinstyle="miter" miterlimit="10" on="false" color="#000000" opacity="0"/>
+                        <v:fill on="true" color="#000000"/>
+                      </v:shape>
+                      <v:shape id="Shape 5004" style="position:absolute;width:95;height:2857;left:381;top:0;" coordsize="9525,285750" path="m0,0l9525,0l9525,285750l0,285750l0,0">
+                        <v:stroke weight="0pt" endcap="flat" joinstyle="miter" miterlimit="10" on="false" color="#000000" opacity="0"/>
+                        <v:fill on="true" color="#000000"/>
+                      </v:shape>
+                      <v:shape id="Shape 5005" style="position:absolute;width:95;height:2857;left:571;top:0;" coordsize="9525,285750" path="m0,0l9525,0l9525,285750l0,285750l0,0">
+                        <v:stroke weight="0pt" endcap="flat" joinstyle="miter" miterlimit="10" on="false" color="#000000" opacity="0"/>
+                        <v:fill on="true" color="#000000"/>
+                      </v:shape>
+                      <v:shape id="Shape 5006" style="position:absolute;width:95;height:2857;left:857;top:0;" coordsize="9525,285750" path="m0,0l9525,0l9525,285750l0,285750l0,0">
+                        <v:stroke weight="0pt" endcap="flat" joinstyle="miter" miterlimit="10" on="false" color="#000000" opacity="0"/>
+                        <v:fill on="true" color="#000000"/>
+                      </v:shape>
+                      <v:shape id="Shape 5007" style="position:absolute;width:95;height:2857;left:952;top:0;" coordsize="9525,285750" path="m0,0l9525,0l9525,285750l0,285750l0,0">
+                        <v:stroke weight="0pt" endcap="flat" joinstyle="miter" miterlimit="10" on="false" color="#000000" opacity="0"/>
+                        <v:fill on="true" color="#000000"/>
+                      </v:shape>
+                      <v:shape id="Shape 5008" style="position:absolute;width:95;height:2857;left:1143;top:0;" coordsize="9525,285750" path="m0,0l9525,0l9525,285750l0,285750l0,0">
+                        <v:stroke weight="0pt" endcap="flat" joinstyle="miter" miterlimit="10" on="false" color="#000000" opacity="0"/>
+                        <v:fill on="true" color="#000000"/>
+                      </v:shape>
+                      <v:shape id="Shape 5009" style="position:absolute;width:95;height:2857;left:1238;top:0;" coordsize="9525,285750" path="m0,0l9525,0l9525,285750l0,285750l0,0">
+                        <v:stroke weight="0pt" endcap="flat" joinstyle="miter" miterlimit="10" on="false" color="#000000" opacity="0"/>
+                        <v:fill on="true" color="#000000"/>
+                      </v:shape>
+                      <v:shape id="Shape 5010" style="position:absolute;width:95;height:2857;left:1428;top:0;" coordsize="9525,285750" path="m0,0l9525,0l9525,285750l0,285750l0,0">
+                        <v:stroke weight="0pt" endcap="flat" joinstyle="miter" miterlimit="10" on="false" color="#000000" opacity="0"/>
+                        <v:fill on="true" color="#000000"/>
+                      </v:shape>
+                      <v:shape id="Shape 5011" style="position:absolute;width:95;height:2857;left:1714;top:0;" coordsize="9525,285750" path="m0,0l9525,0l9525,285750l0,285750l0,0">
+                        <v:stroke weight="0pt" endcap="flat" joinstyle="miter" miterlimit="10" on="false" color="#000000" opacity="0"/>
+                        <v:fill on="true" color="#000000"/>
+                      </v:shape>
+                      <v:shape id="Shape 5012" style="position:absolute;width:95;height:2857;left:1809;top:0;" coordsize="9525,285750" path="m0,0l9525,0l9525,285750l0,285750l0,0">
+                        <v:stroke weight="0pt" endcap="flat" joinstyle="miter" miterlimit="10" on="false" color="#000000" opacity="0"/>
+                        <v:fill on="true" color="#000000"/>
+                      </v:shape>
+                      <v:shape id="Shape 5013" style="position:absolute;width:95;height:2857;left:2095;top:0;" coordsize="9525,285750" path="m0,0l9525,0l9525,285750l0,285750l0,0">
+                        <v:stroke weight="0pt" endcap="flat" joinstyle="miter" miterlimit="10" on="false" color="#000000" opacity="0"/>
+                        <v:fill on="true" color="#000000"/>
+                      </v:shape>
+                      <v:shape id="Shape 5014" style="position:absolute;width:95;height:2857;left:2286;top:0;" coordsize="9525,285750" path="m0,0l9525,0l9525,285750l0,285750l0,0">
+                        <v:stroke weight="0pt" endcap="flat" joinstyle="miter" miterlimit="10" on="false" color="#000000" opacity="0"/>
+                        <v:fill on="true" color="#000000"/>
+                      </v:shape>
+                      <v:shape id="Shape 5015" style="position:absolute;width:95;height:2857;left:2571;top:0;" coordsize="9525,285750" path="m0,0l9525,0l9525,285750l0,285750l0,0">
+                        <v:stroke weight="0pt" endcap="flat" joinstyle="miter" miterlimit="10" on="false" color="#000000" opacity="0"/>
+                        <v:fill on="true" color="#000000"/>
+                      </v:shape>
+                      <v:shape id="Shape 5016" style="position:absolute;width:95;height:2857;left:2762;top:0;" coordsize="9525,285750" path="m0,0l9525,0l9525,285750l0,285750l0,0">
+                        <v:stroke weight="0pt" endcap="flat" joinstyle="miter" miterlimit="10" on="false" color="#000000" opacity="0"/>
+                        <v:fill on="true" color="#000000"/>
+                      </v:shape>
+                      <v:shape id="Shape 5017" style="position:absolute;width:95;height:2857;left:2857;top:0;" coordsize="9525,285750" path="m0,0l9525,0l9525,285750l0,285750l0,0">
+                        <v:stroke weight="0pt" endcap="flat" joinstyle="miter" miterlimit="10" on="false" color="#000000" opacity="0"/>
+                        <v:fill on="true" color="#000000"/>
+                      </v:shape>
+                      <v:shape id="Shape 5018" style="position:absolute;width:95;height:2857;left:3048;top:0;" coordsize="9525,285750" path="m0,0l9525,0l9525,285750l0,285750l0,0">
+                        <v:stroke weight="0pt" endcap="flat" joinstyle="miter" miterlimit="10" on="false" color="#000000" opacity="0"/>
+                        <v:fill on="true" color="#000000"/>
+                      </v:shape>
+                      <v:shape id="Shape 5019" style="position:absolute;width:95;height:2857;left:3143;top:0;" coordsize="9525,285750" path="m0,0l9525,0l9525,285750l0,285750l0,0">
+                        <v:stroke weight="0pt" endcap="flat" joinstyle="miter" miterlimit="10" on="false" color="#000000" opacity="0"/>
+                        <v:fill on="true" color="#000000"/>
+                      </v:shape>
+                      <v:shape id="Shape 5020" style="position:absolute;width:95;height:2857;left:3429;top:0;" coordsize="9525,285750" path="m0,0l9525,0l9525,285750l0,285750l0,0">
+                        <v:stroke weight="0pt" endcap="flat" joinstyle="miter" miterlimit="10" on="false" color="#000000" opacity="0"/>
+                        <v:fill on="true" color="#000000"/>
+                      </v:shape>
+                      <v:shape id="Shape 5021" style="position:absolute;width:95;height:2857;left:3524;top:0;" coordsize="9525,285750" path="m0,0l9525,0l9525,285750l0,285750l0,0">
+                        <v:stroke weight="0pt" endcap="flat" joinstyle="miter" miterlimit="10" on="false" color="#000000" opacity="0"/>
+                        <v:fill on="true" color="#000000"/>
+                      </v:shape>
+                      <v:shape id="Shape 5022" style="position:absolute;width:95;height:2857;left:3714;top:0;" coordsize="9525,285750" path="m0,0l9525,0l9525,285750l0,285750l0,0">
+                        <v:stroke weight="0pt" endcap="flat" joinstyle="miter" miterlimit="10" on="false" color="#000000" opacity="0"/>
+                        <v:fill on="true" color="#000000"/>
+                      </v:shape>
+                      <v:shape id="Shape 5023" style="position:absolute;width:95;height:2857;left:4000;top:0;" coordsize="9525,285750" path="m0,0l9525,0l9525,285750l0,285750l0,0">
+                        <v:stroke weight="0pt" endcap="flat" joinstyle="miter" miterlimit="10" on="false" color="#000000" opacity="0"/>
+                        <v:fill on="true" color="#000000"/>
+                      </v:shape>
+                      <v:shape id="Shape 5024" style="position:absolute;width:95;height:2857;left:4191;top:0;" coordsize="9525,285750" path="m0,0l9525,0l9525,285750l0,285750l0,0">
+                        <v:stroke weight="0pt" endcap="flat" joinstyle="miter" miterlimit="10" on="false" color="#000000" opacity="0"/>
+                        <v:fill on="true" color="#000000"/>
+                      </v:shape>
+                      <v:shape id="Shape 5025" style="position:absolute;width:95;height:2857;left:4381;top:0;" coordsize="9525,285750" path="m0,0l9525,0l9525,285750l0,285750l0,0">
+                        <v:stroke weight="0pt" endcap="flat" joinstyle="miter" miterlimit="10" on="false" color="#000000" opacity="0"/>
+                        <v:fill on="true" color="#000000"/>
+                      </v:shape>
+                      <v:shape id="Shape 5026" style="position:absolute;width:95;height:2857;left:4572;top:0;" coordsize="9525,285750" path="m0,0l9525,0l9525,285750l0,285750l0,0">
+                        <v:stroke weight="0pt" endcap="flat" joinstyle="miter" miterlimit="10" on="false" color="#000000" opacity="0"/>
+                        <v:fill on="true" color="#000000"/>
+                      </v:shape>
+                      <v:shape id="Shape 5027" style="position:absolute;width:95;height:2857;left:4667;top:0;" coordsize="9525,285750" path="m0,0l9525,0l9525,285750l0,285750l0,0">
+                        <v:stroke weight="0pt" endcap="flat" joinstyle="miter" miterlimit="10" on="false" color="#000000" opacity="0"/>
+                        <v:fill on="true" color="#000000"/>
+                      </v:shape>
+                      <v:shape id="Shape 5028" style="position:absolute;width:95;height:2857;left:4953;top:0;" coordsize="9525,285750" path="m0,0l9525,0l9525,285750l0,285750l0,0">
+                        <v:stroke weight="0pt" endcap="flat" joinstyle="miter" miterlimit="10" on="false" color="#000000" opacity="0"/>
+                        <v:fill on="true" color="#000000"/>
+                      </v:shape>
+                      <v:shape id="Shape 5029" style="position:absolute;width:95;height:2857;left:5143;top:0;" coordsize="9525,285750" path="m0,0l9525,0l9525,285750l0,285750l0,0">
+                        <v:stroke weight="0pt" endcap="flat" joinstyle="miter" miterlimit="10" on="false" color="#000000" opacity="0"/>
+                        <v:fill on="true" color="#000000"/>
+                      </v:shape>
+                      <v:shape id="Shape 5030" style="position:absolute;width:95;height:2857;left:5238;top:0;" coordsize="9525,285750" path="m0,0l9525,0l9525,285750l0,285750l0,0">
+                        <v:stroke weight="0pt" endcap="flat" joinstyle="miter" miterlimit="10" on="false" color="#000000" opacity="0"/>
+                        <v:fill on="true" color="#000000"/>
+                      </v:shape>
+                      <v:shape id="Shape 5031" style="position:absolute;width:95;height:2857;left:5524;top:0;" coordsize="9525,285750" path="m0,0l9525,0l9525,285750l0,285750l0,0">
+                        <v:stroke weight="0pt" endcap="flat" joinstyle="miter" miterlimit="10" on="false" color="#000000" opacity="0"/>
+                        <v:fill on="true" color="#000000"/>
+                      </v:shape>
+                      <v:shape id="Shape 5032" style="position:absolute;width:95;height:2857;left:5715;top:0;" coordsize="9525,285750" path="m0,0l9525,0l9525,285750l0,285750l0,0">
+                        <v:stroke weight="0pt" endcap="flat" joinstyle="miter" miterlimit="10" on="false" color="#000000" opacity="0"/>
+                        <v:fill on="true" color="#000000"/>
+                      </v:shape>
+                      <v:shape id="Shape 5033" style="position:absolute;width:95;height:2857;left:5810;top:0;" coordsize="9525,285750" path="m0,0l9525,0l9525,285750l0,285750l0,0">
+                        <v:stroke weight="0pt" endcap="flat" joinstyle="miter" miterlimit="10" on="false" color="#000000" opacity="0"/>
+                        <v:fill on="true" color="#000000"/>
+                      </v:shape>
+                      <v:shape id="Shape 5034" style="position:absolute;width:95;height:2857;left:6000;top:0;" coordsize="9525,285750" path="m0,0l9525,0l9525,285750l0,285750l0,0">
+                        <v:stroke weight="0pt" endcap="flat" joinstyle="miter" miterlimit="10" on="false" color="#000000" opacity="0"/>
+                        <v:fill on="true" color="#000000"/>
+                      </v:shape>
+                      <v:shape id="Shape 5035" style="position:absolute;width:95;height:2857;left:6191;top:0;" coordsize="9525,285750" path="m0,0l9525,0l9525,285750l0,285750l0,0">
+                        <v:stroke weight="0pt" endcap="flat" joinstyle="miter" miterlimit="10" on="false" color="#000000" opacity="0"/>
+                        <v:fill on="true" color="#000000"/>
+                      </v:shape>
+                      <v:shape id="Shape 5036" style="position:absolute;width:95;height:2857;left:6477;top:0;" coordsize="9525,285750" path="m0,0l9525,0l9525,285750l0,285750l0,0">
+                        <v:stroke weight="0pt" endcap="flat" joinstyle="miter" miterlimit="10" on="false" color="#000000" opacity="0"/>
+                        <v:fill on="true" color="#000000"/>
+                      </v:shape>
+                      <v:shape id="Shape 5037" style="position:absolute;width:95;height:2857;left:6762;top:0;" coordsize="9525,285750" path="m0,0l9525,0l9525,285750l0,285750l0,0">
+                        <v:stroke weight="0pt" endcap="flat" joinstyle="miter" miterlimit="10" on="false" color="#000000" opacity="0"/>
+                        <v:fill on="true" color="#000000"/>
+                      </v:shape>
+                      <v:shape id="Shape 5038" style="position:absolute;width:95;height:2857;left:6858;top:0;" coordsize="9525,285750" path="m0,0l9525,0l9525,285750l0,285750l0,0">
+                        <v:stroke weight="0pt" endcap="flat" joinstyle="miter" miterlimit="10" on="false" color="#000000" opacity="0"/>
+                        <v:fill on="true" color="#000000"/>
+                      </v:shape>
+                      <v:shape id="Shape 5039" style="position:absolute;width:95;height:2857;left:7048;top:0;" coordsize="9525,285750" path="m0,0l9525,0l9525,285750l0,285750l0,0">
+                        <v:stroke weight="0pt" endcap="flat" joinstyle="miter" miterlimit="10" on="false" color="#000000" opacity="0"/>
+                        <v:fill on="true" color="#000000"/>
+                      </v:shape>
+                      <v:shape id="Shape 5040" style="position:absolute;width:95;height:2857;left:7143;top:0;" coordsize="9525,285750" path="m0,0l9525,0l9525,285750l0,285750l0,0">
+                        <v:stroke weight="0pt" endcap="flat" joinstyle="miter" miterlimit="10" on="false" color="#000000" opacity="0"/>
+                        <v:fill on="true" color="#000000"/>
+                      </v:shape>
+                      <v:shape id="Shape 5041" style="position:absolute;width:95;height:2857;left:7334;top:0;" coordsize="9525,285750" path="m0,0l9525,0l9525,285750l0,285750l0,0">
+                        <v:stroke weight="0pt" endcap="flat" joinstyle="miter" miterlimit="10" on="false" color="#000000" opacity="0"/>
+                        <v:fill on="true" color="#000000"/>
+                      </v:shape>
+                    </v:group>
+                  </w:pict>
+                </mc:Fallback>
+              </mc:AlternateContent>
+            </w:r>
+            <w:r>
+              <w:rPr>
+                <w:rFonts w:ascii="Arial" w:hAnsi="Arial"/>
+                <w:b w:val="0"/>
+                <w:color w:val="000000"/>
+              </w:rPr>
               <w:t>0215359910</w:t>
             </w:r>
           </w:p>
@@ -2196,12 +4636,10 @@
       </w:pPr>
       <w:r>
         <w:rPr>
-          <w:rFonts w:ascii="Arial" w:eastAsia="Arial" w:hAnsi="Arial" w:cs="Arial"/>
+          <w:rFonts w:ascii="Arial" w:hAnsi="Arial"/>
           <w:b/>
-          <w:bCs/>
-          <w:sz w:val="24"/>
-          <w:u w:val="single" w:color="000000"/>
-          <w:rtl/>
+          <w:color w:val="00008B"/>
+          <w:u w:val="single"/>
         </w:rPr>
         <w:t>אישור מחלה</w:t>
       </w:r>
@@ -2214,11 +4652,11 @@
       </w:pPr>
       <w:r>
         <w:rPr>
-          <w:rFonts w:ascii="Segoe UI" w:eastAsia="Segoe UI" w:hAnsi="Segoe UI" w:cs="Segoe UI"/>
-          <w:color w:val="FFFFFF"/>
-          <w:sz w:val="2"/>
+          <w:rFonts w:ascii="Arial" w:hAnsi="Arial"/>
+          <w:b w:val="0"/>
+          <w:color w:val="000000"/>
         </w:rPr>
-        <w:t xml:space="preserve">ET4D-CV5-ZKC-6R82-449XH </w:t>
+        <w:t>ET4D-CV5-ZKC-6R82-449XH</w:t>
       </w:r>
     </w:p>
     <w:p>
@@ -2254,172 +4692,63 @@
       </w:pPr>
       <w:r>
         <w:rPr>
-          <w:rFonts w:ascii="Arial" w:eastAsia="Arial" w:hAnsi="Arial" w:cs="Arial"/>
+          <w:rFonts w:ascii="Arial" w:hAnsi="Arial"/>
           <w:b/>
-          <w:bCs/>
           <w:color w:val="00008B"/>
-          <w:sz w:val="20"/>
-          <w:szCs w:val="20"/>
-          <w:rtl/>
         </w:rPr>
         <w:t>אינו/ה מסוגל/ת לעבוד מיום:</w:t>
       </w:r>
       <w:r>
         <w:rPr>
-          <w:rFonts w:ascii="Arial" w:eastAsia="Arial" w:hAnsi="Arial" w:cs="Arial"/>
-          <w:sz w:val="20"/>
-          <w:szCs w:val="20"/>
-          <w:rtl/>
+          <w:rFonts w:ascii="Arial" w:hAnsi="Arial"/>
+          <w:b w:val="0"/>
+          <w:color w:val="000000"/>
         </w:rPr>
+        <w:tab/>
+        <w:t>24/08/2026</w:t>
         <w:tab/>
       </w:r>
       <w:r>
         <w:rPr>
-          <w:rFonts w:ascii="Arial" w:eastAsia="Arial" w:hAnsi="Arial" w:cs="Arial"/>
-          <w:sz w:val="20"/>
-          <w:szCs w:val="20"/>
+          <w:rFonts w:ascii="Arial" w:hAnsi="Arial"/>
+          <w:b/>
+          <w:color w:val="00008B"/>
         </w:rPr>
-        <w:t>24</w:t>
-      </w:r>
-      <w:r>
-        <w:rPr>
-          <w:rFonts w:ascii="Arial" w:eastAsia="Arial" w:hAnsi="Arial" w:cs="Arial"/>
-          <w:sz w:val="20"/>
-          <w:szCs w:val="20"/>
-          <w:rtl/>
-        </w:rPr>
-        <w:t>/</w:t>
-      </w:r>
-      <w:r>
-        <w:rPr>
-          <w:rFonts w:ascii="Arial" w:eastAsia="Arial" w:hAnsi="Arial" w:cs="Arial"/>
-          <w:sz w:val="20"/>
-          <w:szCs w:val="20"/>
-        </w:rPr>
-        <w:t>08</w:t>
-      </w:r>
-      <w:r>
-        <w:rPr>
-          <w:rFonts w:ascii="Arial" w:eastAsia="Arial" w:hAnsi="Arial" w:cs="Arial"/>
-          <w:sz w:val="20"/>
-          <w:szCs w:val="20"/>
-          <w:rtl/>
-        </w:rPr>
-        <w:t>/</w:t>
-      </w:r>
-      <w:r>
-        <w:rPr>
-          <w:rFonts w:ascii="Arial" w:eastAsia="Arial" w:hAnsi="Arial" w:cs="Arial"/>
-          <w:sz w:val="20"/>
-          <w:szCs w:val="20"/>
-        </w:rPr>
-        <w:t>2026</w:t>
-      </w:r>
-      <w:r>
-        <w:rPr>
-          <w:rFonts w:ascii="Arial" w:eastAsia="Arial" w:hAnsi="Arial" w:cs="Arial"/>
-          <w:b/>
-          <w:bCs/>
-          <w:color w:val="00008B"/>
-          <w:sz w:val="20"/>
-          <w:szCs w:val="20"/>
-          <w:rtl/>
-        </w:rPr>
-        <w:tab/>
         <w:t>עד יום:</w:t>
       </w:r>
       <w:r>
         <w:rPr>
-          <w:rFonts w:ascii="Arial" w:eastAsia="Arial" w:hAnsi="Arial" w:cs="Arial"/>
-          <w:sz w:val="20"/>
-          <w:szCs w:val="20"/>
-          <w:rtl/>
+          <w:rFonts w:ascii="Arial" w:hAnsi="Arial"/>
+          <w:b w:val="0"/>
+          <w:color w:val="000000"/>
         </w:rPr>
+        <w:tab/>
+        <w:t>27/08/2026</w:t>
         <w:tab/>
       </w:r>
       <w:r>
         <w:rPr>
-          <w:rFonts w:ascii="Arial" w:eastAsia="Arial" w:hAnsi="Arial" w:cs="Arial"/>
-          <w:sz w:val="20"/>
-          <w:szCs w:val="20"/>
+          <w:rFonts w:ascii="Arial" w:hAnsi="Arial"/>
+          <w:b/>
+          <w:color w:val="00008B"/>
         </w:rPr>
-        <w:t>27</w:t>
+        <w:t xml:space="preserve">סה"כ: </w:t>
       </w:r>
       <w:r>
         <w:rPr>
-          <w:rFonts w:ascii="Arial" w:eastAsia="Arial" w:hAnsi="Arial" w:cs="Arial"/>
-          <w:sz w:val="20"/>
-          <w:szCs w:val="20"/>
-          <w:rtl/>
+          <w:rFonts w:ascii="Arial" w:hAnsi="Arial"/>
+          <w:b w:val="0"/>
+          <w:color w:val="000000"/>
         </w:rPr>
-        <w:t>/</w:t>
+        <w:t>4</w:t>
+        <w:tab/>
       </w:r>
       <w:r>
         <w:rPr>
-          <w:rFonts w:ascii="Arial" w:eastAsia="Arial" w:hAnsi="Arial" w:cs="Arial"/>
-          <w:sz w:val="20"/>
-          <w:szCs w:val="20"/>
+          <w:rFonts w:ascii="Arial" w:hAnsi="Arial"/>
+          <w:b/>
+          <w:color w:val="00008B"/>
         </w:rPr>
-        <w:t>08</w:t>
-      </w:r>
-      <w:r>
-        <w:rPr>
-          <w:rFonts w:ascii="Arial" w:eastAsia="Arial" w:hAnsi="Arial" w:cs="Arial"/>
-          <w:sz w:val="20"/>
-          <w:szCs w:val="20"/>
-          <w:rtl/>
-        </w:rPr>
-        <w:t>/</w:t>
-      </w:r>
-      <w:r>
-        <w:rPr>
-          <w:rFonts w:ascii="Arial" w:eastAsia="Arial" w:hAnsi="Arial" w:cs="Arial"/>
-          <w:sz w:val="20"/>
-          <w:szCs w:val="20"/>
-        </w:rPr>
-        <w:t>2026</w:t>
-      </w:r>
-      <w:r>
-        <w:rPr>
-          <w:rFonts w:ascii="Arial" w:eastAsia="Arial" w:hAnsi="Arial" w:cs="Arial"/>
-          <w:b/>
-          <w:bCs/>
-          <w:color w:val="00008B"/>
-          <w:sz w:val="20"/>
-          <w:szCs w:val="20"/>
-          <w:rtl/>
-        </w:rPr>
-        <w:tab/>
-        <w:t>סה"כ:</w:t>
-      </w:r>
-      <w:r>
-        <w:rPr>
-          <w:rFonts w:ascii="Arial" w:eastAsia="Arial" w:hAnsi="Arial" w:cs="Arial"/>
-          <w:sz w:val="20"/>
-          <w:szCs w:val="20"/>
-          <w:rtl/>
-        </w:rPr>
-        <w:t xml:space="preserve"> </w:t>
-      </w:r>
-      <w:r>
-        <w:rPr>
-          <w:rFonts w:ascii="Arial" w:eastAsia="Arial" w:hAnsi="Arial" w:cs="Arial"/>
-          <w:sz w:val="20"/>
-          <w:szCs w:val="20"/>
-        </w:rPr>
-        <w:t>4</w:t>
-      </w:r>
-      <w:r>
-        <w:rPr>
-          <w:rFonts w:ascii="Arial" w:eastAsia="Arial" w:hAnsi="Arial" w:cs="Arial"/>
-          <w:b/>
-          <w:bCs/>
-          <w:color w:val="00008B"/>
-          <w:sz w:val="20"/>
-          <w:szCs w:val="20"/>
-          <w:rtl/>
-        </w:rPr>
-        <w:tab/>
         <w:t>ימים.</w:t>
       </w:r>
     </w:p>
@@ -2592,34 +4921,34 @@
       </w:pPr>
       <w:r>
         <w:rPr>
-          <w:szCs w:val="22"/>
-          <w:rtl/>
+          <w:rFonts w:ascii="Arial" w:hAnsi="Arial"/>
+          <w:b w:val="0"/>
+          <w:color w:val="000000"/>
         </w:rPr>
         <w:tab/>
       </w:r>
       <w:r>
         <w:rPr>
-          <w:rFonts w:ascii="Arial" w:eastAsia="Arial" w:hAnsi="Arial" w:cs="Arial"/>
+          <w:rFonts w:ascii="Arial" w:hAnsi="Arial"/>
           <w:b/>
-          <w:bCs/>
           <w:color w:val="00008B"/>
-          <w:sz w:val="20"/>
-          <w:szCs w:val="20"/>
-          <w:rtl/>
         </w:rPr>
         <w:t>תאריך</w:t>
       </w:r>
       <w:r>
         <w:rPr>
-          <w:rFonts w:ascii="Arial" w:eastAsia="Arial" w:hAnsi="Arial" w:cs="Arial"/>
-          <w:b/>
-          <w:bCs/>
-          <w:color w:val="00008B"/>
-          <w:sz w:val="20"/>
-          <w:szCs w:val="20"/>
-          <w:rtl/>
+          <w:rFonts w:ascii="Arial" w:hAnsi="Arial"/>
+          <w:b w:val="0"/>
+          <w:color w:val="000000"/>
         </w:rPr>
         <w:tab/>
+      </w:r>
+      <w:r>
+        <w:rPr>
+          <w:rFonts w:ascii="Arial" w:hAnsi="Arial"/>
+          <w:b/>
+          <w:color w:val="00008B"/>
+        </w:rPr>
         <w:t>חתימה וחותמת הרופא</w:t>
       </w:r>
     </w:p>

</xml_diff>

<commit_message>
Fix BiDi formatting, remove ET4D line, improve spacing
Co-authored-by: Ron Gurfinkel <RonBabaj@users.noreply.github.com>
</commit_message>
<xml_diff>
--- a/exports/medical_certificate.docx
+++ b/exports/medical_certificate.docx
@@ -4,7 +4,7 @@
   <w:body>
     <w:p>
       <w:pPr>
-        <w:spacing w:after="7" w:line="382" w:lineRule="auto"/>
+        <w:spacing w:after="80" w:line="382" w:lineRule="auto"/>
         <w:ind w:right="712" w:firstLine="4080"/>
       </w:pPr>
       <w:r>
@@ -105,7 +105,7 @@
     </w:p>
     <w:p>
       <w:pPr>
-        <w:spacing w:after="536"/>
+        <w:spacing w:after="80"/>
         <w:ind w:right="1589"/>
         <w:jc w:val="left"/>
       </w:pPr>
@@ -1756,100 +1756,52 @@
     </w:p>
     <w:p>
       <w:pPr>
-        <w:spacing w:after="0" w:line="392" w:lineRule="auto"/>
+        <w:spacing w:after="40" w:line="392" w:lineRule="auto"/>
         <w:ind w:left="3511" w:right="1589"/>
+        <w:bidi w:val="1"/>
+        <w:jc w:val="center"/>
       </w:pPr>
       <w:r>
         <w:rPr>
-          <w:rFonts w:ascii="Arial" w:eastAsia="Arial" w:hAnsi="Arial" w:cs="Arial"/>
+          <w:rFonts w:ascii="Arial" w:hAnsi="Arial"/>
           <w:b/>
-          <w:bCs/>
           <w:color w:val="00008B"/>
-          <w:sz w:val="20"/>
-          <w:szCs w:val="20"/>
-          <w:rtl/>
         </w:rPr>
-        <w:t>טלפון:</w:t>
+        <w:t xml:space="preserve">טלפון: </w:t>
       </w:r>
       <w:r>
         <w:rPr>
-          <w:rFonts w:ascii="Arial" w:eastAsia="Arial" w:hAnsi="Arial" w:cs="Arial"/>
-          <w:sz w:val="20"/>
-          <w:szCs w:val="20"/>
-          <w:rtl/>
+          <w:rFonts w:ascii="Arial" w:hAnsi="Arial"/>
+          <w:b w:val="0"/>
+          <w:color w:val="000000"/>
+          <w:rtl w:val="0"/>
         </w:rPr>
-        <w:t xml:space="preserve"> </w:t>
+        <w:t>‎08-9257689</w:t>
       </w:r>
       <w:r>
         <w:rPr>
-          <w:rFonts w:ascii="Arial" w:eastAsia="Arial" w:hAnsi="Arial" w:cs="Arial"/>
-          <w:sz w:val="20"/>
-          <w:szCs w:val="20"/>
+          <w:rFonts w:ascii="Arial" w:hAnsi="Arial"/>
+          <w:b w:val="0"/>
+          <w:color w:val="000000"/>
         </w:rPr>
-        <w:t>08</w:t>
+        <w:br/>
       </w:r>
       <w:r>
         <w:rPr>
-          <w:rFonts w:ascii="Arial" w:eastAsia="Arial" w:hAnsi="Arial" w:cs="Arial"/>
-          <w:sz w:val="20"/>
-          <w:szCs w:val="20"/>
-          <w:rtl/>
+          <w:rFonts w:ascii="Arial" w:hAnsi="Arial"/>
+          <w:b/>
+          <w:color w:val="00008B"/>
         </w:rPr>
-        <w:t>-</w:t>
+        <w:t xml:space="preserve">פקס: </w:t>
       </w:r>
       <w:r>
         <w:rPr>
-          <w:rFonts w:ascii="Arial" w:eastAsia="Arial" w:hAnsi="Arial" w:cs="Arial"/>
-          <w:sz w:val="20"/>
-          <w:szCs w:val="20"/>
+          <w:rFonts w:ascii="Arial" w:hAnsi="Arial"/>
+          <w:b w:val="0"/>
+          <w:color w:val="000000"/>
+          <w:rtl w:val="0"/>
         </w:rPr>
-        <w:t>9257689</w:t>
-      </w:r>
-      <w:r>
-        <w:rPr>
-          <w:rFonts w:ascii="Arial" w:eastAsia="Arial" w:hAnsi="Arial" w:cs="Arial"/>
-          <w:b/>
-          <w:bCs/>
-          <w:color w:val="00008B"/>
-          <w:sz w:val="20"/>
-          <w:szCs w:val="20"/>
-          <w:rtl/>
-        </w:rPr>
-        <w:t>פקס:</w:t>
-      </w:r>
-      <w:r>
-        <w:rPr>
-          <w:rFonts w:ascii="Arial" w:eastAsia="Arial" w:hAnsi="Arial" w:cs="Arial"/>
-          <w:sz w:val="20"/>
-          <w:szCs w:val="20"/>
-          <w:rtl/>
-        </w:rPr>
-        <w:t xml:space="preserve"> </w:t>
-      </w:r>
-      <w:r>
-        <w:rPr>
-          <w:rFonts w:ascii="Arial" w:eastAsia="Arial" w:hAnsi="Arial" w:cs="Arial"/>
-          <w:sz w:val="20"/>
-          <w:szCs w:val="20"/>
-        </w:rPr>
-        <w:t>9257689</w:t>
-      </w:r>
-      <w:r>
-        <w:rPr>
-          <w:rFonts w:ascii="Arial" w:eastAsia="Arial" w:hAnsi="Arial" w:cs="Arial"/>
-          <w:sz w:val="20"/>
-          <w:szCs w:val="20"/>
-          <w:rtl/>
-        </w:rPr>
-        <w:t>-</w:t>
-      </w:r>
-      <w:r>
-        <w:rPr>
-          <w:rFonts w:ascii="Arial" w:eastAsia="Arial" w:hAnsi="Arial" w:cs="Arial"/>
-          <w:sz w:val="20"/>
-          <w:szCs w:val="20"/>
-        </w:rPr>
-        <w:t>08</w:t>
+        <w:t>‎08-9257689</w:t>
       </w:r>
     </w:p>
     <w:p>
@@ -1858,54 +1810,25 @@
           <w:tab w:val="center" w:pos="4653"/>
           <w:tab w:val="center" w:pos="5814"/>
         </w:tabs>
-        <w:spacing w:after="0"/>
-        <w:jc w:val="left"/>
+        <w:spacing w:after="200"/>
+        <w:jc w:val="center"/>
+        <w:bidi w:val="1"/>
       </w:pPr>
       <w:r>
         <w:rPr>
-          <w:szCs w:val="22"/>
-          <w:rtl/>
+          <w:rFonts w:ascii="Arial" w:hAnsi="Arial"/>
+          <w:b/>
+          <w:color w:val="00008B"/>
         </w:rPr>
-        <w:tab/>
+        <w:t xml:space="preserve">כתובת: </w:t>
       </w:r>
       <w:r>
         <w:rPr>
-          <w:rFonts w:ascii="Arial" w:eastAsia="Arial" w:hAnsi="Arial" w:cs="Arial"/>
-          <w:b/>
-          <w:bCs/>
-          <w:color w:val="00008B"/>
-          <w:sz w:val="20"/>
-          <w:szCs w:val="20"/>
-          <w:rtl/>
+          <w:rFonts w:ascii="Arial" w:hAnsi="Arial"/>
+          <w:b w:val="0"/>
+          <w:color w:val="000000"/>
         </w:rPr>
-        <w:t>כתובת:</w:t>
-      </w:r>
-      <w:r>
-        <w:rPr>
-          <w:rFonts w:ascii="Arial" w:eastAsia="Arial" w:hAnsi="Arial" w:cs="Arial"/>
-          <w:sz w:val="20"/>
-          <w:szCs w:val="20"/>
-          <w:rtl/>
-        </w:rPr>
-        <w:tab/>
-        <w:t xml:space="preserve">שטרן יאיר </w:t>
-      </w:r>
-      <w:r>
-        <w:rPr>
-          <w:rFonts w:ascii="Arial" w:eastAsia="Arial" w:hAnsi="Arial" w:cs="Arial"/>
-          <w:sz w:val="20"/>
-          <w:szCs w:val="20"/>
-        </w:rPr>
-        <w:t>14</w:t>
-      </w:r>
-      <w:r>
-        <w:rPr>
-          <w:rFonts w:ascii="Arial" w:eastAsia="Arial" w:hAnsi="Arial" w:cs="Arial"/>
-          <w:sz w:val="20"/>
-          <w:szCs w:val="20"/>
-          <w:rtl/>
-        </w:rPr>
-        <w:t>, רמלה</w:t>
+        <w:t>שטרן יאיר 14, רמלה</w:t>
       </w:r>
     </w:p>
     <w:tbl>
@@ -1946,11 +1869,12 @@
             <w:pPr>
               <w:spacing w:after="0"/>
               <w:ind w:right="1583"/>
+              <w:bidi w:val="1"/>
             </w:pPr>
             <w:r>
               <w:rPr>
                 <w:rFonts w:ascii="Arial" w:hAnsi="Arial"/>
-                <w:b w:val="0"/>
+                <w:b/>
                 <w:color w:val="00008B"/>
               </w:rPr>
               <w:t>ת.ז.:</w:t>
@@ -1961,7 +1885,16 @@
                 <w:b w:val="0"/>
                 <w:color w:val="000000"/>
               </w:rPr>
-              <w:t xml:space="preserve"> 215359910</w:t>
+              <w:t xml:space="preserve"> </w:t>
+            </w:r>
+            <w:r>
+              <w:rPr>
+                <w:rFonts w:ascii="Arial" w:hAnsi="Arial"/>
+                <w:b w:val="0"/>
+                <w:color w:val="000000"/>
+                <w:rtl w:val="0"/>
+              </w:rPr>
+              <w:t>‎215359910</w:t>
             </w:r>
           </w:p>
         </w:tc>
@@ -1980,11 +1913,12 @@
             <w:pPr>
               <w:spacing w:after="0"/>
               <w:ind w:right="598"/>
+              <w:bidi w:val="1"/>
             </w:pPr>
             <w:r>
               <w:rPr>
                 <w:rFonts w:ascii="Arial" w:hAnsi="Arial"/>
-                <w:b w:val="0"/>
+                <w:b/>
                 <w:color w:val="00008B"/>
               </w:rPr>
               <w:t>שם פרטי:</w:t>
@@ -2014,11 +1948,12 @@
             <w:pPr>
               <w:spacing w:after="0"/>
               <w:jc w:val="left"/>
+              <w:bidi w:val="1"/>
             </w:pPr>
             <w:r>
               <w:rPr>
                 <w:rFonts w:ascii="Arial" w:hAnsi="Arial"/>
-                <w:b w:val="0"/>
+                <w:b/>
                 <w:color w:val="00008B"/>
               </w:rPr>
               <w:t>שם משפחה:</w:t>
@@ -2047,11 +1982,12 @@
             <w:pPr>
               <w:spacing w:after="0"/>
               <w:ind w:right="408"/>
+              <w:bidi w:val="1"/>
             </w:pPr>
             <w:r>
               <w:rPr>
                 <w:rFonts w:ascii="Arial" w:hAnsi="Arial"/>
-                <w:b w:val="0"/>
+                <w:b/>
                 <w:color w:val="00008B"/>
               </w:rPr>
               <w:t>פרטי הנבדק:</w:t>
@@ -2078,11 +2014,12 @@
               <w:spacing w:after="0"/>
               <w:ind w:left="720" w:right="1583" w:hanging="720"/>
               <w:jc w:val="both"/>
+              <w:bidi w:val="1"/>
             </w:pPr>
             <w:r>
               <w:rPr>
                 <w:rFonts w:ascii="Arial" w:hAnsi="Arial"/>
-                <w:b w:val="0"/>
+                <w:b/>
                 <w:color w:val="00008B"/>
               </w:rPr>
               <w:t>טל.עבודה/נייד:</w:t>
@@ -2093,7 +2030,16 @@
                 <w:b w:val="0"/>
                 <w:color w:val="000000"/>
               </w:rPr>
-              <w:t xml:space="preserve"> 0522460193</w:t>
+              <w:t xml:space="preserve"> </w:t>
+            </w:r>
+            <w:r>
+              <w:rPr>
+                <w:rFonts w:ascii="Arial" w:hAnsi="Arial"/>
+                <w:b w:val="0"/>
+                <w:color w:val="000000"/>
+                <w:rtl w:val="0"/>
+              </w:rPr>
+              <w:t>‎0522460193</w:t>
             </w:r>
             <w:r>
               <w:rPr>
@@ -2106,10 +2052,10 @@
             <w:r>
               <w:rPr>
                 <w:rFonts w:ascii="Arial" w:hAnsi="Arial"/>
-                <w:b w:val="0"/>
+                <w:b/>
                 <w:color w:val="00008B"/>
               </w:rPr>
-              <w:t xml:space="preserve">מיקוד </w:t>
+              <w:t>מיקוד:</w:t>
             </w:r>
             <w:r>
               <w:rPr>
@@ -2117,7 +2063,16 @@
                 <w:b w:val="0"/>
                 <w:color w:val="000000"/>
               </w:rPr>
-              <w:t>7228212</w:t>
+              <w:t xml:space="preserve"> </w:t>
+            </w:r>
+            <w:r>
+              <w:rPr>
+                <w:rFonts w:ascii="Arial" w:hAnsi="Arial"/>
+                <w:b w:val="0"/>
+                <w:color w:val="000000"/>
+                <w:rtl w:val="0"/>
+              </w:rPr>
+              <w:t>‎7228212</w:t>
             </w:r>
           </w:p>
         </w:tc>
@@ -2139,11 +2094,12 @@
               </w:tabs>
               <w:spacing w:after="0"/>
               <w:jc w:val="left"/>
+              <w:bidi w:val="1"/>
             </w:pPr>
             <w:r>
               <w:rPr>
                 <w:rFonts w:ascii="Arial" w:hAnsi="Arial"/>
-                <w:b w:val="0"/>
+                <w:b/>
                 <w:color w:val="00008B"/>
               </w:rPr>
               <w:t>טלפון:</w:t>
@@ -2154,7 +2110,16 @@
                 <w:b w:val="0"/>
                 <w:color w:val="000000"/>
               </w:rPr>
-              <w:t xml:space="preserve"> 08-9244787</w:t>
+              <w:t xml:space="preserve"> </w:t>
+            </w:r>
+            <w:r>
+              <w:rPr>
+                <w:rFonts w:ascii="Arial" w:hAnsi="Arial"/>
+                <w:b w:val="0"/>
+                <w:color w:val="000000"/>
+                <w:rtl w:val="0"/>
+              </w:rPr>
+              <w:t>‎08-9244787</w:t>
             </w:r>
           </w:p>
         </w:tc>
@@ -2172,11 +2137,12 @@
             <w:pPr>
               <w:spacing w:after="0"/>
               <w:ind w:right="383"/>
+              <w:bidi w:val="1"/>
             </w:pPr>
             <w:r>
               <w:rPr>
                 <w:rFonts w:ascii="Arial" w:hAnsi="Arial"/>
-                <w:b w:val="0"/>
+                <w:b/>
                 <w:color w:val="00008B"/>
               </w:rPr>
               <w:t>ת.לידה:</w:t>
@@ -2187,8 +2153,16 @@
                 <w:b w:val="0"/>
                 <w:color w:val="000000"/>
               </w:rPr>
-              <w:t xml:space="preserve"> 30/05/2005</w:t>
-              <w:tab/>
+              <w:t xml:space="preserve"> </w:t>
+            </w:r>
+            <w:r>
+              <w:rPr>
+                <w:rFonts w:ascii="Arial" w:hAnsi="Arial"/>
+                <w:b w:val="0"/>
+                <w:color w:val="000000"/>
+                <w:rtl w:val="0"/>
+              </w:rPr>
+              <w:t>‎30/05/2005</w:t>
             </w:r>
             <w:r>
               <w:rPr>
@@ -2201,7 +2175,7 @@
             <w:r>
               <w:rPr>
                 <w:rFonts w:ascii="Arial" w:hAnsi="Arial"/>
-                <w:b w:val="0"/>
+                <w:b/>
                 <w:color w:val="00008B"/>
               </w:rPr>
               <w:t>מין:</w:t>
@@ -2225,7 +2199,7 @@
             <w:r>
               <w:rPr>
                 <w:rFonts w:ascii="Arial" w:hAnsi="Arial"/>
-                <w:b w:val="0"/>
+                <w:b/>
                 <w:color w:val="00008B"/>
               </w:rPr>
               <w:t>כתובת:</w:t>
@@ -4621,8 +4595,9 @@
                 <w:rFonts w:ascii="Arial" w:hAnsi="Arial"/>
                 <w:b w:val="0"/>
                 <w:color w:val="000000"/>
+                <w:rtl w:val="0"/>
               </w:rPr>
-              <w:t>0215359910</w:t>
+              <w:t>‎0215359910</w:t>
             </w:r>
           </w:p>
         </w:tc>
@@ -4630,15 +4605,16 @@
     </w:tbl>
     <w:p>
       <w:pPr>
-        <w:spacing w:after="0"/>
+        <w:spacing w:after="200" w:before="160"/>
         <w:ind w:right="907"/>
         <w:jc w:val="center"/>
+        <w:bidi w:val="1"/>
       </w:pPr>
       <w:r>
         <w:rPr>
           <w:rFonts w:ascii="Arial" w:hAnsi="Arial"/>
           <w:b/>
-          <w:color w:val="00008B"/>
+          <w:color w:val="000000"/>
           <w:u w:val="single"/>
         </w:rPr>
         <w:t>אישור מחלה</w:t>
@@ -4646,24 +4622,10 @@
     </w:p>
     <w:p>
       <w:pPr>
-        <w:bidi w:val="0"/>
-        <w:spacing w:after="222"/>
-        <w:jc w:val="left"/>
-      </w:pPr>
-      <w:r>
-        <w:rPr>
-          <w:rFonts w:ascii="Arial" w:hAnsi="Arial"/>
-          <w:b w:val="0"/>
-          <w:color w:val="000000"/>
-        </w:rPr>
-        <w:t>ET4D-CV5-ZKC-6R82-449XH</w:t>
-      </w:r>
-    </w:p>
-    <w:p>
-      <w:pPr>
-        <w:spacing w:after="558" w:line="467" w:lineRule="auto"/>
+        <w:spacing w:after="160" w:line="467" w:lineRule="auto"/>
         <w:ind w:left="212" w:hanging="10"/>
         <w:jc w:val="left"/>
+        <w:bidi w:val="1"/>
       </w:pPr>
       <w:r>
         <w:rPr>
@@ -4687,8 +4649,9 @@
           <w:tab w:val="center" w:pos="6175"/>
           <w:tab w:val="center" w:pos="6979"/>
         </w:tabs>
-        <w:spacing w:after="945" w:line="467" w:lineRule="auto"/>
+        <w:spacing w:after="320" w:line="467" w:lineRule="auto"/>
         <w:jc w:val="left"/>
+        <w:bidi w:val="1"/>
       </w:pPr>
       <w:r>
         <w:rPr>
@@ -4696,7 +4659,16 @@
           <w:b/>
           <w:color w:val="00008B"/>
         </w:rPr>
-        <w:t>אינו/ה מסוגל/ת לעבוד מיום:</w:t>
+        <w:t xml:space="preserve">אינו/ה מסוגל/ת לעבוד מיום: </w:t>
+      </w:r>
+      <w:r>
+        <w:rPr>
+          <w:rFonts w:ascii="Arial" w:hAnsi="Arial"/>
+          <w:b w:val="0"/>
+          <w:color w:val="000000"/>
+          <w:rtl w:val="0"/>
+        </w:rPr>
+        <w:t>‎24/08/2026</w:t>
       </w:r>
       <w:r>
         <w:rPr>
@@ -4704,9 +4676,7 @@
           <w:b w:val="0"/>
           <w:color w:val="000000"/>
         </w:rPr>
-        <w:tab/>
-        <w:t>24/08/2026</w:t>
-        <w:tab/>
+        <w:t xml:space="preserve">   </w:t>
       </w:r>
       <w:r>
         <w:rPr>
@@ -4714,7 +4684,16 @@
           <w:b/>
           <w:color w:val="00008B"/>
         </w:rPr>
-        <w:t>עד יום:</w:t>
+        <w:t xml:space="preserve">עד יום: </w:t>
+      </w:r>
+      <w:r>
+        <w:rPr>
+          <w:rFonts w:ascii="Arial" w:hAnsi="Arial"/>
+          <w:b w:val="0"/>
+          <w:color w:val="000000"/>
+          <w:rtl w:val="0"/>
+        </w:rPr>
+        <w:t>‎27/08/2026</w:t>
       </w:r>
       <w:r>
         <w:rPr>
@@ -4722,9 +4701,7 @@
           <w:b w:val="0"/>
           <w:color w:val="000000"/>
         </w:rPr>
-        <w:tab/>
-        <w:t>27/08/2026</w:t>
-        <w:tab/>
+        <w:t xml:space="preserve">   </w:t>
       </w:r>
       <w:r>
         <w:rPr>
@@ -4740,16 +4717,7 @@
           <w:b w:val="0"/>
           <w:color w:val="000000"/>
         </w:rPr>
-        <w:t>4</w:t>
-        <w:tab/>
-      </w:r>
-      <w:r>
-        <w:rPr>
-          <w:rFonts w:ascii="Arial" w:hAnsi="Arial"/>
-          <w:b/>
-          <w:color w:val="00008B"/>
-        </w:rPr>
-        <w:t>ימים.</w:t>
+        <w:t>4 ימים.</w:t>
       </w:r>
     </w:p>
     <w:p>
@@ -4916,8 +4884,9 @@
           <w:tab w:val="center" w:pos="700"/>
           <w:tab w:val="center" w:pos="8738"/>
         </w:tabs>
-        <w:spacing w:after="0"/>
+        <w:spacing w:after="0" w:before="480"/>
         <w:jc w:val="left"/>
+        <w:bidi w:val="1"/>
       </w:pPr>
       <w:r>
         <w:rPr>
@@ -4941,6 +4910,9 @@
           <w:b w:val="0"/>
           <w:color w:val="000000"/>
         </w:rPr>
+        <w:tab/>
+        <w:tab/>
+        <w:tab/>
         <w:tab/>
       </w:r>
       <w:r>

</xml_diff>

<commit_message>
Fix BiDi overlap, header layout, patient table rows, and footer signature placement
- Add RTL-aware header table (date | Maccabi | doctor) and split contact lines
- Rebuild patient table as 4 rows to prevent add_row cell merging/overlap
- Apply LRM + LTR runs for dates, phones, and ID numbers
- Restructure footer: date on right, signature on left, preserve line drawings
- Only collect footer drawings from removed paragraphs (keep header barcodes)

Co-authored-by: Ron Gurfinkel <RonBabaj@users.noreply.github.com>
</commit_message>
<xml_diff>
--- a/exports/medical_certificate.docx
+++ b/exports/medical_certificate.docx
@@ -2,112 +2,126 @@
 <file path=word/document.xml><?xml version="1.0" encoding="utf-8"?>
 <w:document xmlns:wpc="http://schemas.microsoft.com/office/word/2010/wordprocessingCanvas" xmlns:cx="http://schemas.microsoft.com/office/drawing/2014/chartex" xmlns:cx1="http://schemas.microsoft.com/office/drawing/2015/9/8/chartex" xmlns:cx2="http://schemas.microsoft.com/office/drawing/2015/10/21/chartex" xmlns:cx3="http://schemas.microsoft.com/office/drawing/2016/5/9/chartex" xmlns:cx4="http://schemas.microsoft.com/office/drawing/2016/5/10/chartex" xmlns:cx5="http://schemas.microsoft.com/office/drawing/2016/5/11/chartex" xmlns:cx6="http://schemas.microsoft.com/office/drawing/2016/5/12/chartex" xmlns:cx7="http://schemas.microsoft.com/office/drawing/2016/5/13/chartex" xmlns:cx8="http://schemas.microsoft.com/office/drawing/2016/5/14/chartex" xmlns:mc="http://schemas.openxmlformats.org/markup-compatibility/2006" xmlns:m="http://schemas.openxmlformats.org/officeDocument/2006/math" xmlns:aink="http://schemas.microsoft.com/office/drawing/2016/ink" xmlns:am3d="http://schemas.microsoft.com/office/drawing/2017/model3d" xmlns:oel="http://schemas.microsoft.com/office/2019/extlst" xmlns:r="http://schemas.openxmlformats.org/officeDocument/2006/relationships" xmlns:wp14="http://schemas.microsoft.com/office/word/2010/wordprocessingDrawing" xmlns:wp="http://schemas.openxmlformats.org/drawingml/2006/wordprocessingDrawing" xmlns:wpg="http://schemas.microsoft.com/office/word/2010/wordprocessingGroup" xmlns:wpi="http://schemas.microsoft.com/office/word/2010/wordprocessingInk" xmlns:wps="http://schemas.microsoft.com/office/word/2010/wordprocessingShape" xmlns:o="urn:schemas-microsoft-com:office:office" xmlns:v="urn:schemas-microsoft-com:vml" xmlns:w10="urn:schemas-microsoft-com:office:word" xmlns:w="http://schemas.openxmlformats.org/wordprocessingml/2006/main" xmlns:w14="http://schemas.microsoft.com/office/word/2010/wordml" xmlns:w15="http://schemas.microsoft.com/office/word/2012/wordml" xmlns:w16cex="http://schemas.microsoft.com/office/word/2018/wordml/cex" xmlns:w16cid="http://schemas.microsoft.com/office/word/2016/wordml/cid" xmlns:w16="http://schemas.microsoft.com/office/word/2018/wordml" xmlns:w16sdtdh="http://schemas.microsoft.com/office/word/2020/wordml/sdtdatahash" xmlns:w16sdtfl="http://schemas.microsoft.com/office/word/2024/wordml/sdtformatlock" xmlns:w16se="http://schemas.microsoft.com/office/word/2015/wordml/symex" xmlns:w16du="http://schemas.microsoft.com/office/word/2023/wordml/word16du" xmlns:wne="http://schemas.microsoft.com/office/word/2006/wordml" mc:Ignorable="w14 w15 w16se w16cid w16 w16cex w16sdtdh w16sdtfl w16du wp14">
   <w:body>
-    <w:p>
-      <w:pPr>
-        <w:spacing w:after="80" w:line="382" w:lineRule="auto"/>
-        <w:ind w:right="712" w:firstLine="4080"/>
-      </w:pPr>
-      <w:r>
-        <w:rPr>
-          <w:rFonts w:ascii="Arial" w:eastAsia="Arial" w:hAnsi="Arial" w:cs="Arial"/>
-          <w:b/>
-          <w:bCs/>
-          <w:sz w:val="24"/>
-          <w:rtl/>
-        </w:rPr>
-        <w:t>מכבי שירותי בריאות</w:t>
-      </w:r>
-      <w:r>
-        <w:rPr>
-          <w:rFonts w:ascii="Arial" w:eastAsia="Arial" w:hAnsi="Arial" w:cs="Arial"/>
-          <w:b/>
-          <w:bCs/>
-          <w:color w:val="00008B"/>
-          <w:sz w:val="20"/>
-          <w:szCs w:val="20"/>
-          <w:rtl/>
-        </w:rPr>
-        <w:t xml:space="preserve"> תאריך:</w:t>
-      </w:r>
-      <w:r>
-        <w:rPr>
-          <w:rFonts w:ascii="Arial" w:eastAsia="Arial" w:hAnsi="Arial" w:cs="Arial"/>
-          <w:sz w:val="20"/>
-          <w:szCs w:val="20"/>
-          <w:rtl/>
-        </w:rPr>
-        <w:t xml:space="preserve"> </w:t>
-      </w:r>
-      <w:r>
-        <w:rPr>
-          <w:rFonts w:ascii="Arial" w:eastAsia="Arial" w:hAnsi="Arial" w:cs="Arial"/>
-          <w:sz w:val="20"/>
-          <w:szCs w:val="20"/>
-        </w:rPr>
-        <w:t>31</w:t>
-      </w:r>
-      <w:r>
-        <w:rPr>
-          <w:rFonts w:ascii="Arial" w:eastAsia="Arial" w:hAnsi="Arial" w:cs="Arial"/>
-          <w:sz w:val="20"/>
-          <w:szCs w:val="20"/>
-          <w:rtl/>
-        </w:rPr>
-        <w:t>/</w:t>
-      </w:r>
-      <w:r>
-        <w:rPr>
-          <w:rFonts w:ascii="Arial" w:eastAsia="Arial" w:hAnsi="Arial" w:cs="Arial"/>
-          <w:sz w:val="20"/>
-          <w:szCs w:val="20"/>
-        </w:rPr>
-        <w:t>08</w:t>
-      </w:r>
-      <w:r>
-        <w:rPr>
-          <w:rFonts w:ascii="Arial" w:eastAsia="Arial" w:hAnsi="Arial" w:cs="Arial"/>
-          <w:sz w:val="20"/>
-          <w:szCs w:val="20"/>
-          <w:rtl/>
-        </w:rPr>
-        <w:t>/</w:t>
-      </w:r>
-      <w:r>
-        <w:rPr>
-          <w:rFonts w:ascii="Arial" w:eastAsia="Arial" w:hAnsi="Arial" w:cs="Arial"/>
-          <w:sz w:val="20"/>
-          <w:szCs w:val="20"/>
-        </w:rPr>
-        <w:t>2026</w:t>
-      </w:r>
-      <w:r>
-        <w:rPr>
-          <w:rFonts w:ascii="Arial" w:eastAsia="Arial" w:hAnsi="Arial" w:cs="Arial"/>
-          <w:b/>
-          <w:bCs/>
-          <w:sz w:val="20"/>
-          <w:szCs w:val="20"/>
-          <w:rtl/>
-        </w:rPr>
-        <w:t>דר' קגנוביץ גלינה</w:t>
-      </w:r>
-      <w:r>
-        <w:rPr>
-          <w:rFonts w:ascii="Arial" w:eastAsia="Arial" w:hAnsi="Arial" w:cs="Arial"/>
-          <w:color w:val="00008B"/>
-          <w:sz w:val="17"/>
-          <w:szCs w:val="17"/>
-          <w:rtl/>
-        </w:rPr>
-        <w:tab/>
-        <w:t>מ.ר גורם מפנה</w:t>
-      </w:r>
-    </w:p>
+    <w:tbl>
+      <w:tblPr>
+        <w:tblW w:type="auto" w:w="0"/>
+        <w:tblLayout w:type="fixed"/>
+        <w:tblLook w:firstColumn="1" w:firstRow="1" w:lastColumn="0" w:lastRow="0" w:noHBand="0" w:noVBand="1" w:val="04A0"/>
+        <w:jc w:val="center"/>
+        <w:tblBorders>
+          <w:top w:val="none"/>
+          <w:left w:val="none"/>
+          <w:bottom w:val="none"/>
+          <w:right w:val="none"/>
+          <w:insideH w:val="none"/>
+          <w:insideV w:val="none"/>
+        </w:tblBorders>
+      </w:tblPr>
+      <w:tblGrid>
+        <w:gridCol w:w="3532"/>
+        <w:gridCol w:w="3532"/>
+        <w:gridCol w:w="3532"/>
+      </w:tblGrid>
+      <w:tr>
+        <w:tc>
+          <w:tcPr>
+            <w:tcW w:type="dxa" w:w="3402"/>
+          </w:tcPr>
+          <w:p>
+            <w:pPr>
+              <w:bidi w:val="1"/>
+              <w:jc w:val="right"/>
+            </w:pPr>
+            <w:r>
+              <w:rPr>
+                <w:rFonts w:ascii="Arial" w:hAnsi="Arial"/>
+                <w:b/>
+                <w:color w:val="000000"/>
+              </w:rPr>
+              <w:t>דר' קגנוביץ גלינה</w:t>
+            </w:r>
+          </w:p>
+        </w:tc>
+        <w:tc>
+          <w:tcPr>
+            <w:tcW w:type="dxa" w:w="3402"/>
+          </w:tcPr>
+          <w:p>
+            <w:pPr>
+              <w:bidi w:val="1"/>
+              <w:jc w:val="center"/>
+            </w:pPr>
+            <w:r>
+              <w:rPr>
+                <w:rFonts w:ascii="Arial" w:hAnsi="Arial"/>
+                <w:b/>
+                <w:color w:val="000000"/>
+                <w:sz w:val="28"/>
+              </w:rPr>
+              <w:t>מכבי שירותי בריאות</w:t>
+            </w:r>
+          </w:p>
+        </w:tc>
+        <w:tc>
+          <w:tcPr>
+            <w:tcW w:type="dxa" w:w="3402"/>
+          </w:tcPr>
+          <w:p>
+            <w:pPr>
+              <w:bidi w:val="1"/>
+              <w:jc w:val="left"/>
+            </w:pPr>
+            <w:r>
+              <w:rPr>
+                <w:rFonts w:ascii="Arial" w:hAnsi="Arial"/>
+                <w:b/>
+                <w:color w:val="00008B"/>
+              </w:rPr>
+              <w:t xml:space="preserve">תאריך: </w:t>
+            </w:r>
+            <w:r>
+              <w:rPr>
+                <w:rFonts w:ascii="Arial" w:hAnsi="Arial"/>
+                <w:b w:val="0"/>
+                <w:color w:val="000000"/>
+                <w:rtl w:val="0"/>
+              </w:rPr>
+              <w:t>‎31/08/2026</w:t>
+            </w:r>
+            <w:r>
+              <w:rPr>
+                <w:rFonts w:ascii="Arial" w:hAnsi="Arial"/>
+                <w:b w:val="0"/>
+                <w:color w:val="000000"/>
+              </w:rPr>
+              <w:br/>
+            </w:r>
+            <w:r>
+              <w:rPr>
+                <w:rFonts w:ascii="Arial" w:hAnsi="Arial"/>
+                <w:b/>
+                <w:color w:val="00008B"/>
+              </w:rPr>
+              <w:t xml:space="preserve">מ.ר </w:t>
+            </w:r>
+            <w:r>
+              <w:rPr>
+                <w:rFonts w:ascii="Arial" w:hAnsi="Arial"/>
+                <w:b/>
+                <w:color w:val="00008B"/>
+              </w:rPr>
+              <w:t>גורם מפנה</w:t>
+            </w:r>
+          </w:p>
+        </w:tc>
+      </w:tr>
+    </w:tbl>
     <w:p>
       <w:pPr>
         <w:spacing w:after="80"/>
         <w:ind w:right="1589"/>
-        <w:jc w:val="left"/>
+        <w:jc w:val="right"/>
+        <w:bidi w:val="1"/>
       </w:pPr>
       <w:r>
         <w:rPr>
@@ -1746,10 +1760,9 @@
       </w:r>
       <w:r>
         <w:rPr>
-          <w:rFonts w:ascii="Arial" w:eastAsia="Arial" w:hAnsi="Arial" w:cs="Arial"/>
-          <w:sz w:val="20"/>
-          <w:szCs w:val="20"/>
-          <w:rtl/>
+          <w:rFonts w:ascii="Arial" w:hAnsi="Arial"/>
+          <w:b w:val="0"/>
+          <w:color w:val="000000"/>
         </w:rPr>
         <w:t>משפחה, פנימית וכללית</w:t>
       </w:r>
@@ -1833,43 +1846,69 @@
     </w:p>
     <w:tbl>
       <w:tblPr>
-        <w:tblStyle w:val="TableGrid"/>
-        <w:tblW w:w="10785" w:type="dxa"/>
-        <w:tblInd w:w="-181" w:type="dxa"/>
+        <w:tblLook w:firstColumn="1" w:firstRow="1" w:lastColumn="0" w:lastRow="0" w:noHBand="0" w:noVBand="1" w:val="04A0"/>
         <w:tblCellMar>
           <w:top w:w="26" w:type="dxa"/>
           <w:left w:w="0" w:type="dxa"/>
           <w:bottom w:w="86" w:type="dxa"/>
           <w:right w:w="182" w:type="dxa"/>
         </w:tblCellMar>
-        <w:tblLook w:val="04A0" w:firstRow="1" w:lastRow="0" w:firstColumn="1" w:lastColumn="0" w:noHBand="0" w:noVBand="1"/>
+        <w:tblW w:w="10785" w:type="dxa"/>
       </w:tblPr>
       <w:tblGrid>
-        <w:gridCol w:w="4057"/>
-        <w:gridCol w:w="1808"/>
-        <w:gridCol w:w="2968"/>
-        <w:gridCol w:w="1952"/>
+        <w:gridCol w:w="2649"/>
+        <w:gridCol w:w="2649"/>
+        <w:gridCol w:w="2649"/>
+        <w:gridCol w:w="2649"/>
       </w:tblGrid>
       <w:tr>
-        <w:trPr>
-          <w:trHeight w:val="672"/>
-        </w:trPr>
         <w:tc>
           <w:tcPr>
-            <w:tcW w:w="3249" w:type="dxa"/>
-            <w:tcBorders>
-              <w:top w:val="single" w:sz="6" w:space="0" w:color="00008B"/>
-              <w:left w:val="single" w:sz="6" w:space="0" w:color="00008B"/>
-              <w:bottom w:val="nil"/>
-              <w:right w:val="nil"/>
-            </w:tcBorders>
-            <w:vAlign w:val="bottom"/>
+            <w:tcW w:type="dxa" w:w="2649"/>
+          </w:tcPr>
+          <w:p/>
+        </w:tc>
+        <w:tc>
+          <w:tcPr>
+            <w:tcW w:type="dxa" w:w="2649"/>
+          </w:tcPr>
+          <w:p/>
+        </w:tc>
+        <w:tc>
+          <w:tcPr>
+            <w:tcW w:type="dxa" w:w="2649"/>
+          </w:tcPr>
+          <w:p/>
+        </w:tc>
+        <w:tc>
+          <w:tcPr>
+            <w:tcW w:type="dxa" w:w="2649"/>
           </w:tcPr>
           <w:p>
             <w:pPr>
-              <w:spacing w:after="0"/>
-              <w:ind w:right="1583"/>
               <w:bidi w:val="1"/>
+              <w:spacing w:line="276" w:lineRule="auto"/>
+            </w:pPr>
+            <w:r>
+              <w:rPr>
+                <w:rFonts w:ascii="Arial" w:hAnsi="Arial"/>
+                <w:b/>
+                <w:color w:val="00008B"/>
+              </w:rPr>
+              <w:t>פרטי הנבדק:</w:t>
+            </w:r>
+          </w:p>
+        </w:tc>
+      </w:tr>
+      <w:tr>
+        <w:tc>
+          <w:tcPr>
+            <w:tcW w:type="dxa" w:w="2649"/>
+          </w:tcPr>
+          <w:p>
+            <w:pPr>
+              <w:bidi w:val="1"/>
+              <w:spacing w:line="276" w:lineRule="auto"/>
             </w:pPr>
             <w:r>
               <w:rPr>
@@ -1900,20 +1939,12 @@
         </w:tc>
         <w:tc>
           <w:tcPr>
-            <w:tcW w:w="2016" w:type="dxa"/>
-            <w:tcBorders>
-              <w:top w:val="single" w:sz="6" w:space="0" w:color="00008B"/>
-              <w:left w:val="nil"/>
-              <w:bottom w:val="nil"/>
-              <w:right w:val="nil"/>
-            </w:tcBorders>
-            <w:vAlign w:val="bottom"/>
+            <w:tcW w:type="dxa" w:w="2649"/>
           </w:tcPr>
           <w:p>
             <w:pPr>
-              <w:spacing w:after="0"/>
-              <w:ind w:right="598"/>
               <w:bidi w:val="1"/>
+              <w:spacing w:line="276" w:lineRule="auto"/>
             </w:pPr>
             <w:r>
               <w:rPr>
@@ -1929,26 +1960,26 @@
                 <w:b w:val="0"/>
                 <w:color w:val="000000"/>
               </w:rPr>
-              <w:t xml:space="preserve"> רון</w:t>
+              <w:t xml:space="preserve"> </w:t>
+            </w:r>
+            <w:r>
+              <w:rPr>
+                <w:rFonts w:ascii="Arial" w:hAnsi="Arial"/>
+                <w:b w:val="0"/>
+                <w:color w:val="000000"/>
+              </w:rPr>
+              <w:t>רון</w:t>
             </w:r>
           </w:p>
         </w:tc>
         <w:tc>
           <w:tcPr>
-            <w:tcW w:w="3460" w:type="dxa"/>
-            <w:tcBorders>
-              <w:top w:val="single" w:sz="6" w:space="0" w:color="00008B"/>
-              <w:left w:val="nil"/>
-              <w:bottom w:val="nil"/>
-              <w:right w:val="nil"/>
-            </w:tcBorders>
-            <w:vAlign w:val="bottom"/>
+            <w:tcW w:type="dxa" w:w="2649"/>
           </w:tcPr>
           <w:p>
             <w:pPr>
-              <w:spacing w:after="0"/>
-              <w:jc w:val="left"/>
               <w:bidi w:val="1"/>
+              <w:spacing w:line="276" w:lineRule="auto"/>
             </w:pPr>
             <w:r>
               <w:rPr>
@@ -1964,65 +1995,7 @@
                 <w:b w:val="0"/>
                 <w:color w:val="000000"/>
               </w:rPr>
-              <w:t xml:space="preserve"> גורפינקל</w:t>
-            </w:r>
-          </w:p>
-        </w:tc>
-        <w:tc>
-          <w:tcPr>
-            <w:tcW w:w="2060" w:type="dxa"/>
-            <w:tcBorders>
-              <w:top w:val="single" w:sz="6" w:space="0" w:color="00008B"/>
-              <w:left w:val="nil"/>
-              <w:bottom w:val="nil"/>
-              <w:right w:val="single" w:sz="6" w:space="0" w:color="00008B"/>
-            </w:tcBorders>
-          </w:tcPr>
-          <w:p>
-            <w:pPr>
-              <w:spacing w:after="0"/>
-              <w:ind w:right="408"/>
-              <w:bidi w:val="1"/>
-            </w:pPr>
-            <w:r>
-              <w:rPr>
-                <w:rFonts w:ascii="Arial" w:hAnsi="Arial"/>
-                <w:b/>
-                <w:color w:val="00008B"/>
-              </w:rPr>
-              <w:t>פרטי הנבדק:</w:t>
-            </w:r>
-          </w:p>
-        </w:tc>
-      </w:tr>
-      <w:tr>
-        <w:trPr>
-          <w:trHeight w:val="817"/>
-        </w:trPr>
-        <w:tc>
-          <w:tcPr>
-            <w:tcW w:w="3249" w:type="dxa"/>
-            <w:tcBorders>
-              <w:top w:val="nil"/>
-              <w:left w:val="single" w:sz="6" w:space="0" w:color="00008B"/>
-              <w:bottom w:val="single" w:sz="6" w:space="0" w:color="00008B"/>
-              <w:right w:val="nil"/>
-            </w:tcBorders>
-          </w:tcPr>
-          <w:p>
-            <w:pPr>
-              <w:spacing w:after="0"/>
-              <w:ind w:left="720" w:right="1583" w:hanging="720"/>
-              <w:jc w:val="both"/>
-              <w:bidi w:val="1"/>
-            </w:pPr>
-            <w:r>
-              <w:rPr>
-                <w:rFonts w:ascii="Arial" w:hAnsi="Arial"/>
-                <w:b/>
-                <w:color w:val="00008B"/>
-              </w:rPr>
-              <w:t>טל.עבודה/נייד:</w:t>
+              <w:t xml:space="preserve"> </w:t>
             </w:r>
             <w:r>
               <w:rPr>
@@ -2030,208 +2003,15 @@
                 <w:b w:val="0"/>
                 <w:color w:val="000000"/>
               </w:rPr>
-              <w:t xml:space="preserve"> </w:t>
-            </w:r>
-            <w:r>
-              <w:rPr>
-                <w:rFonts w:ascii="Arial" w:hAnsi="Arial"/>
-                <w:b w:val="0"/>
-                <w:color w:val="000000"/>
-                <w:rtl w:val="0"/>
-              </w:rPr>
-              <w:t>‎0522460193</w:t>
-            </w:r>
-            <w:r>
-              <w:rPr>
-                <w:rFonts w:ascii="Arial" w:hAnsi="Arial"/>
-                <w:b w:val="0"/>
-                <w:color w:val="000000"/>
-              </w:rPr>
-              <w:br/>
-            </w:r>
-            <w:r>
-              <w:rPr>
-                <w:rFonts w:ascii="Arial" w:hAnsi="Arial"/>
-                <w:b/>
-                <w:color w:val="00008B"/>
-              </w:rPr>
-              <w:t>מיקוד:</w:t>
-            </w:r>
-            <w:r>
-              <w:rPr>
-                <w:rFonts w:ascii="Arial" w:hAnsi="Arial"/>
-                <w:b w:val="0"/>
-                <w:color w:val="000000"/>
-              </w:rPr>
-              <w:t xml:space="preserve"> </w:t>
-            </w:r>
-            <w:r>
-              <w:rPr>
-                <w:rFonts w:ascii="Arial" w:hAnsi="Arial"/>
-                <w:b w:val="0"/>
-                <w:color w:val="000000"/>
-                <w:rtl w:val="0"/>
-              </w:rPr>
-              <w:t>‎7228212</w:t>
+              <w:t>גורפינקל</w:t>
             </w:r>
           </w:p>
         </w:tc>
         <w:tc>
           <w:tcPr>
-            <w:tcW w:w="2016" w:type="dxa"/>
-            <w:tcBorders>
-              <w:top w:val="nil"/>
-              <w:left w:val="nil"/>
-              <w:bottom w:val="single" w:sz="6" w:space="0" w:color="00008B"/>
-              <w:right w:val="nil"/>
-            </w:tcBorders>
+            <w:tcW w:type="dxa" w:w="2649"/>
           </w:tcPr>
           <w:p>
-            <w:pPr>
-              <w:tabs>
-                <w:tab w:val="center" w:pos="417"/>
-                <w:tab w:val="right" w:pos="1834"/>
-              </w:tabs>
-              <w:spacing w:after="0"/>
-              <w:jc w:val="left"/>
-              <w:bidi w:val="1"/>
-            </w:pPr>
-            <w:r>
-              <w:rPr>
-                <w:rFonts w:ascii="Arial" w:hAnsi="Arial"/>
-                <w:b/>
-                <w:color w:val="00008B"/>
-              </w:rPr>
-              <w:t>טלפון:</w:t>
-            </w:r>
-            <w:r>
-              <w:rPr>
-                <w:rFonts w:ascii="Arial" w:hAnsi="Arial"/>
-                <w:b w:val="0"/>
-                <w:color w:val="000000"/>
-              </w:rPr>
-              <w:t xml:space="preserve"> </w:t>
-            </w:r>
-            <w:r>
-              <w:rPr>
-                <w:rFonts w:ascii="Arial" w:hAnsi="Arial"/>
-                <w:b w:val="0"/>
-                <w:color w:val="000000"/>
-                <w:rtl w:val="0"/>
-              </w:rPr>
-              <w:t>‎08-9244787</w:t>
-            </w:r>
-          </w:p>
-        </w:tc>
-        <w:tc>
-          <w:tcPr>
-            <w:tcW w:w="3460" w:type="dxa"/>
-            <w:tcBorders>
-              <w:top w:val="nil"/>
-              <w:left w:val="nil"/>
-              <w:bottom w:val="single" w:sz="6" w:space="0" w:color="00008B"/>
-              <w:right w:val="nil"/>
-            </w:tcBorders>
-          </w:tcPr>
-          <w:p>
-            <w:pPr>
-              <w:spacing w:after="0"/>
-              <w:ind w:right="383"/>
-              <w:bidi w:val="1"/>
-            </w:pPr>
-            <w:r>
-              <w:rPr>
-                <w:rFonts w:ascii="Arial" w:hAnsi="Arial"/>
-                <w:b/>
-                <w:color w:val="00008B"/>
-              </w:rPr>
-              <w:t>ת.לידה:</w:t>
-            </w:r>
-            <w:r>
-              <w:rPr>
-                <w:rFonts w:ascii="Arial" w:hAnsi="Arial"/>
-                <w:b w:val="0"/>
-                <w:color w:val="000000"/>
-              </w:rPr>
-              <w:t xml:space="preserve"> </w:t>
-            </w:r>
-            <w:r>
-              <w:rPr>
-                <w:rFonts w:ascii="Arial" w:hAnsi="Arial"/>
-                <w:b w:val="0"/>
-                <w:color w:val="000000"/>
-                <w:rtl w:val="0"/>
-              </w:rPr>
-              <w:t>‎30/05/2005</w:t>
-            </w:r>
-            <w:r>
-              <w:rPr>
-                <w:rFonts w:ascii="Arial" w:hAnsi="Arial"/>
-                <w:b w:val="0"/>
-                <w:color w:val="000000"/>
-              </w:rPr>
-              <w:br/>
-            </w:r>
-            <w:r>
-              <w:rPr>
-                <w:rFonts w:ascii="Arial" w:hAnsi="Arial"/>
-                <w:b/>
-                <w:color w:val="00008B"/>
-              </w:rPr>
-              <w:t>מין:</w:t>
-            </w:r>
-            <w:r>
-              <w:rPr>
-                <w:rFonts w:ascii="Arial" w:hAnsi="Arial"/>
-                <w:b w:val="0"/>
-                <w:color w:val="000000"/>
-              </w:rPr>
-              <w:t xml:space="preserve"> ז</w:t>
-            </w:r>
-            <w:r>
-              <w:rPr>
-                <w:rFonts w:ascii="Arial" w:hAnsi="Arial"/>
-                <w:b w:val="0"/>
-                <w:color w:val="000000"/>
-              </w:rPr>
-              <w:br/>
-            </w:r>
-            <w:r>
-              <w:rPr>
-                <w:rFonts w:ascii="Arial" w:hAnsi="Arial"/>
-                <w:b/>
-                <w:color w:val="00008B"/>
-              </w:rPr>
-              <w:t>כתובת:</w:t>
-            </w:r>
-            <w:r>
-              <w:rPr>
-                <w:rFonts w:ascii="Arial" w:hAnsi="Arial"/>
-                <w:b w:val="0"/>
-                <w:color w:val="000000"/>
-              </w:rPr>
-              <w:t xml:space="preserve"> הרב אפריאט 6, רמלה</w:t>
-            </w:r>
-          </w:p>
-        </w:tc>
-        <w:tc>
-          <w:tcPr>
-            <w:tcW w:w="2060" w:type="dxa"/>
-            <w:tcBorders>
-              <w:top w:val="nil"/>
-              <w:left w:val="nil"/>
-              <w:bottom w:val="single" w:sz="6" w:space="0" w:color="00008B"/>
-              <w:right w:val="single" w:sz="6" w:space="0" w:color="00008B"/>
-            </w:tcBorders>
-            <w:vAlign w:val="bottom"/>
-          </w:tcPr>
-          <w:p>
-            <w:pPr>
-              <w:bidi w:val="0"/>
-              <w:spacing w:after="0"/>
-              <w:ind w:left="200"/>
-              <w:jc w:val="left"/>
-            </w:pPr>
             <w:r>
               <w:rPr>
                 <w:noProof/>
@@ -4590,6 +4370,240 @@
                 </mc:Fallback>
               </mc:AlternateContent>
             </w:r>
+          </w:p>
+        </w:tc>
+      </w:tr>
+      <w:tr>
+        <w:tc>
+          <w:tcPr>
+            <w:tcW w:type="dxa" w:w="2649"/>
+          </w:tcPr>
+          <w:p>
+            <w:pPr>
+              <w:bidi w:val="1"/>
+              <w:spacing w:line="276" w:lineRule="auto"/>
+            </w:pPr>
+            <w:r>
+              <w:rPr>
+                <w:rFonts w:ascii="Arial" w:hAnsi="Arial"/>
+                <w:b/>
+                <w:color w:val="00008B"/>
+              </w:rPr>
+              <w:t>טל.עבודה/נייד:</w:t>
+            </w:r>
+            <w:r>
+              <w:rPr>
+                <w:rFonts w:ascii="Arial" w:hAnsi="Arial"/>
+                <w:b w:val="0"/>
+                <w:color w:val="000000"/>
+              </w:rPr>
+              <w:t xml:space="preserve"> </w:t>
+            </w:r>
+            <w:r>
+              <w:rPr>
+                <w:rFonts w:ascii="Arial" w:hAnsi="Arial"/>
+                <w:b w:val="0"/>
+                <w:color w:val="000000"/>
+                <w:rtl w:val="0"/>
+              </w:rPr>
+              <w:t>‎0522460193</w:t>
+            </w:r>
+          </w:p>
+        </w:tc>
+        <w:tc>
+          <w:tcPr>
+            <w:tcW w:type="dxa" w:w="2649"/>
+          </w:tcPr>
+          <w:p>
+            <w:pPr>
+              <w:bidi w:val="1"/>
+              <w:spacing w:line="276" w:lineRule="auto"/>
+            </w:pPr>
+            <w:r>
+              <w:rPr>
+                <w:rFonts w:ascii="Arial" w:hAnsi="Arial"/>
+                <w:b/>
+                <w:color w:val="00008B"/>
+              </w:rPr>
+              <w:t>טלפון:</w:t>
+            </w:r>
+            <w:r>
+              <w:rPr>
+                <w:rFonts w:ascii="Arial" w:hAnsi="Arial"/>
+                <w:b w:val="0"/>
+                <w:color w:val="000000"/>
+              </w:rPr>
+              <w:t xml:space="preserve"> </w:t>
+            </w:r>
+            <w:r>
+              <w:rPr>
+                <w:rFonts w:ascii="Arial" w:hAnsi="Arial"/>
+                <w:b w:val="0"/>
+                <w:color w:val="000000"/>
+                <w:rtl w:val="0"/>
+              </w:rPr>
+              <w:t>‎08-9244787</w:t>
+            </w:r>
+          </w:p>
+        </w:tc>
+        <w:tc>
+          <w:tcPr>
+            <w:tcW w:type="dxa" w:w="2649"/>
+          </w:tcPr>
+          <w:p>
+            <w:pPr>
+              <w:bidi w:val="1"/>
+              <w:spacing w:line="276" w:lineRule="auto"/>
+            </w:pPr>
+            <w:r>
+              <w:rPr>
+                <w:rFonts w:ascii="Arial" w:hAnsi="Arial"/>
+                <w:b/>
+                <w:color w:val="00008B"/>
+              </w:rPr>
+              <w:t>ת.לידה:</w:t>
+            </w:r>
+            <w:r>
+              <w:rPr>
+                <w:rFonts w:ascii="Arial" w:hAnsi="Arial"/>
+                <w:b w:val="0"/>
+                <w:color w:val="000000"/>
+              </w:rPr>
+              <w:t xml:space="preserve"> </w:t>
+            </w:r>
+            <w:r>
+              <w:rPr>
+                <w:rFonts w:ascii="Arial" w:hAnsi="Arial"/>
+                <w:b w:val="0"/>
+                <w:color w:val="000000"/>
+                <w:rtl w:val="0"/>
+              </w:rPr>
+              <w:t>‎30/05/2005</w:t>
+            </w:r>
+            <w:r>
+              <w:rPr>
+                <w:rFonts w:ascii="Arial" w:hAnsi="Arial"/>
+                <w:b w:val="0"/>
+                <w:color w:val="000000"/>
+              </w:rPr>
+              <w:br/>
+            </w:r>
+            <w:r>
+              <w:rPr>
+                <w:rFonts w:ascii="Arial" w:hAnsi="Arial"/>
+                <w:b/>
+                <w:color w:val="00008B"/>
+              </w:rPr>
+              <w:t>מין:</w:t>
+            </w:r>
+            <w:r>
+              <w:rPr>
+                <w:rFonts w:ascii="Arial" w:hAnsi="Arial"/>
+                <w:b w:val="0"/>
+                <w:color w:val="000000"/>
+              </w:rPr>
+              <w:t xml:space="preserve"> </w:t>
+            </w:r>
+            <w:r>
+              <w:rPr>
+                <w:rFonts w:ascii="Arial" w:hAnsi="Arial"/>
+                <w:b w:val="0"/>
+                <w:color w:val="000000"/>
+              </w:rPr>
+              <w:t>ז</w:t>
+            </w:r>
+          </w:p>
+        </w:tc>
+        <w:tc>
+          <w:tcPr>
+            <w:tcW w:type="dxa" w:w="2649"/>
+          </w:tcPr>
+          <w:p/>
+        </w:tc>
+      </w:tr>
+      <w:tr>
+        <w:tc>
+          <w:tcPr>
+            <w:tcW w:type="dxa" w:w="2649"/>
+          </w:tcPr>
+          <w:p>
+            <w:pPr>
+              <w:bidi w:val="1"/>
+              <w:spacing w:line="276" w:lineRule="auto"/>
+            </w:pPr>
+            <w:r>
+              <w:rPr>
+                <w:rFonts w:ascii="Arial" w:hAnsi="Arial"/>
+                <w:b/>
+                <w:color w:val="00008B"/>
+              </w:rPr>
+              <w:t>מיקוד:</w:t>
+            </w:r>
+            <w:r>
+              <w:rPr>
+                <w:rFonts w:ascii="Arial" w:hAnsi="Arial"/>
+                <w:b w:val="0"/>
+                <w:color w:val="000000"/>
+              </w:rPr>
+              <w:t xml:space="preserve"> </w:t>
+            </w:r>
+            <w:r>
+              <w:rPr>
+                <w:rFonts w:ascii="Arial" w:hAnsi="Arial"/>
+                <w:b w:val="0"/>
+                <w:color w:val="000000"/>
+                <w:rtl w:val="0"/>
+              </w:rPr>
+              <w:t>‎7228212</w:t>
+            </w:r>
+          </w:p>
+        </w:tc>
+        <w:tc>
+          <w:tcPr>
+            <w:tcW w:type="dxa" w:w="2649"/>
+          </w:tcPr>
+          <w:p/>
+        </w:tc>
+        <w:tc>
+          <w:tcPr>
+            <w:tcW w:type="dxa" w:w="2649"/>
+          </w:tcPr>
+          <w:p>
+            <w:pPr>
+              <w:bidi w:val="1"/>
+              <w:spacing w:line="276" w:lineRule="auto"/>
+            </w:pPr>
+            <w:r>
+              <w:rPr>
+                <w:rFonts w:ascii="Arial" w:hAnsi="Arial"/>
+                <w:b/>
+                <w:color w:val="00008B"/>
+              </w:rPr>
+              <w:t>כתובת:</w:t>
+            </w:r>
+            <w:r>
+              <w:rPr>
+                <w:rFonts w:ascii="Arial" w:hAnsi="Arial"/>
+                <w:b w:val="0"/>
+                <w:color w:val="000000"/>
+              </w:rPr>
+              <w:t xml:space="preserve"> </w:t>
+            </w:r>
+            <w:r>
+              <w:rPr>
+                <w:rFonts w:ascii="Arial" w:hAnsi="Arial"/>
+                <w:b w:val="0"/>
+                <w:color w:val="000000"/>
+              </w:rPr>
+              <w:t>הרב אפריאט 6, רמלה</w:t>
+            </w:r>
+          </w:p>
+        </w:tc>
+        <w:tc>
+          <w:tcPr>
+            <w:tcW w:type="dxa" w:w="2649"/>
+          </w:tcPr>
+          <w:p>
             <w:r>
               <w:rPr>
                 <w:rFonts w:ascii="Arial" w:hAnsi="Arial"/>
@@ -4605,7 +4619,7 @@
     </w:tbl>
     <w:p>
       <w:pPr>
-        <w:spacing w:after="200" w:before="160"/>
+        <w:spacing w:after="160" w:before="120"/>
         <w:ind w:right="907"/>
         <w:jc w:val="center"/>
         <w:bidi w:val="1"/>
@@ -4624,7 +4638,7 @@
       <w:pPr>
         <w:spacing w:after="160" w:line="467" w:lineRule="auto"/>
         <w:ind w:left="212" w:hanging="10"/>
-        <w:jc w:val="left"/>
+        <w:jc w:val="right"/>
         <w:bidi w:val="1"/>
       </w:pPr>
       <w:r>
@@ -4649,8 +4663,8 @@
           <w:tab w:val="center" w:pos="6175"/>
           <w:tab w:val="center" w:pos="6979"/>
         </w:tabs>
-        <w:spacing w:after="320" w:line="467" w:lineRule="auto"/>
-        <w:jc w:val="left"/>
+        <w:spacing w:after="400" w:line="467" w:lineRule="auto"/>
+        <w:jc w:val="right"/>
         <w:bidi w:val="1"/>
       </w:pPr>
       <w:r>
@@ -4676,7 +4690,7 @@
           <w:b w:val="0"/>
           <w:color w:val="000000"/>
         </w:rPr>
-        <w:t xml:space="preserve">   </w:t>
+        <w:t xml:space="preserve">    </w:t>
       </w:r>
       <w:r>
         <w:rPr>
@@ -4701,7 +4715,7 @@
           <w:b w:val="0"/>
           <w:color w:val="000000"/>
         </w:rPr>
-        <w:t xml:space="preserve">   </w:t>
+        <w:t xml:space="preserve">    </w:t>
       </w:r>
       <w:r>
         <w:rPr>
@@ -4720,210 +4734,263 @@
         <w:t>4 ימים.</w:t>
       </w:r>
     </w:p>
-    <w:p>
-      <w:pPr>
-        <w:bidi w:val="0"/>
-        <w:spacing w:after="0"/>
-        <w:ind w:right="490"/>
-      </w:pPr>
-      <w:r>
-        <w:rPr>
-          <w:rFonts w:ascii="Arial" w:eastAsia="Arial" w:hAnsi="Arial" w:cs="Arial"/>
-          <w:sz w:val="20"/>
-        </w:rPr>
-        <w:t>31/08/2026</w:t>
-      </w:r>
-    </w:p>
-    <w:p>
-      <w:pPr>
-        <w:bidi w:val="0"/>
-        <w:spacing w:after="151"/>
-        <w:ind w:left="531"/>
-        <w:jc w:val="left"/>
-      </w:pPr>
-      <w:r>
-        <w:rPr>
-          <w:noProof/>
-        </w:rPr>
-        <mc:AlternateContent>
-          <mc:Choice Requires="wpg">
-            <w:drawing>
-              <wp:inline distT="0" distB="0" distL="0" distR="0" wp14:anchorId="3ADCAACD" wp14:editId="3E914B8C">
-                <wp:extent cx="6343650" cy="9525"/>
-                <wp:effectExtent l="0" t="0" r="0" b="0"/>
-                <wp:docPr id="2909" name="Group 2909"/>
-                <wp:cNvGraphicFramePr/>
-                <a:graphic xmlns:a="http://schemas.openxmlformats.org/drawingml/2006/main">
-                  <a:graphicData uri="http://schemas.microsoft.com/office/word/2010/wordprocessingGroup">
-                    <wpg:wgp>
-                      <wpg:cNvGrpSpPr/>
-                      <wpg:grpSpPr>
-                        <a:xfrm>
-                          <a:off x="0" y="0"/>
-                          <a:ext cx="6343650" cy="9525"/>
-                          <a:chOff x="0" y="0"/>
-                          <a:chExt cx="6343650" cy="9525"/>
-                        </a:xfrm>
-                      </wpg:grpSpPr>
-                      <wps:wsp>
-                        <wps:cNvPr id="235" name="Shape 235"/>
-                        <wps:cNvSpPr/>
-                        <wps:spPr>
-                          <a:xfrm>
-                            <a:off x="5419725" y="0"/>
-                            <a:ext cx="923925" cy="0"/>
-                          </a:xfrm>
-                          <a:custGeom>
-                            <a:avLst/>
-                            <a:gdLst/>
-                            <a:ahLst/>
-                            <a:cxnLst/>
-                            <a:rect l="0" t="0" r="0" b="0"/>
-                            <a:pathLst>
-                              <a:path w="923925">
-                                <a:moveTo>
-                                  <a:pt x="923925" y="0"/>
-                                </a:moveTo>
-                                <a:lnTo>
-                                  <a:pt x="0" y="0"/>
-                                </a:lnTo>
-                              </a:path>
-                            </a:pathLst>
-                          </a:custGeom>
-                          <a:ln w="9525" cap="flat">
-                            <a:miter lim="127000"/>
-                          </a:ln>
-                        </wps:spPr>
-                        <wps:style>
-                          <a:lnRef idx="1">
-                            <a:srgbClr val="00008B"/>
-                          </a:lnRef>
-                          <a:fillRef idx="0">
-                            <a:srgbClr val="000000">
-                              <a:alpha val="0"/>
-                            </a:srgbClr>
-                          </a:fillRef>
-                          <a:effectRef idx="0">
-                            <a:scrgbClr r="0" g="0" b="0"/>
-                          </a:effectRef>
-                          <a:fontRef idx="none"/>
-                        </wps:style>
-                        <wps:bodyPr/>
-                      </wps:wsp>
-                      <wps:wsp>
-                        <wps:cNvPr id="236" name="Shape 236"/>
-                        <wps:cNvSpPr/>
-                        <wps:spPr>
-                          <a:xfrm>
-                            <a:off x="0" y="0"/>
-                            <a:ext cx="1533525" cy="0"/>
-                          </a:xfrm>
-                          <a:custGeom>
-                            <a:avLst/>
-                            <a:gdLst/>
-                            <a:ahLst/>
-                            <a:cxnLst/>
-                            <a:rect l="0" t="0" r="0" b="0"/>
-                            <a:pathLst>
-                              <a:path w="1533525">
-                                <a:moveTo>
-                                  <a:pt x="1533525" y="0"/>
-                                </a:moveTo>
-                                <a:lnTo>
-                                  <a:pt x="0" y="0"/>
-                                </a:lnTo>
-                              </a:path>
-                            </a:pathLst>
-                          </a:custGeom>
-                          <a:ln w="9525" cap="flat">
-                            <a:miter lim="127000"/>
-                          </a:ln>
-                        </wps:spPr>
-                        <wps:style>
-                          <a:lnRef idx="1">
-                            <a:srgbClr val="00008B"/>
-                          </a:lnRef>
-                          <a:fillRef idx="0">
-                            <a:srgbClr val="000000">
-                              <a:alpha val="0"/>
-                            </a:srgbClr>
-                          </a:fillRef>
-                          <a:effectRef idx="0">
-                            <a:scrgbClr r="0" g="0" b="0"/>
-                          </a:effectRef>
-                          <a:fontRef idx="none"/>
-                        </wps:style>
-                        <wps:bodyPr/>
-                      </wps:wsp>
-                    </wpg:wgp>
-                  </a:graphicData>
-                </a:graphic>
-              </wp:inline>
-            </w:drawing>
-          </mc:Choice>
-          <mc:Fallback xmlns:a="http://schemas.openxmlformats.org/drawingml/2006/main">
-            <w:pict>
-              <v:group id="Group 2909" style="width:499.5pt;height:0.75pt;mso-position-horizontal-relative:char;mso-position-vertical-relative:line" coordsize="63436,95">
-                <v:shape id="Shape 235" style="position:absolute;width:9239;height:0;left:54197;top:0;" coordsize="923925,0" path="m923925,0l0,0">
-                  <v:stroke weight="0.75pt" endcap="flat" joinstyle="miter" miterlimit="10" on="true" color="#00008b"/>
-                  <v:fill on="false" color="#000000" opacity="0"/>
-                </v:shape>
-                <v:shape id="Shape 236" style="position:absolute;width:15335;height:0;left:0;top:0;" coordsize="1533525,0" path="m1533525,0l0,0">
-                  <v:stroke weight="0.75pt" endcap="flat" joinstyle="miter" miterlimit="10" on="true" color="#00008b"/>
-                  <v:fill on="false" color="#000000" opacity="0"/>
-                </v:shape>
-              </v:group>
-            </w:pict>
-          </mc:Fallback>
-        </mc:AlternateContent>
-      </w:r>
-    </w:p>
-    <w:p>
-      <w:pPr>
-        <w:tabs>
-          <w:tab w:val="center" w:pos="700"/>
-          <w:tab w:val="center" w:pos="8738"/>
-        </w:tabs>
-        <w:spacing w:after="0" w:before="480"/>
-        <w:jc w:val="left"/>
-        <w:bidi w:val="1"/>
-      </w:pPr>
-      <w:r>
-        <w:rPr>
-          <w:rFonts w:ascii="Arial" w:hAnsi="Arial"/>
-          <w:b w:val="0"/>
-          <w:color w:val="000000"/>
-        </w:rPr>
-        <w:tab/>
-      </w:r>
-      <w:r>
-        <w:rPr>
-          <w:rFonts w:ascii="Arial" w:hAnsi="Arial"/>
-          <w:b/>
-          <w:color w:val="00008B"/>
-        </w:rPr>
-        <w:t>תאריך</w:t>
-      </w:r>
-      <w:r>
-        <w:rPr>
-          <w:rFonts w:ascii="Arial" w:hAnsi="Arial"/>
-          <w:b w:val="0"/>
-          <w:color w:val="000000"/>
-        </w:rPr>
-        <w:tab/>
-        <w:tab/>
-        <w:tab/>
-        <w:tab/>
-      </w:r>
-      <w:r>
-        <w:rPr>
-          <w:rFonts w:ascii="Arial" w:hAnsi="Arial"/>
-          <w:b/>
-          <w:color w:val="00008B"/>
-        </w:rPr>
-        <w:t>חתימה וחותמת הרופא</w:t>
-      </w:r>
-    </w:p>
+    <w:tbl>
+      <w:tblPr>
+        <w:tblW w:type="auto" w:w="0"/>
+        <w:tblLayout w:type="fixed"/>
+        <w:tblLook w:firstColumn="1" w:firstRow="1" w:lastColumn="0" w:lastRow="0" w:noHBand="0" w:noVBand="1" w:val="04A0"/>
+        <w:jc w:val="center"/>
+        <w:tblBorders>
+          <w:top w:val="none"/>
+          <w:left w:val="none"/>
+          <w:bottom w:val="none"/>
+          <w:right w:val="none"/>
+          <w:insideH w:val="none"/>
+          <w:insideV w:val="none"/>
+        </w:tblBorders>
+      </w:tblPr>
+      <w:tblGrid>
+        <w:gridCol w:w="5298"/>
+        <w:gridCol w:w="5298"/>
+      </w:tblGrid>
+      <w:tr>
+        <w:tc>
+          <w:tcPr>
+            <w:tcW w:type="dxa" w:w="5102"/>
+          </w:tcPr>
+          <w:p>
+            <w:pPr>
+              <w:bidi w:val="1"/>
+              <w:spacing w:before="480"/>
+              <w:jc w:val="right"/>
+            </w:pPr>
+            <w:r>
+              <w:rPr>
+                <w:rFonts w:ascii="Arial" w:hAnsi="Arial"/>
+                <w:b w:val="0"/>
+                <w:color w:val="000000"/>
+                <w:rtl w:val="0"/>
+              </w:rPr>
+              <w:t>‎31/08/2026</w:t>
+            </w:r>
+          </w:p>
+        </w:tc>
+        <w:tc>
+          <w:tcPr>
+            <w:tcW w:type="dxa" w:w="5102"/>
+          </w:tcPr>
+          <w:p/>
+        </w:tc>
+      </w:tr>
+      <w:tr>
+        <w:tc>
+          <w:tcPr>
+            <w:tcW w:type="dxa" w:w="5102"/>
+          </w:tcPr>
+          <w:p>
+            <w:pPr>
+              <w:bidi w:val="1"/>
+              <w:jc w:val="right"/>
+            </w:pPr>
+            <w:r>
+              <w:rPr>
+                <w:rFonts w:ascii="Arial" w:hAnsi="Arial"/>
+                <w:b w:val="0"/>
+                <w:color w:val="000000"/>
+              </w:rPr>
+              <w:t>________________________</w:t>
+            </w:r>
+          </w:p>
+        </w:tc>
+        <w:tc>
+          <w:tcPr>
+            <w:tcW w:type="dxa" w:w="5102"/>
+          </w:tcPr>
+          <w:p>
+            <w:pPr>
+              <w:bidi w:val="1"/>
+              <w:jc w:val="left"/>
+            </w:pPr>
+            <w:r>
+              <w:rPr>
+                <w:noProof/>
+              </w:rPr>
+              <mc:AlternateContent>
+                <mc:Choice Requires="wpg">
+                  <w:drawing>
+                    <wp:inline distT="0" distB="0" distL="0" distR="0" wp14:anchorId="3ADCAACD" wp14:editId="3E914B8C">
+                      <wp:extent cx="6343650" cy="9525"/>
+                      <wp:effectExtent l="0" t="0" r="0" b="0"/>
+                      <wp:docPr id="2909" name="Group 2909"/>
+                      <wp:cNvGraphicFramePr/>
+                      <a:graphic xmlns:a="http://schemas.openxmlformats.org/drawingml/2006/main">
+                        <a:graphicData uri="http://schemas.microsoft.com/office/word/2010/wordprocessingGroup">
+                          <wpg:wgp>
+                            <wpg:cNvGrpSpPr/>
+                            <wpg:grpSpPr>
+                              <a:xfrm>
+                                <a:off x="0" y="0"/>
+                                <a:ext cx="6343650" cy="9525"/>
+                                <a:chOff x="0" y="0"/>
+                                <a:chExt cx="6343650" cy="9525"/>
+                              </a:xfrm>
+                            </wpg:grpSpPr>
+                            <wps:wsp>
+                              <wps:cNvPr id="235" name="Shape 235"/>
+                              <wps:cNvSpPr/>
+                              <wps:spPr>
+                                <a:xfrm>
+                                  <a:off x="5419725" y="0"/>
+                                  <a:ext cx="923925" cy="0"/>
+                                </a:xfrm>
+                                <a:custGeom>
+                                  <a:avLst/>
+                                  <a:gdLst/>
+                                  <a:ahLst/>
+                                  <a:cxnLst/>
+                                  <a:rect l="0" t="0" r="0" b="0"/>
+                                  <a:pathLst>
+                                    <a:path w="923925">
+                                      <a:moveTo>
+                                        <a:pt x="923925" y="0"/>
+                                      </a:moveTo>
+                                      <a:lnTo>
+                                        <a:pt x="0" y="0"/>
+                                      </a:lnTo>
+                                    </a:path>
+                                  </a:pathLst>
+                                </a:custGeom>
+                                <a:ln w="9525" cap="flat">
+                                  <a:miter lim="127000"/>
+                                </a:ln>
+                              </wps:spPr>
+                              <wps:style>
+                                <a:lnRef idx="1">
+                                  <a:srgbClr val="00008B"/>
+                                </a:lnRef>
+                                <a:fillRef idx="0">
+                                  <a:srgbClr val="000000">
+                                    <a:alpha val="0"/>
+                                  </a:srgbClr>
+                                </a:fillRef>
+                                <a:effectRef idx="0">
+                                  <a:scrgbClr r="0" g="0" b="0"/>
+                                </a:effectRef>
+                                <a:fontRef idx="none"/>
+                              </wps:style>
+                              <wps:bodyPr/>
+                            </wps:wsp>
+                            <wps:wsp>
+                              <wps:cNvPr id="236" name="Shape 236"/>
+                              <wps:cNvSpPr/>
+                              <wps:spPr>
+                                <a:xfrm>
+                                  <a:off x="0" y="0"/>
+                                  <a:ext cx="1533525" cy="0"/>
+                                </a:xfrm>
+                                <a:custGeom>
+                                  <a:avLst/>
+                                  <a:gdLst/>
+                                  <a:ahLst/>
+                                  <a:cxnLst/>
+                                  <a:rect l="0" t="0" r="0" b="0"/>
+                                  <a:pathLst>
+                                    <a:path w="1533525">
+                                      <a:moveTo>
+                                        <a:pt x="1533525" y="0"/>
+                                      </a:moveTo>
+                                      <a:lnTo>
+                                        <a:pt x="0" y="0"/>
+                                      </a:lnTo>
+                                    </a:path>
+                                  </a:pathLst>
+                                </a:custGeom>
+                                <a:ln w="9525" cap="flat">
+                                  <a:miter lim="127000"/>
+                                </a:ln>
+                              </wps:spPr>
+                              <wps:style>
+                                <a:lnRef idx="1">
+                                  <a:srgbClr val="00008B"/>
+                                </a:lnRef>
+                                <a:fillRef idx="0">
+                                  <a:srgbClr val="000000">
+                                    <a:alpha val="0"/>
+                                  </a:srgbClr>
+                                </a:fillRef>
+                                <a:effectRef idx="0">
+                                  <a:scrgbClr r="0" g="0" b="0"/>
+                                </a:effectRef>
+                                <a:fontRef idx="none"/>
+                              </wps:style>
+                              <wps:bodyPr/>
+                            </wps:wsp>
+                          </wpg:wgp>
+                        </a:graphicData>
+                      </a:graphic>
+                    </wp:inline>
+                  </w:drawing>
+                </mc:Choice>
+                <mc:Fallback xmlns:a="http://schemas.openxmlformats.org/drawingml/2006/main">
+                  <w:pict>
+                    <v:group id="Group 2909" style="width:499.5pt;height:0.75pt;mso-position-horizontal-relative:char;mso-position-vertical-relative:line" coordsize="63436,95">
+                      <v:shape id="Shape 235" style="position:absolute;width:9239;height:0;left:54197;top:0;" coordsize="923925,0" path="m923925,0l0,0">
+                        <v:stroke weight="0.75pt" endcap="flat" joinstyle="miter" miterlimit="10" on="true" color="#00008b"/>
+                        <v:fill on="false" color="#000000" opacity="0"/>
+                      </v:shape>
+                      <v:shape id="Shape 236" style="position:absolute;width:15335;height:0;left:0;top:0;" coordsize="1533525,0" path="m1533525,0l0,0">
+                        <v:stroke weight="0.75pt" endcap="flat" joinstyle="miter" miterlimit="10" on="true" color="#00008b"/>
+                        <v:fill on="false" color="#000000" opacity="0"/>
+                      </v:shape>
+                    </v:group>
+                  </w:pict>
+                </mc:Fallback>
+              </mc:AlternateContent>
+            </w:r>
+          </w:p>
+        </w:tc>
+      </w:tr>
+      <w:tr>
+        <w:tc>
+          <w:tcPr>
+            <w:tcW w:type="dxa" w:w="5102"/>
+          </w:tcPr>
+          <w:p>
+            <w:pPr>
+              <w:bidi w:val="1"/>
+              <w:jc w:val="right"/>
+            </w:pPr>
+            <w:r>
+              <w:rPr>
+                <w:rFonts w:ascii="Arial" w:hAnsi="Arial"/>
+                <w:b/>
+                <w:color w:val="00008B"/>
+              </w:rPr>
+              <w:t>תאריך</w:t>
+            </w:r>
+          </w:p>
+        </w:tc>
+        <w:tc>
+          <w:tcPr>
+            <w:tcW w:type="dxa" w:w="5102"/>
+          </w:tcPr>
+          <w:p>
+            <w:pPr>
+              <w:bidi w:val="1"/>
+              <w:jc w:val="left"/>
+            </w:pPr>
+            <w:r>
+              <w:rPr>
+                <w:rFonts w:ascii="Arial" w:hAnsi="Arial"/>
+                <w:b/>
+                <w:color w:val="00008B"/>
+              </w:rPr>
+              <w:t>חתימה וחותמת הרופא</w:t>
+            </w:r>
+          </w:p>
+        </w:tc>
+      </w:tr>
+    </w:tbl>
     <w:sectPr>
       <w:pgSz w:w="11906" w:h="16838"/>
       <w:pgMar w:top="1440" w:right="705" w:bottom="1440" w:left="604" w:header="720" w:footer="720" w:gutter="0"/>

</xml_diff>

<commit_message>
Fix RTL label/value order with explicit RTL runs, RLM, and Hebrew lang
- Mark Hebrew label runs w:rtl=1 and LTR values with LRM+RLM boundaries
- Right-align patient table cells; set document body bidi default
- Add he-IL language on RTL runs for Google Docs/mobile renderers

Co-authored-by: Ron Gurfinkel <RonBabaj@users.noreply.github.com>
</commit_message>
<xml_diff>
--- a/exports/medical_certificate.docx
+++ b/exports/medical_certificate.docx
@@ -2,6 +2,9 @@
 <file path=word/document.xml><?xml version="1.0" encoding="utf-8"?>
 <w:document xmlns:wpc="http://schemas.microsoft.com/office/word/2010/wordprocessingCanvas" xmlns:cx="http://schemas.microsoft.com/office/drawing/2014/chartex" xmlns:cx1="http://schemas.microsoft.com/office/drawing/2015/9/8/chartex" xmlns:cx2="http://schemas.microsoft.com/office/drawing/2015/10/21/chartex" xmlns:cx3="http://schemas.microsoft.com/office/drawing/2016/5/9/chartex" xmlns:cx4="http://schemas.microsoft.com/office/drawing/2016/5/10/chartex" xmlns:cx5="http://schemas.microsoft.com/office/drawing/2016/5/11/chartex" xmlns:cx6="http://schemas.microsoft.com/office/drawing/2016/5/12/chartex" xmlns:cx7="http://schemas.microsoft.com/office/drawing/2016/5/13/chartex" xmlns:cx8="http://schemas.microsoft.com/office/drawing/2016/5/14/chartex" xmlns:mc="http://schemas.openxmlformats.org/markup-compatibility/2006" xmlns:m="http://schemas.openxmlformats.org/officeDocument/2006/math" xmlns:aink="http://schemas.microsoft.com/office/drawing/2016/ink" xmlns:am3d="http://schemas.microsoft.com/office/drawing/2017/model3d" xmlns:oel="http://schemas.microsoft.com/office/2019/extlst" xmlns:r="http://schemas.openxmlformats.org/officeDocument/2006/relationships" xmlns:wp14="http://schemas.microsoft.com/office/word/2010/wordprocessingDrawing" xmlns:wp="http://schemas.openxmlformats.org/drawingml/2006/wordprocessingDrawing" xmlns:wpg="http://schemas.microsoft.com/office/word/2010/wordprocessingGroup" xmlns:wpi="http://schemas.microsoft.com/office/word/2010/wordprocessingInk" xmlns:wps="http://schemas.microsoft.com/office/word/2010/wordprocessingShape" xmlns:o="urn:schemas-microsoft-com:office:office" xmlns:v="urn:schemas-microsoft-com:vml" xmlns:w10="urn:schemas-microsoft-com:office:word" xmlns:w="http://schemas.openxmlformats.org/wordprocessingml/2006/main" xmlns:w14="http://schemas.microsoft.com/office/word/2010/wordml" xmlns:w15="http://schemas.microsoft.com/office/word/2012/wordml" xmlns:w16cex="http://schemas.microsoft.com/office/word/2018/wordml/cex" xmlns:w16cid="http://schemas.microsoft.com/office/word/2016/wordml/cid" xmlns:w16="http://schemas.microsoft.com/office/word/2018/wordml" xmlns:w16sdtdh="http://schemas.microsoft.com/office/word/2020/wordml/sdtdatahash" xmlns:w16sdtfl="http://schemas.microsoft.com/office/word/2024/wordml/sdtformatlock" xmlns:w16se="http://schemas.microsoft.com/office/word/2015/wordml/symex" xmlns:w16du="http://schemas.microsoft.com/office/word/2023/wordml/word16du" xmlns:wne="http://schemas.microsoft.com/office/word/2006/wordml" mc:Ignorable="w14 w15 w16se w16cid w16 w16cex w16sdtdh w16sdtfl w16du wp14">
   <w:body>
+    <w:bodyPr>
+      <w:bidi w:val="1"/>
+    </w:bodyPr>
     <w:tbl>
       <w:tblPr>
         <w:tblW w:type="auto" w:w="0"/>
@@ -37,6 +40,7 @@
                 <w:rFonts w:ascii="Arial" w:hAnsi="Arial"/>
                 <w:b/>
                 <w:color w:val="000000"/>
+                <w:rtl w:val="1"/>
               </w:rPr>
               <w:t>דר' קגנוביץ גלינה</w:t>
             </w:r>
@@ -57,6 +61,7 @@
                 <w:b/>
                 <w:color w:val="000000"/>
                 <w:sz w:val="28"/>
+                <w:rtl w:val="1"/>
               </w:rPr>
               <w:t>מכבי שירותי בריאות</w:t>
             </w:r>
@@ -76,6 +81,7 @@
                 <w:rFonts w:ascii="Arial" w:hAnsi="Arial"/>
                 <w:b/>
                 <w:color w:val="00008B"/>
+                <w:rtl w:val="1"/>
               </w:rPr>
               <w:t xml:space="preserve">תאריך: </w:t>
             </w:r>
@@ -94,6 +100,14 @@
                 <w:b w:val="0"/>
                 <w:color w:val="000000"/>
               </w:rPr>
+              <w:t>‏</w:t>
+            </w:r>
+            <w:r>
+              <w:rPr>
+                <w:rFonts w:ascii="Arial" w:hAnsi="Arial"/>
+                <w:b w:val="0"/>
+                <w:color w:val="000000"/>
+              </w:rPr>
               <w:br/>
             </w:r>
             <w:r>
@@ -101,6 +115,7 @@
                 <w:rFonts w:ascii="Arial" w:hAnsi="Arial"/>
                 <w:b/>
                 <w:color w:val="00008B"/>
+                <w:rtl w:val="1"/>
               </w:rPr>
               <w:t xml:space="preserve">מ.ר </w:t>
             </w:r>
@@ -109,6 +124,7 @@
                 <w:rFonts w:ascii="Arial" w:hAnsi="Arial"/>
                 <w:b/>
                 <w:color w:val="00008B"/>
+                <w:rtl w:val="1"/>
               </w:rPr>
               <w:t>גורם מפנה</w:t>
             </w:r>
@@ -1763,6 +1779,7 @@
           <w:rFonts w:ascii="Arial" w:hAnsi="Arial"/>
           <w:b w:val="0"/>
           <w:color w:val="000000"/>
+          <w:rtl w:val="1"/>
         </w:rPr>
         <w:t>משפחה, פנימית וכללית</w:t>
       </w:r>
@@ -1779,6 +1796,7 @@
           <w:rFonts w:ascii="Arial" w:hAnsi="Arial"/>
           <w:b/>
           <w:color w:val="00008B"/>
+          <w:rtl w:val="1"/>
         </w:rPr>
         <w:t xml:space="preserve">טלפון: </w:t>
       </w:r>
@@ -1797,6 +1815,14 @@
           <w:b w:val="0"/>
           <w:color w:val="000000"/>
         </w:rPr>
+        <w:t>‏</w:t>
+      </w:r>
+      <w:r>
+        <w:rPr>
+          <w:rFonts w:ascii="Arial" w:hAnsi="Arial"/>
+          <w:b w:val="0"/>
+          <w:color w:val="000000"/>
+        </w:rPr>
         <w:br/>
       </w:r>
       <w:r>
@@ -1804,6 +1830,7 @@
           <w:rFonts w:ascii="Arial" w:hAnsi="Arial"/>
           <w:b/>
           <w:color w:val="00008B"/>
+          <w:rtl w:val="1"/>
         </w:rPr>
         <w:t xml:space="preserve">פקס: </w:t>
       </w:r>
@@ -1815,6 +1842,14 @@
           <w:rtl w:val="0"/>
         </w:rPr>
         <w:t>‎08-9257689</w:t>
+      </w:r>
+      <w:r>
+        <w:rPr>
+          <w:rFonts w:ascii="Arial" w:hAnsi="Arial"/>
+          <w:b w:val="0"/>
+          <w:color w:val="000000"/>
+        </w:rPr>
+        <w:t>‏</w:t>
       </w:r>
     </w:p>
     <w:p>
@@ -1832,6 +1867,7 @@
           <w:rFonts w:ascii="Arial" w:hAnsi="Arial"/>
           <w:b/>
           <w:color w:val="00008B"/>
+          <w:rtl w:val="1"/>
         </w:rPr>
         <w:t xml:space="preserve">כתובת: </w:t>
       </w:r>
@@ -1840,6 +1876,7 @@
           <w:rFonts w:ascii="Arial" w:hAnsi="Arial"/>
           <w:b w:val="0"/>
           <w:color w:val="000000"/>
+          <w:rtl w:val="1"/>
         </w:rPr>
         <w:t>שטרן יאיר 14, רמלה</w:t>
       </w:r>
@@ -1888,12 +1925,14 @@
             <w:pPr>
               <w:bidi w:val="1"/>
               <w:spacing w:line="276" w:lineRule="auto"/>
+              <w:jc w:val="right"/>
             </w:pPr>
             <w:r>
               <w:rPr>
                 <w:rFonts w:ascii="Arial" w:hAnsi="Arial"/>
                 <w:b/>
                 <w:color w:val="00008B"/>
+                <w:rtl w:val="1"/>
               </w:rPr>
               <w:t>פרטי הנבדק:</w:t>
             </w:r>
@@ -1909,12 +1948,14 @@
             <w:pPr>
               <w:bidi w:val="1"/>
               <w:spacing w:line="276" w:lineRule="auto"/>
+              <w:jc w:val="right"/>
             </w:pPr>
             <w:r>
               <w:rPr>
                 <w:rFonts w:ascii="Arial" w:hAnsi="Arial"/>
                 <w:b/>
                 <w:color w:val="00008B"/>
+                <w:rtl w:val="1"/>
               </w:rPr>
               <w:t>ת.ז.:</w:t>
             </w:r>
@@ -1935,6 +1976,14 @@
               </w:rPr>
               <w:t>‎215359910</w:t>
             </w:r>
+            <w:r>
+              <w:rPr>
+                <w:rFonts w:ascii="Arial" w:hAnsi="Arial"/>
+                <w:b w:val="0"/>
+                <w:color w:val="000000"/>
+              </w:rPr>
+              <w:t>‏</w:t>
+            </w:r>
           </w:p>
         </w:tc>
         <w:tc>
@@ -1945,12 +1994,14 @@
             <w:pPr>
               <w:bidi w:val="1"/>
               <w:spacing w:line="276" w:lineRule="auto"/>
+              <w:jc w:val="right"/>
             </w:pPr>
             <w:r>
               <w:rPr>
                 <w:rFonts w:ascii="Arial" w:hAnsi="Arial"/>
                 <w:b/>
                 <w:color w:val="00008B"/>
+                <w:rtl w:val="1"/>
               </w:rPr>
               <w:t>שם פרטי:</w:t>
             </w:r>
@@ -1967,6 +2018,7 @@
                 <w:rFonts w:ascii="Arial" w:hAnsi="Arial"/>
                 <w:b w:val="0"/>
                 <w:color w:val="000000"/>
+                <w:rtl w:val="1"/>
               </w:rPr>
               <w:t>רון</w:t>
             </w:r>
@@ -1980,12 +2032,14 @@
             <w:pPr>
               <w:bidi w:val="1"/>
               <w:spacing w:line="276" w:lineRule="auto"/>
+              <w:jc w:val="right"/>
             </w:pPr>
             <w:r>
               <w:rPr>
                 <w:rFonts w:ascii="Arial" w:hAnsi="Arial"/>
                 <w:b/>
                 <w:color w:val="00008B"/>
+                <w:rtl w:val="1"/>
               </w:rPr>
               <w:t>שם משפחה:</w:t>
             </w:r>
@@ -2002,6 +2056,7 @@
                 <w:rFonts w:ascii="Arial" w:hAnsi="Arial"/>
                 <w:b w:val="0"/>
                 <w:color w:val="000000"/>
+                <w:rtl w:val="1"/>
               </w:rPr>
               <w:t>גורפינקל</w:t>
             </w:r>
@@ -4382,12 +4437,14 @@
             <w:pPr>
               <w:bidi w:val="1"/>
               <w:spacing w:line="276" w:lineRule="auto"/>
+              <w:jc w:val="right"/>
             </w:pPr>
             <w:r>
               <w:rPr>
                 <w:rFonts w:ascii="Arial" w:hAnsi="Arial"/>
                 <w:b/>
                 <w:color w:val="00008B"/>
+                <w:rtl w:val="1"/>
               </w:rPr>
               <w:t>טל.עבודה/נייד:</w:t>
             </w:r>
@@ -4408,6 +4465,14 @@
               </w:rPr>
               <w:t>‎0522460193</w:t>
             </w:r>
+            <w:r>
+              <w:rPr>
+                <w:rFonts w:ascii="Arial" w:hAnsi="Arial"/>
+                <w:b w:val="0"/>
+                <w:color w:val="000000"/>
+              </w:rPr>
+              <w:t>‏</w:t>
+            </w:r>
           </w:p>
         </w:tc>
         <w:tc>
@@ -4418,12 +4483,14 @@
             <w:pPr>
               <w:bidi w:val="1"/>
               <w:spacing w:line="276" w:lineRule="auto"/>
+              <w:jc w:val="right"/>
             </w:pPr>
             <w:r>
               <w:rPr>
                 <w:rFonts w:ascii="Arial" w:hAnsi="Arial"/>
                 <w:b/>
                 <w:color w:val="00008B"/>
+                <w:rtl w:val="1"/>
               </w:rPr>
               <w:t>טלפון:</w:t>
             </w:r>
@@ -4444,6 +4511,14 @@
               </w:rPr>
               <w:t>‎08-9244787</w:t>
             </w:r>
+            <w:r>
+              <w:rPr>
+                <w:rFonts w:ascii="Arial" w:hAnsi="Arial"/>
+                <w:b w:val="0"/>
+                <w:color w:val="000000"/>
+              </w:rPr>
+              <w:t>‏</w:t>
+            </w:r>
           </w:p>
         </w:tc>
         <w:tc>
@@ -4454,12 +4529,14 @@
             <w:pPr>
               <w:bidi w:val="1"/>
               <w:spacing w:line="276" w:lineRule="auto"/>
+              <w:jc w:val="right"/>
             </w:pPr>
             <w:r>
               <w:rPr>
                 <w:rFonts w:ascii="Arial" w:hAnsi="Arial"/>
                 <w:b/>
                 <w:color w:val="00008B"/>
+                <w:rtl w:val="1"/>
               </w:rPr>
               <w:t>ת.לידה:</w:t>
             </w:r>
@@ -4486,6 +4563,14 @@
                 <w:b w:val="0"/>
                 <w:color w:val="000000"/>
               </w:rPr>
+              <w:t>‏</w:t>
+            </w:r>
+            <w:r>
+              <w:rPr>
+                <w:rFonts w:ascii="Arial" w:hAnsi="Arial"/>
+                <w:b w:val="0"/>
+                <w:color w:val="000000"/>
+              </w:rPr>
               <w:br/>
             </w:r>
             <w:r>
@@ -4493,6 +4578,7 @@
                 <w:rFonts w:ascii="Arial" w:hAnsi="Arial"/>
                 <w:b/>
                 <w:color w:val="00008B"/>
+                <w:rtl w:val="1"/>
               </w:rPr>
               <w:t>מין:</w:t>
             </w:r>
@@ -4509,6 +4595,7 @@
                 <w:rFonts w:ascii="Arial" w:hAnsi="Arial"/>
                 <w:b w:val="0"/>
                 <w:color w:val="000000"/>
+                <w:rtl w:val="1"/>
               </w:rPr>
               <w:t>ז</w:t>
             </w:r>
@@ -4530,12 +4617,14 @@
             <w:pPr>
               <w:bidi w:val="1"/>
               <w:spacing w:line="276" w:lineRule="auto"/>
+              <w:jc w:val="right"/>
             </w:pPr>
             <w:r>
               <w:rPr>
                 <w:rFonts w:ascii="Arial" w:hAnsi="Arial"/>
                 <w:b/>
                 <w:color w:val="00008B"/>
+                <w:rtl w:val="1"/>
               </w:rPr>
               <w:t>מיקוד:</w:t>
             </w:r>
@@ -4556,6 +4645,14 @@
               </w:rPr>
               <w:t>‎7228212</w:t>
             </w:r>
+            <w:r>
+              <w:rPr>
+                <w:rFonts w:ascii="Arial" w:hAnsi="Arial"/>
+                <w:b w:val="0"/>
+                <w:color w:val="000000"/>
+              </w:rPr>
+              <w:t>‏</w:t>
+            </w:r>
           </w:p>
         </w:tc>
         <w:tc>
@@ -4572,12 +4669,14 @@
             <w:pPr>
               <w:bidi w:val="1"/>
               <w:spacing w:line="276" w:lineRule="auto"/>
+              <w:jc w:val="right"/>
             </w:pPr>
             <w:r>
               <w:rPr>
                 <w:rFonts w:ascii="Arial" w:hAnsi="Arial"/>
                 <w:b/>
                 <w:color w:val="00008B"/>
+                <w:rtl w:val="1"/>
               </w:rPr>
               <w:t>כתובת:</w:t>
             </w:r>
@@ -4594,6 +4693,7 @@
                 <w:rFonts w:ascii="Arial" w:hAnsi="Arial"/>
                 <w:b w:val="0"/>
                 <w:color w:val="000000"/>
+                <w:rtl w:val="1"/>
               </w:rPr>
               <w:t>הרב אפריאט 6, רמלה</w:t>
             </w:r>
@@ -4613,6 +4713,14 @@
               </w:rPr>
               <w:t>‎0215359910</w:t>
             </w:r>
+            <w:r>
+              <w:rPr>
+                <w:rFonts w:ascii="Arial" w:hAnsi="Arial"/>
+                <w:b w:val="0"/>
+                <w:color w:val="000000"/>
+              </w:rPr>
+              <w:t>‏</w:t>
+            </w:r>
           </w:p>
         </w:tc>
       </w:tr>
@@ -4630,6 +4738,7 @@
           <w:b/>
           <w:color w:val="000000"/>
           <w:u w:val="single"/>
+          <w:rtl w:val="1"/>
         </w:rPr>
         <w:t>אישור מחלה</w:t>
       </w:r>
@@ -4649,7 +4758,7 @@
           <w:color w:val="00008B"/>
           <w:sz w:val="20"/>
           <w:szCs w:val="20"/>
-          <w:rtl/>
+          <w:rtl w:val="1"/>
         </w:rPr>
         <w:t>הנני לאשר כי הנ"ל חלה/תה, האבחנה מפורטת ברשומה הרפואית.</w:t>
       </w:r>
@@ -4672,6 +4781,7 @@
           <w:rFonts w:ascii="Arial" w:hAnsi="Arial"/>
           <w:b/>
           <w:color w:val="00008B"/>
+          <w:rtl w:val="1"/>
         </w:rPr>
         <w:t xml:space="preserve">אינו/ה מסוגל/ת לעבוד מיום: </w:t>
       </w:r>
@@ -4690,6 +4800,14 @@
           <w:b w:val="0"/>
           <w:color w:val="000000"/>
         </w:rPr>
+        <w:t>‏</w:t>
+      </w:r>
+      <w:r>
+        <w:rPr>
+          <w:rFonts w:ascii="Arial" w:hAnsi="Arial"/>
+          <w:b w:val="0"/>
+          <w:color w:val="000000"/>
+        </w:rPr>
         <w:t xml:space="preserve">    </w:t>
       </w:r>
       <w:r>
@@ -4697,6 +4815,7 @@
           <w:rFonts w:ascii="Arial" w:hAnsi="Arial"/>
           <w:b/>
           <w:color w:val="00008B"/>
+          <w:rtl w:val="1"/>
         </w:rPr>
         <w:t xml:space="preserve">עד יום: </w:t>
       </w:r>
@@ -4715,6 +4834,14 @@
           <w:b w:val="0"/>
           <w:color w:val="000000"/>
         </w:rPr>
+        <w:t>‏</w:t>
+      </w:r>
+      <w:r>
+        <w:rPr>
+          <w:rFonts w:ascii="Arial" w:hAnsi="Arial"/>
+          <w:b w:val="0"/>
+          <w:color w:val="000000"/>
+        </w:rPr>
         <w:t xml:space="preserve">    </w:t>
       </w:r>
       <w:r>
@@ -4722,6 +4849,7 @@
           <w:rFonts w:ascii="Arial" w:hAnsi="Arial"/>
           <w:b/>
           <w:color w:val="00008B"/>
+          <w:rtl w:val="1"/>
         </w:rPr>
         <w:t xml:space="preserve">סה"כ: </w:t>
       </w:r>
@@ -4730,6 +4858,7 @@
           <w:rFonts w:ascii="Arial" w:hAnsi="Arial"/>
           <w:b w:val="0"/>
           <w:color w:val="000000"/>
+          <w:rtl w:val="1"/>
         </w:rPr>
         <w:t>4 ימים.</w:t>
       </w:r>
@@ -4772,6 +4901,14 @@
                 <w:rtl w:val="0"/>
               </w:rPr>
               <w:t>‎31/08/2026</w:t>
+            </w:r>
+            <w:r>
+              <w:rPr>
+                <w:rFonts w:ascii="Arial" w:hAnsi="Arial"/>
+                <w:b w:val="0"/>
+                <w:color w:val="000000"/>
+              </w:rPr>
+              <w:t>‏</w:t>
             </w:r>
           </w:p>
         </w:tc>
@@ -4965,6 +5102,7 @@
                 <w:rFonts w:ascii="Arial" w:hAnsi="Arial"/>
                 <w:b/>
                 <w:color w:val="00008B"/>
+                <w:rtl w:val="1"/>
               </w:rPr>
               <w:t>תאריך</w:t>
             </w:r>
@@ -4984,6 +5122,7 @@
                 <w:rFonts w:ascii="Arial" w:hAnsi="Arial"/>
                 <w:b/>
                 <w:color w:val="00008B"/>
+                <w:rtl w:val="1"/>
               </w:rPr>
               <w:t>חתימה וחותמת הרופא</w:t>
             </w:r>

</xml_diff>

<commit_message>
Clear LTR indents and align header/footer paragraphs RTL
- Strip leftover Word PDF import indents, tabs, and hanging margins
- Set section/body bidi; bidiVisual on header/footer tables only
- Right-align footer date and signature cells (both RTL)
- Final normalize_layout pass on all paragraphs and table cells

Co-authored-by: Ron Gurfinkel <RonBabaj@users.noreply.github.com>
</commit_message>
<xml_diff>
--- a/exports/medical_certificate.docx
+++ b/exports/medical_certificate.docx
@@ -19,6 +19,7 @@
           <w:insideH w:val="none"/>
           <w:insideV w:val="none"/>
         </w:tblBorders>
+        <w:bidiVisual w:val="1"/>
       </w:tblPr>
       <w:tblGrid>
         <w:gridCol w:w="3532"/>
@@ -33,6 +34,7 @@
           <w:p>
             <w:pPr>
               <w:bidi w:val="1"/>
+              <w:ind w:left="0" w:right="0" w:firstLine="0"/>
               <w:jc w:val="right"/>
             </w:pPr>
             <w:r>
@@ -41,6 +43,7 @@
                 <w:b/>
                 <w:color w:val="000000"/>
                 <w:rtl w:val="1"/>
+                <w:lang w:bidi="he-IL" w:rtl="he-IL"/>
               </w:rPr>
               <w:t>דר' קגנוביץ גלינה</w:t>
             </w:r>
@@ -53,6 +56,7 @@
           <w:p>
             <w:pPr>
               <w:bidi w:val="1"/>
+              <w:ind w:left="0" w:right="0" w:firstLine="0"/>
               <w:jc w:val="center"/>
             </w:pPr>
             <w:r>
@@ -62,6 +66,7 @@
                 <w:color w:val="000000"/>
                 <w:sz w:val="28"/>
                 <w:rtl w:val="1"/>
+                <w:lang w:bidi="he-IL" w:rtl="he-IL"/>
               </w:rPr>
               <w:t>מכבי שירותי בריאות</w:t>
             </w:r>
@@ -74,7 +79,8 @@
           <w:p>
             <w:pPr>
               <w:bidi w:val="1"/>
-              <w:jc w:val="left"/>
+              <w:ind w:left="0" w:right="0" w:firstLine="0"/>
+              <w:jc w:val="right"/>
             </w:pPr>
             <w:r>
               <w:rPr>
@@ -82,6 +88,7 @@
                 <w:b/>
                 <w:color w:val="00008B"/>
                 <w:rtl w:val="1"/>
+                <w:lang w:bidi="he-IL" w:rtl="he-IL"/>
               </w:rPr>
               <w:t xml:space="preserve">תאריך: </w:t>
             </w:r>
@@ -116,6 +123,7 @@
                 <w:b/>
                 <w:color w:val="00008B"/>
                 <w:rtl w:val="1"/>
+                <w:lang w:bidi="he-IL" w:rtl="he-IL"/>
               </w:rPr>
               <w:t xml:space="preserve">מ.ר </w:t>
             </w:r>
@@ -125,6 +133,7 @@
                 <w:b/>
                 <w:color w:val="00008B"/>
                 <w:rtl w:val="1"/>
+                <w:lang w:bidi="he-IL" w:rtl="he-IL"/>
               </w:rPr>
               <w:t>גורם מפנה</w:t>
             </w:r>
@@ -135,7 +144,7 @@
     <w:p>
       <w:pPr>
         <w:spacing w:after="80"/>
-        <w:ind w:right="1589"/>
+        <w:ind w:left="0" w:right="0" w:firstLine="0"/>
         <w:jc w:val="right"/>
         <w:bidi w:val="1"/>
       </w:pPr>
@@ -1780,6 +1789,7 @@
           <w:b w:val="0"/>
           <w:color w:val="000000"/>
           <w:rtl w:val="1"/>
+          <w:lang w:bidi="he-IL" w:rtl="he-IL"/>
         </w:rPr>
         <w:t>משפחה, פנימית וכללית</w:t>
       </w:r>
@@ -1787,8 +1797,8 @@
     <w:p>
       <w:pPr>
         <w:spacing w:after="40" w:line="392" w:lineRule="auto"/>
-        <w:ind w:left="3511" w:right="1589"/>
         <w:bidi w:val="1"/>
+        <w:ind w:left="0" w:right="0" w:firstLine="0"/>
         <w:jc w:val="center"/>
       </w:pPr>
       <w:r>
@@ -1797,6 +1807,7 @@
           <w:b/>
           <w:color w:val="00008B"/>
           <w:rtl w:val="1"/>
+          <w:lang w:bidi="he-IL" w:rtl="he-IL"/>
         </w:rPr>
         <w:t xml:space="preserve">טלפון: </w:t>
       </w:r>
@@ -1831,6 +1842,7 @@
           <w:b/>
           <w:color w:val="00008B"/>
           <w:rtl w:val="1"/>
+          <w:lang w:bidi="he-IL" w:rtl="he-IL"/>
         </w:rPr>
         <w:t xml:space="preserve">פקס: </w:t>
       </w:r>
@@ -1854,11 +1866,8 @@
     </w:p>
     <w:p>
       <w:pPr>
-        <w:tabs>
-          <w:tab w:val="center" w:pos="4653"/>
-          <w:tab w:val="center" w:pos="5814"/>
-        </w:tabs>
         <w:spacing w:after="200"/>
+        <w:ind w:left="0" w:right="0" w:firstLine="0"/>
         <w:jc w:val="center"/>
         <w:bidi w:val="1"/>
       </w:pPr>
@@ -1868,6 +1877,7 @@
           <w:b/>
           <w:color w:val="00008B"/>
           <w:rtl w:val="1"/>
+          <w:lang w:bidi="he-IL" w:rtl="he-IL"/>
         </w:rPr>
         <w:t xml:space="preserve">כתובת: </w:t>
       </w:r>
@@ -1877,6 +1887,7 @@
           <w:b w:val="0"/>
           <w:color w:val="000000"/>
           <w:rtl w:val="1"/>
+          <w:lang w:bidi="he-IL" w:rtl="he-IL"/>
         </w:rPr>
         <w:t>שטרן יאיר 14, רמלה</w:t>
       </w:r>
@@ -1891,6 +1902,7 @@
           <w:right w:w="182" w:type="dxa"/>
         </w:tblCellMar>
         <w:tblW w:w="10785" w:type="dxa"/>
+        <w:bidiVisual w:val="1"/>
       </w:tblPr>
       <w:tblGrid>
         <w:gridCol w:w="2649"/>
@@ -1903,19 +1915,34 @@
           <w:tcPr>
             <w:tcW w:type="dxa" w:w="2649"/>
           </w:tcPr>
-          <w:p/>
+          <w:p>
+            <w:pPr>
+              <w:bidi w:val="1"/>
+              <w:ind w:left="0" w:right="0" w:firstLine="0"/>
+            </w:pPr>
+          </w:p>
         </w:tc>
         <w:tc>
           <w:tcPr>
             <w:tcW w:type="dxa" w:w="2649"/>
           </w:tcPr>
-          <w:p/>
+          <w:p>
+            <w:pPr>
+              <w:bidi w:val="1"/>
+              <w:ind w:left="0" w:right="0" w:firstLine="0"/>
+            </w:pPr>
+          </w:p>
         </w:tc>
         <w:tc>
           <w:tcPr>
             <w:tcW w:type="dxa" w:w="2649"/>
           </w:tcPr>
-          <w:p/>
+          <w:p>
+            <w:pPr>
+              <w:bidi w:val="1"/>
+              <w:ind w:left="0" w:right="0" w:firstLine="0"/>
+            </w:pPr>
+          </w:p>
         </w:tc>
         <w:tc>
           <w:tcPr>
@@ -1925,6 +1952,7 @@
             <w:pPr>
               <w:bidi w:val="1"/>
               <w:spacing w:line="276" w:lineRule="auto"/>
+              <w:ind w:left="0" w:right="0" w:firstLine="0"/>
               <w:jc w:val="right"/>
             </w:pPr>
             <w:r>
@@ -1933,6 +1961,7 @@
                 <w:b/>
                 <w:color w:val="00008B"/>
                 <w:rtl w:val="1"/>
+                <w:lang w:bidi="he-IL" w:rtl="he-IL"/>
               </w:rPr>
               <w:t>פרטי הנבדק:</w:t>
             </w:r>
@@ -1948,6 +1977,7 @@
             <w:pPr>
               <w:bidi w:val="1"/>
               <w:spacing w:line="276" w:lineRule="auto"/>
+              <w:ind w:left="0" w:right="0" w:firstLine="0"/>
               <w:jc w:val="right"/>
             </w:pPr>
             <w:r>
@@ -1956,6 +1986,7 @@
                 <w:b/>
                 <w:color w:val="00008B"/>
                 <w:rtl w:val="1"/>
+                <w:lang w:bidi="he-IL" w:rtl="he-IL"/>
               </w:rPr>
               <w:t>ת.ז.:</w:t>
             </w:r>
@@ -1994,6 +2025,7 @@
             <w:pPr>
               <w:bidi w:val="1"/>
               <w:spacing w:line="276" w:lineRule="auto"/>
+              <w:ind w:left="0" w:right="0" w:firstLine="0"/>
               <w:jc w:val="right"/>
             </w:pPr>
             <w:r>
@@ -2002,6 +2034,7 @@
                 <w:b/>
                 <w:color w:val="00008B"/>
                 <w:rtl w:val="1"/>
+                <w:lang w:bidi="he-IL" w:rtl="he-IL"/>
               </w:rPr>
               <w:t>שם פרטי:</w:t>
             </w:r>
@@ -2019,6 +2052,7 @@
                 <w:b w:val="0"/>
                 <w:color w:val="000000"/>
                 <w:rtl w:val="1"/>
+                <w:lang w:bidi="he-IL" w:rtl="he-IL"/>
               </w:rPr>
               <w:t>רון</w:t>
             </w:r>
@@ -2032,6 +2066,7 @@
             <w:pPr>
               <w:bidi w:val="1"/>
               <w:spacing w:line="276" w:lineRule="auto"/>
+              <w:ind w:left="0" w:right="0" w:firstLine="0"/>
               <w:jc w:val="right"/>
             </w:pPr>
             <w:r>
@@ -2040,6 +2075,7 @@
                 <w:b/>
                 <w:color w:val="00008B"/>
                 <w:rtl w:val="1"/>
+                <w:lang w:bidi="he-IL" w:rtl="he-IL"/>
               </w:rPr>
               <w:t>שם משפחה:</w:t>
             </w:r>
@@ -2057,6 +2093,7 @@
                 <w:b w:val="0"/>
                 <w:color w:val="000000"/>
                 <w:rtl w:val="1"/>
+                <w:lang w:bidi="he-IL" w:rtl="he-IL"/>
               </w:rPr>
               <w:t>גורפינקל</w:t>
             </w:r>
@@ -2067,6 +2104,10 @@
             <w:tcW w:type="dxa" w:w="2649"/>
           </w:tcPr>
           <w:p>
+            <w:pPr>
+              <w:bidi w:val="1"/>
+              <w:ind w:left="0" w:right="0" w:firstLine="0"/>
+            </w:pPr>
             <w:r>
               <w:rPr>
                 <w:noProof/>
@@ -4437,6 +4478,7 @@
             <w:pPr>
               <w:bidi w:val="1"/>
               <w:spacing w:line="276" w:lineRule="auto"/>
+              <w:ind w:left="0" w:right="0" w:firstLine="0"/>
               <w:jc w:val="right"/>
             </w:pPr>
             <w:r>
@@ -4445,6 +4487,7 @@
                 <w:b/>
                 <w:color w:val="00008B"/>
                 <w:rtl w:val="1"/>
+                <w:lang w:bidi="he-IL" w:rtl="he-IL"/>
               </w:rPr>
               <w:t>טל.עבודה/נייד:</w:t>
             </w:r>
@@ -4483,6 +4526,7 @@
             <w:pPr>
               <w:bidi w:val="1"/>
               <w:spacing w:line="276" w:lineRule="auto"/>
+              <w:ind w:left="0" w:right="0" w:firstLine="0"/>
               <w:jc w:val="right"/>
             </w:pPr>
             <w:r>
@@ -4491,6 +4535,7 @@
                 <w:b/>
                 <w:color w:val="00008B"/>
                 <w:rtl w:val="1"/>
+                <w:lang w:bidi="he-IL" w:rtl="he-IL"/>
               </w:rPr>
               <w:t>טלפון:</w:t>
             </w:r>
@@ -4529,6 +4574,7 @@
             <w:pPr>
               <w:bidi w:val="1"/>
               <w:spacing w:line="276" w:lineRule="auto"/>
+              <w:ind w:left="0" w:right="0" w:firstLine="0"/>
               <w:jc w:val="right"/>
             </w:pPr>
             <w:r>
@@ -4537,6 +4583,7 @@
                 <w:b/>
                 <w:color w:val="00008B"/>
                 <w:rtl w:val="1"/>
+                <w:lang w:bidi="he-IL" w:rtl="he-IL"/>
               </w:rPr>
               <w:t>ת.לידה:</w:t>
             </w:r>
@@ -4579,6 +4626,7 @@
                 <w:b/>
                 <w:color w:val="00008B"/>
                 <w:rtl w:val="1"/>
+                <w:lang w:bidi="he-IL" w:rtl="he-IL"/>
               </w:rPr>
               <w:t>מין:</w:t>
             </w:r>
@@ -4596,6 +4644,7 @@
                 <w:b w:val="0"/>
                 <w:color w:val="000000"/>
                 <w:rtl w:val="1"/>
+                <w:lang w:bidi="he-IL" w:rtl="he-IL"/>
               </w:rPr>
               <w:t>ז</w:t>
             </w:r>
@@ -4605,7 +4654,12 @@
           <w:tcPr>
             <w:tcW w:type="dxa" w:w="2649"/>
           </w:tcPr>
-          <w:p/>
+          <w:p>
+            <w:pPr>
+              <w:bidi w:val="1"/>
+              <w:ind w:left="0" w:right="0" w:firstLine="0"/>
+            </w:pPr>
+          </w:p>
         </w:tc>
       </w:tr>
       <w:tr>
@@ -4617,6 +4671,7 @@
             <w:pPr>
               <w:bidi w:val="1"/>
               <w:spacing w:line="276" w:lineRule="auto"/>
+              <w:ind w:left="0" w:right="0" w:firstLine="0"/>
               <w:jc w:val="right"/>
             </w:pPr>
             <w:r>
@@ -4625,6 +4680,7 @@
                 <w:b/>
                 <w:color w:val="00008B"/>
                 <w:rtl w:val="1"/>
+                <w:lang w:bidi="he-IL" w:rtl="he-IL"/>
               </w:rPr>
               <w:t>מיקוד:</w:t>
             </w:r>
@@ -4659,7 +4715,12 @@
           <w:tcPr>
             <w:tcW w:type="dxa" w:w="2649"/>
           </w:tcPr>
-          <w:p/>
+          <w:p>
+            <w:pPr>
+              <w:bidi w:val="1"/>
+              <w:ind w:left="0" w:right="0" w:firstLine="0"/>
+            </w:pPr>
+          </w:p>
         </w:tc>
         <w:tc>
           <w:tcPr>
@@ -4669,6 +4730,7 @@
             <w:pPr>
               <w:bidi w:val="1"/>
               <w:spacing w:line="276" w:lineRule="auto"/>
+              <w:ind w:left="0" w:right="0" w:firstLine="0"/>
               <w:jc w:val="right"/>
             </w:pPr>
             <w:r>
@@ -4677,6 +4739,7 @@
                 <w:b/>
                 <w:color w:val="00008B"/>
                 <w:rtl w:val="1"/>
+                <w:lang w:bidi="he-IL" w:rtl="he-IL"/>
               </w:rPr>
               <w:t>כתובת:</w:t>
             </w:r>
@@ -4694,6 +4757,7 @@
                 <w:b w:val="0"/>
                 <w:color w:val="000000"/>
                 <w:rtl w:val="1"/>
+                <w:lang w:bidi="he-IL" w:rtl="he-IL"/>
               </w:rPr>
               <w:t>הרב אפריאט 6, רמלה</w:t>
             </w:r>
@@ -4704,6 +4768,11 @@
             <w:tcW w:type="dxa" w:w="2649"/>
           </w:tcPr>
           <w:p>
+            <w:pPr>
+              <w:bidi w:val="1"/>
+              <w:ind w:left="0" w:right="0" w:firstLine="0"/>
+              <w:jc w:val="right"/>
+            </w:pPr>
             <w:r>
               <w:rPr>
                 <w:rFonts w:ascii="Arial" w:hAnsi="Arial"/>
@@ -4728,7 +4797,7 @@
     <w:p>
       <w:pPr>
         <w:spacing w:after="160" w:before="120"/>
-        <w:ind w:right="907"/>
+        <w:ind w:left="0" w:right="0" w:firstLine="0"/>
         <w:jc w:val="center"/>
         <w:bidi w:val="1"/>
       </w:pPr>
@@ -4739,6 +4808,7 @@
           <w:color w:val="000000"/>
           <w:u w:val="single"/>
           <w:rtl w:val="1"/>
+          <w:lang w:bidi="he-IL" w:rtl="he-IL"/>
         </w:rPr>
         <w:t>אישור מחלה</w:t>
       </w:r>
@@ -4746,7 +4816,7 @@
     <w:p>
       <w:pPr>
         <w:spacing w:after="160" w:line="467" w:lineRule="auto"/>
-        <w:ind w:left="212" w:hanging="10"/>
+        <w:ind w:left="0" w:right="0" w:firstLine="0"/>
         <w:jc w:val="right"/>
         <w:bidi w:val="1"/>
       </w:pPr>
@@ -4759,20 +4829,15 @@
           <w:sz w:val="20"/>
           <w:szCs w:val="20"/>
           <w:rtl w:val="1"/>
+          <w:lang w:bidi="he-IL" w:rtl="he-IL"/>
         </w:rPr>
         <w:t>הנני לאשר כי הנ"ל חלה/תה, האבחנה מפורטת ברשומה הרפואית.</w:t>
       </w:r>
     </w:p>
     <w:p>
       <w:pPr>
-        <w:tabs>
-          <w:tab w:val="center" w:pos="2532"/>
-          <w:tab w:val="center" w:pos="4051"/>
-          <w:tab w:val="center" w:pos="4692"/>
-          <w:tab w:val="center" w:pos="6175"/>
-          <w:tab w:val="center" w:pos="6979"/>
-        </w:tabs>
         <w:spacing w:after="400" w:line="467" w:lineRule="auto"/>
+        <w:ind w:left="0" w:right="0" w:firstLine="0"/>
         <w:jc w:val="right"/>
         <w:bidi w:val="1"/>
       </w:pPr>
@@ -4782,6 +4847,7 @@
           <w:b/>
           <w:color w:val="00008B"/>
           <w:rtl w:val="1"/>
+          <w:lang w:bidi="he-IL" w:rtl="he-IL"/>
         </w:rPr>
         <w:t xml:space="preserve">אינו/ה מסוגל/ת לעבוד מיום: </w:t>
       </w:r>
@@ -4816,6 +4882,7 @@
           <w:b/>
           <w:color w:val="00008B"/>
           <w:rtl w:val="1"/>
+          <w:lang w:bidi="he-IL" w:rtl="he-IL"/>
         </w:rPr>
         <w:t xml:space="preserve">עד יום: </w:t>
       </w:r>
@@ -4850,6 +4917,7 @@
           <w:b/>
           <w:color w:val="00008B"/>
           <w:rtl w:val="1"/>
+          <w:lang w:bidi="he-IL" w:rtl="he-IL"/>
         </w:rPr>
         <w:t xml:space="preserve">סה"כ: </w:t>
       </w:r>
@@ -4859,6 +4927,7 @@
           <w:b w:val="0"/>
           <w:color w:val="000000"/>
           <w:rtl w:val="1"/>
+          <w:lang w:bidi="he-IL" w:rtl="he-IL"/>
         </w:rPr>
         <w:t>4 ימים.</w:t>
       </w:r>
@@ -4877,6 +4946,7 @@
           <w:insideH w:val="none"/>
           <w:insideV w:val="none"/>
         </w:tblBorders>
+        <w:bidiVisual w:val="1"/>
       </w:tblPr>
       <w:tblGrid>
         <w:gridCol w:w="5298"/>
@@ -4891,6 +4961,7 @@
             <w:pPr>
               <w:bidi w:val="1"/>
               <w:spacing w:before="480"/>
+              <w:ind w:left="0" w:right="0" w:firstLine="0"/>
               <w:jc w:val="right"/>
             </w:pPr>
             <w:r>
@@ -4916,7 +4987,12 @@
           <w:tcPr>
             <w:tcW w:type="dxa" w:w="5102"/>
           </w:tcPr>
-          <w:p/>
+          <w:p>
+            <w:pPr>
+              <w:bidi w:val="1"/>
+              <w:ind w:left="0" w:right="0" w:firstLine="0"/>
+            </w:pPr>
+          </w:p>
         </w:tc>
       </w:tr>
       <w:tr>
@@ -4927,6 +5003,7 @@
           <w:p>
             <w:pPr>
               <w:bidi w:val="1"/>
+              <w:ind w:left="0" w:right="0" w:firstLine="0"/>
               <w:jc w:val="right"/>
             </w:pPr>
             <w:r>
@@ -4946,7 +5023,8 @@
           <w:p>
             <w:pPr>
               <w:bidi w:val="1"/>
-              <w:jc w:val="left"/>
+              <w:ind w:left="0" w:right="0" w:firstLine="0"/>
+              <w:jc w:val="right"/>
             </w:pPr>
             <w:r>
               <w:rPr>
@@ -5095,6 +5173,7 @@
           <w:p>
             <w:pPr>
               <w:bidi w:val="1"/>
+              <w:ind w:left="0" w:right="0" w:firstLine="0"/>
               <w:jc w:val="right"/>
             </w:pPr>
             <w:r>
@@ -5103,6 +5182,7 @@
                 <w:b/>
                 <w:color w:val="00008B"/>
                 <w:rtl w:val="1"/>
+                <w:lang w:bidi="he-IL" w:rtl="he-IL"/>
               </w:rPr>
               <w:t>תאריך</w:t>
             </w:r>
@@ -5115,7 +5195,8 @@
           <w:p>
             <w:pPr>
               <w:bidi w:val="1"/>
-              <w:jc w:val="left"/>
+              <w:ind w:left="0" w:right="0" w:firstLine="0"/>
+              <w:jc w:val="right"/>
             </w:pPr>
             <w:r>
               <w:rPr>
@@ -5123,6 +5204,7 @@
                 <w:b/>
                 <w:color w:val="00008B"/>
                 <w:rtl w:val="1"/>
+                <w:lang w:bidi="he-IL" w:rtl="he-IL"/>
               </w:rPr>
               <w:t>חתימה וחותמת הרופא</w:t>
             </w:r>

</xml_diff>